<commit_message>
feat: update regulations for the 2026-2027 season
</commit_message>
<xml_diff>
--- a/public/docs/Regolamento_erFantacalcio.docx
+++ b/public/docs/Regolamento_erFantacalcio.docx
@@ -19,63 +19,86 @@
         <w:t xml:space="preserve"> 202</w:t>
       </w:r>
       <w:r>
+        <w:t>6</w:t>
+      </w:r>
+      <w:r>
+        <w:t>-202</w:t>
+      </w:r>
+      <w:r>
+        <w:t>7</w:t>
+      </w:r>
+    </w:p>
+    <w:p/>
+    <w:p/>
+    <w:p/>
+    <w:p>
+      <w:pPr>
+        <w:pStyle w:val="Titolo2"/>
+      </w:pPr>
+      <w:r>
+        <w:t xml:space="preserve">Calendario stagionale  </w:t>
+      </w:r>
+    </w:p>
+    <w:p>
+      <w:r>
+        <w:t xml:space="preserve">Si saltano le prime 3 giornate di serie A, si comincia la nostra stagione dalla </w:t>
+      </w:r>
+      <w:proofErr w:type="gramStart"/>
+      <w:r>
+        <w:t>4</w:t>
+      </w:r>
+      <w:proofErr w:type="gramEnd"/>
+      <w:r>
+        <w:t xml:space="preserve"> giornata di serie A prevista per </w:t>
+      </w:r>
+      <w:r>
+        <w:t>venerdì 19</w:t>
+      </w:r>
+      <w:r>
+        <w:t xml:space="preserve"> settembre e termina la </w:t>
+      </w:r>
+      <w:proofErr w:type="gramStart"/>
+      <w:r>
+        <w:t>38</w:t>
+      </w:r>
+      <w:proofErr w:type="gramEnd"/>
+      <w:r>
+        <w:t xml:space="preserve"> giornata di serie A prevista per il 2</w:t>
+      </w:r>
+      <w:r>
+        <w:t>4</w:t>
+      </w:r>
+      <w:r>
+        <w:t xml:space="preserve"> maggio 202</w:t>
+      </w:r>
+      <w:r>
+        <w:t>6</w:t>
+      </w:r>
+      <w:r>
+        <w:t>.</w:t>
+      </w:r>
+    </w:p>
+    <w:p/>
+    <w:p>
+      <w:pPr>
+        <w:pStyle w:val="Titolo4"/>
+      </w:pPr>
+      <w:r>
+        <w:t>Campionato</w:t>
+      </w:r>
+    </w:p>
+    <w:p>
+      <w:r>
+        <w:t xml:space="preserve">Il calendario prevede per il fantacampionato </w:t>
+      </w:r>
+      <w:r>
         <w:t>5</w:t>
       </w:r>
       <w:r>
-        <w:t>-202</w:t>
-      </w:r>
-      <w:r>
-        <w:t>6</w:t>
-      </w:r>
-    </w:p>
-    <w:p/>
-    <w:p/>
-    <w:p/>
-    <w:p>
-      <w:pPr>
-        <w:pStyle w:val="Titolo2"/>
-      </w:pPr>
-      <w:r>
-        <w:t xml:space="preserve">Calendario stagionale  </w:t>
-      </w:r>
-    </w:p>
-    <w:p>
-      <w:r>
-        <w:t xml:space="preserve">Si saltano le prime 3 giornate di serie A, si comincia la nostra stagione dalla </w:t>
-      </w:r>
-      <w:proofErr w:type="gramStart"/>
-      <w:r>
-        <w:t>4</w:t>
-      </w:r>
-      <w:proofErr w:type="gramEnd"/>
-      <w:r>
-        <w:t xml:space="preserve"> giornata di serie A prevista per </w:t>
-      </w:r>
-      <w:r>
-        <w:t>venerdì 19</w:t>
-      </w:r>
-      <w:r>
-        <w:t xml:space="preserve"> settembre e termina la </w:t>
-      </w:r>
-      <w:proofErr w:type="gramStart"/>
-      <w:r>
-        <w:t>38</w:t>
-      </w:r>
-      <w:proofErr w:type="gramEnd"/>
-      <w:r>
-        <w:t xml:space="preserve"> giornata di serie A prevista per il 2</w:t>
-      </w:r>
-      <w:r>
-        <w:t>4</w:t>
-      </w:r>
-      <w:r>
-        <w:t xml:space="preserve"> maggio 202</w:t>
-      </w:r>
-      <w:r>
-        <w:t>6</w:t>
-      </w:r>
-      <w:r>
-        <w:t>.</w:t>
+        <w:t xml:space="preserve"> gironi</w:t>
+      </w:r>
+      <w:r>
+        <w:t xml:space="preserve">, ogni girone è composto da 7 giornate per un totale di 35 giornate. </w:t>
       </w:r>
     </w:p>
     <w:p/>
@@ -84,29 +107,6 @@
         <w:pStyle w:val="Titolo4"/>
       </w:pPr>
       <w:r>
-        <w:t>Campionato</w:t>
-      </w:r>
-    </w:p>
-    <w:p>
-      <w:r>
-        <w:t xml:space="preserve">Il calendario prevede per il fantacampionato </w:t>
-      </w:r>
-      <w:r>
-        <w:t>5</w:t>
-      </w:r>
-      <w:r>
-        <w:t xml:space="preserve"> gironi</w:t>
-      </w:r>
-      <w:r>
-        <w:t xml:space="preserve">, ogni girone è composto da 7 giornate per un totale di 35 giornate. </w:t>
-      </w:r>
-    </w:p>
-    <w:p/>
-    <w:p>
-      <w:pPr>
-        <w:pStyle w:val="Titolo4"/>
-      </w:pPr>
-      <w:r>
         <w:t>Champions</w:t>
       </w:r>
     </w:p>
@@ -185,6 +185,21 @@
     <w:p>
       <w:r>
         <w:t>Le fasi finali della Champions si giocheranno nelle seguenti giornate di serie A: 28, 32, 36</w:t>
+      </w:r>
+    </w:p>
+    <w:p>
+      <w:pPr>
+        <w:rPr>
+          <w:b/>
+          <w:bCs/>
+        </w:rPr>
+      </w:pPr>
+      <w:r>
+        <w:rPr>
+          <w:b/>
+          <w:bCs/>
+        </w:rPr>
+        <w:t>Per le fasi finali in caso non venga consegnata la formazione non vengono previste multe, la partita si giocherà regolarmente inserendo la formazione precedentemente rilasciata.</w:t>
       </w:r>
     </w:p>
     <w:p/>
@@ -738,6 +753,32 @@
       <w:r>
         <w:t xml:space="preserve"> punteggio dell’andata più quello del ritorno.</w:t>
       </w:r>
+      <w:r>
+        <w:t xml:space="preserve"> </w:t>
+      </w:r>
+      <w:r>
+        <w:rPr>
+          <w:b/>
+          <w:bCs/>
+        </w:rPr>
+        <w:t xml:space="preserve">In caso di parità al </w:t>
+      </w:r>
+      <w:proofErr w:type="spellStart"/>
+      <w:r>
+        <w:rPr>
+          <w:b/>
+          <w:bCs/>
+        </w:rPr>
+        <w:t>fantapunteggio</w:t>
+      </w:r>
+      <w:proofErr w:type="spellEnd"/>
+      <w:r>
+        <w:rPr>
+          <w:b/>
+          <w:bCs/>
+        </w:rPr>
+        <w:t xml:space="preserve"> vincerà la squadra meglio piazzata in campionato (al momento della disputa) </w:t>
+      </w:r>
     </w:p>
     <w:p/>
     <w:p/>
@@ -789,11 +830,28 @@
       </w:r>
     </w:p>
     <w:p>
-      <w:r>
-        <w:t>Per le ultime 6 giornate le multe aumenteranno a 20€.</w:t>
-      </w:r>
-    </w:p>
-    <w:p/>
+      <w:pPr>
+        <w:rPr>
+          <w:b/>
+          <w:bCs/>
+        </w:rPr>
+      </w:pPr>
+      <w:r>
+        <w:rPr>
+          <w:b/>
+          <w:bCs/>
+        </w:rPr>
+        <w:lastRenderedPageBreak/>
+        <w:t>Si propone l’abolizione delle multe</w:t>
+      </w:r>
+      <w:r>
+        <w:rPr>
+          <w:b/>
+          <w:bCs/>
+        </w:rPr>
+        <w:t>: il presidente potrà, in autonomia, solo confermare la formazione precedente e giocarsela senza handicap.</w:t>
+      </w:r>
+    </w:p>
     <w:p/>
     <w:p>
       <w:pPr>
@@ -853,7 +911,13 @@
     </w:p>
     <w:p>
       <w:r>
-        <w:t>Al termine del mercato, ovvero quando sono state ultimate tutte le rose delle squadre, si può procedere con lo scambio dei giocatori usufruendo come merce di scambio i fantamilioni residui o un altro giocatore. Resta inteso che le rose devono rimanere inalterate nel numero fisso per ogni reparto di gioco.</w:t>
+        <w:t>Al termine del mercato</w:t>
+      </w:r>
+      <w:r>
+        <w:t xml:space="preserve"> di settembre</w:t>
+      </w:r>
+      <w:r>
+        <w:t>, ovvero quando sono state ultimate tutte le rose delle squadre, si può procedere con lo scambio dei giocatori usufruendo come merce di scambio i fantamilioni residui o un altro giocatore. Resta inteso che le rose devono rimanere inalterate nel numero fisso per ogni reparto di gioco.</w:t>
       </w:r>
     </w:p>
     <w:p/>
@@ -862,12 +926,113 @@
         <w:pStyle w:val="Titolo2"/>
       </w:pPr>
       <w:r>
-        <w:t>Scambio giocatori sosta nazionali</w:t>
-      </w:r>
-    </w:p>
-    <w:p>
-      <w:r>
-        <w:t>Durante il periodo della sosta nazionali sono consentiti scambi giocatori tra fantasquadre. La rosa al termine dei cambi dovrà comunque rispettare i 3 portieri, 8 difensori, 8 centrocampisti e 6 attaccanti.</w:t>
+        <w:t>Sessioni di mercato</w:t>
+      </w:r>
+      <w:r>
+        <w:t xml:space="preserve"> sosta nazionali</w:t>
+      </w:r>
+    </w:p>
+    <w:p>
+      <w:pPr>
+        <w:rPr>
+          <w:b/>
+          <w:bCs/>
+        </w:rPr>
+      </w:pPr>
+      <w:r>
+        <w:rPr>
+          <w:b/>
+          <w:bCs/>
+        </w:rPr>
+        <w:t xml:space="preserve">Durante il periodo della sosta nazionali </w:t>
+      </w:r>
+      <w:r>
+        <w:rPr>
+          <w:b/>
+          <w:bCs/>
+        </w:rPr>
+        <w:t>(orientativamente a novembre e a marzo) verrà creata una sessione di mercato sul sito</w:t>
+      </w:r>
+      <w:r>
+        <w:rPr>
+          <w:b/>
+          <w:bCs/>
+        </w:rPr>
+        <w:t>.</w:t>
+      </w:r>
+      <w:r>
+        <w:rPr>
+          <w:b/>
+          <w:bCs/>
+        </w:rPr>
+        <w:t xml:space="preserve"> La sessione di mercato prevede una finestra temporale (data inizio, data fine) e un numero massimo di proposte di acquisto per ciascuna squadra. Ciascun presidente può effettuare delle proposte di acquisto, in soldi reali o fantamilioni restanti.</w:t>
+      </w:r>
+    </w:p>
+    <w:p>
+      <w:pPr>
+        <w:rPr>
+          <w:b/>
+          <w:bCs/>
+        </w:rPr>
+      </w:pPr>
+      <w:r>
+        <w:rPr>
+          <w:b/>
+          <w:bCs/>
+        </w:rPr>
+        <w:t>Le proposte di acquisto non sono visibili agli altri presidenti fino a chiusura della data fine della sessione di mercato (le proposte sono criptate, non visibili nemmeno dall’amministratore).</w:t>
+      </w:r>
+    </w:p>
+    <w:p>
+      <w:pPr>
+        <w:rPr>
+          <w:b/>
+          <w:bCs/>
+        </w:rPr>
+      </w:pPr>
+      <w:r>
+        <w:rPr>
+          <w:b/>
+          <w:bCs/>
+        </w:rPr>
+        <w:lastRenderedPageBreak/>
+        <w:t xml:space="preserve">Alla scadenza della sessione di mercato le offerte pervenute saranno visibili da tutti </w:t>
+      </w:r>
+      <w:r>
+        <w:rPr>
+          <w:b/>
+          <w:bCs/>
+        </w:rPr>
+        <w:t xml:space="preserve">in trasparenza </w:t>
+      </w:r>
+      <w:r>
+        <w:rPr>
+          <w:b/>
+          <w:bCs/>
+        </w:rPr>
+        <w:t>e si procederà all’acquisto dichiarando il giocatore da cedere.</w:t>
+      </w:r>
+    </w:p>
+    <w:p>
+      <w:pPr>
+        <w:rPr>
+          <w:b/>
+          <w:bCs/>
+        </w:rPr>
+      </w:pPr>
+      <w:r>
+        <w:rPr>
+          <w:b/>
+          <w:bCs/>
+        </w:rPr>
+        <w:t>Per le sessioni di mercato se procediamo con l’acquisto in fantamilioni è previsto all’apertura di ogni sessione un extra bonus di 30 fantamilioni oltre a quelli restanti del mercato di settembre/gennaio. Se procediamo con soldi reali non sono previsti extra bonus e l’offerta non è legata a vincoli</w:t>
+      </w:r>
+      <w:r>
+        <w:rPr>
+          <w:b/>
+          <w:bCs/>
+        </w:rPr>
+        <w:t>.</w:t>
       </w:r>
     </w:p>
     <w:p/>
@@ -878,7 +1043,6 @@
         <w:pStyle w:val="Titolo2"/>
       </w:pPr>
       <w:r>
-        <w:lastRenderedPageBreak/>
         <w:t xml:space="preserve">Mercato di gennaio  </w:t>
       </w:r>
     </w:p>
@@ -893,6 +1057,15 @@
       <w:proofErr w:type="gramEnd"/>
       <w:r>
         <w:t xml:space="preserve"> In caso di slittamenti del mercato le partite giocate in meno di 11 giocatori prevedono un 6 politico per ogni giocatore mancante in formazione. I giocatori non potranno più essere ceduti in cambio di soldi reali direttamente al presidente che vende; i giocatori messi sul mercato verranno battuti all’asta e i soldi andranno solo sul montepremi generale.</w:t>
+      </w:r>
+    </w:p>
+    <w:p>
+      <w:r>
+        <w:rPr>
+          <w:b/>
+          <w:bCs/>
+        </w:rPr>
+        <w:t>Al mercato di riparazione in caso di alcune dimenticanze di aggiustamenti della rosa dovranno essere riparati quanto prima; eventuali partite giocate, prima della riparazione, andranno ricalcolate con il giocatore/i subentrato</w:t>
       </w:r>
     </w:p>
     <w:p/>
@@ -988,6 +1161,7 @@
         <w:pStyle w:val="Titolo2"/>
       </w:pPr>
       <w:r>
+        <w:lastRenderedPageBreak/>
         <w:t xml:space="preserve">Penalità di fine stagione  </w:t>
       </w:r>
     </w:p>
@@ -1469,6 +1643,118 @@
     </w:lvl>
   </w:abstractNum>
   <w:abstractNum w:abstractNumId="4" w15:restartNumberingAfterBreak="0">
+    <w:nsid w:val="47181E04"/>
+    <w:multiLevelType w:val="hybridMultilevel"/>
+    <w:tmpl w:val="6E2CE55C"/>
+    <w:lvl w:ilvl="0" w:tplc="4D2C1296">
+      <w:numFmt w:val="bullet"/>
+      <w:lvlText w:val="-"/>
+      <w:lvlJc w:val="left"/>
+      <w:pPr>
+        <w:ind w:left="720" w:hanging="360"/>
+      </w:pPr>
+      <w:rPr>
+        <w:rFonts w:ascii="Calibri" w:eastAsiaTheme="minorHAnsi" w:hAnsi="Calibri" w:cs="Calibri" w:hint="default"/>
+      </w:rPr>
+    </w:lvl>
+    <w:lvl w:ilvl="1" w:tplc="04100003" w:tentative="1">
+      <w:start w:val="1"/>
+      <w:numFmt w:val="bullet"/>
+      <w:lvlText w:val="o"/>
+      <w:lvlJc w:val="left"/>
+      <w:pPr>
+        <w:ind w:left="1440" w:hanging="360"/>
+      </w:pPr>
+      <w:rPr>
+        <w:rFonts w:ascii="Courier New" w:hAnsi="Courier New" w:cs="Courier New" w:hint="default"/>
+      </w:rPr>
+    </w:lvl>
+    <w:lvl w:ilvl="2" w:tplc="04100005" w:tentative="1">
+      <w:start w:val="1"/>
+      <w:numFmt w:val="bullet"/>
+      <w:lvlText w:val=""/>
+      <w:lvlJc w:val="left"/>
+      <w:pPr>
+        <w:ind w:left="2160" w:hanging="360"/>
+      </w:pPr>
+      <w:rPr>
+        <w:rFonts w:ascii="Wingdings" w:hAnsi="Wingdings" w:hint="default"/>
+      </w:rPr>
+    </w:lvl>
+    <w:lvl w:ilvl="3" w:tplc="04100001" w:tentative="1">
+      <w:start w:val="1"/>
+      <w:numFmt w:val="bullet"/>
+      <w:lvlText w:val=""/>
+      <w:lvlJc w:val="left"/>
+      <w:pPr>
+        <w:ind w:left="2880" w:hanging="360"/>
+      </w:pPr>
+      <w:rPr>
+        <w:rFonts w:ascii="Symbol" w:hAnsi="Symbol" w:hint="default"/>
+      </w:rPr>
+    </w:lvl>
+    <w:lvl w:ilvl="4" w:tplc="04100003" w:tentative="1">
+      <w:start w:val="1"/>
+      <w:numFmt w:val="bullet"/>
+      <w:lvlText w:val="o"/>
+      <w:lvlJc w:val="left"/>
+      <w:pPr>
+        <w:ind w:left="3600" w:hanging="360"/>
+      </w:pPr>
+      <w:rPr>
+        <w:rFonts w:ascii="Courier New" w:hAnsi="Courier New" w:cs="Courier New" w:hint="default"/>
+      </w:rPr>
+    </w:lvl>
+    <w:lvl w:ilvl="5" w:tplc="04100005" w:tentative="1">
+      <w:start w:val="1"/>
+      <w:numFmt w:val="bullet"/>
+      <w:lvlText w:val=""/>
+      <w:lvlJc w:val="left"/>
+      <w:pPr>
+        <w:ind w:left="4320" w:hanging="360"/>
+      </w:pPr>
+      <w:rPr>
+        <w:rFonts w:ascii="Wingdings" w:hAnsi="Wingdings" w:hint="default"/>
+      </w:rPr>
+    </w:lvl>
+    <w:lvl w:ilvl="6" w:tplc="04100001" w:tentative="1">
+      <w:start w:val="1"/>
+      <w:numFmt w:val="bullet"/>
+      <w:lvlText w:val=""/>
+      <w:lvlJc w:val="left"/>
+      <w:pPr>
+        <w:ind w:left="5040" w:hanging="360"/>
+      </w:pPr>
+      <w:rPr>
+        <w:rFonts w:ascii="Symbol" w:hAnsi="Symbol" w:hint="default"/>
+      </w:rPr>
+    </w:lvl>
+    <w:lvl w:ilvl="7" w:tplc="04100003" w:tentative="1">
+      <w:start w:val="1"/>
+      <w:numFmt w:val="bullet"/>
+      <w:lvlText w:val="o"/>
+      <w:lvlJc w:val="left"/>
+      <w:pPr>
+        <w:ind w:left="5760" w:hanging="360"/>
+      </w:pPr>
+      <w:rPr>
+        <w:rFonts w:ascii="Courier New" w:hAnsi="Courier New" w:cs="Courier New" w:hint="default"/>
+      </w:rPr>
+    </w:lvl>
+    <w:lvl w:ilvl="8" w:tplc="04100005" w:tentative="1">
+      <w:start w:val="1"/>
+      <w:numFmt w:val="bullet"/>
+      <w:lvlText w:val=""/>
+      <w:lvlJc w:val="left"/>
+      <w:pPr>
+        <w:ind w:left="6480" w:hanging="360"/>
+      </w:pPr>
+      <w:rPr>
+        <w:rFonts w:ascii="Wingdings" w:hAnsi="Wingdings" w:hint="default"/>
+      </w:rPr>
+    </w:lvl>
+  </w:abstractNum>
+  <w:abstractNum w:abstractNumId="5" w15:restartNumberingAfterBreak="0">
     <w:nsid w:val="5E2D33B9"/>
     <w:multiLevelType w:val="hybridMultilevel"/>
     <w:tmpl w:val="14960ACC"/>
@@ -1581,7 +1867,7 @@
       </w:rPr>
     </w:lvl>
   </w:abstractNum>
-  <w:abstractNum w:abstractNumId="5" w15:restartNumberingAfterBreak="0">
+  <w:abstractNum w:abstractNumId="6" w15:restartNumberingAfterBreak="0">
     <w:nsid w:val="700D66D2"/>
     <w:multiLevelType w:val="hybridMultilevel"/>
     <w:tmpl w:val="B3BA5AE8"/>
@@ -1694,7 +1980,7 @@
       </w:rPr>
     </w:lvl>
   </w:abstractNum>
-  <w:abstractNum w:abstractNumId="6" w15:restartNumberingAfterBreak="0">
+  <w:abstractNum w:abstractNumId="7" w15:restartNumberingAfterBreak="0">
     <w:nsid w:val="72353A77"/>
     <w:multiLevelType w:val="hybridMultilevel"/>
     <w:tmpl w:val="57502344"/>
@@ -1808,25 +2094,28 @@
     </w:lvl>
   </w:abstractNum>
   <w:num w:numId="1" w16cid:durableId="1235234935">
-    <w:abstractNumId w:val="6"/>
+    <w:abstractNumId w:val="7"/>
   </w:num>
   <w:num w:numId="2" w16cid:durableId="1808547614">
     <w:abstractNumId w:val="1"/>
   </w:num>
   <w:num w:numId="3" w16cid:durableId="1125194435">
-    <w:abstractNumId w:val="5"/>
+    <w:abstractNumId w:val="6"/>
   </w:num>
   <w:num w:numId="4" w16cid:durableId="998002894">
     <w:abstractNumId w:val="3"/>
   </w:num>
   <w:num w:numId="5" w16cid:durableId="171259058">
-    <w:abstractNumId w:val="4"/>
+    <w:abstractNumId w:val="5"/>
   </w:num>
   <w:num w:numId="6" w16cid:durableId="642078686">
     <w:abstractNumId w:val="2"/>
   </w:num>
   <w:num w:numId="7" w16cid:durableId="1473905170">
     <w:abstractNumId w:val="0"/>
+  </w:num>
+  <w:num w:numId="8" w16cid:durableId="849641207">
+    <w:abstractNumId w:val="4"/>
   </w:num>
 </w:numbering>
 </file>

</xml_diff>

<commit_message>
fix: update season dates and clarify rules in Regolamento document for 2026-2027
</commit_message>
<xml_diff>
--- a/public/docs/Regolamento_erFantacalcio.docx
+++ b/public/docs/Regolamento_erFantacalcio.docx
@@ -52,7 +52,10 @@
         <w:t xml:space="preserve"> giornata di serie A prevista per </w:t>
       </w:r>
       <w:r>
-        <w:t>venerdì 19</w:t>
+        <w:t>venerdì 1</w:t>
+      </w:r>
+      <w:r>
+        <w:t>1</w:t>
       </w:r>
       <w:r>
         <w:t xml:space="preserve"> settembre e termina la </w:t>
@@ -63,16 +66,16 @@
       </w:r>
       <w:proofErr w:type="gramEnd"/>
       <w:r>
-        <w:t xml:space="preserve"> giornata di serie A prevista per il 2</w:t>
-      </w:r>
-      <w:r>
-        <w:t>4</w:t>
+        <w:t xml:space="preserve"> giornata di serie A prevista per il </w:t>
+      </w:r>
+      <w:r>
+        <w:t>30</w:t>
       </w:r>
       <w:r>
         <w:t xml:space="preserve"> maggio 202</w:t>
       </w:r>
       <w:r>
-        <w:t>6</w:t>
+        <w:t>7</w:t>
       </w:r>
       <w:r>
         <w:t>.</w:t>
@@ -199,7 +202,21 @@
           <w:b/>
           <w:bCs/>
         </w:rPr>
-        <w:t>Per le fasi finali in caso non venga consegnata la formazione non vengono previste multe, la partita si giocherà regolarmente inserendo la formazione precedentemente rilasciata.</w:t>
+        <w:t xml:space="preserve">Per le fasi finali </w:t>
+      </w:r>
+      <w:r>
+        <w:rPr>
+          <w:b/>
+          <w:bCs/>
+        </w:rPr>
+        <w:t xml:space="preserve">della Champions </w:t>
+      </w:r>
+      <w:r>
+        <w:rPr>
+          <w:b/>
+          <w:bCs/>
+        </w:rPr>
+        <w:t>in caso non venga consegnata la formazione non vengono previste multe, la partita si giocherà regolarmente inserendo la formazione precedentemente rilasciata.</w:t>
       </w:r>
     </w:p>
     <w:p/>
@@ -849,7 +866,35 @@
           <w:b/>
           <w:bCs/>
         </w:rPr>
-        <w:t>: il presidente potrà, in autonomia, solo confermare la formazione precedente e giocarsela senza handicap.</w:t>
+        <w:t xml:space="preserve">: </w:t>
+      </w:r>
+      <w:r>
+        <w:rPr>
+          <w:b/>
+          <w:bCs/>
+        </w:rPr>
+        <w:t>ciascun</w:t>
+      </w:r>
+      <w:r>
+        <w:rPr>
+          <w:b/>
+          <w:bCs/>
+        </w:rPr>
+        <w:t xml:space="preserve"> presidente </w:t>
+      </w:r>
+      <w:r>
+        <w:rPr>
+          <w:b/>
+          <w:bCs/>
+        </w:rPr>
+        <w:t xml:space="preserve">ritardatario </w:t>
+      </w:r>
+      <w:r>
+        <w:rPr>
+          <w:b/>
+          <w:bCs/>
+        </w:rPr>
+        <w:t>potrà, in autonomia, solo confermare la formazione precedente e giocarsela senza handicap.</w:t>
       </w:r>
     </w:p>
     <w:p/>

</xml_diff>

<commit_message>
feat: update regulation document to 2026-27 version and adjust link in DocumentiPage
</commit_message>
<xml_diff>
--- a/public/docs/Regolamento_erFantacalcio.docx
+++ b/public/docs/Regolamento_erFantacalcio.docx
@@ -1010,7 +1010,145 @@
           <w:b/>
           <w:bCs/>
         </w:rPr>
-        <w:t xml:space="preserve"> La sessione di mercato prevede una finestra temporale (data inizio, data fine) e un numero massimo di proposte di acquisto per ciascuna squadra. Ciascun presidente può effettuare delle proposte di acquisto, in soldi reali o fantamilioni restanti.</w:t>
+        <w:t xml:space="preserve"> La sessione di mercato prevede </w:t>
+      </w:r>
+      <w:r>
+        <w:rPr>
+          <w:b/>
+          <w:bCs/>
+        </w:rPr>
+        <w:t>la scelta di:</w:t>
+      </w:r>
+    </w:p>
+    <w:p>
+      <w:pPr>
+        <w:pStyle w:val="Paragrafoelenco"/>
+        <w:numPr>
+          <w:ilvl w:val="0"/>
+          <w:numId w:val="9"/>
+        </w:numPr>
+        <w:rPr>
+          <w:b/>
+          <w:bCs/>
+        </w:rPr>
+      </w:pPr>
+      <w:r>
+        <w:rPr>
+          <w:b/>
+          <w:bCs/>
+        </w:rPr>
+        <w:t xml:space="preserve">una finestra temporale (data inizio, data fine) </w:t>
+      </w:r>
+    </w:p>
+    <w:p>
+      <w:pPr>
+        <w:pStyle w:val="Paragrafoelenco"/>
+        <w:numPr>
+          <w:ilvl w:val="0"/>
+          <w:numId w:val="9"/>
+        </w:numPr>
+        <w:rPr>
+          <w:b/>
+          <w:bCs/>
+        </w:rPr>
+      </w:pPr>
+      <w:r>
+        <w:rPr>
+          <w:b/>
+          <w:bCs/>
+        </w:rPr>
+        <w:t>soldi reali o fantamilioni</w:t>
+      </w:r>
+    </w:p>
+    <w:p>
+      <w:pPr>
+        <w:pStyle w:val="Paragrafoelenco"/>
+        <w:numPr>
+          <w:ilvl w:val="0"/>
+          <w:numId w:val="9"/>
+        </w:numPr>
+        <w:rPr>
+          <w:b/>
+          <w:bCs/>
+        </w:rPr>
+      </w:pPr>
+      <w:r>
+        <w:rPr>
+          <w:b/>
+          <w:bCs/>
+        </w:rPr>
+        <w:t>un numero massimo di proposte di acquisto per ciascuna squadra</w:t>
+      </w:r>
+    </w:p>
+    <w:p>
+      <w:pPr>
+        <w:pStyle w:val="Paragrafoelenco"/>
+        <w:numPr>
+          <w:ilvl w:val="0"/>
+          <w:numId w:val="9"/>
+        </w:numPr>
+        <w:rPr>
+          <w:b/>
+          <w:bCs/>
+        </w:rPr>
+      </w:pPr>
+      <w:r>
+        <w:rPr>
+          <w:b/>
+          <w:bCs/>
+        </w:rPr>
+        <w:t>un numero massimo di giocatori acquistabili per ciascuna squadra</w:t>
+      </w:r>
+      <w:r>
+        <w:rPr>
+          <w:b/>
+          <w:bCs/>
+        </w:rPr>
+        <w:t xml:space="preserve">. </w:t>
+      </w:r>
+    </w:p>
+    <w:p>
+      <w:pPr>
+        <w:rPr>
+          <w:b/>
+          <w:bCs/>
+        </w:rPr>
+      </w:pPr>
+      <w:r>
+        <w:rPr>
+          <w:b/>
+          <w:bCs/>
+        </w:rPr>
+        <w:lastRenderedPageBreak/>
+        <w:t>Ciascun presidente può effettuare delle proposte di acquisto</w:t>
+      </w:r>
+      <w:r>
+        <w:rPr>
+          <w:b/>
+          <w:bCs/>
+        </w:rPr>
+        <w:t xml:space="preserve"> indicando il costo</w:t>
+      </w:r>
+      <w:r>
+        <w:rPr>
+          <w:b/>
+          <w:bCs/>
+        </w:rPr>
+        <w:t>, in soldi reali o fantamilioni restanti</w:t>
+      </w:r>
+      <w:r>
+        <w:rPr>
+          <w:b/>
+          <w:bCs/>
+        </w:rPr>
+        <w:t xml:space="preserve"> e la priorità</w:t>
+      </w:r>
+      <w:r>
+        <w:rPr>
+          <w:b/>
+          <w:bCs/>
+        </w:rPr>
+        <w:t>.</w:t>
       </w:r>
     </w:p>
     <w:p>
@@ -1040,7 +1178,6 @@
           <w:b/>
           <w:bCs/>
         </w:rPr>
-        <w:lastRenderedPageBreak/>
         <w:t xml:space="preserve">Alla scadenza della sessione di mercato le offerte pervenute saranno visibili da tutti </w:t>
       </w:r>
       <w:r>
@@ -1056,6 +1193,82 @@
           <w:bCs/>
         </w:rPr>
         <w:t>e si procederà all’acquisto dichiarando il giocatore da cedere.</w:t>
+      </w:r>
+    </w:p>
+    <w:p>
+      <w:pPr>
+        <w:rPr>
+          <w:b/>
+          <w:bCs/>
+        </w:rPr>
+      </w:pPr>
+      <w:r>
+        <w:rPr>
+          <w:b/>
+          <w:bCs/>
+        </w:rPr>
+        <w:t>L’aggiudicazione di un giocatore avviene nel seguente modo:</w:t>
+      </w:r>
+    </w:p>
+    <w:p>
+      <w:pPr>
+        <w:pStyle w:val="Paragrafoelenco"/>
+        <w:numPr>
+          <w:ilvl w:val="0"/>
+          <w:numId w:val="9"/>
+        </w:numPr>
+        <w:rPr>
+          <w:b/>
+          <w:bCs/>
+        </w:rPr>
+      </w:pPr>
+      <w:r>
+        <w:rPr>
+          <w:b/>
+          <w:bCs/>
+        </w:rPr>
+        <w:t>regola base: per ogni giocatore vince la squadra che ha offerto il prezzo più alto. A parità di prezzo, vince chi ha inviato la proposta prima</w:t>
+      </w:r>
+    </w:p>
+    <w:p>
+      <w:pPr>
+        <w:pStyle w:val="Paragrafoelenco"/>
+        <w:numPr>
+          <w:ilvl w:val="0"/>
+          <w:numId w:val="9"/>
+        </w:numPr>
+        <w:rPr>
+          <w:b/>
+          <w:bCs/>
+        </w:rPr>
+      </w:pPr>
+      <w:r>
+        <w:rPr>
+          <w:b/>
+          <w:bCs/>
+        </w:rPr>
+        <w:t>Cap acquisti: ogni squadra può aggiudicarsi al massimo gli acquisti effettivi concessi, quindi se un presidente effettua 5 proposte e gli acquisti consentiti sono 2 prende i primi 2 giocatori</w:t>
+      </w:r>
+      <w:r>
+        <w:rPr>
+          <w:b/>
+          <w:bCs/>
+        </w:rPr>
+        <w:t xml:space="preserve"> </w:t>
+      </w:r>
+      <w:r>
+        <w:rPr>
+          <w:b/>
+          <w:bCs/>
+        </w:rPr>
+        <w:t>in ordine di priorità</w:t>
+      </w:r>
+      <w:r>
+        <w:rPr>
+          <w:b/>
+          <w:bCs/>
+        </w:rPr>
+        <w:t>, su cui è il miglior offerente.</w:t>
       </w:r>
     </w:p>
     <w:p>
@@ -1206,7 +1419,6 @@
         <w:pStyle w:val="Titolo2"/>
       </w:pPr>
       <w:r>
-        <w:lastRenderedPageBreak/>
         <w:t xml:space="preserve">Penalità di fine stagione  </w:t>
       </w:r>
     </w:p>
@@ -1688,6 +1900,118 @@
     </w:lvl>
   </w:abstractNum>
   <w:abstractNum w:abstractNumId="4" w15:restartNumberingAfterBreak="0">
+    <w:nsid w:val="42F45ABE"/>
+    <w:multiLevelType w:val="hybridMultilevel"/>
+    <w:tmpl w:val="B6625492"/>
+    <w:lvl w:ilvl="0" w:tplc="3B1608CC">
+      <w:numFmt w:val="bullet"/>
+      <w:lvlText w:val="-"/>
+      <w:lvlJc w:val="left"/>
+      <w:pPr>
+        <w:ind w:left="720" w:hanging="360"/>
+      </w:pPr>
+      <w:rPr>
+        <w:rFonts w:ascii="Calibri" w:eastAsiaTheme="minorHAnsi" w:hAnsi="Calibri" w:cs="Calibri" w:hint="default"/>
+      </w:rPr>
+    </w:lvl>
+    <w:lvl w:ilvl="1" w:tplc="04100003" w:tentative="1">
+      <w:start w:val="1"/>
+      <w:numFmt w:val="bullet"/>
+      <w:lvlText w:val="o"/>
+      <w:lvlJc w:val="left"/>
+      <w:pPr>
+        <w:ind w:left="1440" w:hanging="360"/>
+      </w:pPr>
+      <w:rPr>
+        <w:rFonts w:ascii="Courier New" w:hAnsi="Courier New" w:cs="Courier New" w:hint="default"/>
+      </w:rPr>
+    </w:lvl>
+    <w:lvl w:ilvl="2" w:tplc="04100005" w:tentative="1">
+      <w:start w:val="1"/>
+      <w:numFmt w:val="bullet"/>
+      <w:lvlText w:val=""/>
+      <w:lvlJc w:val="left"/>
+      <w:pPr>
+        <w:ind w:left="2160" w:hanging="360"/>
+      </w:pPr>
+      <w:rPr>
+        <w:rFonts w:ascii="Wingdings" w:hAnsi="Wingdings" w:hint="default"/>
+      </w:rPr>
+    </w:lvl>
+    <w:lvl w:ilvl="3" w:tplc="04100001" w:tentative="1">
+      <w:start w:val="1"/>
+      <w:numFmt w:val="bullet"/>
+      <w:lvlText w:val=""/>
+      <w:lvlJc w:val="left"/>
+      <w:pPr>
+        <w:ind w:left="2880" w:hanging="360"/>
+      </w:pPr>
+      <w:rPr>
+        <w:rFonts w:ascii="Symbol" w:hAnsi="Symbol" w:hint="default"/>
+      </w:rPr>
+    </w:lvl>
+    <w:lvl w:ilvl="4" w:tplc="04100003" w:tentative="1">
+      <w:start w:val="1"/>
+      <w:numFmt w:val="bullet"/>
+      <w:lvlText w:val="o"/>
+      <w:lvlJc w:val="left"/>
+      <w:pPr>
+        <w:ind w:left="3600" w:hanging="360"/>
+      </w:pPr>
+      <w:rPr>
+        <w:rFonts w:ascii="Courier New" w:hAnsi="Courier New" w:cs="Courier New" w:hint="default"/>
+      </w:rPr>
+    </w:lvl>
+    <w:lvl w:ilvl="5" w:tplc="04100005" w:tentative="1">
+      <w:start w:val="1"/>
+      <w:numFmt w:val="bullet"/>
+      <w:lvlText w:val=""/>
+      <w:lvlJc w:val="left"/>
+      <w:pPr>
+        <w:ind w:left="4320" w:hanging="360"/>
+      </w:pPr>
+      <w:rPr>
+        <w:rFonts w:ascii="Wingdings" w:hAnsi="Wingdings" w:hint="default"/>
+      </w:rPr>
+    </w:lvl>
+    <w:lvl w:ilvl="6" w:tplc="04100001" w:tentative="1">
+      <w:start w:val="1"/>
+      <w:numFmt w:val="bullet"/>
+      <w:lvlText w:val=""/>
+      <w:lvlJc w:val="left"/>
+      <w:pPr>
+        <w:ind w:left="5040" w:hanging="360"/>
+      </w:pPr>
+      <w:rPr>
+        <w:rFonts w:ascii="Symbol" w:hAnsi="Symbol" w:hint="default"/>
+      </w:rPr>
+    </w:lvl>
+    <w:lvl w:ilvl="7" w:tplc="04100003" w:tentative="1">
+      <w:start w:val="1"/>
+      <w:numFmt w:val="bullet"/>
+      <w:lvlText w:val="o"/>
+      <w:lvlJc w:val="left"/>
+      <w:pPr>
+        <w:ind w:left="5760" w:hanging="360"/>
+      </w:pPr>
+      <w:rPr>
+        <w:rFonts w:ascii="Courier New" w:hAnsi="Courier New" w:cs="Courier New" w:hint="default"/>
+      </w:rPr>
+    </w:lvl>
+    <w:lvl w:ilvl="8" w:tplc="04100005" w:tentative="1">
+      <w:start w:val="1"/>
+      <w:numFmt w:val="bullet"/>
+      <w:lvlText w:val=""/>
+      <w:lvlJc w:val="left"/>
+      <w:pPr>
+        <w:ind w:left="6480" w:hanging="360"/>
+      </w:pPr>
+      <w:rPr>
+        <w:rFonts w:ascii="Wingdings" w:hAnsi="Wingdings" w:hint="default"/>
+      </w:rPr>
+    </w:lvl>
+  </w:abstractNum>
+  <w:abstractNum w:abstractNumId="5" w15:restartNumberingAfterBreak="0">
     <w:nsid w:val="47181E04"/>
     <w:multiLevelType w:val="hybridMultilevel"/>
     <w:tmpl w:val="6E2CE55C"/>
@@ -1799,7 +2123,7 @@
       </w:rPr>
     </w:lvl>
   </w:abstractNum>
-  <w:abstractNum w:abstractNumId="5" w15:restartNumberingAfterBreak="0">
+  <w:abstractNum w:abstractNumId="6" w15:restartNumberingAfterBreak="0">
     <w:nsid w:val="5E2D33B9"/>
     <w:multiLevelType w:val="hybridMultilevel"/>
     <w:tmpl w:val="14960ACC"/>
@@ -1912,7 +2236,7 @@
       </w:rPr>
     </w:lvl>
   </w:abstractNum>
-  <w:abstractNum w:abstractNumId="6" w15:restartNumberingAfterBreak="0">
+  <w:abstractNum w:abstractNumId="7" w15:restartNumberingAfterBreak="0">
     <w:nsid w:val="700D66D2"/>
     <w:multiLevelType w:val="hybridMultilevel"/>
     <w:tmpl w:val="B3BA5AE8"/>
@@ -2025,7 +2349,7 @@
       </w:rPr>
     </w:lvl>
   </w:abstractNum>
-  <w:abstractNum w:abstractNumId="7" w15:restartNumberingAfterBreak="0">
+  <w:abstractNum w:abstractNumId="8" w15:restartNumberingAfterBreak="0">
     <w:nsid w:val="72353A77"/>
     <w:multiLevelType w:val="hybridMultilevel"/>
     <w:tmpl w:val="57502344"/>
@@ -2139,19 +2463,19 @@
     </w:lvl>
   </w:abstractNum>
   <w:num w:numId="1" w16cid:durableId="1235234935">
-    <w:abstractNumId w:val="7"/>
+    <w:abstractNumId w:val="8"/>
   </w:num>
   <w:num w:numId="2" w16cid:durableId="1808547614">
     <w:abstractNumId w:val="1"/>
   </w:num>
   <w:num w:numId="3" w16cid:durableId="1125194435">
-    <w:abstractNumId w:val="6"/>
+    <w:abstractNumId w:val="7"/>
   </w:num>
   <w:num w:numId="4" w16cid:durableId="998002894">
     <w:abstractNumId w:val="3"/>
   </w:num>
   <w:num w:numId="5" w16cid:durableId="171259058">
-    <w:abstractNumId w:val="5"/>
+    <w:abstractNumId w:val="6"/>
   </w:num>
   <w:num w:numId="6" w16cid:durableId="642078686">
     <w:abstractNumId w:val="2"/>
@@ -2160,6 +2484,9 @@
     <w:abstractNumId w:val="0"/>
   </w:num>
   <w:num w:numId="8" w16cid:durableId="849641207">
+    <w:abstractNumId w:val="5"/>
+  </w:num>
+  <w:num w:numId="9" w16cid:durableId="1176336906">
     <w:abstractNumId w:val="4"/>
   </w:num>
 </w:numbering>

</xml_diff>

<commit_message>
refactor: add new rules for Coppa dei Perdenti and update Champions section for clarity
</commit_message>
<xml_diff>
--- a/public/docs/Regolamento_erFantacalcio.docx
+++ b/public/docs/Regolamento_erFantacalcio.docx
@@ -119,104 +119,951 @@
       </w:r>
     </w:p>
     <w:p>
+      <w:pPr>
+        <w:pStyle w:val="Paragrafoelenco"/>
+        <w:numPr>
+          <w:ilvl w:val="0"/>
+          <w:numId w:val="11"/>
+        </w:numPr>
+      </w:pPr>
       <w:r>
         <w:t>Girone A (passano le prime 2)</w:t>
       </w:r>
     </w:p>
     <w:p>
+      <w:pPr>
+        <w:pStyle w:val="Paragrafoelenco"/>
+        <w:numPr>
+          <w:ilvl w:val="0"/>
+          <w:numId w:val="11"/>
+        </w:numPr>
+      </w:pPr>
       <w:r>
         <w:t>Girone B (passano le prime 2)</w:t>
       </w:r>
     </w:p>
     <w:p>
+      <w:pPr>
+        <w:pStyle w:val="Paragrafoelenco"/>
+        <w:numPr>
+          <w:ilvl w:val="0"/>
+          <w:numId w:val="11"/>
+        </w:numPr>
+      </w:pPr>
       <w:r>
         <w:t>Semifinale di andata (senza gol che vale doppio e senza fattore casalingo)</w:t>
       </w:r>
     </w:p>
     <w:p>
+      <w:pPr>
+        <w:pStyle w:val="Paragrafoelenco"/>
+        <w:numPr>
+          <w:ilvl w:val="0"/>
+          <w:numId w:val="11"/>
+        </w:numPr>
+      </w:pPr>
       <w:r>
         <w:t>Semifinale di ritorno (senza gol che vale doppio e senza fattore casalingo)</w:t>
       </w:r>
     </w:p>
     <w:p>
+      <w:pPr>
+        <w:pStyle w:val="Paragrafoelenco"/>
+        <w:numPr>
+          <w:ilvl w:val="0"/>
+          <w:numId w:val="11"/>
+        </w:numPr>
+      </w:pPr>
       <w:r>
         <w:t>Finalissima unica senza fattore casalingo</w:t>
       </w:r>
     </w:p>
     <w:p>
       <w:r>
-        <w:t xml:space="preserve">Tutte le partite di Champions verranno giocate in contemporanea con una partita di fantacampionato. In caso di parità tra reti fatte e subite verrà assegnato come vincitore la squadra che ha realizzato il maggior numero di </w:t>
+        <w:t>Tutte le partite di Champions verranno giocate in contemporanea con una partita di fantacampionato. In caso di parità tra reti fatte e subite verrà assegnato come vincitore la squadra che ha realizzato il maggior numero di fantapunti nelle partite coinvolte.</w:t>
+      </w:r>
+    </w:p>
+    <w:p>
+      <w:r>
+        <w:t>I gironi dell</w:t>
+      </w:r>
+      <w:r>
+        <w:t xml:space="preserve">a </w:t>
+      </w:r>
+      <w:r>
+        <w:t>C</w:t>
+      </w:r>
+      <w:r>
+        <w:t>hampions si giocher</w:t>
+      </w:r>
+      <w:r>
+        <w:t>anno</w:t>
+      </w:r>
+      <w:r>
+        <w:t xml:space="preserve"> nelle seguenti giornate di serie A: 7,</w:t>
+      </w:r>
+      <w:r>
+        <w:t xml:space="preserve"> </w:t>
+      </w:r>
+      <w:r>
+        <w:t xml:space="preserve">10, </w:t>
+      </w:r>
+      <w:r>
+        <w:t xml:space="preserve">13, 16, 19, 22, </w:t>
+      </w:r>
+    </w:p>
+    <w:p>
+      <w:r>
+        <w:t>Le fasi finali della Champions si giocheranno nelle seguenti giornate di serie A: 28, 32, 36</w:t>
+      </w:r>
+    </w:p>
+    <w:p>
+      <w:pPr>
+        <w:rPr>
+          <w:b/>
+          <w:bCs/>
+        </w:rPr>
+      </w:pPr>
+      <w:r>
+        <w:rPr>
+          <w:b/>
+          <w:bCs/>
+        </w:rPr>
+        <w:t xml:space="preserve">Per le fasi finali </w:t>
+      </w:r>
+      <w:r>
+        <w:rPr>
+          <w:b/>
+          <w:bCs/>
+        </w:rPr>
+        <w:t xml:space="preserve">della Champions </w:t>
+      </w:r>
+      <w:r>
+        <w:rPr>
+          <w:b/>
+          <w:bCs/>
+        </w:rPr>
+        <w:t>in caso non venga consegnata la formazione non vengono previste multe, la partita si giocherà regolarmente inserendo la formazione precedentemente rilasciata.</w:t>
+      </w:r>
+    </w:p>
+    <w:p/>
+    <w:p>
+      <w:pPr>
+        <w:pStyle w:val="Titolo4"/>
+      </w:pPr>
+      <w:r>
+        <w:t>Coppa dei perdenti</w:t>
+      </w:r>
+    </w:p>
+    <w:p>
+      <w:pPr>
+        <w:rPr>
+          <w:b/>
+          <w:bCs/>
+        </w:rPr>
+      </w:pPr>
+      <w:r>
+        <w:rPr>
+          <w:b/>
+          <w:bCs/>
+        </w:rPr>
+        <w:t>Da quest’anno per aumentare l’interesse per il fantacalcio anche per le squadre inferiori si propone la Coppa dei Perdenti.</w:t>
+      </w:r>
+    </w:p>
+    <w:p>
+      <w:pPr>
+        <w:rPr>
+          <w:b/>
+          <w:bCs/>
+        </w:rPr>
+      </w:pPr>
+      <w:r>
+        <w:rPr>
+          <w:b/>
+          <w:bCs/>
+        </w:rPr>
+        <w:t>La Coppa prevede le seguenti partite:</w:t>
+      </w:r>
+    </w:p>
+    <w:p>
+      <w:pPr>
+        <w:pStyle w:val="Paragrafoelenco"/>
+        <w:numPr>
+          <w:ilvl w:val="0"/>
+          <w:numId w:val="10"/>
+        </w:numPr>
+        <w:rPr>
+          <w:b/>
+          <w:bCs/>
+        </w:rPr>
+      </w:pPr>
+      <w:r>
+        <w:rPr>
+          <w:b/>
+          <w:bCs/>
+        </w:rPr>
+        <w:t>Semifinale di andata (senza gol che vale doppio e senza fattore casalingo)</w:t>
+      </w:r>
+    </w:p>
+    <w:p>
+      <w:pPr>
+        <w:pStyle w:val="Paragrafoelenco"/>
+        <w:numPr>
+          <w:ilvl w:val="0"/>
+          <w:numId w:val="10"/>
+        </w:numPr>
+        <w:rPr>
+          <w:b/>
+          <w:bCs/>
+        </w:rPr>
+      </w:pPr>
+      <w:r>
+        <w:rPr>
+          <w:b/>
+          <w:bCs/>
+        </w:rPr>
+        <w:t>Semifinale di ritorno (senza gol che vale doppio e senza fattore casalingo)</w:t>
+      </w:r>
+    </w:p>
+    <w:p>
+      <w:pPr>
+        <w:pStyle w:val="Paragrafoelenco"/>
+        <w:numPr>
+          <w:ilvl w:val="0"/>
+          <w:numId w:val="10"/>
+        </w:numPr>
+        <w:rPr>
+          <w:b/>
+          <w:bCs/>
+        </w:rPr>
+      </w:pPr>
+      <w:r>
+        <w:rPr>
+          <w:b/>
+          <w:bCs/>
+        </w:rPr>
+        <w:t>Finalissima unica senza fattore casalingo</w:t>
+      </w:r>
+    </w:p>
+    <w:p>
+      <w:pPr>
+        <w:rPr>
+          <w:b/>
+          <w:bCs/>
+        </w:rPr>
+      </w:pPr>
+      <w:r>
+        <w:rPr>
+          <w:b/>
+          <w:bCs/>
+        </w:rPr>
+        <w:t>Gli accoppiamenti saranno definiti subito dopo il termine dell’ultima partita dei gironi di Champions, accederanno alle semifinali le squadre eliminate dalla Champions.</w:t>
+      </w:r>
+    </w:p>
+    <w:p>
+      <w:pPr>
+        <w:rPr>
+          <w:b/>
+          <w:bCs/>
+        </w:rPr>
+      </w:pPr>
+      <w:r>
+        <w:rPr>
+          <w:b/>
+          <w:bCs/>
+        </w:rPr>
+        <w:t>Si scontreranno in semifinale la 3 del girone A vs 4 girone B e la 3 del girone B vs la 4 del girone A</w:t>
+      </w:r>
+    </w:p>
+    <w:p>
+      <w:pPr>
+        <w:rPr>
+          <w:b/>
+          <w:bCs/>
+        </w:rPr>
+      </w:pPr>
+      <w:r>
+        <w:rPr>
+          <w:b/>
+          <w:bCs/>
+        </w:rPr>
+        <w:lastRenderedPageBreak/>
+        <w:t>Che premi prevede la Coppa dei perdenti? L’azzeramento della quota annuale del fantacalcio.</w:t>
+      </w:r>
+    </w:p>
+    <w:p>
+      <w:pPr>
+        <w:rPr>
+          <w:b/>
+          <w:bCs/>
+        </w:rPr>
+      </w:pPr>
+      <w:r>
+        <w:rPr>
+          <w:b/>
+          <w:bCs/>
+        </w:rPr>
+        <w:t>Il vincitore della doppia semifinale regala al perdente metà della quota annuale (esempio: 120€ di quota annuale, la metà 60€ va al perdente della semifinale che a fine anno dovrà pagare 120+60=180€.</w:t>
+      </w:r>
+    </w:p>
+    <w:p>
+      <w:pPr>
+        <w:rPr>
+          <w:b/>
+          <w:bCs/>
+        </w:rPr>
+      </w:pPr>
+      <w:r>
+        <w:rPr>
+          <w:b/>
+          <w:bCs/>
+        </w:rPr>
+        <w:t>In finale si gioca All-in: la vincente regala i 60€ restanti al perdente e quindi la situazione sarà la seguente:</w:t>
+      </w:r>
+    </w:p>
+    <w:p>
+      <w:pPr>
+        <w:pStyle w:val="Paragrafoelenco"/>
+        <w:numPr>
+          <w:ilvl w:val="0"/>
+          <w:numId w:val="10"/>
+        </w:numPr>
+        <w:rPr>
+          <w:b/>
+          <w:bCs/>
+        </w:rPr>
+      </w:pPr>
+      <w:r>
+        <w:rPr>
+          <w:b/>
+          <w:bCs/>
+        </w:rPr>
+        <w:t>Vincitore: 0€</w:t>
+      </w:r>
+    </w:p>
+    <w:p>
+      <w:pPr>
+        <w:pStyle w:val="Paragrafoelenco"/>
+        <w:numPr>
+          <w:ilvl w:val="0"/>
+          <w:numId w:val="10"/>
+        </w:numPr>
+        <w:rPr>
+          <w:b/>
+          <w:bCs/>
+        </w:rPr>
+      </w:pPr>
+      <w:r>
+        <w:rPr>
+          <w:b/>
+          <w:bCs/>
+        </w:rPr>
+        <w:t>Perdente finale: 120€</w:t>
+      </w:r>
+    </w:p>
+    <w:p>
+      <w:pPr>
+        <w:pStyle w:val="Paragrafoelenco"/>
+        <w:numPr>
+          <w:ilvl w:val="0"/>
+          <w:numId w:val="10"/>
+        </w:numPr>
+        <w:rPr>
+          <w:b/>
+          <w:bCs/>
+        </w:rPr>
+      </w:pPr>
+      <w:r>
+        <w:rPr>
+          <w:b/>
+          <w:bCs/>
+        </w:rPr>
+        <w:t>Perdenti semifinali: 180€</w:t>
+      </w:r>
+    </w:p>
+    <w:p>
+      <w:r>
+        <w:rPr>
+          <w:b/>
+          <w:bCs/>
+        </w:rPr>
+        <w:t>Le spese di mercato e le multe non vengono conteggiate nella suddivisione suddetta</w:t>
+      </w:r>
+    </w:p>
+    <w:p/>
+    <w:p>
+      <w:pPr>
+        <w:pStyle w:val="Titolo2"/>
+      </w:pPr>
+      <w:r>
+        <w:t xml:space="preserve">Rose  </w:t>
+      </w:r>
+    </w:p>
+    <w:p>
+      <w:r>
+        <w:t>Il numero dei giocatori per ciascuna rosa è fisso:</w:t>
+      </w:r>
+      <w:r>
+        <w:t xml:space="preserve"> </w:t>
+      </w:r>
+      <w:r>
+        <w:t>3 Portieri</w:t>
+      </w:r>
+      <w:r>
+        <w:t xml:space="preserve">, </w:t>
+      </w:r>
+      <w:r>
+        <w:t>8 Difensori</w:t>
+      </w:r>
+      <w:r>
+        <w:t xml:space="preserve">, </w:t>
+      </w:r>
+      <w:r>
+        <w:t>8 centrocampisti</w:t>
+      </w:r>
+      <w:r>
+        <w:t xml:space="preserve">, </w:t>
+      </w:r>
+      <w:r>
+        <w:t>6 attaccanti</w:t>
+      </w:r>
+    </w:p>
+    <w:p>
+      <w:r>
+        <w:t>In caso di infortunio o morte di un giocatore, questo non potrà essere sostituito fino alla prossima sessione di mercato. Nel caso non sia prevista un’ulteriore sessione di mercato la squadra rimarrà con un giocatore in meno.</w:t>
+      </w:r>
+    </w:p>
+    <w:p/>
+    <w:p/>
+    <w:p>
+      <w:pPr>
+        <w:pStyle w:val="Titolo2"/>
+      </w:pPr>
+      <w:r>
+        <w:t xml:space="preserve">Acquisto portieri  </w:t>
+      </w:r>
+    </w:p>
+    <w:p>
+      <w:r>
+        <w:t>I portieri sono trattati come qualsiasi altro ruolo. Quindi non va più dichiarato se un portiere è primario o secondario. Il presidente dovrà acquistare 3 portieri e avrà a disposizione solo quei 3 in rosa.</w:t>
+      </w:r>
+    </w:p>
+    <w:p/>
+    <w:p/>
+    <w:p/>
+    <w:p>
+      <w:pPr>
+        <w:pStyle w:val="Titolo2"/>
+      </w:pPr>
+      <w:r>
+        <w:t xml:space="preserve">Schieramento formazione  </w:t>
+      </w:r>
+    </w:p>
+    <w:p>
+      <w:r>
+        <w:t>La formazione va schierata secondo quanto segue:</w:t>
+      </w:r>
+      <w:r>
+        <w:t xml:space="preserve"> </w:t>
+      </w:r>
+    </w:p>
+    <w:p>
+      <w:proofErr w:type="gramStart"/>
+      <w:r>
+        <w:t>11</w:t>
+      </w:r>
+      <w:proofErr w:type="gramEnd"/>
+      <w:r>
+        <w:t xml:space="preserve"> titolari</w:t>
+      </w:r>
+    </w:p>
+    <w:p>
+      <w:r>
+        <w:t>Tutti i giocatori rimanenti vanno schierati in panchina</w:t>
+      </w:r>
+    </w:p>
+    <w:p/>
+    <w:p/>
+    <w:p>
+      <w:pPr>
+        <w:pStyle w:val="Titolo2"/>
+      </w:pPr>
+      <w:r>
+        <w:t xml:space="preserve">Voti  </w:t>
+      </w:r>
+    </w:p>
+    <w:p>
+      <w:r>
+        <w:t xml:space="preserve">I voti verranno presi dal sito PianetaFantacalcio.it; sul sito vengono riportati tutti i voti di tutte le principali testate giornalistiche sportive: Corriere dello sport e Gazzetta. Il conteggio di ciascun giocatore verrà fatto usando la media dei 2 giornali con precisione al </w:t>
+      </w:r>
+      <w:proofErr w:type="gramStart"/>
+      <w:r>
+        <w:t>2°</w:t>
+      </w:r>
+      <w:proofErr w:type="gramEnd"/>
+      <w:r>
+        <w:t xml:space="preserve"> numero decimale. </w:t>
+      </w:r>
+      <w:proofErr w:type="gramStart"/>
+      <w:r>
+        <w:t>E’</w:t>
+      </w:r>
+      <w:proofErr w:type="gramEnd"/>
+      <w:r>
+        <w:t xml:space="preserve"> importante ricordare che la media viene fatta solo sui voti presenti per un calciatore; </w:t>
+      </w:r>
+      <w:proofErr w:type="gramStart"/>
+      <w:r>
+        <w:t>ad esempio</w:t>
+      </w:r>
+      <w:proofErr w:type="gramEnd"/>
+      <w:r>
+        <w:t xml:space="preserve"> se Totti prende 6 sul corriere, </w:t>
       </w:r>
       <w:proofErr w:type="spellStart"/>
       <w:r>
-        <w:t>fantapunti</w:t>
+        <w:t>s.v</w:t>
       </w:r>
       <w:proofErr w:type="spellEnd"/>
       <w:r>
-        <w:t xml:space="preserve"> nelle partite coinvolte.</w:t>
-      </w:r>
-    </w:p>
-    <w:p>
-      <w:r>
-        <w:t>I gironi dell</w:t>
-      </w:r>
-      <w:r>
-        <w:t xml:space="preserve">a </w:t>
-      </w:r>
-      <w:r>
-        <w:t>C</w:t>
-      </w:r>
-      <w:r>
-        <w:t>hampions si giocher</w:t>
-      </w:r>
-      <w:r>
-        <w:t>anno</w:t>
-      </w:r>
-      <w:r>
-        <w:t xml:space="preserve"> nelle seguenti giornate di serie A: 7,</w:t>
+        <w:t xml:space="preserve"> sulla gazzetta, il voto finale sarà 6. </w:t>
+      </w:r>
+      <w:proofErr w:type="gramStart"/>
+      <w:r>
+        <w:t>Inoltre</w:t>
+      </w:r>
+      <w:proofErr w:type="gramEnd"/>
+      <w:r>
+        <w:t xml:space="preserve"> se un giornale assegna un gol a un giocatore, mentre un altro giornale non assegna il gol ma dà l’autogol al difensore, verrà presa in considerazione esclusivamente la decisione che prenderà pianetafantacalcio.it Gli assist vengono presi esclusivamente dal Corriere dello Sport.</w:t>
+      </w:r>
+    </w:p>
+    <w:p/>
+    <w:p/>
+    <w:p/>
+    <w:p>
+      <w:pPr>
+        <w:pStyle w:val="Titolo2"/>
+      </w:pPr>
+      <w:r>
+        <w:t xml:space="preserve">Sostituzioni della partita  </w:t>
+      </w:r>
+    </w:p>
+    <w:p>
+      <w:r>
+        <w:t xml:space="preserve">Il numero massimo delle sostituzioni è fissato a </w:t>
+      </w:r>
+      <w:proofErr w:type="gramStart"/>
+      <w:r>
+        <w:t>6</w:t>
+      </w:r>
+      <w:proofErr w:type="gramEnd"/>
+      <w:r>
+        <w:t xml:space="preserve"> giocatori. Le sostituzioni seguono come sempre l’ordine del primo schierato per ciascun ruolo, secondariamente viene preso in considerazione il miglior voto (es.: non mi giocano 2 </w:t>
+      </w:r>
+      <w:proofErr w:type="spellStart"/>
+      <w:r>
+        <w:t>Dif</w:t>
+      </w:r>
+      <w:proofErr w:type="spellEnd"/>
+      <w:r>
+        <w:t xml:space="preserve">, 2 Cen, 2 </w:t>
+      </w:r>
+      <w:proofErr w:type="spellStart"/>
+      <w:r>
+        <w:t>Att</w:t>
+      </w:r>
+      <w:proofErr w:type="spellEnd"/>
+      <w:r>
+        <w:t xml:space="preserve">, tra le riserve mi entrerà la prima scelta del </w:t>
+      </w:r>
+      <w:proofErr w:type="spellStart"/>
+      <w:r>
+        <w:t>Dif</w:t>
+      </w:r>
+      <w:proofErr w:type="spellEnd"/>
+      <w:r>
+        <w:t>, del Cen, dell’</w:t>
+      </w:r>
+      <w:proofErr w:type="spellStart"/>
+      <w:r>
+        <w:t>Att</w:t>
+      </w:r>
+      <w:proofErr w:type="spellEnd"/>
+      <w:r>
+        <w:t xml:space="preserve">; come quarta riserva mi entrerà il migliore tra le seconde scelte). In caso non vi sia alcun sostituto il giocatore senza voto prende in automatico </w:t>
+      </w:r>
+      <w:proofErr w:type="gramStart"/>
+      <w:r>
+        <w:t>3</w:t>
+      </w:r>
+      <w:proofErr w:type="gramEnd"/>
+      <w:r>
+        <w:t xml:space="preserve"> come voto.</w:t>
+      </w:r>
+    </w:p>
+    <w:p/>
+    <w:p/>
+    <w:p/>
+    <w:p>
+      <w:pPr>
+        <w:pStyle w:val="Titolo2"/>
+      </w:pPr>
+      <w:r>
+        <w:t xml:space="preserve">Bonus / Malus  </w:t>
+      </w:r>
+    </w:p>
+    <w:p>
+      <w:pPr>
+        <w:pStyle w:val="Paragrafoelenco"/>
+        <w:numPr>
+          <w:ilvl w:val="0"/>
+          <w:numId w:val="5"/>
+        </w:numPr>
+      </w:pPr>
+      <w:r>
+        <w:t xml:space="preserve">Fattore casalingo: </w:t>
+      </w:r>
+      <w:r>
+        <w:t>+2</w:t>
+      </w:r>
+    </w:p>
+    <w:p>
+      <w:pPr>
+        <w:pStyle w:val="Paragrafoelenco"/>
+        <w:numPr>
+          <w:ilvl w:val="0"/>
+          <w:numId w:val="5"/>
+        </w:numPr>
+      </w:pPr>
+      <w:r>
+        <w:t>Gol fatto: +3</w:t>
+      </w:r>
+    </w:p>
+    <w:p>
+      <w:pPr>
+        <w:pStyle w:val="Paragrafoelenco"/>
+        <w:numPr>
+          <w:ilvl w:val="0"/>
+          <w:numId w:val="5"/>
+        </w:numPr>
+      </w:pPr>
+      <w:r>
+        <w:t>Assist: +1</w:t>
+      </w:r>
+    </w:p>
+    <w:p>
+      <w:pPr>
+        <w:pStyle w:val="Paragrafoelenco"/>
+        <w:numPr>
+          <w:ilvl w:val="0"/>
+          <w:numId w:val="5"/>
+        </w:numPr>
+      </w:pPr>
+      <w:r>
+        <w:t>Gol subito: -1</w:t>
+      </w:r>
+    </w:p>
+    <w:p>
+      <w:pPr>
+        <w:pStyle w:val="Paragrafoelenco"/>
+        <w:numPr>
+          <w:ilvl w:val="0"/>
+          <w:numId w:val="5"/>
+        </w:numPr>
+      </w:pPr>
+      <w:r>
+        <w:t>Rigore sbagliato: -3</w:t>
+      </w:r>
+    </w:p>
+    <w:p>
+      <w:pPr>
+        <w:pStyle w:val="Paragrafoelenco"/>
+        <w:numPr>
+          <w:ilvl w:val="0"/>
+          <w:numId w:val="5"/>
+        </w:numPr>
+      </w:pPr>
+      <w:r>
+        <w:t>Rigore parato: +3</w:t>
+      </w:r>
+    </w:p>
+    <w:p>
+      <w:pPr>
+        <w:pStyle w:val="Paragrafoelenco"/>
+        <w:numPr>
+          <w:ilvl w:val="0"/>
+          <w:numId w:val="5"/>
+        </w:numPr>
+      </w:pPr>
+      <w:r>
+        <w:t>Ammonizione: -0,5</w:t>
+      </w:r>
+    </w:p>
+    <w:p>
+      <w:pPr>
+        <w:pStyle w:val="Paragrafoelenco"/>
+        <w:numPr>
+          <w:ilvl w:val="0"/>
+          <w:numId w:val="5"/>
+        </w:numPr>
+      </w:pPr>
+      <w:r>
+        <w:t>Espulsione: -1</w:t>
+      </w:r>
+    </w:p>
+    <w:p>
+      <w:pPr>
+        <w:pStyle w:val="Paragrafoelenco"/>
+        <w:numPr>
+          <w:ilvl w:val="0"/>
+          <w:numId w:val="5"/>
+        </w:numPr>
+      </w:pPr>
+      <w:r>
+        <w:t>Autogol: -2</w:t>
+      </w:r>
+    </w:p>
+    <w:p>
+      <w:pPr>
+        <w:pStyle w:val="Paragrafoelenco"/>
+        <w:numPr>
+          <w:ilvl w:val="0"/>
+          <w:numId w:val="5"/>
+        </w:numPr>
+      </w:pPr>
+      <w:r>
+        <w:t xml:space="preserve">Portiere S.V.: </w:t>
+      </w:r>
+      <w:r>
+        <w:t>3</w:t>
+      </w:r>
+    </w:p>
+    <w:p>
+      <w:pPr>
+        <w:pStyle w:val="Paragrafoelenco"/>
+        <w:numPr>
+          <w:ilvl w:val="0"/>
+          <w:numId w:val="5"/>
+        </w:numPr>
+      </w:pPr>
+      <w:r>
+        <w:t xml:space="preserve">Giocatore S.V.: </w:t>
+      </w:r>
+      <w:r>
+        <w:t>3</w:t>
+      </w:r>
+    </w:p>
+    <w:p/>
+    <w:p>
+      <w:pPr>
+        <w:pStyle w:val="Titolo2"/>
+      </w:pPr>
+      <w:r>
+        <w:t xml:space="preserve">Calcolo dei gol  </w:t>
+      </w:r>
+    </w:p>
+    <w:p>
+      <w:pPr>
+        <w:pStyle w:val="Paragrafoelenco"/>
+        <w:numPr>
+          <w:ilvl w:val="0"/>
+          <w:numId w:val="2"/>
+        </w:numPr>
+      </w:pPr>
+      <w:r>
+        <w:t>Punteggio 66: 1</w:t>
+      </w:r>
+    </w:p>
+    <w:p>
+      <w:pPr>
+        <w:pStyle w:val="Paragrafoelenco"/>
+        <w:numPr>
+          <w:ilvl w:val="0"/>
+          <w:numId w:val="2"/>
+        </w:numPr>
+      </w:pPr>
+      <w:r>
+        <w:t>Punteggio 72: 2</w:t>
+      </w:r>
+    </w:p>
+    <w:p>
+      <w:pPr>
+        <w:pStyle w:val="Paragrafoelenco"/>
+        <w:numPr>
+          <w:ilvl w:val="0"/>
+          <w:numId w:val="2"/>
+        </w:numPr>
+      </w:pPr>
+      <w:r>
+        <w:t>Punteggio 78: 3</w:t>
+      </w:r>
+    </w:p>
+    <w:p>
+      <w:pPr>
+        <w:pStyle w:val="Paragrafoelenco"/>
+        <w:numPr>
+          <w:ilvl w:val="0"/>
+          <w:numId w:val="2"/>
+        </w:numPr>
+      </w:pPr>
+      <w:r>
+        <w:t>Punteggio 82: 4</w:t>
+      </w:r>
+    </w:p>
+    <w:p>
+      <w:pPr>
+        <w:pStyle w:val="Paragrafoelenco"/>
+        <w:numPr>
+          <w:ilvl w:val="0"/>
+          <w:numId w:val="2"/>
+        </w:numPr>
+      </w:pPr>
+      <w:r>
+        <w:t>Punteggio 86: 5</w:t>
+      </w:r>
+    </w:p>
+    <w:p>
+      <w:pPr>
+        <w:pStyle w:val="Paragrafoelenco"/>
+        <w:numPr>
+          <w:ilvl w:val="0"/>
+          <w:numId w:val="2"/>
+        </w:numPr>
+      </w:pPr>
+      <w:r>
+        <w:t>Punteggio 90: 6</w:t>
+      </w:r>
+    </w:p>
+    <w:p>
+      <w:pPr>
+        <w:pStyle w:val="Paragrafoelenco"/>
+        <w:numPr>
+          <w:ilvl w:val="0"/>
+          <w:numId w:val="2"/>
+        </w:numPr>
+      </w:pPr>
+      <w:r>
+        <w:t>Punteggio 94: 7</w:t>
+      </w:r>
+    </w:p>
+    <w:p/>
+    <w:p/>
+    <w:p>
+      <w:pPr>
+        <w:pStyle w:val="Titolo2"/>
+      </w:pPr>
+      <w:r>
+        <w:t xml:space="preserve">In caso di parità punti  </w:t>
+      </w:r>
+    </w:p>
+    <w:p>
+      <w:r>
+        <w:t>A fine campionato o nei gironi della Champions League in caso di squadre a pari punti che lottano per una posizione che determina una vincita (o una penalità), si procederà seguendo nell'ordine i vari criteri:</w:t>
+      </w:r>
+    </w:p>
+    <w:p/>
+    <w:p>
+      <w:pPr>
+        <w:pStyle w:val="Paragrafoelenco"/>
+        <w:numPr>
+          <w:ilvl w:val="0"/>
+          <w:numId w:val="1"/>
+        </w:numPr>
+      </w:pPr>
+      <w:r>
+        <w:t>Gol Fatti</w:t>
+      </w:r>
+    </w:p>
+    <w:p>
+      <w:pPr>
+        <w:pStyle w:val="Paragrafoelenco"/>
+        <w:numPr>
+          <w:ilvl w:val="0"/>
+          <w:numId w:val="1"/>
+        </w:numPr>
+      </w:pPr>
+      <w:r>
+        <w:lastRenderedPageBreak/>
+        <w:t>Differenza reti</w:t>
+      </w:r>
+    </w:p>
+    <w:p>
+      <w:pPr>
+        <w:pStyle w:val="Paragrafoelenco"/>
+        <w:numPr>
+          <w:ilvl w:val="0"/>
+          <w:numId w:val="1"/>
+        </w:numPr>
+      </w:pPr>
+      <w:r>
+        <w:t>Scontri diretti (solo nel torneo chiamato in causa)</w:t>
+      </w:r>
+    </w:p>
+    <w:p>
+      <w:pPr>
+        <w:pStyle w:val="Paragrafoelenco"/>
+        <w:numPr>
+          <w:ilvl w:val="0"/>
+          <w:numId w:val="1"/>
+        </w:numPr>
+      </w:pPr>
+      <w:r>
+        <w:t>Gol subiti</w:t>
+      </w:r>
+    </w:p>
+    <w:p>
+      <w:r>
+        <w:t xml:space="preserve">Per le partite eliminatorie come la semifinale o la finale di </w:t>
+      </w:r>
+      <w:proofErr w:type="spellStart"/>
+      <w:r>
+        <w:t>champions</w:t>
+      </w:r>
+      <w:proofErr w:type="spellEnd"/>
+      <w:r>
+        <w:t xml:space="preserve"> in caso di partita che finisce in parità vincerà la squadra che ha realizzato il miglior </w:t>
+      </w:r>
+      <w:proofErr w:type="spellStart"/>
+      <w:r>
+        <w:t>fantapunteggio</w:t>
+      </w:r>
+      <w:proofErr w:type="spellEnd"/>
+      <w:r>
+        <w:t xml:space="preserve">. Per la semifinale si calcolerà il </w:t>
+      </w:r>
+      <w:proofErr w:type="spellStart"/>
+      <w:r>
+        <w:t>fanta</w:t>
+      </w:r>
+      <w:proofErr w:type="spellEnd"/>
+      <w:r>
+        <w:t xml:space="preserve"> punteggio dell’andata più quello del ritorno.</w:t>
       </w:r>
       <w:r>
         <w:t xml:space="preserve"> </w:t>
       </w:r>
       <w:r>
-        <w:t xml:space="preserve">10, </w:t>
-      </w:r>
-      <w:r>
-        <w:t xml:space="preserve">13, 16, 19, 22, </w:t>
-      </w:r>
-    </w:p>
-    <w:p>
-      <w:r>
-        <w:t>Le fasi finali della Champions si giocheranno nelle seguenti giornate di serie A: 28, 32, 36</w:t>
-      </w:r>
-    </w:p>
-    <w:p>
-      <w:pPr>
-        <w:rPr>
-          <w:b/>
-          <w:bCs/>
-        </w:rPr>
-      </w:pPr>
-      <w:r>
-        <w:rPr>
-          <w:b/>
-          <w:bCs/>
-        </w:rPr>
-        <w:t xml:space="preserve">Per le fasi finali </w:t>
-      </w:r>
-      <w:r>
-        <w:rPr>
-          <w:b/>
-          <w:bCs/>
-        </w:rPr>
-        <w:t xml:space="preserve">della Champions </w:t>
-      </w:r>
-      <w:r>
-        <w:rPr>
-          <w:b/>
-          <w:bCs/>
-        </w:rPr>
-        <w:t>in caso non venga consegnata la formazione non vengono previste multe, la partita si giocherà regolarmente inserendo la formazione precedentemente rilasciata.</w:t>
+        <w:rPr>
+          <w:b/>
+          <w:bCs/>
+        </w:rPr>
+        <w:t xml:space="preserve">In caso di parità al </w:t>
+      </w:r>
+      <w:proofErr w:type="spellStart"/>
+      <w:r>
+        <w:rPr>
+          <w:b/>
+          <w:bCs/>
+        </w:rPr>
+        <w:t>fantapunteggio</w:t>
+      </w:r>
+      <w:proofErr w:type="spellEnd"/>
+      <w:r>
+        <w:rPr>
+          <w:b/>
+          <w:bCs/>
+        </w:rPr>
+        <w:t xml:space="preserve"> vincerà la squadra meglio piazzata in campionato (al momento della disputa) </w:t>
       </w:r>
     </w:p>
     <w:p/>
@@ -226,57 +1073,146 @@
         <w:pStyle w:val="Titolo2"/>
       </w:pPr>
       <w:r>
-        <w:t xml:space="preserve">Rose  </w:t>
-      </w:r>
-    </w:p>
-    <w:p>
-      <w:r>
-        <w:t>Il numero dei giocatori per ciascuna rosa è fisso:</w:t>
-      </w:r>
-      <w:r>
-        <w:t xml:space="preserve"> </w:t>
-      </w:r>
-      <w:r>
-        <w:t>3 Portieri</w:t>
-      </w:r>
-      <w:r>
-        <w:t xml:space="preserve">, </w:t>
-      </w:r>
-      <w:r>
-        <w:t>8 Difensori</w:t>
-      </w:r>
-      <w:r>
-        <w:t xml:space="preserve">, </w:t>
-      </w:r>
-      <w:r>
-        <w:t>8 centrocampisti</w:t>
-      </w:r>
-      <w:r>
-        <w:t xml:space="preserve">, </w:t>
-      </w:r>
-      <w:r>
-        <w:t>6 attaccanti</w:t>
-      </w:r>
-    </w:p>
-    <w:p>
-      <w:r>
-        <w:t>In caso di infortunio o morte di un giocatore, questo non potrà essere sostituito fino alla prossima sessione di mercato. Nel caso non sia prevista un’ulteriore sessione di mercato la squadra rimarrà con un giocatore in meno.</w:t>
-      </w:r>
-    </w:p>
-    <w:p/>
+        <w:t xml:space="preserve">Comunicazione formazione e multe  </w:t>
+      </w:r>
+    </w:p>
+    <w:p>
+      <w:r>
+        <w:t>La formazione va rilasciata sempre prima dell’inizio del primo anticipo di giornata. La formazione va inserita sempre sul sito tramite l’apposita funzionalità. In casi estremi la formazione può comunque essere comunicata in uno dei seguenti modi:</w:t>
+      </w:r>
+    </w:p>
+    <w:p>
+      <w:pPr>
+        <w:pStyle w:val="Paragrafoelenco"/>
+        <w:numPr>
+          <w:ilvl w:val="0"/>
+          <w:numId w:val="6"/>
+        </w:numPr>
+      </w:pPr>
+      <w:r>
+        <w:t xml:space="preserve">Tramite WhatsApp! Sul gruppo </w:t>
+      </w:r>
+      <w:proofErr w:type="spellStart"/>
+      <w:r>
+        <w:t>erFantacalcio</w:t>
+      </w:r>
+      <w:proofErr w:type="spellEnd"/>
+    </w:p>
+    <w:p>
+      <w:pPr>
+        <w:pStyle w:val="Paragrafoelenco"/>
+        <w:numPr>
+          <w:ilvl w:val="0"/>
+          <w:numId w:val="6"/>
+        </w:numPr>
+      </w:pPr>
+      <w:r>
+        <w:t>Inviando una mail o un sms al presidente nei tempi stabiliti</w:t>
+      </w:r>
+    </w:p>
+    <w:p>
+      <w:r>
+        <w:t>Nel caso una squadra non vengano rispettate le norme sopra stabilite, la squadra giocherà con la formazione della precedente giornata con l'handicap di prendere 0 punti indistintamente dal risultato maturato; in più pagherà una multa di 10 euro che arricchirà il montepremi del torneo generale.</w:t>
+      </w:r>
+    </w:p>
+    <w:p>
+      <w:pPr>
+        <w:rPr>
+          <w:b/>
+          <w:bCs/>
+        </w:rPr>
+      </w:pPr>
+      <w:r>
+        <w:rPr>
+          <w:b/>
+          <w:bCs/>
+        </w:rPr>
+        <w:t>Si propone l’abolizione delle multe</w:t>
+      </w:r>
+      <w:r>
+        <w:rPr>
+          <w:b/>
+          <w:bCs/>
+        </w:rPr>
+        <w:t xml:space="preserve">: </w:t>
+      </w:r>
+      <w:r>
+        <w:rPr>
+          <w:b/>
+          <w:bCs/>
+        </w:rPr>
+        <w:t>ciascun</w:t>
+      </w:r>
+      <w:r>
+        <w:rPr>
+          <w:b/>
+          <w:bCs/>
+        </w:rPr>
+        <w:t xml:space="preserve"> presidente </w:t>
+      </w:r>
+      <w:r>
+        <w:rPr>
+          <w:b/>
+          <w:bCs/>
+        </w:rPr>
+        <w:t xml:space="preserve">ritardatario </w:t>
+      </w:r>
+      <w:r>
+        <w:rPr>
+          <w:b/>
+          <w:bCs/>
+        </w:rPr>
+        <w:t>potrà, in autonomia, solo confermare la formazione precedente e giocarsela senza handicap.</w:t>
+      </w:r>
+    </w:p>
     <w:p/>
     <w:p>
       <w:pPr>
         <w:pStyle w:val="Titolo2"/>
       </w:pPr>
       <w:r>
+        <w:t xml:space="preserve">Recuperi partite rinviate  </w:t>
+      </w:r>
+    </w:p>
+    <w:p>
+      <w:r>
+        <w:t xml:space="preserve">In caso di partite rinviate in serie A, si aspetterà il recupero della stessa per procedere all’aggiornamento dei voti del fantacalcio. </w:t>
+      </w:r>
+      <w:proofErr w:type="gramStart"/>
+      <w:r>
+        <w:t>Nel frattempo</w:t>
+      </w:r>
+      <w:proofErr w:type="gramEnd"/>
+      <w:r>
+        <w:t xml:space="preserve"> si aggiornerà la giornata impostando a tutte le partite di giornata il risultato di 0-0. Dopo il recupero, i giocatori schierati in formazione e non scesi in campo nella partita, avranno il 6 politico solo nel caso in cui non ci sia nessun sostituto disponibile.</w:t>
+      </w:r>
+    </w:p>
+    <w:p/>
+    <w:p/>
+    <w:p/>
+    <w:p>
+      <w:pPr>
+        <w:pStyle w:val="Titolo2"/>
+      </w:pPr>
+      <w:r>
+        <w:t xml:space="preserve">Mercato di settembre  </w:t>
+      </w:r>
+    </w:p>
+    <w:p>
+      <w:r>
+        <w:t xml:space="preserve">Durante l’asta ciascun presidente chiamerà un giocatore seguendo il consueto ordine (portieri, difensori, centrocampisti, attaccanti). Ogni presidente può chiamare 1 solo giocatore a sua scelta con la chiamata a busta. Al mercato di settembre ogni squadra partirà con 600 fantamilioni. Nel caso una squadra spenda più soldi di quelli concessi si procederà togliendo alla squadra il giocatore più pagato nel mercato; </w:t>
+      </w:r>
+      <w:proofErr w:type="gramStart"/>
+      <w:r>
+        <w:t>inoltre</w:t>
+      </w:r>
+      <w:proofErr w:type="gramEnd"/>
+      <w:r>
+        <w:t xml:space="preserve"> il giocatore tolto potrà essere comprato dalle altre squadre solo nel mercato di gennaio; la squadra penalizzata ovviamente non riprende nessun fantamilione dal giocatore perso. Per altre tipologie di illeciti voluti o non voluti durante il mercato iniziale si applicherà una multa che verrà decisa sul momento dalle persone non interessate direttamente nella questione. Suddetta multa andrà ad arricchire il montepremi del Campionato. Inoltre, dove possibile, il danno dovrà essere quanto prima "aggiustato" per riportare la situazione alla normalità. I giocatori non potranno più essere ceduti in cambio di soldi reali direttamente al </w:t>
+      </w:r>
+      <w:r>
         <w:lastRenderedPageBreak/>
-        <w:t xml:space="preserve">Acquisto portieri  </w:t>
-      </w:r>
-    </w:p>
-    <w:p>
-      <w:r>
-        <w:t>I portieri sono trattati come qualsiasi altro ruolo. Quindi non va più dichiarato se un portiere è primario o secondario. Il presidente dovrà acquistare 3 portieri e avrà a disposizione solo quei 3 in rosa.</w:t>
+        <w:t>presidente che vende; i giocatori messi sul mercato verranno battuti all’asta e i soldi andranno solo sul montepremi generale.</w:t>
       </w:r>
     </w:p>
     <w:p/>
@@ -287,32 +1223,350 @@
         <w:pStyle w:val="Titolo2"/>
       </w:pPr>
       <w:r>
-        <w:t xml:space="preserve">Schieramento formazione  </w:t>
-      </w:r>
-    </w:p>
-    <w:p>
-      <w:r>
-        <w:t>La formazione va schierata secondo quanto segue:</w:t>
-      </w:r>
-      <w:r>
-        <w:t xml:space="preserve"> </w:t>
-      </w:r>
-    </w:p>
-    <w:p>
+        <w:t xml:space="preserve">Scambio giocatori  </w:t>
+      </w:r>
+    </w:p>
+    <w:p>
+      <w:r>
+        <w:t>Al termine del mercato</w:t>
+      </w:r>
+      <w:r>
+        <w:t xml:space="preserve"> di settembre</w:t>
+      </w:r>
+      <w:r>
+        <w:t>, ovvero quando sono state ultimate tutte le rose delle squadre, si può procedere con lo scambio dei giocatori usufruendo come merce di scambio i fantamilioni residui o un altro giocatore. Resta inteso che le rose devono rimanere inalterate nel numero fisso per ogni reparto di gioco.</w:t>
+      </w:r>
+    </w:p>
+    <w:p/>
+    <w:p>
+      <w:pPr>
+        <w:pStyle w:val="Titolo2"/>
+      </w:pPr>
+      <w:r>
+        <w:t>Sessioni di mercato</w:t>
+      </w:r>
+      <w:r>
+        <w:t xml:space="preserve"> sosta nazionali</w:t>
+      </w:r>
+    </w:p>
+    <w:p>
+      <w:pPr>
+        <w:rPr>
+          <w:b/>
+          <w:bCs/>
+        </w:rPr>
+      </w:pPr>
+      <w:r>
+        <w:rPr>
+          <w:b/>
+          <w:bCs/>
+        </w:rPr>
+        <w:t xml:space="preserve">Durante il periodo della sosta nazionali </w:t>
+      </w:r>
+      <w:r>
+        <w:rPr>
+          <w:b/>
+          <w:bCs/>
+        </w:rPr>
+        <w:t>(orientativamente a novembre e a marzo) verrà creata una sessione di mercato sul sito</w:t>
+      </w:r>
+      <w:r>
+        <w:rPr>
+          <w:b/>
+          <w:bCs/>
+        </w:rPr>
+        <w:t>.</w:t>
+      </w:r>
+      <w:r>
+        <w:rPr>
+          <w:b/>
+          <w:bCs/>
+        </w:rPr>
+        <w:t xml:space="preserve"> La sessione di mercato prevede </w:t>
+      </w:r>
+      <w:r>
+        <w:rPr>
+          <w:b/>
+          <w:bCs/>
+        </w:rPr>
+        <w:t>la scelta di:</w:t>
+      </w:r>
+    </w:p>
+    <w:p>
+      <w:pPr>
+        <w:pStyle w:val="Paragrafoelenco"/>
+        <w:numPr>
+          <w:ilvl w:val="0"/>
+          <w:numId w:val="9"/>
+        </w:numPr>
+        <w:rPr>
+          <w:b/>
+          <w:bCs/>
+        </w:rPr>
+      </w:pPr>
+      <w:r>
+        <w:rPr>
+          <w:b/>
+          <w:bCs/>
+        </w:rPr>
+        <w:t xml:space="preserve">una finestra temporale (data inizio, data fine) </w:t>
+      </w:r>
+    </w:p>
+    <w:p>
+      <w:pPr>
+        <w:pStyle w:val="Paragrafoelenco"/>
+        <w:numPr>
+          <w:ilvl w:val="0"/>
+          <w:numId w:val="9"/>
+        </w:numPr>
+        <w:rPr>
+          <w:b/>
+          <w:bCs/>
+        </w:rPr>
+      </w:pPr>
+      <w:r>
+        <w:rPr>
+          <w:b/>
+          <w:bCs/>
+        </w:rPr>
+        <w:t>soldi reali o fantamilioni</w:t>
+      </w:r>
+    </w:p>
+    <w:p>
+      <w:pPr>
+        <w:pStyle w:val="Paragrafoelenco"/>
+        <w:numPr>
+          <w:ilvl w:val="0"/>
+          <w:numId w:val="9"/>
+        </w:numPr>
+        <w:rPr>
+          <w:b/>
+          <w:bCs/>
+        </w:rPr>
+      </w:pPr>
+      <w:r>
+        <w:rPr>
+          <w:b/>
+          <w:bCs/>
+        </w:rPr>
+        <w:t>un numero massimo di proposte di acquisto per ciascuna squadra</w:t>
+      </w:r>
+    </w:p>
+    <w:p>
+      <w:pPr>
+        <w:pStyle w:val="Paragrafoelenco"/>
+        <w:numPr>
+          <w:ilvl w:val="0"/>
+          <w:numId w:val="9"/>
+        </w:numPr>
+        <w:rPr>
+          <w:b/>
+          <w:bCs/>
+        </w:rPr>
+      </w:pPr>
+      <w:r>
+        <w:rPr>
+          <w:b/>
+          <w:bCs/>
+        </w:rPr>
+        <w:t>un numero massimo di giocatori acquistabili per ciascuna squadra</w:t>
+      </w:r>
+      <w:r>
+        <w:rPr>
+          <w:b/>
+          <w:bCs/>
+        </w:rPr>
+        <w:t xml:space="preserve">. </w:t>
+      </w:r>
+    </w:p>
+    <w:p>
+      <w:pPr>
+        <w:rPr>
+          <w:b/>
+          <w:bCs/>
+        </w:rPr>
+      </w:pPr>
+      <w:r>
+        <w:rPr>
+          <w:b/>
+          <w:bCs/>
+        </w:rPr>
+        <w:t>Ciascun presidente può effettuare delle proposte di acquisto</w:t>
+      </w:r>
+      <w:r>
+        <w:rPr>
+          <w:b/>
+          <w:bCs/>
+        </w:rPr>
+        <w:t xml:space="preserve"> indicando il costo</w:t>
+      </w:r>
+      <w:r>
+        <w:rPr>
+          <w:b/>
+          <w:bCs/>
+        </w:rPr>
+        <w:t>, in soldi reali o fantamilioni restanti</w:t>
+      </w:r>
+      <w:r>
+        <w:rPr>
+          <w:b/>
+          <w:bCs/>
+        </w:rPr>
+        <w:t xml:space="preserve"> e la priorità</w:t>
+      </w:r>
+      <w:r>
+        <w:rPr>
+          <w:b/>
+          <w:bCs/>
+        </w:rPr>
+        <w:t>.</w:t>
+      </w:r>
+    </w:p>
+    <w:p>
+      <w:pPr>
+        <w:rPr>
+          <w:b/>
+          <w:bCs/>
+        </w:rPr>
+      </w:pPr>
+      <w:r>
+        <w:rPr>
+          <w:b/>
+          <w:bCs/>
+        </w:rPr>
+        <w:t>Le proposte di acquisto non sono visibili agli altri presidenti fino a chiusura della data fine della sessione di mercato (le proposte sono criptate, non visibili nemmeno dall’amministratore).</w:t>
+      </w:r>
+    </w:p>
+    <w:p>
+      <w:pPr>
+        <w:rPr>
+          <w:b/>
+          <w:bCs/>
+        </w:rPr>
+      </w:pPr>
+      <w:r>
+        <w:rPr>
+          <w:b/>
+          <w:bCs/>
+        </w:rPr>
+        <w:t xml:space="preserve">Alla scadenza della sessione di mercato le offerte pervenute saranno visibili da tutti </w:t>
+      </w:r>
+      <w:r>
+        <w:rPr>
+          <w:b/>
+          <w:bCs/>
+        </w:rPr>
+        <w:t xml:space="preserve">in trasparenza </w:t>
+      </w:r>
+      <w:r>
+        <w:rPr>
+          <w:b/>
+          <w:bCs/>
+        </w:rPr>
+        <w:t>e si procederà all’acquisto dichiarando il giocatore da cedere.</w:t>
+      </w:r>
+    </w:p>
+    <w:p>
+      <w:pPr>
+        <w:rPr>
+          <w:b/>
+          <w:bCs/>
+        </w:rPr>
+      </w:pPr>
+      <w:r>
+        <w:rPr>
+          <w:b/>
+          <w:bCs/>
+        </w:rPr>
+        <w:t>L’aggiudicazione di un giocatore avviene nel seguente modo:</w:t>
+      </w:r>
+    </w:p>
+    <w:p>
+      <w:pPr>
+        <w:pStyle w:val="Paragrafoelenco"/>
+        <w:numPr>
+          <w:ilvl w:val="0"/>
+          <w:numId w:val="9"/>
+        </w:numPr>
+        <w:rPr>
+          <w:b/>
+          <w:bCs/>
+        </w:rPr>
+      </w:pPr>
+      <w:r>
+        <w:rPr>
+          <w:b/>
+          <w:bCs/>
+        </w:rPr>
+        <w:t>regola base: per ogni giocatore vince la squadra che ha offerto il prezzo più alto. A parità di prezzo, vince chi ha inviato la proposta prima</w:t>
+      </w:r>
+    </w:p>
+    <w:p>
+      <w:pPr>
+        <w:pStyle w:val="Paragrafoelenco"/>
+        <w:numPr>
+          <w:ilvl w:val="0"/>
+          <w:numId w:val="9"/>
+        </w:numPr>
+        <w:rPr>
+          <w:b/>
+          <w:bCs/>
+        </w:rPr>
+      </w:pPr>
+      <w:r>
+        <w:rPr>
+          <w:b/>
+          <w:bCs/>
+        </w:rPr>
+        <w:t xml:space="preserve">Cap acquisti: ogni squadra può aggiudicarsi al massimo gli acquisti effettivi </w:t>
+      </w:r>
       <w:proofErr w:type="gramStart"/>
       <w:r>
-        <w:t>11</w:t>
+        <w:rPr>
+          <w:b/>
+          <w:bCs/>
+        </w:rPr>
+        <w:t>concessi, quindi</w:t>
       </w:r>
       <w:proofErr w:type="gramEnd"/>
       <w:r>
-        <w:t xml:space="preserve"> titolari</w:t>
-      </w:r>
-    </w:p>
-    <w:p>
-      <w:r>
-        <w:t>Tutti i giocatori rimanenti vanno schierati in panchina</w:t>
-      </w:r>
-    </w:p>
+        <w:rPr>
+          <w:b/>
+          <w:bCs/>
+        </w:rPr>
+        <w:t xml:space="preserve"> se un presidente effettua 5 proposte e gli acquisti consentiti sono 2 prende i primi 2 giocatori</w:t>
+      </w:r>
+      <w:r>
+        <w:rPr>
+          <w:b/>
+          <w:bCs/>
+        </w:rPr>
+        <w:t xml:space="preserve"> in ordine di priorità, su cui è il miglior offerente.</w:t>
+      </w:r>
+    </w:p>
+    <w:p>
+      <w:pPr>
+        <w:rPr>
+          <w:b/>
+          <w:bCs/>
+        </w:rPr>
+      </w:pPr>
+      <w:r>
+        <w:rPr>
+          <w:b/>
+          <w:bCs/>
+        </w:rPr>
+        <w:t>Per le sessioni di mercato se procediamo con l’acquisto in fantamilioni è previsto all’apertura di ogni sessione un extra bonus di 30 fantamilioni oltre a quelli restanti del mercato di settembre/gennaio. Se procediamo con soldi reali non sono previsti extra bonus e l’offerta non è legata a vincoli</w:t>
+      </w:r>
+      <w:r>
+        <w:rPr>
+          <w:b/>
+          <w:bCs/>
+        </w:rPr>
+        <w:t>.</w:t>
+      </w:r>
+    </w:p>
+    <w:p/>
     <w:p/>
     <w:p/>
     <w:p>
@@ -320,1001 +1574,24 @@
         <w:pStyle w:val="Titolo2"/>
       </w:pPr>
       <w:r>
-        <w:t xml:space="preserve">Voti  </w:t>
-      </w:r>
-    </w:p>
-    <w:p>
-      <w:r>
-        <w:t xml:space="preserve">I voti verranno presi dal sito PianetaFantacalcio.it; sul sito vengono riportati tutti i voti di tutte le principali testate giornalistiche sportive: Corriere dello sport e Gazzetta. Il conteggio di ciascun giocatore verrà fatto usando la media dei 2 giornali con precisione al </w:t>
+        <w:t xml:space="preserve">Mercato di gennaio  </w:t>
+      </w:r>
+    </w:p>
+    <w:p>
+      <w:r>
+        <w:t xml:space="preserve">Il mercato di riparazione si terrà, subito dopo la conclusione del mercato reale della serie A, fissato per il 31 gennaio. Per investire al mercato di gennaio si usano i fantamilioni restanti dal mercato di settembre; i fantamilioni restanti verranno tramutati in € secondo la seguente regola: 1 € = 5 </w:t>
       </w:r>
       <w:proofErr w:type="gramStart"/>
       <w:r>
-        <w:t>2°</w:t>
+        <w:t>fantamilioni</w:t>
       </w:r>
       <w:proofErr w:type="gramEnd"/>
       <w:r>
-        <w:t xml:space="preserve"> numero decimale. </w:t>
-      </w:r>
-      <w:proofErr w:type="gramStart"/>
-      <w:r>
-        <w:t>E’</w:t>
-      </w:r>
-      <w:proofErr w:type="gramEnd"/>
-      <w:r>
-        <w:t xml:space="preserve"> importante ricordare che la media viene fatta solo sui voti presenti per un calciatore; </w:t>
-      </w:r>
-      <w:proofErr w:type="gramStart"/>
-      <w:r>
-        <w:t>ad esempio</w:t>
-      </w:r>
-      <w:proofErr w:type="gramEnd"/>
-      <w:r>
-        <w:t xml:space="preserve"> se Totti prende 6 sul corriere, </w:t>
-      </w:r>
-      <w:proofErr w:type="spellStart"/>
-      <w:r>
-        <w:t>s.v</w:t>
-      </w:r>
-      <w:proofErr w:type="spellEnd"/>
-      <w:r>
-        <w:t xml:space="preserve"> sulla gazzetta, il voto finale sarà 6. </w:t>
-      </w:r>
-      <w:proofErr w:type="gramStart"/>
-      <w:r>
-        <w:t>Inoltre</w:t>
-      </w:r>
-      <w:proofErr w:type="gramEnd"/>
-      <w:r>
-        <w:t xml:space="preserve"> se un giornale assegna un gol a un giocatore, mentre un altro giornale non assegna il gol ma dà l’autogol al difensore, verrà presa in considerazione esclusivamente la decisione che prenderà pianetafantacalcio.it Gli assist vengono presi esclusivamente dal Corriere dello Sport.</w:t>
-      </w:r>
-    </w:p>
-    <w:p/>
-    <w:p/>
-    <w:p/>
-    <w:p>
-      <w:pPr>
-        <w:pStyle w:val="Titolo2"/>
-      </w:pPr>
-      <w:r>
-        <w:t xml:space="preserve">Sostituzioni della partita  </w:t>
-      </w:r>
-    </w:p>
-    <w:p>
-      <w:r>
-        <w:t xml:space="preserve">Il numero massimo delle sostituzioni è fissato a </w:t>
-      </w:r>
-      <w:proofErr w:type="gramStart"/>
-      <w:r>
-        <w:t>6</w:t>
-      </w:r>
-      <w:proofErr w:type="gramEnd"/>
-      <w:r>
-        <w:t xml:space="preserve"> giocatori. Le sostituzioni seguono come sempre l’ordine del primo schierato per ciascun ruolo, secondariamente viene preso in considerazione il miglior voto (es.: non mi giocano 2 </w:t>
-      </w:r>
-      <w:proofErr w:type="spellStart"/>
-      <w:r>
-        <w:t>Dif</w:t>
-      </w:r>
-      <w:proofErr w:type="spellEnd"/>
-      <w:r>
-        <w:t xml:space="preserve">, 2 Cen, 2 </w:t>
-      </w:r>
-      <w:proofErr w:type="spellStart"/>
-      <w:r>
-        <w:t>Att</w:t>
-      </w:r>
-      <w:proofErr w:type="spellEnd"/>
-      <w:r>
-        <w:t xml:space="preserve">, tra le riserve mi entrerà la prima scelta del </w:t>
-      </w:r>
-      <w:proofErr w:type="spellStart"/>
-      <w:r>
-        <w:t>Dif</w:t>
-      </w:r>
-      <w:proofErr w:type="spellEnd"/>
-      <w:r>
-        <w:t>, del Cen, dell’</w:t>
-      </w:r>
-      <w:proofErr w:type="spellStart"/>
-      <w:r>
-        <w:t>Att</w:t>
-      </w:r>
-      <w:proofErr w:type="spellEnd"/>
-      <w:r>
-        <w:t xml:space="preserve">; come quarta riserva mi entrerà il migliore tra le seconde scelte). In caso non vi sia alcun sostituto il giocatore senza voto prende in automatico </w:t>
-      </w:r>
-      <w:proofErr w:type="gramStart"/>
-      <w:r>
-        <w:t>3</w:t>
-      </w:r>
-      <w:proofErr w:type="gramEnd"/>
-      <w:r>
-        <w:t xml:space="preserve"> come voto.</w:t>
-      </w:r>
-    </w:p>
-    <w:p/>
-    <w:p/>
-    <w:p/>
-    <w:p>
-      <w:pPr>
-        <w:pStyle w:val="Titolo2"/>
-      </w:pPr>
-      <w:r>
-        <w:t xml:space="preserve">Bonus / Malus  </w:t>
-      </w:r>
-    </w:p>
-    <w:p>
-      <w:pPr>
-        <w:pStyle w:val="Paragrafoelenco"/>
-        <w:numPr>
-          <w:ilvl w:val="0"/>
-          <w:numId w:val="5"/>
-        </w:numPr>
-      </w:pPr>
-      <w:r>
-        <w:t xml:space="preserve">Fattore casalingo: </w:t>
-      </w:r>
-      <w:r>
-        <w:t>+2</w:t>
-      </w:r>
-    </w:p>
-    <w:p>
-      <w:pPr>
-        <w:pStyle w:val="Paragrafoelenco"/>
-        <w:numPr>
-          <w:ilvl w:val="0"/>
-          <w:numId w:val="5"/>
-        </w:numPr>
-      </w:pPr>
-      <w:r>
-        <w:t>Gol fatto: +3</w:t>
-      </w:r>
-    </w:p>
-    <w:p>
-      <w:pPr>
-        <w:pStyle w:val="Paragrafoelenco"/>
-        <w:numPr>
-          <w:ilvl w:val="0"/>
-          <w:numId w:val="5"/>
-        </w:numPr>
-      </w:pPr>
-      <w:r>
-        <w:t>Assist: +1</w:t>
-      </w:r>
-    </w:p>
-    <w:p>
-      <w:pPr>
-        <w:pStyle w:val="Paragrafoelenco"/>
-        <w:numPr>
-          <w:ilvl w:val="0"/>
-          <w:numId w:val="5"/>
-        </w:numPr>
-      </w:pPr>
-      <w:r>
-        <w:t>Gol subito: -1</w:t>
-      </w:r>
-    </w:p>
-    <w:p>
-      <w:pPr>
-        <w:pStyle w:val="Paragrafoelenco"/>
-        <w:numPr>
-          <w:ilvl w:val="0"/>
-          <w:numId w:val="5"/>
-        </w:numPr>
-      </w:pPr>
-      <w:r>
-        <w:t>Rigore sbagliato: -3</w:t>
-      </w:r>
-    </w:p>
-    <w:p>
-      <w:pPr>
-        <w:pStyle w:val="Paragrafoelenco"/>
-        <w:numPr>
-          <w:ilvl w:val="0"/>
-          <w:numId w:val="5"/>
-        </w:numPr>
-      </w:pPr>
+        <w:t xml:space="preserve"> In caso di </w:t>
+      </w:r>
       <w:r>
         <w:lastRenderedPageBreak/>
-        <w:t>Rigore parato: +3</w:t>
-      </w:r>
-    </w:p>
-    <w:p>
-      <w:pPr>
-        <w:pStyle w:val="Paragrafoelenco"/>
-        <w:numPr>
-          <w:ilvl w:val="0"/>
-          <w:numId w:val="5"/>
-        </w:numPr>
-      </w:pPr>
-      <w:r>
-        <w:t>Ammonizione: -0,5</w:t>
-      </w:r>
-    </w:p>
-    <w:p>
-      <w:pPr>
-        <w:pStyle w:val="Paragrafoelenco"/>
-        <w:numPr>
-          <w:ilvl w:val="0"/>
-          <w:numId w:val="5"/>
-        </w:numPr>
-      </w:pPr>
-      <w:r>
-        <w:t>Espulsione: -1</w:t>
-      </w:r>
-    </w:p>
-    <w:p>
-      <w:pPr>
-        <w:pStyle w:val="Paragrafoelenco"/>
-        <w:numPr>
-          <w:ilvl w:val="0"/>
-          <w:numId w:val="5"/>
-        </w:numPr>
-      </w:pPr>
-      <w:r>
-        <w:t>Autogol: -2</w:t>
-      </w:r>
-    </w:p>
-    <w:p>
-      <w:pPr>
-        <w:pStyle w:val="Paragrafoelenco"/>
-        <w:numPr>
-          <w:ilvl w:val="0"/>
-          <w:numId w:val="5"/>
-        </w:numPr>
-      </w:pPr>
-      <w:r>
-        <w:t xml:space="preserve">Portiere S.V.: </w:t>
-      </w:r>
-      <w:r>
-        <w:t>3</w:t>
-      </w:r>
-    </w:p>
-    <w:p>
-      <w:pPr>
-        <w:pStyle w:val="Paragrafoelenco"/>
-        <w:numPr>
-          <w:ilvl w:val="0"/>
-          <w:numId w:val="5"/>
-        </w:numPr>
-      </w:pPr>
-      <w:r>
-        <w:t xml:space="preserve">Giocatore S.V.: </w:t>
-      </w:r>
-      <w:r>
-        <w:t>3</w:t>
-      </w:r>
-    </w:p>
-    <w:p/>
-    <w:p>
-      <w:pPr>
-        <w:pStyle w:val="Titolo2"/>
-      </w:pPr>
-      <w:r>
-        <w:t xml:space="preserve">Calcolo dei gol  </w:t>
-      </w:r>
-    </w:p>
-    <w:p>
-      <w:pPr>
-        <w:pStyle w:val="Paragrafoelenco"/>
-        <w:numPr>
-          <w:ilvl w:val="0"/>
-          <w:numId w:val="2"/>
-        </w:numPr>
-      </w:pPr>
-      <w:r>
-        <w:t>Punteggio 66: 1</w:t>
-      </w:r>
-    </w:p>
-    <w:p>
-      <w:pPr>
-        <w:pStyle w:val="Paragrafoelenco"/>
-        <w:numPr>
-          <w:ilvl w:val="0"/>
-          <w:numId w:val="2"/>
-        </w:numPr>
-      </w:pPr>
-      <w:r>
-        <w:t>Punteggio 72: 2</w:t>
-      </w:r>
-    </w:p>
-    <w:p>
-      <w:pPr>
-        <w:pStyle w:val="Paragrafoelenco"/>
-        <w:numPr>
-          <w:ilvl w:val="0"/>
-          <w:numId w:val="2"/>
-        </w:numPr>
-      </w:pPr>
-      <w:r>
-        <w:t>Punteggio 78: 3</w:t>
-      </w:r>
-    </w:p>
-    <w:p>
-      <w:pPr>
-        <w:pStyle w:val="Paragrafoelenco"/>
-        <w:numPr>
-          <w:ilvl w:val="0"/>
-          <w:numId w:val="2"/>
-        </w:numPr>
-      </w:pPr>
-      <w:r>
-        <w:t>Punteggio 82: 4</w:t>
-      </w:r>
-    </w:p>
-    <w:p>
-      <w:pPr>
-        <w:pStyle w:val="Paragrafoelenco"/>
-        <w:numPr>
-          <w:ilvl w:val="0"/>
-          <w:numId w:val="2"/>
-        </w:numPr>
-      </w:pPr>
-      <w:r>
-        <w:t>Punteggio 86: 5</w:t>
-      </w:r>
-    </w:p>
-    <w:p>
-      <w:pPr>
-        <w:pStyle w:val="Paragrafoelenco"/>
-        <w:numPr>
-          <w:ilvl w:val="0"/>
-          <w:numId w:val="2"/>
-        </w:numPr>
-      </w:pPr>
-      <w:r>
-        <w:t>Punteggio 90: 6</w:t>
-      </w:r>
-    </w:p>
-    <w:p>
-      <w:pPr>
-        <w:pStyle w:val="Paragrafoelenco"/>
-        <w:numPr>
-          <w:ilvl w:val="0"/>
-          <w:numId w:val="2"/>
-        </w:numPr>
-      </w:pPr>
-      <w:r>
-        <w:t>Punteggio 94: 7</w:t>
-      </w:r>
-    </w:p>
-    <w:p/>
-    <w:p/>
-    <w:p>
-      <w:pPr>
-        <w:pStyle w:val="Titolo2"/>
-      </w:pPr>
-      <w:r>
-        <w:t xml:space="preserve">In caso di parità punti  </w:t>
-      </w:r>
-    </w:p>
-    <w:p>
-      <w:r>
-        <w:t>A fine campionato o nei gironi della Champions League in caso di squadre a pari punti che lottano per una posizione che determina una vincita (o una penalità), si procederà seguendo nell'ordine i vari criteri:</w:t>
-      </w:r>
-    </w:p>
-    <w:p/>
-    <w:p>
-      <w:pPr>
-        <w:pStyle w:val="Paragrafoelenco"/>
-        <w:numPr>
-          <w:ilvl w:val="0"/>
-          <w:numId w:val="1"/>
-        </w:numPr>
-      </w:pPr>
-      <w:r>
-        <w:t>Gol Fatti</w:t>
-      </w:r>
-    </w:p>
-    <w:p>
-      <w:pPr>
-        <w:pStyle w:val="Paragrafoelenco"/>
-        <w:numPr>
-          <w:ilvl w:val="0"/>
-          <w:numId w:val="1"/>
-        </w:numPr>
-      </w:pPr>
-      <w:r>
-        <w:t>Differenza reti</w:t>
-      </w:r>
-    </w:p>
-    <w:p>
-      <w:pPr>
-        <w:pStyle w:val="Paragrafoelenco"/>
-        <w:numPr>
-          <w:ilvl w:val="0"/>
-          <w:numId w:val="1"/>
-        </w:numPr>
-      </w:pPr>
-      <w:r>
-        <w:t>Scontri diretti (solo nel torneo chiamato in causa)</w:t>
-      </w:r>
-    </w:p>
-    <w:p>
-      <w:pPr>
-        <w:pStyle w:val="Paragrafoelenco"/>
-        <w:numPr>
-          <w:ilvl w:val="0"/>
-          <w:numId w:val="1"/>
-        </w:numPr>
-      </w:pPr>
-      <w:r>
-        <w:t>Gol subiti</w:t>
-      </w:r>
-    </w:p>
-    <w:p>
-      <w:r>
-        <w:t xml:space="preserve">Per le partite eliminatorie come la semifinale o la finale di </w:t>
-      </w:r>
-      <w:proofErr w:type="spellStart"/>
-      <w:r>
-        <w:t>champions</w:t>
-      </w:r>
-      <w:proofErr w:type="spellEnd"/>
-      <w:r>
-        <w:t xml:space="preserve"> in caso di partita che finisce in parità vincerà la squadra che ha realizzato il miglior </w:t>
-      </w:r>
-      <w:proofErr w:type="spellStart"/>
-      <w:r>
-        <w:t>fantapunteggio</w:t>
-      </w:r>
-      <w:proofErr w:type="spellEnd"/>
-      <w:r>
-        <w:t xml:space="preserve">. Per la semifinale si calcolerà il </w:t>
-      </w:r>
-      <w:proofErr w:type="spellStart"/>
-      <w:r>
-        <w:t>fanta</w:t>
-      </w:r>
-      <w:proofErr w:type="spellEnd"/>
-      <w:r>
-        <w:t xml:space="preserve"> punteggio dell’andata più quello del ritorno.</w:t>
-      </w:r>
-      <w:r>
-        <w:t xml:space="preserve"> </w:t>
-      </w:r>
-      <w:r>
-        <w:rPr>
-          <w:b/>
-          <w:bCs/>
-        </w:rPr>
-        <w:t xml:space="preserve">In caso di parità al </w:t>
-      </w:r>
-      <w:proofErr w:type="spellStart"/>
-      <w:r>
-        <w:rPr>
-          <w:b/>
-          <w:bCs/>
-        </w:rPr>
-        <w:t>fantapunteggio</w:t>
-      </w:r>
-      <w:proofErr w:type="spellEnd"/>
-      <w:r>
-        <w:rPr>
-          <w:b/>
-          <w:bCs/>
-        </w:rPr>
-        <w:t xml:space="preserve"> vincerà la squadra meglio piazzata in campionato (al momento della disputa) </w:t>
-      </w:r>
-    </w:p>
-    <w:p/>
-    <w:p/>
-    <w:p>
-      <w:pPr>
-        <w:pStyle w:val="Titolo2"/>
-      </w:pPr>
-      <w:r>
-        <w:t xml:space="preserve">Comunicazione formazione e multe  </w:t>
-      </w:r>
-    </w:p>
-    <w:p>
-      <w:r>
-        <w:t>La formazione va rilasciata sempre prima dell’inizio del primo anticipo di giornata. La formazione va inserita sempre sul sito tramite l’apposita funzionalità. In casi estremi la formazione può comunque essere comunicata in uno dei seguenti modi:</w:t>
-      </w:r>
-    </w:p>
-    <w:p>
-      <w:pPr>
-        <w:pStyle w:val="Paragrafoelenco"/>
-        <w:numPr>
-          <w:ilvl w:val="0"/>
-          <w:numId w:val="6"/>
-        </w:numPr>
-      </w:pPr>
-      <w:r>
-        <w:t xml:space="preserve">Tramite WhatsApp! Sul gruppo </w:t>
-      </w:r>
-      <w:proofErr w:type="spellStart"/>
-      <w:r>
-        <w:t>erFantacalcio</w:t>
-      </w:r>
-      <w:proofErr w:type="spellEnd"/>
-    </w:p>
-    <w:p>
-      <w:pPr>
-        <w:pStyle w:val="Paragrafoelenco"/>
-        <w:numPr>
-          <w:ilvl w:val="0"/>
-          <w:numId w:val="6"/>
-        </w:numPr>
-      </w:pPr>
-      <w:r>
-        <w:t>Inviando una mail o un sms al presidente nei tempi stabiliti</w:t>
-      </w:r>
-    </w:p>
-    <w:p>
-      <w:r>
-        <w:t>Nel caso una squadra non vengano rispettate le norme sopra stabilite, la squadra giocherà con la formazione della precedente giornata con l'handicap di prendere 0 punti indistintamente dal risultato maturato; in più pagherà una multa di 10 euro che arricchirà il montepremi del torneo generale.</w:t>
-      </w:r>
-    </w:p>
-    <w:p>
-      <w:pPr>
-        <w:rPr>
-          <w:b/>
-          <w:bCs/>
-        </w:rPr>
-      </w:pPr>
-      <w:r>
-        <w:rPr>
-          <w:b/>
-          <w:bCs/>
-        </w:rPr>
-        <w:lastRenderedPageBreak/>
-        <w:t>Si propone l’abolizione delle multe</w:t>
-      </w:r>
-      <w:r>
-        <w:rPr>
-          <w:b/>
-          <w:bCs/>
-        </w:rPr>
-        <w:t xml:space="preserve">: </w:t>
-      </w:r>
-      <w:r>
-        <w:rPr>
-          <w:b/>
-          <w:bCs/>
-        </w:rPr>
-        <w:t>ciascun</w:t>
-      </w:r>
-      <w:r>
-        <w:rPr>
-          <w:b/>
-          <w:bCs/>
-        </w:rPr>
-        <w:t xml:space="preserve"> presidente </w:t>
-      </w:r>
-      <w:r>
-        <w:rPr>
-          <w:b/>
-          <w:bCs/>
-        </w:rPr>
-        <w:t xml:space="preserve">ritardatario </w:t>
-      </w:r>
-      <w:r>
-        <w:rPr>
-          <w:b/>
-          <w:bCs/>
-        </w:rPr>
-        <w:t>potrà, in autonomia, solo confermare la formazione precedente e giocarsela senza handicap.</w:t>
-      </w:r>
-    </w:p>
-    <w:p/>
-    <w:p>
-      <w:pPr>
-        <w:pStyle w:val="Titolo2"/>
-      </w:pPr>
-      <w:r>
-        <w:t xml:space="preserve">Recuperi partite rinviate  </w:t>
-      </w:r>
-    </w:p>
-    <w:p>
-      <w:r>
-        <w:t xml:space="preserve">In caso di partite rinviate in serie A, si aspetterà il recupero della stessa per procedere all’aggiornamento dei voti del fantacalcio. </w:t>
-      </w:r>
-      <w:proofErr w:type="gramStart"/>
-      <w:r>
-        <w:t>Nel frattempo</w:t>
-      </w:r>
-      <w:proofErr w:type="gramEnd"/>
-      <w:r>
-        <w:t xml:space="preserve"> si aggiornerà la giornata impostando a tutte le partite di giornata il risultato di 0-0. Dopo il recupero, i giocatori schierati in formazione e non scesi in campo nella partita, avranno il 6 politico solo nel caso in cui non ci sia nessun sostituto disponibile.</w:t>
-      </w:r>
-    </w:p>
-    <w:p/>
-    <w:p/>
-    <w:p/>
-    <w:p>
-      <w:pPr>
-        <w:pStyle w:val="Titolo2"/>
-      </w:pPr>
-      <w:r>
-        <w:t xml:space="preserve">Mercato di settembre  </w:t>
-      </w:r>
-    </w:p>
-    <w:p>
-      <w:r>
-        <w:t xml:space="preserve">Durante l’asta ciascun presidente chiamerà un giocatore seguendo il consueto ordine (portieri, difensori, centrocampisti, attaccanti). Ogni presidente può chiamare 1 solo giocatore a sua scelta con la chiamata a busta. Al mercato di settembre ogni squadra partirà con 600 fantamilioni. Nel caso una squadra spenda più soldi di quelli concessi si procederà togliendo alla squadra il giocatore più pagato nel mercato; </w:t>
-      </w:r>
-      <w:proofErr w:type="gramStart"/>
-      <w:r>
-        <w:t>inoltre</w:t>
-      </w:r>
-      <w:proofErr w:type="gramEnd"/>
-      <w:r>
-        <w:t xml:space="preserve"> il giocatore tolto potrà essere comprato dalle altre squadre solo nel mercato di gennaio; la squadra penalizzata ovviamente non riprende nessun fantamilione dal giocatore perso. Per altre tipologie di illeciti voluti o non voluti durante il mercato iniziale si applicherà una multa che verrà decisa sul momento dalle persone non interessate direttamente nella questione. Suddetta multa andrà ad arricchire il montepremi del Campionato. Inoltre, dove possibile, il danno dovrà essere quanto prima "aggiustato" per riportare la situazione alla normalità. I giocatori non potranno più essere ceduti in cambio di soldi reali direttamente al presidente che vende; i giocatori messi sul mercato verranno battuti all’asta e i soldi andranno solo sul montepremi generale.</w:t>
-      </w:r>
-    </w:p>
-    <w:p/>
-    <w:p/>
-    <w:p/>
-    <w:p>
-      <w:pPr>
-        <w:pStyle w:val="Titolo2"/>
-      </w:pPr>
-      <w:r>
-        <w:t xml:space="preserve">Scambio giocatori  </w:t>
-      </w:r>
-    </w:p>
-    <w:p>
-      <w:r>
-        <w:t>Al termine del mercato</w:t>
-      </w:r>
-      <w:r>
-        <w:t xml:space="preserve"> di settembre</w:t>
-      </w:r>
-      <w:r>
-        <w:t>, ovvero quando sono state ultimate tutte le rose delle squadre, si può procedere con lo scambio dei giocatori usufruendo come merce di scambio i fantamilioni residui o un altro giocatore. Resta inteso che le rose devono rimanere inalterate nel numero fisso per ogni reparto di gioco.</w:t>
-      </w:r>
-    </w:p>
-    <w:p/>
-    <w:p>
-      <w:pPr>
-        <w:pStyle w:val="Titolo2"/>
-      </w:pPr>
-      <w:r>
-        <w:t>Sessioni di mercato</w:t>
-      </w:r>
-      <w:r>
-        <w:t xml:space="preserve"> sosta nazionali</w:t>
-      </w:r>
-    </w:p>
-    <w:p>
-      <w:pPr>
-        <w:rPr>
-          <w:b/>
-          <w:bCs/>
-        </w:rPr>
-      </w:pPr>
-      <w:r>
-        <w:rPr>
-          <w:b/>
-          <w:bCs/>
-        </w:rPr>
-        <w:t xml:space="preserve">Durante il periodo della sosta nazionali </w:t>
-      </w:r>
-      <w:r>
-        <w:rPr>
-          <w:b/>
-          <w:bCs/>
-        </w:rPr>
-        <w:t>(orientativamente a novembre e a marzo) verrà creata una sessione di mercato sul sito</w:t>
-      </w:r>
-      <w:r>
-        <w:rPr>
-          <w:b/>
-          <w:bCs/>
-        </w:rPr>
-        <w:t>.</w:t>
-      </w:r>
-      <w:r>
-        <w:rPr>
-          <w:b/>
-          <w:bCs/>
-        </w:rPr>
-        <w:t xml:space="preserve"> La sessione di mercato prevede </w:t>
-      </w:r>
-      <w:r>
-        <w:rPr>
-          <w:b/>
-          <w:bCs/>
-        </w:rPr>
-        <w:t>la scelta di:</w:t>
-      </w:r>
-    </w:p>
-    <w:p>
-      <w:pPr>
-        <w:pStyle w:val="Paragrafoelenco"/>
-        <w:numPr>
-          <w:ilvl w:val="0"/>
-          <w:numId w:val="9"/>
-        </w:numPr>
-        <w:rPr>
-          <w:b/>
-          <w:bCs/>
-        </w:rPr>
-      </w:pPr>
-      <w:r>
-        <w:rPr>
-          <w:b/>
-          <w:bCs/>
-        </w:rPr>
-        <w:t xml:space="preserve">una finestra temporale (data inizio, data fine) </w:t>
-      </w:r>
-    </w:p>
-    <w:p>
-      <w:pPr>
-        <w:pStyle w:val="Paragrafoelenco"/>
-        <w:numPr>
-          <w:ilvl w:val="0"/>
-          <w:numId w:val="9"/>
-        </w:numPr>
-        <w:rPr>
-          <w:b/>
-          <w:bCs/>
-        </w:rPr>
-      </w:pPr>
-      <w:r>
-        <w:rPr>
-          <w:b/>
-          <w:bCs/>
-        </w:rPr>
-        <w:t>soldi reali o fantamilioni</w:t>
-      </w:r>
-    </w:p>
-    <w:p>
-      <w:pPr>
-        <w:pStyle w:val="Paragrafoelenco"/>
-        <w:numPr>
-          <w:ilvl w:val="0"/>
-          <w:numId w:val="9"/>
-        </w:numPr>
-        <w:rPr>
-          <w:b/>
-          <w:bCs/>
-        </w:rPr>
-      </w:pPr>
-      <w:r>
-        <w:rPr>
-          <w:b/>
-          <w:bCs/>
-        </w:rPr>
-        <w:t>un numero massimo di proposte di acquisto per ciascuna squadra</w:t>
-      </w:r>
-    </w:p>
-    <w:p>
-      <w:pPr>
-        <w:pStyle w:val="Paragrafoelenco"/>
-        <w:numPr>
-          <w:ilvl w:val="0"/>
-          <w:numId w:val="9"/>
-        </w:numPr>
-        <w:rPr>
-          <w:b/>
-          <w:bCs/>
-        </w:rPr>
-      </w:pPr>
-      <w:r>
-        <w:rPr>
-          <w:b/>
-          <w:bCs/>
-        </w:rPr>
-        <w:t>un numero massimo di giocatori acquistabili per ciascuna squadra</w:t>
-      </w:r>
-      <w:r>
-        <w:rPr>
-          <w:b/>
-          <w:bCs/>
-        </w:rPr>
-        <w:t xml:space="preserve">. </w:t>
-      </w:r>
-    </w:p>
-    <w:p>
-      <w:pPr>
-        <w:rPr>
-          <w:b/>
-          <w:bCs/>
-        </w:rPr>
-      </w:pPr>
-      <w:r>
-        <w:rPr>
-          <w:b/>
-          <w:bCs/>
-        </w:rPr>
-        <w:lastRenderedPageBreak/>
-        <w:t>Ciascun presidente può effettuare delle proposte di acquisto</w:t>
-      </w:r>
-      <w:r>
-        <w:rPr>
-          <w:b/>
-          <w:bCs/>
-        </w:rPr>
-        <w:t xml:space="preserve"> indicando il costo</w:t>
-      </w:r>
-      <w:r>
-        <w:rPr>
-          <w:b/>
-          <w:bCs/>
-        </w:rPr>
-        <w:t>, in soldi reali o fantamilioni restanti</w:t>
-      </w:r>
-      <w:r>
-        <w:rPr>
-          <w:b/>
-          <w:bCs/>
-        </w:rPr>
-        <w:t xml:space="preserve"> e la priorità</w:t>
-      </w:r>
-      <w:r>
-        <w:rPr>
-          <w:b/>
-          <w:bCs/>
-        </w:rPr>
-        <w:t>.</w:t>
-      </w:r>
-    </w:p>
-    <w:p>
-      <w:pPr>
-        <w:rPr>
-          <w:b/>
-          <w:bCs/>
-        </w:rPr>
-      </w:pPr>
-      <w:r>
-        <w:rPr>
-          <w:b/>
-          <w:bCs/>
-        </w:rPr>
-        <w:t>Le proposte di acquisto non sono visibili agli altri presidenti fino a chiusura della data fine della sessione di mercato (le proposte sono criptate, non visibili nemmeno dall’amministratore).</w:t>
-      </w:r>
-    </w:p>
-    <w:p>
-      <w:pPr>
-        <w:rPr>
-          <w:b/>
-          <w:bCs/>
-        </w:rPr>
-      </w:pPr>
-      <w:r>
-        <w:rPr>
-          <w:b/>
-          <w:bCs/>
-        </w:rPr>
-        <w:t xml:space="preserve">Alla scadenza della sessione di mercato le offerte pervenute saranno visibili da tutti </w:t>
-      </w:r>
-      <w:r>
-        <w:rPr>
-          <w:b/>
-          <w:bCs/>
-        </w:rPr>
-        <w:t xml:space="preserve">in trasparenza </w:t>
-      </w:r>
-      <w:r>
-        <w:rPr>
-          <w:b/>
-          <w:bCs/>
-        </w:rPr>
-        <w:t>e si procederà all’acquisto dichiarando il giocatore da cedere.</w:t>
-      </w:r>
-    </w:p>
-    <w:p>
-      <w:pPr>
-        <w:rPr>
-          <w:b/>
-          <w:bCs/>
-        </w:rPr>
-      </w:pPr>
-      <w:r>
-        <w:rPr>
-          <w:b/>
-          <w:bCs/>
-        </w:rPr>
-        <w:t>L’aggiudicazione di un giocatore avviene nel seguente modo:</w:t>
-      </w:r>
-    </w:p>
-    <w:p>
-      <w:pPr>
-        <w:pStyle w:val="Paragrafoelenco"/>
-        <w:numPr>
-          <w:ilvl w:val="0"/>
-          <w:numId w:val="9"/>
-        </w:numPr>
-        <w:rPr>
-          <w:b/>
-          <w:bCs/>
-        </w:rPr>
-      </w:pPr>
-      <w:r>
-        <w:rPr>
-          <w:b/>
-          <w:bCs/>
-        </w:rPr>
-        <w:t>regola base: per ogni giocatore vince la squadra che ha offerto il prezzo più alto. A parità di prezzo, vince chi ha inviato la proposta prima</w:t>
-      </w:r>
-    </w:p>
-    <w:p>
-      <w:pPr>
-        <w:pStyle w:val="Paragrafoelenco"/>
-        <w:numPr>
-          <w:ilvl w:val="0"/>
-          <w:numId w:val="9"/>
-        </w:numPr>
-        <w:rPr>
-          <w:b/>
-          <w:bCs/>
-        </w:rPr>
-      </w:pPr>
-      <w:r>
-        <w:rPr>
-          <w:b/>
-          <w:bCs/>
-        </w:rPr>
-        <w:t>Cap acquisti: ogni squadra può aggiudicarsi al massimo gli acquisti effettivi concessi, quindi se un presidente effettua 5 proposte e gli acquisti consentiti sono 2 prende i primi 2 giocatori</w:t>
-      </w:r>
-      <w:r>
-        <w:rPr>
-          <w:b/>
-          <w:bCs/>
-        </w:rPr>
-        <w:t xml:space="preserve"> </w:t>
-      </w:r>
-      <w:r>
-        <w:rPr>
-          <w:b/>
-          <w:bCs/>
-        </w:rPr>
-        <w:t>in ordine di priorità</w:t>
-      </w:r>
-      <w:r>
-        <w:rPr>
-          <w:b/>
-          <w:bCs/>
-        </w:rPr>
-        <w:t>, su cui è il miglior offerente.</w:t>
-      </w:r>
-    </w:p>
-    <w:p>
-      <w:pPr>
-        <w:rPr>
-          <w:b/>
-          <w:bCs/>
-        </w:rPr>
-      </w:pPr>
-      <w:r>
-        <w:rPr>
-          <w:b/>
-          <w:bCs/>
-        </w:rPr>
-        <w:t>Per le sessioni di mercato se procediamo con l’acquisto in fantamilioni è previsto all’apertura di ogni sessione un extra bonus di 30 fantamilioni oltre a quelli restanti del mercato di settembre/gennaio. Se procediamo con soldi reali non sono previsti extra bonus e l’offerta non è legata a vincoli</w:t>
-      </w:r>
-      <w:r>
-        <w:rPr>
-          <w:b/>
-          <w:bCs/>
-        </w:rPr>
-        <w:t>.</w:t>
-      </w:r>
-    </w:p>
-    <w:p/>
-    <w:p/>
-    <w:p/>
-    <w:p>
-      <w:pPr>
-        <w:pStyle w:val="Titolo2"/>
-      </w:pPr>
-      <w:r>
-        <w:t xml:space="preserve">Mercato di gennaio  </w:t>
-      </w:r>
-    </w:p>
-    <w:p>
-      <w:r>
-        <w:t xml:space="preserve">Il mercato di riparazione si terrà, subito dopo la conclusione del mercato reale della serie A, fissato per il 31 gennaio. Per investire al mercato di gennaio si usano i fantamilioni restanti dal mercato di settembre; i fantamilioni restanti verranno tramutati in € secondo la seguente regola: 1 € = 5 </w:t>
-      </w:r>
-      <w:proofErr w:type="gramStart"/>
-      <w:r>
-        <w:t>fantamilioni</w:t>
-      </w:r>
-      <w:proofErr w:type="gramEnd"/>
-      <w:r>
-        <w:t xml:space="preserve"> In caso di slittamenti del mercato le partite giocate in meno di 11 giocatori prevedono un 6 politico per ogni giocatore mancante in formazione. I giocatori non potranno più essere ceduti in cambio di soldi reali direttamente al presidente che vende; i giocatori messi sul mercato verranno battuti all’asta e i soldi andranno solo sul montepremi generale.</w:t>
+        <w:t>slittamenti del mercato le partite giocate in meno di 11 giocatori prevedono un 6 politico per ogni giocatore mancante in formazione. I giocatori non potranno più essere ceduti in cambio di soldi reali direttamente al presidente che vende; i giocatori messi sul mercato verranno battuti all’asta e i soldi andranno solo sul montepremi generale.</w:t>
       </w:r>
     </w:p>
     <w:p>
@@ -1561,6 +1838,118 @@
     </w:lvl>
   </w:abstractNum>
   <w:abstractNum w:abstractNumId="1" w15:restartNumberingAfterBreak="0">
+    <w:nsid w:val="21277D14"/>
+    <w:multiLevelType w:val="hybridMultilevel"/>
+    <w:tmpl w:val="7DB2BB9A"/>
+    <w:lvl w:ilvl="0" w:tplc="6D4A3D8A">
+      <w:numFmt w:val="bullet"/>
+      <w:lvlText w:val="-"/>
+      <w:lvlJc w:val="left"/>
+      <w:pPr>
+        <w:ind w:left="720" w:hanging="360"/>
+      </w:pPr>
+      <w:rPr>
+        <w:rFonts w:ascii="Calibri" w:eastAsiaTheme="minorHAnsi" w:hAnsi="Calibri" w:cs="Calibri" w:hint="default"/>
+      </w:rPr>
+    </w:lvl>
+    <w:lvl w:ilvl="1" w:tplc="04100003" w:tentative="1">
+      <w:start w:val="1"/>
+      <w:numFmt w:val="bullet"/>
+      <w:lvlText w:val="o"/>
+      <w:lvlJc w:val="left"/>
+      <w:pPr>
+        <w:ind w:left="1440" w:hanging="360"/>
+      </w:pPr>
+      <w:rPr>
+        <w:rFonts w:ascii="Courier New" w:hAnsi="Courier New" w:cs="Courier New" w:hint="default"/>
+      </w:rPr>
+    </w:lvl>
+    <w:lvl w:ilvl="2" w:tplc="04100005" w:tentative="1">
+      <w:start w:val="1"/>
+      <w:numFmt w:val="bullet"/>
+      <w:lvlText w:val=""/>
+      <w:lvlJc w:val="left"/>
+      <w:pPr>
+        <w:ind w:left="2160" w:hanging="360"/>
+      </w:pPr>
+      <w:rPr>
+        <w:rFonts w:ascii="Wingdings" w:hAnsi="Wingdings" w:hint="default"/>
+      </w:rPr>
+    </w:lvl>
+    <w:lvl w:ilvl="3" w:tplc="04100001" w:tentative="1">
+      <w:start w:val="1"/>
+      <w:numFmt w:val="bullet"/>
+      <w:lvlText w:val=""/>
+      <w:lvlJc w:val="left"/>
+      <w:pPr>
+        <w:ind w:left="2880" w:hanging="360"/>
+      </w:pPr>
+      <w:rPr>
+        <w:rFonts w:ascii="Symbol" w:hAnsi="Symbol" w:hint="default"/>
+      </w:rPr>
+    </w:lvl>
+    <w:lvl w:ilvl="4" w:tplc="04100003" w:tentative="1">
+      <w:start w:val="1"/>
+      <w:numFmt w:val="bullet"/>
+      <w:lvlText w:val="o"/>
+      <w:lvlJc w:val="left"/>
+      <w:pPr>
+        <w:ind w:left="3600" w:hanging="360"/>
+      </w:pPr>
+      <w:rPr>
+        <w:rFonts w:ascii="Courier New" w:hAnsi="Courier New" w:cs="Courier New" w:hint="default"/>
+      </w:rPr>
+    </w:lvl>
+    <w:lvl w:ilvl="5" w:tplc="04100005" w:tentative="1">
+      <w:start w:val="1"/>
+      <w:numFmt w:val="bullet"/>
+      <w:lvlText w:val=""/>
+      <w:lvlJc w:val="left"/>
+      <w:pPr>
+        <w:ind w:left="4320" w:hanging="360"/>
+      </w:pPr>
+      <w:rPr>
+        <w:rFonts w:ascii="Wingdings" w:hAnsi="Wingdings" w:hint="default"/>
+      </w:rPr>
+    </w:lvl>
+    <w:lvl w:ilvl="6" w:tplc="04100001" w:tentative="1">
+      <w:start w:val="1"/>
+      <w:numFmt w:val="bullet"/>
+      <w:lvlText w:val=""/>
+      <w:lvlJc w:val="left"/>
+      <w:pPr>
+        <w:ind w:left="5040" w:hanging="360"/>
+      </w:pPr>
+      <w:rPr>
+        <w:rFonts w:ascii="Symbol" w:hAnsi="Symbol" w:hint="default"/>
+      </w:rPr>
+    </w:lvl>
+    <w:lvl w:ilvl="7" w:tplc="04100003" w:tentative="1">
+      <w:start w:val="1"/>
+      <w:numFmt w:val="bullet"/>
+      <w:lvlText w:val="o"/>
+      <w:lvlJc w:val="left"/>
+      <w:pPr>
+        <w:ind w:left="5760" w:hanging="360"/>
+      </w:pPr>
+      <w:rPr>
+        <w:rFonts w:ascii="Courier New" w:hAnsi="Courier New" w:cs="Courier New" w:hint="default"/>
+      </w:rPr>
+    </w:lvl>
+    <w:lvl w:ilvl="8" w:tplc="04100005" w:tentative="1">
+      <w:start w:val="1"/>
+      <w:numFmt w:val="bullet"/>
+      <w:lvlText w:val=""/>
+      <w:lvlJc w:val="left"/>
+      <w:pPr>
+        <w:ind w:left="6480" w:hanging="360"/>
+      </w:pPr>
+      <w:rPr>
+        <w:rFonts w:ascii="Wingdings" w:hAnsi="Wingdings" w:hint="default"/>
+      </w:rPr>
+    </w:lvl>
+  </w:abstractNum>
+  <w:abstractNum w:abstractNumId="2" w15:restartNumberingAfterBreak="0">
     <w:nsid w:val="21C417C6"/>
     <w:multiLevelType w:val="hybridMultilevel"/>
     <w:tmpl w:val="755A910E"/>
@@ -1673,7 +2062,7 @@
       </w:rPr>
     </w:lvl>
   </w:abstractNum>
-  <w:abstractNum w:abstractNumId="2" w15:restartNumberingAfterBreak="0">
+  <w:abstractNum w:abstractNumId="3" w15:restartNumberingAfterBreak="0">
     <w:nsid w:val="236510C2"/>
     <w:multiLevelType w:val="hybridMultilevel"/>
     <w:tmpl w:val="25E06386"/>
@@ -1786,7 +2175,7 @@
       </w:rPr>
     </w:lvl>
   </w:abstractNum>
-  <w:abstractNum w:abstractNumId="3" w15:restartNumberingAfterBreak="0">
+  <w:abstractNum w:abstractNumId="4" w15:restartNumberingAfterBreak="0">
     <w:nsid w:val="292B1991"/>
     <w:multiLevelType w:val="hybridMultilevel"/>
     <w:tmpl w:val="EC448D02"/>
@@ -1899,7 +2288,119 @@
       </w:rPr>
     </w:lvl>
   </w:abstractNum>
-  <w:abstractNum w:abstractNumId="4" w15:restartNumberingAfterBreak="0">
+  <w:abstractNum w:abstractNumId="5" w15:restartNumberingAfterBreak="0">
+    <w:nsid w:val="2FC12FA8"/>
+    <w:multiLevelType w:val="hybridMultilevel"/>
+    <w:tmpl w:val="2AC65196"/>
+    <w:lvl w:ilvl="0" w:tplc="6D4A3D8A">
+      <w:numFmt w:val="bullet"/>
+      <w:lvlText w:val="-"/>
+      <w:lvlJc w:val="left"/>
+      <w:pPr>
+        <w:ind w:left="720" w:hanging="360"/>
+      </w:pPr>
+      <w:rPr>
+        <w:rFonts w:ascii="Calibri" w:eastAsiaTheme="minorHAnsi" w:hAnsi="Calibri" w:cs="Calibri" w:hint="default"/>
+      </w:rPr>
+    </w:lvl>
+    <w:lvl w:ilvl="1" w:tplc="04100003" w:tentative="1">
+      <w:start w:val="1"/>
+      <w:numFmt w:val="bullet"/>
+      <w:lvlText w:val="o"/>
+      <w:lvlJc w:val="left"/>
+      <w:pPr>
+        <w:ind w:left="1440" w:hanging="360"/>
+      </w:pPr>
+      <w:rPr>
+        <w:rFonts w:ascii="Courier New" w:hAnsi="Courier New" w:cs="Courier New" w:hint="default"/>
+      </w:rPr>
+    </w:lvl>
+    <w:lvl w:ilvl="2" w:tplc="04100005" w:tentative="1">
+      <w:start w:val="1"/>
+      <w:numFmt w:val="bullet"/>
+      <w:lvlText w:val=""/>
+      <w:lvlJc w:val="left"/>
+      <w:pPr>
+        <w:ind w:left="2160" w:hanging="360"/>
+      </w:pPr>
+      <w:rPr>
+        <w:rFonts w:ascii="Wingdings" w:hAnsi="Wingdings" w:hint="default"/>
+      </w:rPr>
+    </w:lvl>
+    <w:lvl w:ilvl="3" w:tplc="04100001" w:tentative="1">
+      <w:start w:val="1"/>
+      <w:numFmt w:val="bullet"/>
+      <w:lvlText w:val=""/>
+      <w:lvlJc w:val="left"/>
+      <w:pPr>
+        <w:ind w:left="2880" w:hanging="360"/>
+      </w:pPr>
+      <w:rPr>
+        <w:rFonts w:ascii="Symbol" w:hAnsi="Symbol" w:hint="default"/>
+      </w:rPr>
+    </w:lvl>
+    <w:lvl w:ilvl="4" w:tplc="04100003" w:tentative="1">
+      <w:start w:val="1"/>
+      <w:numFmt w:val="bullet"/>
+      <w:lvlText w:val="o"/>
+      <w:lvlJc w:val="left"/>
+      <w:pPr>
+        <w:ind w:left="3600" w:hanging="360"/>
+      </w:pPr>
+      <w:rPr>
+        <w:rFonts w:ascii="Courier New" w:hAnsi="Courier New" w:cs="Courier New" w:hint="default"/>
+      </w:rPr>
+    </w:lvl>
+    <w:lvl w:ilvl="5" w:tplc="04100005" w:tentative="1">
+      <w:start w:val="1"/>
+      <w:numFmt w:val="bullet"/>
+      <w:lvlText w:val=""/>
+      <w:lvlJc w:val="left"/>
+      <w:pPr>
+        <w:ind w:left="4320" w:hanging="360"/>
+      </w:pPr>
+      <w:rPr>
+        <w:rFonts w:ascii="Wingdings" w:hAnsi="Wingdings" w:hint="default"/>
+      </w:rPr>
+    </w:lvl>
+    <w:lvl w:ilvl="6" w:tplc="04100001" w:tentative="1">
+      <w:start w:val="1"/>
+      <w:numFmt w:val="bullet"/>
+      <w:lvlText w:val=""/>
+      <w:lvlJc w:val="left"/>
+      <w:pPr>
+        <w:ind w:left="5040" w:hanging="360"/>
+      </w:pPr>
+      <w:rPr>
+        <w:rFonts w:ascii="Symbol" w:hAnsi="Symbol" w:hint="default"/>
+      </w:rPr>
+    </w:lvl>
+    <w:lvl w:ilvl="7" w:tplc="04100003" w:tentative="1">
+      <w:start w:val="1"/>
+      <w:numFmt w:val="bullet"/>
+      <w:lvlText w:val="o"/>
+      <w:lvlJc w:val="left"/>
+      <w:pPr>
+        <w:ind w:left="5760" w:hanging="360"/>
+      </w:pPr>
+      <w:rPr>
+        <w:rFonts w:ascii="Courier New" w:hAnsi="Courier New" w:cs="Courier New" w:hint="default"/>
+      </w:rPr>
+    </w:lvl>
+    <w:lvl w:ilvl="8" w:tplc="04100005" w:tentative="1">
+      <w:start w:val="1"/>
+      <w:numFmt w:val="bullet"/>
+      <w:lvlText w:val=""/>
+      <w:lvlJc w:val="left"/>
+      <w:pPr>
+        <w:ind w:left="6480" w:hanging="360"/>
+      </w:pPr>
+      <w:rPr>
+        <w:rFonts w:ascii="Wingdings" w:hAnsi="Wingdings" w:hint="default"/>
+      </w:rPr>
+    </w:lvl>
+  </w:abstractNum>
+  <w:abstractNum w:abstractNumId="6" w15:restartNumberingAfterBreak="0">
     <w:nsid w:val="42F45ABE"/>
     <w:multiLevelType w:val="hybridMultilevel"/>
     <w:tmpl w:val="B6625492"/>
@@ -2011,7 +2512,7 @@
       </w:rPr>
     </w:lvl>
   </w:abstractNum>
-  <w:abstractNum w:abstractNumId="5" w15:restartNumberingAfterBreak="0">
+  <w:abstractNum w:abstractNumId="7" w15:restartNumberingAfterBreak="0">
     <w:nsid w:val="47181E04"/>
     <w:multiLevelType w:val="hybridMultilevel"/>
     <w:tmpl w:val="6E2CE55C"/>
@@ -2123,7 +2624,7 @@
       </w:rPr>
     </w:lvl>
   </w:abstractNum>
-  <w:abstractNum w:abstractNumId="6" w15:restartNumberingAfterBreak="0">
+  <w:abstractNum w:abstractNumId="8" w15:restartNumberingAfterBreak="0">
     <w:nsid w:val="5E2D33B9"/>
     <w:multiLevelType w:val="hybridMultilevel"/>
     <w:tmpl w:val="14960ACC"/>
@@ -2236,7 +2737,7 @@
       </w:rPr>
     </w:lvl>
   </w:abstractNum>
-  <w:abstractNum w:abstractNumId="7" w15:restartNumberingAfterBreak="0">
+  <w:abstractNum w:abstractNumId="9" w15:restartNumberingAfterBreak="0">
     <w:nsid w:val="700D66D2"/>
     <w:multiLevelType w:val="hybridMultilevel"/>
     <w:tmpl w:val="B3BA5AE8"/>
@@ -2349,7 +2850,7 @@
       </w:rPr>
     </w:lvl>
   </w:abstractNum>
-  <w:abstractNum w:abstractNumId="8" w15:restartNumberingAfterBreak="0">
+  <w:abstractNum w:abstractNumId="10" w15:restartNumberingAfterBreak="0">
     <w:nsid w:val="72353A77"/>
     <w:multiLevelType w:val="hybridMultilevel"/>
     <w:tmpl w:val="57502344"/>
@@ -2463,31 +2964,37 @@
     </w:lvl>
   </w:abstractNum>
   <w:num w:numId="1" w16cid:durableId="1235234935">
+    <w:abstractNumId w:val="10"/>
+  </w:num>
+  <w:num w:numId="2" w16cid:durableId="1808547614">
+    <w:abstractNumId w:val="2"/>
+  </w:num>
+  <w:num w:numId="3" w16cid:durableId="1125194435">
+    <w:abstractNumId w:val="9"/>
+  </w:num>
+  <w:num w:numId="4" w16cid:durableId="998002894">
+    <w:abstractNumId w:val="4"/>
+  </w:num>
+  <w:num w:numId="5" w16cid:durableId="171259058">
     <w:abstractNumId w:val="8"/>
   </w:num>
-  <w:num w:numId="2" w16cid:durableId="1808547614">
-    <w:abstractNumId w:val="1"/>
-  </w:num>
-  <w:num w:numId="3" w16cid:durableId="1125194435">
-    <w:abstractNumId w:val="7"/>
-  </w:num>
-  <w:num w:numId="4" w16cid:durableId="998002894">
+  <w:num w:numId="6" w16cid:durableId="642078686">
     <w:abstractNumId w:val="3"/>
-  </w:num>
-  <w:num w:numId="5" w16cid:durableId="171259058">
-    <w:abstractNumId w:val="6"/>
-  </w:num>
-  <w:num w:numId="6" w16cid:durableId="642078686">
-    <w:abstractNumId w:val="2"/>
   </w:num>
   <w:num w:numId="7" w16cid:durableId="1473905170">
     <w:abstractNumId w:val="0"/>
   </w:num>
   <w:num w:numId="8" w16cid:durableId="849641207">
+    <w:abstractNumId w:val="7"/>
+  </w:num>
+  <w:num w:numId="9" w16cid:durableId="1176336906">
+    <w:abstractNumId w:val="6"/>
+  </w:num>
+  <w:num w:numId="10" w16cid:durableId="1626812830">
     <w:abstractNumId w:val="5"/>
   </w:num>
-  <w:num w:numId="9" w16cid:durableId="1176336906">
-    <w:abstractNumId w:val="4"/>
+  <w:num w:numId="11" w16cid:durableId="2082438036">
+    <w:abstractNumId w:val="1"/>
   </w:num>
 </w:numbering>
 </file>

</xml_diff>

<commit_message>
refactor: update regulation document with table of contents and improved structure
</commit_message>
<xml_diff>
--- a/public/docs/Regolamento_erFantacalcio.docx
+++ b/public/docs/Regolamento_erFantacalcio.docx
@@ -7,14 +7,10 @@
         <w:pStyle w:val="Titolo1"/>
         <w:jc w:val="center"/>
       </w:pPr>
-      <w:r>
-        <w:t xml:space="preserve">Regolamento </w:t>
-      </w:r>
-      <w:proofErr w:type="spellStart"/>
-      <w:r>
-        <w:t>erFantacalcio</w:t>
-      </w:r>
-      <w:proofErr w:type="spellEnd"/>
+      <w:bookmarkStart w:id="0" w:name="_Toc233877185"/>
+      <w:r>
+        <w:t>Regolamento erFantacalcio</w:t>
+      </w:r>
       <w:r>
         <w:t xml:space="preserve"> 202</w:t>
       </w:r>
@@ -26,17 +22,1707 @@
       </w:r>
       <w:r>
         <w:t>7</w:t>
+      </w:r>
+      <w:bookmarkEnd w:id="0"/>
+    </w:p>
+    <w:p/>
+    <w:p/>
+    <w:sdt>
+      <w:sdtPr>
+        <w:id w:val="1842969797"/>
+        <w:docPartObj>
+          <w:docPartGallery w:val="Table of Contents"/>
+          <w:docPartUnique/>
+        </w:docPartObj>
+      </w:sdtPr>
+      <w:sdtEndPr>
+        <w:rPr>
+          <w:rFonts w:asciiTheme="minorHAnsi" w:eastAsiaTheme="minorHAnsi" w:hAnsiTheme="minorHAnsi" w:cstheme="minorBidi"/>
+          <w:b/>
+          <w:bCs/>
+          <w:color w:val="auto"/>
+          <w:sz w:val="22"/>
+          <w:szCs w:val="22"/>
+          <w:lang w:eastAsia="en-US"/>
+        </w:rPr>
+      </w:sdtEndPr>
+      <w:sdtContent>
+        <w:p>
+          <w:pPr>
+            <w:pStyle w:val="Titolosommario"/>
+          </w:pPr>
+          <w:r>
+            <w:t>Sommario</w:t>
+          </w:r>
+        </w:p>
+        <w:p>
+          <w:pPr>
+            <w:pStyle w:val="Sommario1"/>
+            <w:tabs>
+              <w:tab w:val="right" w:leader="dot" w:pos="9628"/>
+            </w:tabs>
+            <w:rPr>
+              <w:rFonts w:eastAsiaTheme="minorEastAsia"/>
+              <w:noProof/>
+              <w:kern w:val="2"/>
+              <w:sz w:val="24"/>
+              <w:szCs w:val="24"/>
+              <w:lang w:eastAsia="it-IT"/>
+              <w14:ligatures w14:val="standardContextual"/>
+            </w:rPr>
+          </w:pPr>
+          <w:r>
+            <w:fldChar w:fldCharType="begin"/>
+          </w:r>
+          <w:r>
+            <w:instrText xml:space="preserve"> TOC \o "1-3" \h \z \u </w:instrText>
+          </w:r>
+          <w:r>
+            <w:fldChar w:fldCharType="separate"/>
+          </w:r>
+          <w:hyperlink w:anchor="_Toc233877185" w:history="1">
+            <w:r>
+              <w:rPr>
+                <w:rStyle w:val="Collegamentoipertestuale"/>
+                <w:noProof/>
+              </w:rPr>
+              <w:t>Regolamento erFantacalcio 2026-2027</w:t>
+            </w:r>
+            <w:r>
+              <w:rPr>
+                <w:noProof/>
+                <w:webHidden/>
+              </w:rPr>
+              <w:tab/>
+            </w:r>
+            <w:r>
+              <w:rPr>
+                <w:noProof/>
+                <w:webHidden/>
+              </w:rPr>
+              <w:fldChar w:fldCharType="begin"/>
+            </w:r>
+            <w:r>
+              <w:rPr>
+                <w:noProof/>
+                <w:webHidden/>
+              </w:rPr>
+              <w:instrText xml:space="preserve"> PAGEREF _Toc233877185 \h </w:instrText>
+            </w:r>
+            <w:r>
+              <w:rPr>
+                <w:noProof/>
+                <w:webHidden/>
+              </w:rPr>
+            </w:r>
+            <w:r>
+              <w:rPr>
+                <w:noProof/>
+                <w:webHidden/>
+              </w:rPr>
+              <w:fldChar w:fldCharType="separate"/>
+            </w:r>
+            <w:r>
+              <w:rPr>
+                <w:noProof/>
+                <w:webHidden/>
+              </w:rPr>
+              <w:t>1</w:t>
+            </w:r>
+            <w:r>
+              <w:rPr>
+                <w:noProof/>
+                <w:webHidden/>
+              </w:rPr>
+              <w:fldChar w:fldCharType="end"/>
+            </w:r>
+          </w:hyperlink>
+        </w:p>
+        <w:p>
+          <w:pPr>
+            <w:pStyle w:val="Sommario2"/>
+            <w:tabs>
+              <w:tab w:val="right" w:leader="dot" w:pos="9628"/>
+            </w:tabs>
+            <w:rPr>
+              <w:rFonts w:eastAsiaTheme="minorEastAsia"/>
+              <w:noProof/>
+              <w:kern w:val="2"/>
+              <w:sz w:val="24"/>
+              <w:szCs w:val="24"/>
+              <w:lang w:eastAsia="it-IT"/>
+              <w14:ligatures w14:val="standardContextual"/>
+            </w:rPr>
+          </w:pPr>
+          <w:hyperlink w:anchor="_Toc233877186" w:history="1">
+            <w:r>
+              <w:rPr>
+                <w:rStyle w:val="Collegamentoipertestuale"/>
+                <w:noProof/>
+              </w:rPr>
+              <w:t>Calendario stagionale</w:t>
+            </w:r>
+            <w:r>
+              <w:rPr>
+                <w:noProof/>
+                <w:webHidden/>
+              </w:rPr>
+              <w:tab/>
+            </w:r>
+            <w:r>
+              <w:rPr>
+                <w:noProof/>
+                <w:webHidden/>
+              </w:rPr>
+              <w:fldChar w:fldCharType="begin"/>
+            </w:r>
+            <w:r>
+              <w:rPr>
+                <w:noProof/>
+                <w:webHidden/>
+              </w:rPr>
+              <w:instrText xml:space="preserve"> PAGEREF _Toc233877186 \h </w:instrText>
+            </w:r>
+            <w:r>
+              <w:rPr>
+                <w:noProof/>
+                <w:webHidden/>
+              </w:rPr>
+            </w:r>
+            <w:r>
+              <w:rPr>
+                <w:noProof/>
+                <w:webHidden/>
+              </w:rPr>
+              <w:fldChar w:fldCharType="separate"/>
+            </w:r>
+            <w:r>
+              <w:rPr>
+                <w:noProof/>
+                <w:webHidden/>
+              </w:rPr>
+              <w:t>2</w:t>
+            </w:r>
+            <w:r>
+              <w:rPr>
+                <w:noProof/>
+                <w:webHidden/>
+              </w:rPr>
+              <w:fldChar w:fldCharType="end"/>
+            </w:r>
+          </w:hyperlink>
+        </w:p>
+        <w:p>
+          <w:pPr>
+            <w:pStyle w:val="Sommario3"/>
+            <w:tabs>
+              <w:tab w:val="right" w:leader="dot" w:pos="9628"/>
+            </w:tabs>
+            <w:rPr>
+              <w:rFonts w:cstheme="minorBidi"/>
+              <w:noProof/>
+              <w:kern w:val="2"/>
+              <w:sz w:val="24"/>
+              <w:szCs w:val="24"/>
+              <w14:ligatures w14:val="standardContextual"/>
+            </w:rPr>
+          </w:pPr>
+          <w:hyperlink w:anchor="_Toc233877187" w:history="1">
+            <w:r>
+              <w:rPr>
+                <w:rStyle w:val="Collegamentoipertestuale"/>
+                <w:noProof/>
+              </w:rPr>
+              <w:t>Campionato</w:t>
+            </w:r>
+            <w:r>
+              <w:rPr>
+                <w:noProof/>
+                <w:webHidden/>
+              </w:rPr>
+              <w:tab/>
+            </w:r>
+            <w:r>
+              <w:rPr>
+                <w:noProof/>
+                <w:webHidden/>
+              </w:rPr>
+              <w:fldChar w:fldCharType="begin"/>
+            </w:r>
+            <w:r>
+              <w:rPr>
+                <w:noProof/>
+                <w:webHidden/>
+              </w:rPr>
+              <w:instrText xml:space="preserve"> PAGEREF _Toc233877187 \h </w:instrText>
+            </w:r>
+            <w:r>
+              <w:rPr>
+                <w:noProof/>
+                <w:webHidden/>
+              </w:rPr>
+            </w:r>
+            <w:r>
+              <w:rPr>
+                <w:noProof/>
+                <w:webHidden/>
+              </w:rPr>
+              <w:fldChar w:fldCharType="separate"/>
+            </w:r>
+            <w:r>
+              <w:rPr>
+                <w:noProof/>
+                <w:webHidden/>
+              </w:rPr>
+              <w:t>2</w:t>
+            </w:r>
+            <w:r>
+              <w:rPr>
+                <w:noProof/>
+                <w:webHidden/>
+              </w:rPr>
+              <w:fldChar w:fldCharType="end"/>
+            </w:r>
+          </w:hyperlink>
+        </w:p>
+        <w:p>
+          <w:pPr>
+            <w:pStyle w:val="Sommario3"/>
+            <w:tabs>
+              <w:tab w:val="right" w:leader="dot" w:pos="9628"/>
+            </w:tabs>
+            <w:rPr>
+              <w:rFonts w:cstheme="minorBidi"/>
+              <w:noProof/>
+              <w:kern w:val="2"/>
+              <w:sz w:val="24"/>
+              <w:szCs w:val="24"/>
+              <w14:ligatures w14:val="standardContextual"/>
+            </w:rPr>
+          </w:pPr>
+          <w:hyperlink w:anchor="_Toc233877188" w:history="1">
+            <w:r>
+              <w:rPr>
+                <w:rStyle w:val="Collegamentoipertestuale"/>
+                <w:noProof/>
+              </w:rPr>
+              <w:t>Champions</w:t>
+            </w:r>
+            <w:r>
+              <w:rPr>
+                <w:noProof/>
+                <w:webHidden/>
+              </w:rPr>
+              <w:tab/>
+            </w:r>
+            <w:r>
+              <w:rPr>
+                <w:noProof/>
+                <w:webHidden/>
+              </w:rPr>
+              <w:fldChar w:fldCharType="begin"/>
+            </w:r>
+            <w:r>
+              <w:rPr>
+                <w:noProof/>
+                <w:webHidden/>
+              </w:rPr>
+              <w:instrText xml:space="preserve"> PAGEREF _Toc233877188 \h </w:instrText>
+            </w:r>
+            <w:r>
+              <w:rPr>
+                <w:noProof/>
+                <w:webHidden/>
+              </w:rPr>
+            </w:r>
+            <w:r>
+              <w:rPr>
+                <w:noProof/>
+                <w:webHidden/>
+              </w:rPr>
+              <w:fldChar w:fldCharType="separate"/>
+            </w:r>
+            <w:r>
+              <w:rPr>
+                <w:noProof/>
+                <w:webHidden/>
+              </w:rPr>
+              <w:t>2</w:t>
+            </w:r>
+            <w:r>
+              <w:rPr>
+                <w:noProof/>
+                <w:webHidden/>
+              </w:rPr>
+              <w:fldChar w:fldCharType="end"/>
+            </w:r>
+          </w:hyperlink>
+        </w:p>
+        <w:p>
+          <w:pPr>
+            <w:pStyle w:val="Sommario3"/>
+            <w:tabs>
+              <w:tab w:val="right" w:leader="dot" w:pos="9628"/>
+            </w:tabs>
+            <w:rPr>
+              <w:rFonts w:cstheme="minorBidi"/>
+              <w:noProof/>
+              <w:kern w:val="2"/>
+              <w:sz w:val="24"/>
+              <w:szCs w:val="24"/>
+              <w14:ligatures w14:val="standardContextual"/>
+            </w:rPr>
+          </w:pPr>
+          <w:hyperlink w:anchor="_Toc233877189" w:history="1">
+            <w:r>
+              <w:rPr>
+                <w:rStyle w:val="Collegamentoipertestuale"/>
+                <w:noProof/>
+              </w:rPr>
+              <w:t>Coppa dei perdenti</w:t>
+            </w:r>
+            <w:r>
+              <w:rPr>
+                <w:noProof/>
+                <w:webHidden/>
+              </w:rPr>
+              <w:tab/>
+            </w:r>
+            <w:r>
+              <w:rPr>
+                <w:noProof/>
+                <w:webHidden/>
+              </w:rPr>
+              <w:fldChar w:fldCharType="begin"/>
+            </w:r>
+            <w:r>
+              <w:rPr>
+                <w:noProof/>
+                <w:webHidden/>
+              </w:rPr>
+              <w:instrText xml:space="preserve"> PAGEREF _Toc233877189 \h </w:instrText>
+            </w:r>
+            <w:r>
+              <w:rPr>
+                <w:noProof/>
+                <w:webHidden/>
+              </w:rPr>
+            </w:r>
+            <w:r>
+              <w:rPr>
+                <w:noProof/>
+                <w:webHidden/>
+              </w:rPr>
+              <w:fldChar w:fldCharType="separate"/>
+            </w:r>
+            <w:r>
+              <w:rPr>
+                <w:noProof/>
+                <w:webHidden/>
+              </w:rPr>
+              <w:t>2</w:t>
+            </w:r>
+            <w:r>
+              <w:rPr>
+                <w:noProof/>
+                <w:webHidden/>
+              </w:rPr>
+              <w:fldChar w:fldCharType="end"/>
+            </w:r>
+          </w:hyperlink>
+        </w:p>
+        <w:p>
+          <w:pPr>
+            <w:pStyle w:val="Sommario2"/>
+            <w:tabs>
+              <w:tab w:val="right" w:leader="dot" w:pos="9628"/>
+            </w:tabs>
+            <w:rPr>
+              <w:rFonts w:eastAsiaTheme="minorEastAsia"/>
+              <w:noProof/>
+              <w:kern w:val="2"/>
+              <w:sz w:val="24"/>
+              <w:szCs w:val="24"/>
+              <w:lang w:eastAsia="it-IT"/>
+              <w14:ligatures w14:val="standardContextual"/>
+            </w:rPr>
+          </w:pPr>
+          <w:hyperlink w:anchor="_Toc233877190" w:history="1">
+            <w:r>
+              <w:rPr>
+                <w:rStyle w:val="Collegamentoipertestuale"/>
+                <w:noProof/>
+              </w:rPr>
+              <w:t>Rose</w:t>
+            </w:r>
+            <w:r>
+              <w:rPr>
+                <w:noProof/>
+                <w:webHidden/>
+              </w:rPr>
+              <w:tab/>
+            </w:r>
+            <w:r>
+              <w:rPr>
+                <w:noProof/>
+                <w:webHidden/>
+              </w:rPr>
+              <w:fldChar w:fldCharType="begin"/>
+            </w:r>
+            <w:r>
+              <w:rPr>
+                <w:noProof/>
+                <w:webHidden/>
+              </w:rPr>
+              <w:instrText xml:space="preserve"> PAGEREF _Toc233877190 \h </w:instrText>
+            </w:r>
+            <w:r>
+              <w:rPr>
+                <w:noProof/>
+                <w:webHidden/>
+              </w:rPr>
+            </w:r>
+            <w:r>
+              <w:rPr>
+                <w:noProof/>
+                <w:webHidden/>
+              </w:rPr>
+              <w:fldChar w:fldCharType="separate"/>
+            </w:r>
+            <w:r>
+              <w:rPr>
+                <w:noProof/>
+                <w:webHidden/>
+              </w:rPr>
+              <w:t>3</w:t>
+            </w:r>
+            <w:r>
+              <w:rPr>
+                <w:noProof/>
+                <w:webHidden/>
+              </w:rPr>
+              <w:fldChar w:fldCharType="end"/>
+            </w:r>
+          </w:hyperlink>
+        </w:p>
+        <w:p>
+          <w:pPr>
+            <w:pStyle w:val="Sommario2"/>
+            <w:tabs>
+              <w:tab w:val="right" w:leader="dot" w:pos="9628"/>
+            </w:tabs>
+            <w:rPr>
+              <w:rFonts w:eastAsiaTheme="minorEastAsia"/>
+              <w:noProof/>
+              <w:kern w:val="2"/>
+              <w:sz w:val="24"/>
+              <w:szCs w:val="24"/>
+              <w:lang w:eastAsia="it-IT"/>
+              <w14:ligatures w14:val="standardContextual"/>
+            </w:rPr>
+          </w:pPr>
+          <w:hyperlink w:anchor="_Toc233877191" w:history="1">
+            <w:r>
+              <w:rPr>
+                <w:rStyle w:val="Collegamentoipertestuale"/>
+                <w:noProof/>
+              </w:rPr>
+              <w:t>Acquisto portieri</w:t>
+            </w:r>
+            <w:r>
+              <w:rPr>
+                <w:noProof/>
+                <w:webHidden/>
+              </w:rPr>
+              <w:tab/>
+            </w:r>
+            <w:r>
+              <w:rPr>
+                <w:noProof/>
+                <w:webHidden/>
+              </w:rPr>
+              <w:fldChar w:fldCharType="begin"/>
+            </w:r>
+            <w:r>
+              <w:rPr>
+                <w:noProof/>
+                <w:webHidden/>
+              </w:rPr>
+              <w:instrText xml:space="preserve"> PAGEREF _Toc233877191 \h </w:instrText>
+            </w:r>
+            <w:r>
+              <w:rPr>
+                <w:noProof/>
+                <w:webHidden/>
+              </w:rPr>
+            </w:r>
+            <w:r>
+              <w:rPr>
+                <w:noProof/>
+                <w:webHidden/>
+              </w:rPr>
+              <w:fldChar w:fldCharType="separate"/>
+            </w:r>
+            <w:r>
+              <w:rPr>
+                <w:noProof/>
+                <w:webHidden/>
+              </w:rPr>
+              <w:t>3</w:t>
+            </w:r>
+            <w:r>
+              <w:rPr>
+                <w:noProof/>
+                <w:webHidden/>
+              </w:rPr>
+              <w:fldChar w:fldCharType="end"/>
+            </w:r>
+          </w:hyperlink>
+        </w:p>
+        <w:p>
+          <w:pPr>
+            <w:pStyle w:val="Sommario2"/>
+            <w:tabs>
+              <w:tab w:val="right" w:leader="dot" w:pos="9628"/>
+            </w:tabs>
+            <w:rPr>
+              <w:rFonts w:eastAsiaTheme="minorEastAsia"/>
+              <w:noProof/>
+              <w:kern w:val="2"/>
+              <w:sz w:val="24"/>
+              <w:szCs w:val="24"/>
+              <w:lang w:eastAsia="it-IT"/>
+              <w14:ligatures w14:val="standardContextual"/>
+            </w:rPr>
+          </w:pPr>
+          <w:hyperlink w:anchor="_Toc233877192" w:history="1">
+            <w:r>
+              <w:rPr>
+                <w:rStyle w:val="Collegamentoipertestuale"/>
+                <w:noProof/>
+              </w:rPr>
+              <w:t>Schieramento formazione</w:t>
+            </w:r>
+            <w:r>
+              <w:rPr>
+                <w:noProof/>
+                <w:webHidden/>
+              </w:rPr>
+              <w:tab/>
+            </w:r>
+            <w:r>
+              <w:rPr>
+                <w:noProof/>
+                <w:webHidden/>
+              </w:rPr>
+              <w:fldChar w:fldCharType="begin"/>
+            </w:r>
+            <w:r>
+              <w:rPr>
+                <w:noProof/>
+                <w:webHidden/>
+              </w:rPr>
+              <w:instrText xml:space="preserve"> PAGEREF _Toc233877192 \h </w:instrText>
+            </w:r>
+            <w:r>
+              <w:rPr>
+                <w:noProof/>
+                <w:webHidden/>
+              </w:rPr>
+            </w:r>
+            <w:r>
+              <w:rPr>
+                <w:noProof/>
+                <w:webHidden/>
+              </w:rPr>
+              <w:fldChar w:fldCharType="separate"/>
+            </w:r>
+            <w:r>
+              <w:rPr>
+                <w:noProof/>
+                <w:webHidden/>
+              </w:rPr>
+              <w:t>3</w:t>
+            </w:r>
+            <w:r>
+              <w:rPr>
+                <w:noProof/>
+                <w:webHidden/>
+              </w:rPr>
+              <w:fldChar w:fldCharType="end"/>
+            </w:r>
+          </w:hyperlink>
+        </w:p>
+        <w:p>
+          <w:pPr>
+            <w:pStyle w:val="Sommario2"/>
+            <w:tabs>
+              <w:tab w:val="right" w:leader="dot" w:pos="9628"/>
+            </w:tabs>
+            <w:rPr>
+              <w:rFonts w:eastAsiaTheme="minorEastAsia"/>
+              <w:noProof/>
+              <w:kern w:val="2"/>
+              <w:sz w:val="24"/>
+              <w:szCs w:val="24"/>
+              <w:lang w:eastAsia="it-IT"/>
+              <w14:ligatures w14:val="standardContextual"/>
+            </w:rPr>
+          </w:pPr>
+          <w:hyperlink w:anchor="_Toc233877193" w:history="1">
+            <w:r>
+              <w:rPr>
+                <w:rStyle w:val="Collegamentoipertestuale"/>
+                <w:noProof/>
+              </w:rPr>
+              <w:t>Voti</w:t>
+            </w:r>
+            <w:r>
+              <w:rPr>
+                <w:noProof/>
+                <w:webHidden/>
+              </w:rPr>
+              <w:tab/>
+            </w:r>
+            <w:r>
+              <w:rPr>
+                <w:noProof/>
+                <w:webHidden/>
+              </w:rPr>
+              <w:fldChar w:fldCharType="begin"/>
+            </w:r>
+            <w:r>
+              <w:rPr>
+                <w:noProof/>
+                <w:webHidden/>
+              </w:rPr>
+              <w:instrText xml:space="preserve"> PAGEREF _Toc233877193 \h </w:instrText>
+            </w:r>
+            <w:r>
+              <w:rPr>
+                <w:noProof/>
+                <w:webHidden/>
+              </w:rPr>
+            </w:r>
+            <w:r>
+              <w:rPr>
+                <w:noProof/>
+                <w:webHidden/>
+              </w:rPr>
+              <w:fldChar w:fldCharType="separate"/>
+            </w:r>
+            <w:r>
+              <w:rPr>
+                <w:noProof/>
+                <w:webHidden/>
+              </w:rPr>
+              <w:t>3</w:t>
+            </w:r>
+            <w:r>
+              <w:rPr>
+                <w:noProof/>
+                <w:webHidden/>
+              </w:rPr>
+              <w:fldChar w:fldCharType="end"/>
+            </w:r>
+          </w:hyperlink>
+        </w:p>
+        <w:p>
+          <w:pPr>
+            <w:pStyle w:val="Sommario2"/>
+            <w:tabs>
+              <w:tab w:val="right" w:leader="dot" w:pos="9628"/>
+            </w:tabs>
+            <w:rPr>
+              <w:rFonts w:eastAsiaTheme="minorEastAsia"/>
+              <w:noProof/>
+              <w:kern w:val="2"/>
+              <w:sz w:val="24"/>
+              <w:szCs w:val="24"/>
+              <w:lang w:eastAsia="it-IT"/>
+              <w14:ligatures w14:val="standardContextual"/>
+            </w:rPr>
+          </w:pPr>
+          <w:hyperlink w:anchor="_Toc233877194" w:history="1">
+            <w:r>
+              <w:rPr>
+                <w:rStyle w:val="Collegamentoipertestuale"/>
+                <w:noProof/>
+              </w:rPr>
+              <w:t>Sostituzioni della partita</w:t>
+            </w:r>
+            <w:r>
+              <w:rPr>
+                <w:noProof/>
+                <w:webHidden/>
+              </w:rPr>
+              <w:tab/>
+            </w:r>
+            <w:r>
+              <w:rPr>
+                <w:noProof/>
+                <w:webHidden/>
+              </w:rPr>
+              <w:fldChar w:fldCharType="begin"/>
+            </w:r>
+            <w:r>
+              <w:rPr>
+                <w:noProof/>
+                <w:webHidden/>
+              </w:rPr>
+              <w:instrText xml:space="preserve"> PAGEREF _Toc233877194 \h </w:instrText>
+            </w:r>
+            <w:r>
+              <w:rPr>
+                <w:noProof/>
+                <w:webHidden/>
+              </w:rPr>
+            </w:r>
+            <w:r>
+              <w:rPr>
+                <w:noProof/>
+                <w:webHidden/>
+              </w:rPr>
+              <w:fldChar w:fldCharType="separate"/>
+            </w:r>
+            <w:r>
+              <w:rPr>
+                <w:noProof/>
+                <w:webHidden/>
+              </w:rPr>
+              <w:t>4</w:t>
+            </w:r>
+            <w:r>
+              <w:rPr>
+                <w:noProof/>
+                <w:webHidden/>
+              </w:rPr>
+              <w:fldChar w:fldCharType="end"/>
+            </w:r>
+          </w:hyperlink>
+        </w:p>
+        <w:p>
+          <w:pPr>
+            <w:pStyle w:val="Sommario2"/>
+            <w:tabs>
+              <w:tab w:val="right" w:leader="dot" w:pos="9628"/>
+            </w:tabs>
+            <w:rPr>
+              <w:rFonts w:eastAsiaTheme="minorEastAsia"/>
+              <w:noProof/>
+              <w:kern w:val="2"/>
+              <w:sz w:val="24"/>
+              <w:szCs w:val="24"/>
+              <w:lang w:eastAsia="it-IT"/>
+              <w14:ligatures w14:val="standardContextual"/>
+            </w:rPr>
+          </w:pPr>
+          <w:hyperlink w:anchor="_Toc233877195" w:history="1">
+            <w:r>
+              <w:rPr>
+                <w:rStyle w:val="Collegamentoipertestuale"/>
+                <w:noProof/>
+              </w:rPr>
+              <w:t>Bonus / Malus</w:t>
+            </w:r>
+            <w:r>
+              <w:rPr>
+                <w:noProof/>
+                <w:webHidden/>
+              </w:rPr>
+              <w:tab/>
+            </w:r>
+            <w:r>
+              <w:rPr>
+                <w:noProof/>
+                <w:webHidden/>
+              </w:rPr>
+              <w:fldChar w:fldCharType="begin"/>
+            </w:r>
+            <w:r>
+              <w:rPr>
+                <w:noProof/>
+                <w:webHidden/>
+              </w:rPr>
+              <w:instrText xml:space="preserve"> PAGEREF _Toc233877195 \h </w:instrText>
+            </w:r>
+            <w:r>
+              <w:rPr>
+                <w:noProof/>
+                <w:webHidden/>
+              </w:rPr>
+            </w:r>
+            <w:r>
+              <w:rPr>
+                <w:noProof/>
+                <w:webHidden/>
+              </w:rPr>
+              <w:fldChar w:fldCharType="separate"/>
+            </w:r>
+            <w:r>
+              <w:rPr>
+                <w:noProof/>
+                <w:webHidden/>
+              </w:rPr>
+              <w:t>4</w:t>
+            </w:r>
+            <w:r>
+              <w:rPr>
+                <w:noProof/>
+                <w:webHidden/>
+              </w:rPr>
+              <w:fldChar w:fldCharType="end"/>
+            </w:r>
+          </w:hyperlink>
+        </w:p>
+        <w:p>
+          <w:pPr>
+            <w:pStyle w:val="Sommario2"/>
+            <w:tabs>
+              <w:tab w:val="right" w:leader="dot" w:pos="9628"/>
+            </w:tabs>
+            <w:rPr>
+              <w:rFonts w:eastAsiaTheme="minorEastAsia"/>
+              <w:noProof/>
+              <w:kern w:val="2"/>
+              <w:sz w:val="24"/>
+              <w:szCs w:val="24"/>
+              <w:lang w:eastAsia="it-IT"/>
+              <w14:ligatures w14:val="standardContextual"/>
+            </w:rPr>
+          </w:pPr>
+          <w:hyperlink w:anchor="_Toc233877196" w:history="1">
+            <w:r>
+              <w:rPr>
+                <w:rStyle w:val="Collegamentoipertestuale"/>
+                <w:noProof/>
+              </w:rPr>
+              <w:t>Calcolo dei gol</w:t>
+            </w:r>
+            <w:r>
+              <w:rPr>
+                <w:noProof/>
+                <w:webHidden/>
+              </w:rPr>
+              <w:tab/>
+            </w:r>
+            <w:r>
+              <w:rPr>
+                <w:noProof/>
+                <w:webHidden/>
+              </w:rPr>
+              <w:fldChar w:fldCharType="begin"/>
+            </w:r>
+            <w:r>
+              <w:rPr>
+                <w:noProof/>
+                <w:webHidden/>
+              </w:rPr>
+              <w:instrText xml:space="preserve"> PAGEREF _Toc233877196 \h </w:instrText>
+            </w:r>
+            <w:r>
+              <w:rPr>
+                <w:noProof/>
+                <w:webHidden/>
+              </w:rPr>
+            </w:r>
+            <w:r>
+              <w:rPr>
+                <w:noProof/>
+                <w:webHidden/>
+              </w:rPr>
+              <w:fldChar w:fldCharType="separate"/>
+            </w:r>
+            <w:r>
+              <w:rPr>
+                <w:noProof/>
+                <w:webHidden/>
+              </w:rPr>
+              <w:t>4</w:t>
+            </w:r>
+            <w:r>
+              <w:rPr>
+                <w:noProof/>
+                <w:webHidden/>
+              </w:rPr>
+              <w:fldChar w:fldCharType="end"/>
+            </w:r>
+          </w:hyperlink>
+        </w:p>
+        <w:p>
+          <w:pPr>
+            <w:pStyle w:val="Sommario2"/>
+            <w:tabs>
+              <w:tab w:val="right" w:leader="dot" w:pos="9628"/>
+            </w:tabs>
+            <w:rPr>
+              <w:rFonts w:eastAsiaTheme="minorEastAsia"/>
+              <w:noProof/>
+              <w:kern w:val="2"/>
+              <w:sz w:val="24"/>
+              <w:szCs w:val="24"/>
+              <w:lang w:eastAsia="it-IT"/>
+              <w14:ligatures w14:val="standardContextual"/>
+            </w:rPr>
+          </w:pPr>
+          <w:hyperlink w:anchor="_Toc233877197" w:history="1">
+            <w:r>
+              <w:rPr>
+                <w:rStyle w:val="Collegamentoipertestuale"/>
+                <w:noProof/>
+              </w:rPr>
+              <w:t>In caso di parità punti</w:t>
+            </w:r>
+            <w:r>
+              <w:rPr>
+                <w:noProof/>
+                <w:webHidden/>
+              </w:rPr>
+              <w:tab/>
+            </w:r>
+            <w:r>
+              <w:rPr>
+                <w:noProof/>
+                <w:webHidden/>
+              </w:rPr>
+              <w:fldChar w:fldCharType="begin"/>
+            </w:r>
+            <w:r>
+              <w:rPr>
+                <w:noProof/>
+                <w:webHidden/>
+              </w:rPr>
+              <w:instrText xml:space="preserve"> PAGEREF _Toc233877197 \h </w:instrText>
+            </w:r>
+            <w:r>
+              <w:rPr>
+                <w:noProof/>
+                <w:webHidden/>
+              </w:rPr>
+            </w:r>
+            <w:r>
+              <w:rPr>
+                <w:noProof/>
+                <w:webHidden/>
+              </w:rPr>
+              <w:fldChar w:fldCharType="separate"/>
+            </w:r>
+            <w:r>
+              <w:rPr>
+                <w:noProof/>
+                <w:webHidden/>
+              </w:rPr>
+              <w:t>4</w:t>
+            </w:r>
+            <w:r>
+              <w:rPr>
+                <w:noProof/>
+                <w:webHidden/>
+              </w:rPr>
+              <w:fldChar w:fldCharType="end"/>
+            </w:r>
+          </w:hyperlink>
+        </w:p>
+        <w:p>
+          <w:pPr>
+            <w:pStyle w:val="Sommario2"/>
+            <w:tabs>
+              <w:tab w:val="right" w:leader="dot" w:pos="9628"/>
+            </w:tabs>
+            <w:rPr>
+              <w:rFonts w:eastAsiaTheme="minorEastAsia"/>
+              <w:noProof/>
+              <w:kern w:val="2"/>
+              <w:sz w:val="24"/>
+              <w:szCs w:val="24"/>
+              <w:lang w:eastAsia="it-IT"/>
+              <w14:ligatures w14:val="standardContextual"/>
+            </w:rPr>
+          </w:pPr>
+          <w:hyperlink w:anchor="_Toc233877198" w:history="1">
+            <w:r>
+              <w:rPr>
+                <w:rStyle w:val="Collegamentoipertestuale"/>
+                <w:noProof/>
+              </w:rPr>
+              <w:t>Comunicazione formazione e multe</w:t>
+            </w:r>
+            <w:r>
+              <w:rPr>
+                <w:noProof/>
+                <w:webHidden/>
+              </w:rPr>
+              <w:tab/>
+            </w:r>
+            <w:r>
+              <w:rPr>
+                <w:noProof/>
+                <w:webHidden/>
+              </w:rPr>
+              <w:fldChar w:fldCharType="begin"/>
+            </w:r>
+            <w:r>
+              <w:rPr>
+                <w:noProof/>
+                <w:webHidden/>
+              </w:rPr>
+              <w:instrText xml:space="preserve"> PAGEREF _Toc233877198 \h </w:instrText>
+            </w:r>
+            <w:r>
+              <w:rPr>
+                <w:noProof/>
+                <w:webHidden/>
+              </w:rPr>
+            </w:r>
+            <w:r>
+              <w:rPr>
+                <w:noProof/>
+                <w:webHidden/>
+              </w:rPr>
+              <w:fldChar w:fldCharType="separate"/>
+            </w:r>
+            <w:r>
+              <w:rPr>
+                <w:noProof/>
+                <w:webHidden/>
+              </w:rPr>
+              <w:t>5</w:t>
+            </w:r>
+            <w:r>
+              <w:rPr>
+                <w:noProof/>
+                <w:webHidden/>
+              </w:rPr>
+              <w:fldChar w:fldCharType="end"/>
+            </w:r>
+          </w:hyperlink>
+        </w:p>
+        <w:p>
+          <w:pPr>
+            <w:pStyle w:val="Sommario2"/>
+            <w:tabs>
+              <w:tab w:val="right" w:leader="dot" w:pos="9628"/>
+            </w:tabs>
+            <w:rPr>
+              <w:rFonts w:eastAsiaTheme="minorEastAsia"/>
+              <w:noProof/>
+              <w:kern w:val="2"/>
+              <w:sz w:val="24"/>
+              <w:szCs w:val="24"/>
+              <w:lang w:eastAsia="it-IT"/>
+              <w14:ligatures w14:val="standardContextual"/>
+            </w:rPr>
+          </w:pPr>
+          <w:hyperlink w:anchor="_Toc233877199" w:history="1">
+            <w:r>
+              <w:rPr>
+                <w:rStyle w:val="Collegamentoipertestuale"/>
+                <w:noProof/>
+              </w:rPr>
+              <w:t>Recuperi partite rinviate</w:t>
+            </w:r>
+            <w:r>
+              <w:rPr>
+                <w:noProof/>
+                <w:webHidden/>
+              </w:rPr>
+              <w:tab/>
+            </w:r>
+            <w:r>
+              <w:rPr>
+                <w:noProof/>
+                <w:webHidden/>
+              </w:rPr>
+              <w:fldChar w:fldCharType="begin"/>
+            </w:r>
+            <w:r>
+              <w:rPr>
+                <w:noProof/>
+                <w:webHidden/>
+              </w:rPr>
+              <w:instrText xml:space="preserve"> PAGEREF _Toc233877199 \h </w:instrText>
+            </w:r>
+            <w:r>
+              <w:rPr>
+                <w:noProof/>
+                <w:webHidden/>
+              </w:rPr>
+            </w:r>
+            <w:r>
+              <w:rPr>
+                <w:noProof/>
+                <w:webHidden/>
+              </w:rPr>
+              <w:fldChar w:fldCharType="separate"/>
+            </w:r>
+            <w:r>
+              <w:rPr>
+                <w:noProof/>
+                <w:webHidden/>
+              </w:rPr>
+              <w:t>5</w:t>
+            </w:r>
+            <w:r>
+              <w:rPr>
+                <w:noProof/>
+                <w:webHidden/>
+              </w:rPr>
+              <w:fldChar w:fldCharType="end"/>
+            </w:r>
+          </w:hyperlink>
+        </w:p>
+        <w:p>
+          <w:pPr>
+            <w:pStyle w:val="Sommario2"/>
+            <w:tabs>
+              <w:tab w:val="right" w:leader="dot" w:pos="9628"/>
+            </w:tabs>
+            <w:rPr>
+              <w:rFonts w:eastAsiaTheme="minorEastAsia"/>
+              <w:noProof/>
+              <w:kern w:val="2"/>
+              <w:sz w:val="24"/>
+              <w:szCs w:val="24"/>
+              <w:lang w:eastAsia="it-IT"/>
+              <w14:ligatures w14:val="standardContextual"/>
+            </w:rPr>
+          </w:pPr>
+          <w:hyperlink w:anchor="_Toc233877200" w:history="1">
+            <w:r>
+              <w:rPr>
+                <w:rStyle w:val="Collegamentoipertestuale"/>
+                <w:noProof/>
+              </w:rPr>
+              <w:t>Mercato di settembre</w:t>
+            </w:r>
+            <w:r>
+              <w:rPr>
+                <w:noProof/>
+                <w:webHidden/>
+              </w:rPr>
+              <w:tab/>
+            </w:r>
+            <w:r>
+              <w:rPr>
+                <w:noProof/>
+                <w:webHidden/>
+              </w:rPr>
+              <w:fldChar w:fldCharType="begin"/>
+            </w:r>
+            <w:r>
+              <w:rPr>
+                <w:noProof/>
+                <w:webHidden/>
+              </w:rPr>
+              <w:instrText xml:space="preserve"> PAGEREF _Toc233877200 \h </w:instrText>
+            </w:r>
+            <w:r>
+              <w:rPr>
+                <w:noProof/>
+                <w:webHidden/>
+              </w:rPr>
+            </w:r>
+            <w:r>
+              <w:rPr>
+                <w:noProof/>
+                <w:webHidden/>
+              </w:rPr>
+              <w:fldChar w:fldCharType="separate"/>
+            </w:r>
+            <w:r>
+              <w:rPr>
+                <w:noProof/>
+                <w:webHidden/>
+              </w:rPr>
+              <w:t>5</w:t>
+            </w:r>
+            <w:r>
+              <w:rPr>
+                <w:noProof/>
+                <w:webHidden/>
+              </w:rPr>
+              <w:fldChar w:fldCharType="end"/>
+            </w:r>
+          </w:hyperlink>
+        </w:p>
+        <w:p>
+          <w:pPr>
+            <w:pStyle w:val="Sommario2"/>
+            <w:tabs>
+              <w:tab w:val="right" w:leader="dot" w:pos="9628"/>
+            </w:tabs>
+            <w:rPr>
+              <w:rFonts w:eastAsiaTheme="minorEastAsia"/>
+              <w:noProof/>
+              <w:kern w:val="2"/>
+              <w:sz w:val="24"/>
+              <w:szCs w:val="24"/>
+              <w:lang w:eastAsia="it-IT"/>
+              <w14:ligatures w14:val="standardContextual"/>
+            </w:rPr>
+          </w:pPr>
+          <w:hyperlink w:anchor="_Toc233877201" w:history="1">
+            <w:r>
+              <w:rPr>
+                <w:rStyle w:val="Collegamentoipertestuale"/>
+                <w:noProof/>
+              </w:rPr>
+              <w:t>Scambio giocatori</w:t>
+            </w:r>
+            <w:r>
+              <w:rPr>
+                <w:noProof/>
+                <w:webHidden/>
+              </w:rPr>
+              <w:tab/>
+            </w:r>
+            <w:r>
+              <w:rPr>
+                <w:noProof/>
+                <w:webHidden/>
+              </w:rPr>
+              <w:fldChar w:fldCharType="begin"/>
+            </w:r>
+            <w:r>
+              <w:rPr>
+                <w:noProof/>
+                <w:webHidden/>
+              </w:rPr>
+              <w:instrText xml:space="preserve"> PAGEREF _Toc233877201 \h </w:instrText>
+            </w:r>
+            <w:r>
+              <w:rPr>
+                <w:noProof/>
+                <w:webHidden/>
+              </w:rPr>
+            </w:r>
+            <w:r>
+              <w:rPr>
+                <w:noProof/>
+                <w:webHidden/>
+              </w:rPr>
+              <w:fldChar w:fldCharType="separate"/>
+            </w:r>
+            <w:r>
+              <w:rPr>
+                <w:noProof/>
+                <w:webHidden/>
+              </w:rPr>
+              <w:t>6</w:t>
+            </w:r>
+            <w:r>
+              <w:rPr>
+                <w:noProof/>
+                <w:webHidden/>
+              </w:rPr>
+              <w:fldChar w:fldCharType="end"/>
+            </w:r>
+          </w:hyperlink>
+        </w:p>
+        <w:p>
+          <w:pPr>
+            <w:pStyle w:val="Sommario2"/>
+            <w:tabs>
+              <w:tab w:val="right" w:leader="dot" w:pos="9628"/>
+            </w:tabs>
+            <w:rPr>
+              <w:rFonts w:eastAsiaTheme="minorEastAsia"/>
+              <w:noProof/>
+              <w:kern w:val="2"/>
+              <w:sz w:val="24"/>
+              <w:szCs w:val="24"/>
+              <w:lang w:eastAsia="it-IT"/>
+              <w14:ligatures w14:val="standardContextual"/>
+            </w:rPr>
+          </w:pPr>
+          <w:hyperlink w:anchor="_Toc233877202" w:history="1">
+            <w:r>
+              <w:rPr>
+                <w:rStyle w:val="Collegamentoipertestuale"/>
+                <w:noProof/>
+              </w:rPr>
+              <w:t>Sessioni di mercato sosta nazionali</w:t>
+            </w:r>
+            <w:r>
+              <w:rPr>
+                <w:noProof/>
+                <w:webHidden/>
+              </w:rPr>
+              <w:tab/>
+            </w:r>
+            <w:r>
+              <w:rPr>
+                <w:noProof/>
+                <w:webHidden/>
+              </w:rPr>
+              <w:fldChar w:fldCharType="begin"/>
+            </w:r>
+            <w:r>
+              <w:rPr>
+                <w:noProof/>
+                <w:webHidden/>
+              </w:rPr>
+              <w:instrText xml:space="preserve"> PAGEREF _Toc233877202 \h </w:instrText>
+            </w:r>
+            <w:r>
+              <w:rPr>
+                <w:noProof/>
+                <w:webHidden/>
+              </w:rPr>
+            </w:r>
+            <w:r>
+              <w:rPr>
+                <w:noProof/>
+                <w:webHidden/>
+              </w:rPr>
+              <w:fldChar w:fldCharType="separate"/>
+            </w:r>
+            <w:r>
+              <w:rPr>
+                <w:noProof/>
+                <w:webHidden/>
+              </w:rPr>
+              <w:t>6</w:t>
+            </w:r>
+            <w:r>
+              <w:rPr>
+                <w:noProof/>
+                <w:webHidden/>
+              </w:rPr>
+              <w:fldChar w:fldCharType="end"/>
+            </w:r>
+          </w:hyperlink>
+        </w:p>
+        <w:p>
+          <w:pPr>
+            <w:pStyle w:val="Sommario2"/>
+            <w:tabs>
+              <w:tab w:val="right" w:leader="dot" w:pos="9628"/>
+            </w:tabs>
+            <w:rPr>
+              <w:rFonts w:eastAsiaTheme="minorEastAsia"/>
+              <w:noProof/>
+              <w:kern w:val="2"/>
+              <w:sz w:val="24"/>
+              <w:szCs w:val="24"/>
+              <w:lang w:eastAsia="it-IT"/>
+              <w14:ligatures w14:val="standardContextual"/>
+            </w:rPr>
+          </w:pPr>
+          <w:hyperlink w:anchor="_Toc233877203" w:history="1">
+            <w:r>
+              <w:rPr>
+                <w:rStyle w:val="Collegamentoipertestuale"/>
+                <w:noProof/>
+              </w:rPr>
+              <w:t>Mercato di gennaio</w:t>
+            </w:r>
+            <w:r>
+              <w:rPr>
+                <w:noProof/>
+                <w:webHidden/>
+              </w:rPr>
+              <w:tab/>
+            </w:r>
+            <w:r>
+              <w:rPr>
+                <w:noProof/>
+                <w:webHidden/>
+              </w:rPr>
+              <w:fldChar w:fldCharType="begin"/>
+            </w:r>
+            <w:r>
+              <w:rPr>
+                <w:noProof/>
+                <w:webHidden/>
+              </w:rPr>
+              <w:instrText xml:space="preserve"> PAGEREF _Toc233877203 \h </w:instrText>
+            </w:r>
+            <w:r>
+              <w:rPr>
+                <w:noProof/>
+                <w:webHidden/>
+              </w:rPr>
+            </w:r>
+            <w:r>
+              <w:rPr>
+                <w:noProof/>
+                <w:webHidden/>
+              </w:rPr>
+              <w:fldChar w:fldCharType="separate"/>
+            </w:r>
+            <w:r>
+              <w:rPr>
+                <w:noProof/>
+                <w:webHidden/>
+              </w:rPr>
+              <w:t>6</w:t>
+            </w:r>
+            <w:r>
+              <w:rPr>
+                <w:noProof/>
+                <w:webHidden/>
+              </w:rPr>
+              <w:fldChar w:fldCharType="end"/>
+            </w:r>
+          </w:hyperlink>
+        </w:p>
+        <w:p>
+          <w:pPr>
+            <w:pStyle w:val="Sommario2"/>
+            <w:tabs>
+              <w:tab w:val="right" w:leader="dot" w:pos="9628"/>
+            </w:tabs>
+            <w:rPr>
+              <w:rFonts w:eastAsiaTheme="minorEastAsia"/>
+              <w:noProof/>
+              <w:kern w:val="2"/>
+              <w:sz w:val="24"/>
+              <w:szCs w:val="24"/>
+              <w:lang w:eastAsia="it-IT"/>
+              <w14:ligatures w14:val="standardContextual"/>
+            </w:rPr>
+          </w:pPr>
+          <w:hyperlink w:anchor="_Toc233877204" w:history="1">
+            <w:r>
+              <w:rPr>
+                <w:rStyle w:val="Collegamentoipertestuale"/>
+                <w:noProof/>
+              </w:rPr>
+              <w:t>Cena di fine stagione</w:t>
+            </w:r>
+            <w:r>
+              <w:rPr>
+                <w:noProof/>
+                <w:webHidden/>
+              </w:rPr>
+              <w:tab/>
+            </w:r>
+            <w:r>
+              <w:rPr>
+                <w:noProof/>
+                <w:webHidden/>
+              </w:rPr>
+              <w:fldChar w:fldCharType="begin"/>
+            </w:r>
+            <w:r>
+              <w:rPr>
+                <w:noProof/>
+                <w:webHidden/>
+              </w:rPr>
+              <w:instrText xml:space="preserve"> PAGEREF _Toc233877204 \h </w:instrText>
+            </w:r>
+            <w:r>
+              <w:rPr>
+                <w:noProof/>
+                <w:webHidden/>
+              </w:rPr>
+            </w:r>
+            <w:r>
+              <w:rPr>
+                <w:noProof/>
+                <w:webHidden/>
+              </w:rPr>
+              <w:fldChar w:fldCharType="separate"/>
+            </w:r>
+            <w:r>
+              <w:rPr>
+                <w:noProof/>
+                <w:webHidden/>
+              </w:rPr>
+              <w:t>7</w:t>
+            </w:r>
+            <w:r>
+              <w:rPr>
+                <w:noProof/>
+                <w:webHidden/>
+              </w:rPr>
+              <w:fldChar w:fldCharType="end"/>
+            </w:r>
+          </w:hyperlink>
+        </w:p>
+        <w:p>
+          <w:pPr>
+            <w:pStyle w:val="Sommario2"/>
+            <w:tabs>
+              <w:tab w:val="right" w:leader="dot" w:pos="9628"/>
+            </w:tabs>
+            <w:rPr>
+              <w:rFonts w:eastAsiaTheme="minorEastAsia"/>
+              <w:noProof/>
+              <w:kern w:val="2"/>
+              <w:sz w:val="24"/>
+              <w:szCs w:val="24"/>
+              <w:lang w:eastAsia="it-IT"/>
+              <w14:ligatures w14:val="standardContextual"/>
+            </w:rPr>
+          </w:pPr>
+          <w:hyperlink w:anchor="_Toc233877205" w:history="1">
+            <w:r>
+              <w:rPr>
+                <w:rStyle w:val="Collegamentoipertestuale"/>
+                <w:noProof/>
+              </w:rPr>
+              <w:t>Premi stagionali</w:t>
+            </w:r>
+            <w:r>
+              <w:rPr>
+                <w:noProof/>
+                <w:webHidden/>
+              </w:rPr>
+              <w:tab/>
+            </w:r>
+            <w:r>
+              <w:rPr>
+                <w:noProof/>
+                <w:webHidden/>
+              </w:rPr>
+              <w:fldChar w:fldCharType="begin"/>
+            </w:r>
+            <w:r>
+              <w:rPr>
+                <w:noProof/>
+                <w:webHidden/>
+              </w:rPr>
+              <w:instrText xml:space="preserve"> PAGEREF _Toc233877205 \h </w:instrText>
+            </w:r>
+            <w:r>
+              <w:rPr>
+                <w:noProof/>
+                <w:webHidden/>
+              </w:rPr>
+            </w:r>
+            <w:r>
+              <w:rPr>
+                <w:noProof/>
+                <w:webHidden/>
+              </w:rPr>
+              <w:fldChar w:fldCharType="separate"/>
+            </w:r>
+            <w:r>
+              <w:rPr>
+                <w:noProof/>
+                <w:webHidden/>
+              </w:rPr>
+              <w:t>7</w:t>
+            </w:r>
+            <w:r>
+              <w:rPr>
+                <w:noProof/>
+                <w:webHidden/>
+              </w:rPr>
+              <w:fldChar w:fldCharType="end"/>
+            </w:r>
+          </w:hyperlink>
+        </w:p>
+        <w:p>
+          <w:pPr>
+            <w:pStyle w:val="Sommario2"/>
+            <w:tabs>
+              <w:tab w:val="right" w:leader="dot" w:pos="9628"/>
+            </w:tabs>
+            <w:rPr>
+              <w:rFonts w:eastAsiaTheme="minorEastAsia"/>
+              <w:noProof/>
+              <w:kern w:val="2"/>
+              <w:sz w:val="24"/>
+              <w:szCs w:val="24"/>
+              <w:lang w:eastAsia="it-IT"/>
+              <w14:ligatures w14:val="standardContextual"/>
+            </w:rPr>
+          </w:pPr>
+          <w:hyperlink w:anchor="_Toc233877206" w:history="1">
+            <w:r>
+              <w:rPr>
+                <w:rStyle w:val="Collegamentoipertestuale"/>
+                <w:noProof/>
+              </w:rPr>
+              <w:t>Penalità di fine stagione</w:t>
+            </w:r>
+            <w:r>
+              <w:rPr>
+                <w:noProof/>
+                <w:webHidden/>
+              </w:rPr>
+              <w:tab/>
+            </w:r>
+            <w:r>
+              <w:rPr>
+                <w:noProof/>
+                <w:webHidden/>
+              </w:rPr>
+              <w:fldChar w:fldCharType="begin"/>
+            </w:r>
+            <w:r>
+              <w:rPr>
+                <w:noProof/>
+                <w:webHidden/>
+              </w:rPr>
+              <w:instrText xml:space="preserve"> PAGEREF _Toc233877206 \h </w:instrText>
+            </w:r>
+            <w:r>
+              <w:rPr>
+                <w:noProof/>
+                <w:webHidden/>
+              </w:rPr>
+            </w:r>
+            <w:r>
+              <w:rPr>
+                <w:noProof/>
+                <w:webHidden/>
+              </w:rPr>
+              <w:fldChar w:fldCharType="separate"/>
+            </w:r>
+            <w:r>
+              <w:rPr>
+                <w:noProof/>
+                <w:webHidden/>
+              </w:rPr>
+              <w:t>7</w:t>
+            </w:r>
+            <w:r>
+              <w:rPr>
+                <w:noProof/>
+                <w:webHidden/>
+              </w:rPr>
+              <w:fldChar w:fldCharType="end"/>
+            </w:r>
+          </w:hyperlink>
+        </w:p>
+        <w:p>
+          <w:r>
+            <w:rPr>
+              <w:b/>
+              <w:bCs/>
+            </w:rPr>
+            <w:fldChar w:fldCharType="end"/>
+          </w:r>
+        </w:p>
+      </w:sdtContent>
+    </w:sdt>
+    <w:p>
+      <w:r>
+        <w:br w:type="page"/>
       </w:r>
     </w:p>
     <w:p/>
     <w:p/>
     <w:p/>
+    <w:p/>
     <w:p>
       <w:pPr>
         <w:pStyle w:val="Titolo2"/>
       </w:pPr>
-      <w:r>
-        <w:t xml:space="preserve">Calendario stagionale  </w:t>
+      <w:bookmarkStart w:id="1" w:name="_Toc233877186"/>
+      <w:r>
+        <w:t xml:space="preserve">Calendario </w:t>
+      </w:r>
+      <w:r>
+        <w:t>stagionale</w:t>
+      </w:r>
+      <w:bookmarkEnd w:id="1"/>
+      <w:r>
+        <w:t xml:space="preserve">  </w:t>
       </w:r>
     </w:p>
     <w:p>
@@ -84,11 +1770,13 @@
     <w:p/>
     <w:p>
       <w:pPr>
-        <w:pStyle w:val="Titolo4"/>
-      </w:pPr>
+        <w:pStyle w:val="Titolo3"/>
+      </w:pPr>
+      <w:bookmarkStart w:id="2" w:name="_Toc233877187"/>
       <w:r>
         <w:t>Campionato</w:t>
       </w:r>
+      <w:bookmarkEnd w:id="2"/>
     </w:p>
     <w:p>
       <w:r>
@@ -107,11 +1795,13 @@
     <w:p/>
     <w:p>
       <w:pPr>
-        <w:pStyle w:val="Titolo4"/>
-      </w:pPr>
+        <w:pStyle w:val="Titolo3"/>
+      </w:pPr>
+      <w:bookmarkStart w:id="3" w:name="_Toc233877188"/>
       <w:r>
         <w:t>Champions</w:t>
       </w:r>
+      <w:bookmarkEnd w:id="3"/>
     </w:p>
     <w:p>
       <w:r>
@@ -249,11 +1939,13 @@
     <w:p/>
     <w:p>
       <w:pPr>
-        <w:pStyle w:val="Titolo4"/>
-      </w:pPr>
+        <w:pStyle w:val="Titolo3"/>
+      </w:pPr>
+      <w:bookmarkStart w:id="4" w:name="_Toc233877189"/>
       <w:r>
         <w:t>Coppa dei perdenti</w:t>
       </w:r>
+      <w:bookmarkEnd w:id="4"/>
     </w:p>
     <w:p>
       <w:pPr>
@@ -495,8 +2187,13 @@
       <w:pPr>
         <w:pStyle w:val="Titolo2"/>
       </w:pPr>
-      <w:r>
-        <w:t xml:space="preserve">Rose  </w:t>
+      <w:bookmarkStart w:id="5" w:name="_Toc233877190"/>
+      <w:r>
+        <w:t>Rose</w:t>
+      </w:r>
+      <w:bookmarkEnd w:id="5"/>
+      <w:r>
+        <w:t xml:space="preserve">  </w:t>
       </w:r>
     </w:p>
     <w:p>
@@ -539,8 +2236,13 @@
       <w:pPr>
         <w:pStyle w:val="Titolo2"/>
       </w:pPr>
-      <w:r>
-        <w:t xml:space="preserve">Acquisto portieri  </w:t>
+      <w:bookmarkStart w:id="6" w:name="_Toc233877191"/>
+      <w:r>
+        <w:t>Acquisto portieri</w:t>
+      </w:r>
+      <w:bookmarkEnd w:id="6"/>
+      <w:r>
+        <w:t xml:space="preserve">  </w:t>
       </w:r>
     </w:p>
     <w:p>
@@ -555,8 +2257,13 @@
       <w:pPr>
         <w:pStyle w:val="Titolo2"/>
       </w:pPr>
-      <w:r>
-        <w:t xml:space="preserve">Schieramento formazione  </w:t>
+      <w:bookmarkStart w:id="7" w:name="_Toc233877192"/>
+      <w:r>
+        <w:t>Schieramento formazione</w:t>
+      </w:r>
+      <w:bookmarkEnd w:id="7"/>
+      <w:r>
+        <w:t xml:space="preserve">  </w:t>
       </w:r>
     </w:p>
     <w:p>
@@ -588,8 +2295,13 @@
       <w:pPr>
         <w:pStyle w:val="Titolo2"/>
       </w:pPr>
-      <w:r>
-        <w:t xml:space="preserve">Voti  </w:t>
+      <w:bookmarkStart w:id="8" w:name="_Toc233877193"/>
+      <w:r>
+        <w:t>Voti</w:t>
+      </w:r>
+      <w:bookmarkEnd w:id="8"/>
+      <w:r>
+        <w:t xml:space="preserve">  </w:t>
       </w:r>
     </w:p>
     <w:p>
@@ -644,8 +2356,13 @@
       <w:pPr>
         <w:pStyle w:val="Titolo2"/>
       </w:pPr>
-      <w:r>
-        <w:t xml:space="preserve">Sostituzioni della partita  </w:t>
+      <w:bookmarkStart w:id="9" w:name="_Toc233877194"/>
+      <w:r>
+        <w:t>Sostituzioni della partita</w:t>
+      </w:r>
+      <w:bookmarkEnd w:id="9"/>
+      <w:r>
+        <w:t xml:space="preserve">  </w:t>
       </w:r>
     </w:p>
     <w:p>
@@ -708,8 +2425,13 @@
       <w:pPr>
         <w:pStyle w:val="Titolo2"/>
       </w:pPr>
-      <w:r>
-        <w:t xml:space="preserve">Bonus / Malus  </w:t>
+      <w:bookmarkStart w:id="10" w:name="_Toc233877195"/>
+      <w:r>
+        <w:t>Bonus / Malus</w:t>
+      </w:r>
+      <w:bookmarkEnd w:id="10"/>
+      <w:r>
+        <w:t xml:space="preserve">  </w:t>
       </w:r>
     </w:p>
     <w:p>
@@ -858,8 +2580,13 @@
       <w:pPr>
         <w:pStyle w:val="Titolo2"/>
       </w:pPr>
-      <w:r>
-        <w:t xml:space="preserve">Calcolo dei gol  </w:t>
+      <w:bookmarkStart w:id="11" w:name="_Toc233877196"/>
+      <w:r>
+        <w:t>Calcolo dei gol</w:t>
+      </w:r>
+      <w:bookmarkEnd w:id="11"/>
+      <w:r>
+        <w:t xml:space="preserve">  </w:t>
       </w:r>
     </w:p>
     <w:p>
@@ -952,8 +2679,13 @@
       <w:pPr>
         <w:pStyle w:val="Titolo2"/>
       </w:pPr>
-      <w:r>
-        <w:t xml:space="preserve">In caso di parità punti  </w:t>
+      <w:bookmarkStart w:id="12" w:name="_Toc233877197"/>
+      <w:r>
+        <w:t>In caso di parità punti</w:t>
+      </w:r>
+      <w:bookmarkEnd w:id="12"/>
+      <w:r>
+        <w:t xml:space="preserve">  </w:t>
       </w:r>
     </w:p>
     <w:p>
@@ -1072,8 +2804,13 @@
       <w:pPr>
         <w:pStyle w:val="Titolo2"/>
       </w:pPr>
-      <w:r>
-        <w:t xml:space="preserve">Comunicazione formazione e multe  </w:t>
+      <w:bookmarkStart w:id="13" w:name="_Toc233877198"/>
+      <w:r>
+        <w:t>Comunicazione formazione e multe</w:t>
+      </w:r>
+      <w:bookmarkEnd w:id="13"/>
+      <w:r>
+        <w:t xml:space="preserve">  </w:t>
       </w:r>
     </w:p>
     <w:p>
@@ -1090,13 +2827,8 @@
         </w:numPr>
       </w:pPr>
       <w:r>
-        <w:t xml:space="preserve">Tramite WhatsApp! Sul gruppo </w:t>
-      </w:r>
-      <w:proofErr w:type="spellStart"/>
-      <w:r>
-        <w:t>erFantacalcio</w:t>
-      </w:r>
-      <w:proofErr w:type="spellEnd"/>
+        <w:t>Tramite WhatsApp! Sul gruppo erFantacalcio</w:t>
+      </w:r>
     </w:p>
     <w:p>
       <w:pPr>
@@ -1170,8 +2902,13 @@
       <w:pPr>
         <w:pStyle w:val="Titolo2"/>
       </w:pPr>
-      <w:r>
-        <w:t xml:space="preserve">Recuperi partite rinviate  </w:t>
+      <w:bookmarkStart w:id="14" w:name="_Toc233877199"/>
+      <w:r>
+        <w:t>Recuperi partite rinviate</w:t>
+      </w:r>
+      <w:bookmarkEnd w:id="14"/>
+      <w:r>
+        <w:t xml:space="preserve">  </w:t>
       </w:r>
     </w:p>
     <w:p>
@@ -1194,8 +2931,13 @@
       <w:pPr>
         <w:pStyle w:val="Titolo2"/>
       </w:pPr>
-      <w:r>
-        <w:t xml:space="preserve">Mercato di settembre  </w:t>
+      <w:bookmarkStart w:id="15" w:name="_Toc233877200"/>
+      <w:r>
+        <w:t>Mercato di settembre</w:t>
+      </w:r>
+      <w:bookmarkEnd w:id="15"/>
+      <w:r>
+        <w:t xml:space="preserve">  </w:t>
       </w:r>
     </w:p>
     <w:p>
@@ -1222,8 +2964,13 @@
       <w:pPr>
         <w:pStyle w:val="Titolo2"/>
       </w:pPr>
-      <w:r>
-        <w:t xml:space="preserve">Scambio giocatori  </w:t>
+      <w:bookmarkStart w:id="16" w:name="_Toc233877201"/>
+      <w:r>
+        <w:t>Scambio giocatori</w:t>
+      </w:r>
+      <w:bookmarkEnd w:id="16"/>
+      <w:r>
+        <w:t xml:space="preserve">  </w:t>
       </w:r>
     </w:p>
     <w:p>
@@ -1242,12 +2989,14 @@
       <w:pPr>
         <w:pStyle w:val="Titolo2"/>
       </w:pPr>
+      <w:bookmarkStart w:id="17" w:name="_Toc233877202"/>
       <w:r>
         <w:t>Sessioni di mercato</w:t>
       </w:r>
       <w:r>
         <w:t xml:space="preserve"> sosta nazionali</w:t>
       </w:r>
+      <w:bookmarkEnd w:id="17"/>
     </w:p>
     <w:p>
       <w:pPr>
@@ -1573,8 +3322,13 @@
       <w:pPr>
         <w:pStyle w:val="Titolo2"/>
       </w:pPr>
-      <w:r>
-        <w:t xml:space="preserve">Mercato di gennaio  </w:t>
+      <w:bookmarkStart w:id="18" w:name="_Toc233877203"/>
+      <w:r>
+        <w:t>Mercato di gennaio</w:t>
+      </w:r>
+      <w:bookmarkEnd w:id="18"/>
+      <w:r>
+        <w:t xml:space="preserve">  </w:t>
       </w:r>
     </w:p>
     <w:p>
@@ -1610,8 +3364,13 @@
       <w:pPr>
         <w:pStyle w:val="Titolo2"/>
       </w:pPr>
-      <w:r>
-        <w:t xml:space="preserve">Cena di fine stagione  </w:t>
+      <w:bookmarkStart w:id="19" w:name="_Toc233877204"/>
+      <w:r>
+        <w:t>Cena di fine stagione</w:t>
+      </w:r>
+      <w:bookmarkEnd w:id="19"/>
+      <w:r>
+        <w:t xml:space="preserve">  </w:t>
       </w:r>
     </w:p>
     <w:p>
@@ -1632,8 +3391,13 @@
       <w:pPr>
         <w:pStyle w:val="Titolo2"/>
       </w:pPr>
-      <w:r>
-        <w:t xml:space="preserve">Premi stagionali  </w:t>
+      <w:bookmarkStart w:id="20" w:name="_Toc233877205"/>
+      <w:r>
+        <w:t>Premi stagionali</w:t>
+      </w:r>
+      <w:bookmarkEnd w:id="20"/>
+      <w:r>
+        <w:t xml:space="preserve">  </w:t>
       </w:r>
     </w:p>
     <w:p>
@@ -1695,8 +3459,13 @@
       <w:pPr>
         <w:pStyle w:val="Titolo2"/>
       </w:pPr>
-      <w:r>
-        <w:t xml:space="preserve">Penalità di fine stagione  </w:t>
+      <w:bookmarkStart w:id="21" w:name="_Toc233877206"/>
+      <w:r>
+        <w:t>Penalità di fine stagione</w:t>
+      </w:r>
+      <w:bookmarkEnd w:id="21"/>
+      <w:r>
+        <w:t xml:space="preserve">  </w:t>
       </w:r>
     </w:p>
     <w:p>
@@ -3611,6 +5380,63 @@
       <w:color w:val="2F5496" w:themeColor="accent1" w:themeShade="BF"/>
     </w:rPr>
   </w:style>
+  <w:style w:type="paragraph" w:styleId="Titolosommario">
+    <w:name w:val="TOC Heading"/>
+    <w:basedOn w:val="Titolo1"/>
+    <w:next w:val="Normale"/>
+    <w:uiPriority w:val="39"/>
+    <w:unhideWhenUsed/>
+    <w:qFormat/>
+    <w:rsid w:val="00511535"/>
+    <w:pPr>
+      <w:outlineLvl w:val="9"/>
+    </w:pPr>
+    <w:rPr>
+      <w:lang w:eastAsia="it-IT"/>
+    </w:rPr>
+  </w:style>
+  <w:style w:type="paragraph" w:styleId="Sommario1">
+    <w:name w:val="toc 1"/>
+    <w:basedOn w:val="Normale"/>
+    <w:next w:val="Normale"/>
+    <w:autoRedefine/>
+    <w:uiPriority w:val="39"/>
+    <w:unhideWhenUsed/>
+    <w:rsid w:val="00511535"/>
+    <w:pPr>
+      <w:spacing w:after="100"/>
+    </w:pPr>
+  </w:style>
+  <w:style w:type="paragraph" w:styleId="Sommario2">
+    <w:name w:val="toc 2"/>
+    <w:basedOn w:val="Normale"/>
+    <w:next w:val="Normale"/>
+    <w:autoRedefine/>
+    <w:uiPriority w:val="39"/>
+    <w:unhideWhenUsed/>
+    <w:rsid w:val="00511535"/>
+    <w:pPr>
+      <w:spacing w:after="100"/>
+      <w:ind w:left="220"/>
+    </w:pPr>
+  </w:style>
+  <w:style w:type="paragraph" w:styleId="Sommario3">
+    <w:name w:val="toc 3"/>
+    <w:basedOn w:val="Normale"/>
+    <w:next w:val="Normale"/>
+    <w:autoRedefine/>
+    <w:uiPriority w:val="39"/>
+    <w:unhideWhenUsed/>
+    <w:rsid w:val="001C4F8A"/>
+    <w:pPr>
+      <w:spacing w:after="100"/>
+      <w:ind w:left="440"/>
+    </w:pPr>
+    <w:rPr>
+      <w:rFonts w:eastAsiaTheme="minorEastAsia" w:cs="Times New Roman"/>
+      <w:lang w:eastAsia="it-IT"/>
+    </w:rPr>
+  </w:style>
 </w:styles>
 </file>
 
@@ -3907,4 +5733,16 @@
     </a:ext>
   </a:extLst>
 </a:theme>
+</file>
+
+<file path=customXml/item1.xml><?xml version="1.0" encoding="utf-8"?>
+<b:Sources xmlns:b="http://schemas.openxmlformats.org/officeDocument/2006/bibliography" xmlns="http://schemas.openxmlformats.org/officeDocument/2006/bibliography" SelectedStyle="\APASixthEditionOfficeOnline.xsl" StyleName="APA" Version="6"/>
+</file>
+
+<file path=customXml/itemProps1.xml><?xml version="1.0" encoding="utf-8"?>
+<ds:datastoreItem xmlns:ds="http://schemas.openxmlformats.org/officeDocument/2006/customXml" ds:itemID="{CEEA41A4-F538-4507-AE6C-95DBECD1AAD2}">
+  <ds:schemaRefs>
+    <ds:schemaRef ds:uri="http://schemas.openxmlformats.org/officeDocument/2006/bibliography"/>
+  </ds:schemaRefs>
+</ds:datastoreItem>
 </file>
</xml_diff>

<commit_message>
refactor: update regulation document with revised penalties and clarified rules for Coppa dei Perdenti
</commit_message>
<xml_diff>
--- a/public/docs/Regolamento_erFantacalcio.docx
+++ b/public/docs/Regolamento_erFantacalcio.docx
@@ -7,7 +7,7 @@
         <w:pStyle w:val="Titolo1"/>
         <w:jc w:val="center"/>
       </w:pPr>
-      <w:bookmarkStart w:id="0" w:name="_Toc233877185"/>
+      <w:bookmarkStart w:id="0" w:name="_Toc234244988"/>
       <w:r>
         <w:t>Regolamento erFantacalcio</w:t>
       </w:r>
@@ -29,6 +29,13 @@
     <w:p/>
     <w:sdt>
       <w:sdtPr>
+        <w:rPr>
+          <w:rFonts w:asciiTheme="minorHAnsi" w:eastAsiaTheme="minorHAnsi" w:hAnsiTheme="minorHAnsi" w:cstheme="minorBidi"/>
+          <w:color w:val="auto"/>
+          <w:sz w:val="22"/>
+          <w:szCs w:val="22"/>
+          <w:lang w:eastAsia="en-US"/>
+        </w:rPr>
         <w:id w:val="1842969797"/>
         <w:docPartObj>
           <w:docPartGallery w:val="Table of Contents"/>
@@ -37,13 +44,8 @@
       </w:sdtPr>
       <w:sdtEndPr>
         <w:rPr>
-          <w:rFonts w:asciiTheme="minorHAnsi" w:eastAsiaTheme="minorHAnsi" w:hAnsiTheme="minorHAnsi" w:cstheme="minorBidi"/>
-          <w:b/>
-          <w:bCs/>
-          <w:color w:val="auto"/>
-          <w:sz w:val="22"/>
-          <w:szCs w:val="22"/>
-          <w:lang w:eastAsia="en-US"/>
+          <w:b/>
+          <w:bCs/>
         </w:rPr>
       </w:sdtEndPr>
       <w:sdtContent>
@@ -80,7 +82,7 @@
           <w:r>
             <w:fldChar w:fldCharType="separate"/>
           </w:r>
-          <w:hyperlink w:anchor="_Toc233877185" w:history="1">
+          <w:hyperlink w:anchor="_Toc234244988" w:history="1">
             <w:r>
               <w:rPr>
                 <w:rStyle w:val="Collegamentoipertestuale"/>
@@ -107,7 +109,7 @@
                 <w:noProof/>
                 <w:webHidden/>
               </w:rPr>
-              <w:instrText xml:space="preserve"> PAGEREF _Toc233877185 \h </w:instrText>
+              <w:instrText xml:space="preserve"> PAGEREF _Toc234244988 \h </w:instrText>
             </w:r>
             <w:r>
               <w:rPr>
@@ -154,7 +156,7 @@
               <w14:ligatures w14:val="standardContextual"/>
             </w:rPr>
           </w:pPr>
-          <w:hyperlink w:anchor="_Toc233877186" w:history="1">
+          <w:hyperlink w:anchor="_Toc234244989" w:history="1">
             <w:r>
               <w:rPr>
                 <w:rStyle w:val="Collegamentoipertestuale"/>
@@ -181,7 +183,7 @@
                 <w:noProof/>
                 <w:webHidden/>
               </w:rPr>
-              <w:instrText xml:space="preserve"> PAGEREF _Toc233877186 \h </w:instrText>
+              <w:instrText xml:space="preserve"> PAGEREF _Toc234244989 \h </w:instrText>
             </w:r>
             <w:r>
               <w:rPr>
@@ -227,7 +229,7 @@
               <w14:ligatures w14:val="standardContextual"/>
             </w:rPr>
           </w:pPr>
-          <w:hyperlink w:anchor="_Toc233877187" w:history="1">
+          <w:hyperlink w:anchor="_Toc234244990" w:history="1">
             <w:r>
               <w:rPr>
                 <w:rStyle w:val="Collegamentoipertestuale"/>
@@ -254,7 +256,7 @@
                 <w:noProof/>
                 <w:webHidden/>
               </w:rPr>
-              <w:instrText xml:space="preserve"> PAGEREF _Toc233877187 \h </w:instrText>
+              <w:instrText xml:space="preserve"> PAGEREF _Toc234244990 \h </w:instrText>
             </w:r>
             <w:r>
               <w:rPr>
@@ -300,7 +302,7 @@
               <w14:ligatures w14:val="standardContextual"/>
             </w:rPr>
           </w:pPr>
-          <w:hyperlink w:anchor="_Toc233877188" w:history="1">
+          <w:hyperlink w:anchor="_Toc234244991" w:history="1">
             <w:r>
               <w:rPr>
                 <w:rStyle w:val="Collegamentoipertestuale"/>
@@ -327,7 +329,7 @@
                 <w:noProof/>
                 <w:webHidden/>
               </w:rPr>
-              <w:instrText xml:space="preserve"> PAGEREF _Toc233877188 \h </w:instrText>
+              <w:instrText xml:space="preserve"> PAGEREF _Toc234244991 \h </w:instrText>
             </w:r>
             <w:r>
               <w:rPr>
@@ -373,7 +375,7 @@
               <w14:ligatures w14:val="standardContextual"/>
             </w:rPr>
           </w:pPr>
-          <w:hyperlink w:anchor="_Toc233877189" w:history="1">
+          <w:hyperlink w:anchor="_Toc234244992" w:history="1">
             <w:r>
               <w:rPr>
                 <w:rStyle w:val="Collegamentoipertestuale"/>
@@ -400,7 +402,7 @@
                 <w:noProof/>
                 <w:webHidden/>
               </w:rPr>
-              <w:instrText xml:space="preserve"> PAGEREF _Toc233877189 \h </w:instrText>
+              <w:instrText xml:space="preserve"> PAGEREF _Toc234244992 \h </w:instrText>
             </w:r>
             <w:r>
               <w:rPr>
@@ -447,7 +449,7 @@
               <w14:ligatures w14:val="standardContextual"/>
             </w:rPr>
           </w:pPr>
-          <w:hyperlink w:anchor="_Toc233877190" w:history="1">
+          <w:hyperlink w:anchor="_Toc234244993" w:history="1">
             <w:r>
               <w:rPr>
                 <w:rStyle w:val="Collegamentoipertestuale"/>
@@ -474,7 +476,7 @@
                 <w:noProof/>
                 <w:webHidden/>
               </w:rPr>
-              <w:instrText xml:space="preserve"> PAGEREF _Toc233877190 \h </w:instrText>
+              <w:instrText xml:space="preserve"> PAGEREF _Toc234244993 \h </w:instrText>
             </w:r>
             <w:r>
               <w:rPr>
@@ -521,7 +523,7 @@
               <w14:ligatures w14:val="standardContextual"/>
             </w:rPr>
           </w:pPr>
-          <w:hyperlink w:anchor="_Toc233877191" w:history="1">
+          <w:hyperlink w:anchor="_Toc234244994" w:history="1">
             <w:r>
               <w:rPr>
                 <w:rStyle w:val="Collegamentoipertestuale"/>
@@ -548,7 +550,7 @@
                 <w:noProof/>
                 <w:webHidden/>
               </w:rPr>
-              <w:instrText xml:space="preserve"> PAGEREF _Toc233877191 \h </w:instrText>
+              <w:instrText xml:space="preserve"> PAGEREF _Toc234244994 \h </w:instrText>
             </w:r>
             <w:r>
               <w:rPr>
@@ -595,7 +597,7 @@
               <w14:ligatures w14:val="standardContextual"/>
             </w:rPr>
           </w:pPr>
-          <w:hyperlink w:anchor="_Toc233877192" w:history="1">
+          <w:hyperlink w:anchor="_Toc234244995" w:history="1">
             <w:r>
               <w:rPr>
                 <w:rStyle w:val="Collegamentoipertestuale"/>
@@ -622,7 +624,7 @@
                 <w:noProof/>
                 <w:webHidden/>
               </w:rPr>
-              <w:instrText xml:space="preserve"> PAGEREF _Toc233877192 \h </w:instrText>
+              <w:instrText xml:space="preserve"> PAGEREF _Toc234244995 \h </w:instrText>
             </w:r>
             <w:r>
               <w:rPr>
@@ -669,7 +671,7 @@
               <w14:ligatures w14:val="standardContextual"/>
             </w:rPr>
           </w:pPr>
-          <w:hyperlink w:anchor="_Toc233877193" w:history="1">
+          <w:hyperlink w:anchor="_Toc234244996" w:history="1">
             <w:r>
               <w:rPr>
                 <w:rStyle w:val="Collegamentoipertestuale"/>
@@ -696,7 +698,7 @@
                 <w:noProof/>
                 <w:webHidden/>
               </w:rPr>
-              <w:instrText xml:space="preserve"> PAGEREF _Toc233877193 \h </w:instrText>
+              <w:instrText xml:space="preserve"> PAGEREF _Toc234244996 \h </w:instrText>
             </w:r>
             <w:r>
               <w:rPr>
@@ -743,7 +745,7 @@
               <w14:ligatures w14:val="standardContextual"/>
             </w:rPr>
           </w:pPr>
-          <w:hyperlink w:anchor="_Toc233877194" w:history="1">
+          <w:hyperlink w:anchor="_Toc234244997" w:history="1">
             <w:r>
               <w:rPr>
                 <w:rStyle w:val="Collegamentoipertestuale"/>
@@ -770,7 +772,7 @@
                 <w:noProof/>
                 <w:webHidden/>
               </w:rPr>
-              <w:instrText xml:space="preserve"> PAGEREF _Toc233877194 \h </w:instrText>
+              <w:instrText xml:space="preserve"> PAGEREF _Toc234244997 \h </w:instrText>
             </w:r>
             <w:r>
               <w:rPr>
@@ -817,7 +819,7 @@
               <w14:ligatures w14:val="standardContextual"/>
             </w:rPr>
           </w:pPr>
-          <w:hyperlink w:anchor="_Toc233877195" w:history="1">
+          <w:hyperlink w:anchor="_Toc234244998" w:history="1">
             <w:r>
               <w:rPr>
                 <w:rStyle w:val="Collegamentoipertestuale"/>
@@ -844,7 +846,7 @@
                 <w:noProof/>
                 <w:webHidden/>
               </w:rPr>
-              <w:instrText xml:space="preserve"> PAGEREF _Toc233877195 \h </w:instrText>
+              <w:instrText xml:space="preserve"> PAGEREF _Toc234244998 \h </w:instrText>
             </w:r>
             <w:r>
               <w:rPr>
@@ -891,7 +893,7 @@
               <w14:ligatures w14:val="standardContextual"/>
             </w:rPr>
           </w:pPr>
-          <w:hyperlink w:anchor="_Toc233877196" w:history="1">
+          <w:hyperlink w:anchor="_Toc234244999" w:history="1">
             <w:r>
               <w:rPr>
                 <w:rStyle w:val="Collegamentoipertestuale"/>
@@ -918,7 +920,7 @@
                 <w:noProof/>
                 <w:webHidden/>
               </w:rPr>
-              <w:instrText xml:space="preserve"> PAGEREF _Toc233877196 \h </w:instrText>
+              <w:instrText xml:space="preserve"> PAGEREF _Toc234244999 \h </w:instrText>
             </w:r>
             <w:r>
               <w:rPr>
@@ -965,7 +967,7 @@
               <w14:ligatures w14:val="standardContextual"/>
             </w:rPr>
           </w:pPr>
-          <w:hyperlink w:anchor="_Toc233877197" w:history="1">
+          <w:hyperlink w:anchor="_Toc234245000" w:history="1">
             <w:r>
               <w:rPr>
                 <w:rStyle w:val="Collegamentoipertestuale"/>
@@ -992,7 +994,7 @@
                 <w:noProof/>
                 <w:webHidden/>
               </w:rPr>
-              <w:instrText xml:space="preserve"> PAGEREF _Toc233877197 \h </w:instrText>
+              <w:instrText xml:space="preserve"> PAGEREF _Toc234245000 \h </w:instrText>
             </w:r>
             <w:r>
               <w:rPr>
@@ -1039,7 +1041,7 @@
               <w14:ligatures w14:val="standardContextual"/>
             </w:rPr>
           </w:pPr>
-          <w:hyperlink w:anchor="_Toc233877198" w:history="1">
+          <w:hyperlink w:anchor="_Toc234245001" w:history="1">
             <w:r>
               <w:rPr>
                 <w:rStyle w:val="Collegamentoipertestuale"/>
@@ -1066,7 +1068,7 @@
                 <w:noProof/>
                 <w:webHidden/>
               </w:rPr>
-              <w:instrText xml:space="preserve"> PAGEREF _Toc233877198 \h </w:instrText>
+              <w:instrText xml:space="preserve"> PAGEREF _Toc234245001 \h </w:instrText>
             </w:r>
             <w:r>
               <w:rPr>
@@ -1113,7 +1115,7 @@
               <w14:ligatures w14:val="standardContextual"/>
             </w:rPr>
           </w:pPr>
-          <w:hyperlink w:anchor="_Toc233877199" w:history="1">
+          <w:hyperlink w:anchor="_Toc234245002" w:history="1">
             <w:r>
               <w:rPr>
                 <w:rStyle w:val="Collegamentoipertestuale"/>
@@ -1140,7 +1142,7 @@
                 <w:noProof/>
                 <w:webHidden/>
               </w:rPr>
-              <w:instrText xml:space="preserve"> PAGEREF _Toc233877199 \h </w:instrText>
+              <w:instrText xml:space="preserve"> PAGEREF _Toc234245002 \h </w:instrText>
             </w:r>
             <w:r>
               <w:rPr>
@@ -1187,7 +1189,7 @@
               <w14:ligatures w14:val="standardContextual"/>
             </w:rPr>
           </w:pPr>
-          <w:hyperlink w:anchor="_Toc233877200" w:history="1">
+          <w:hyperlink w:anchor="_Toc234245003" w:history="1">
             <w:r>
               <w:rPr>
                 <w:rStyle w:val="Collegamentoipertestuale"/>
@@ -1214,7 +1216,7 @@
                 <w:noProof/>
                 <w:webHidden/>
               </w:rPr>
-              <w:instrText xml:space="preserve"> PAGEREF _Toc233877200 \h </w:instrText>
+              <w:instrText xml:space="preserve"> PAGEREF _Toc234245003 \h </w:instrText>
             </w:r>
             <w:r>
               <w:rPr>
@@ -1261,7 +1263,7 @@
               <w14:ligatures w14:val="standardContextual"/>
             </w:rPr>
           </w:pPr>
-          <w:hyperlink w:anchor="_Toc233877201" w:history="1">
+          <w:hyperlink w:anchor="_Toc234245004" w:history="1">
             <w:r>
               <w:rPr>
                 <w:rStyle w:val="Collegamentoipertestuale"/>
@@ -1288,7 +1290,7 @@
                 <w:noProof/>
                 <w:webHidden/>
               </w:rPr>
-              <w:instrText xml:space="preserve"> PAGEREF _Toc233877201 \h </w:instrText>
+              <w:instrText xml:space="preserve"> PAGEREF _Toc234245004 \h </w:instrText>
             </w:r>
             <w:r>
               <w:rPr>
@@ -1335,7 +1337,7 @@
               <w14:ligatures w14:val="standardContextual"/>
             </w:rPr>
           </w:pPr>
-          <w:hyperlink w:anchor="_Toc233877202" w:history="1">
+          <w:hyperlink w:anchor="_Toc234245005" w:history="1">
             <w:r>
               <w:rPr>
                 <w:rStyle w:val="Collegamentoipertestuale"/>
@@ -1362,7 +1364,7 @@
                 <w:noProof/>
                 <w:webHidden/>
               </w:rPr>
-              <w:instrText xml:space="preserve"> PAGEREF _Toc233877202 \h </w:instrText>
+              <w:instrText xml:space="preserve"> PAGEREF _Toc234245005 \h </w:instrText>
             </w:r>
             <w:r>
               <w:rPr>
@@ -1409,7 +1411,7 @@
               <w14:ligatures w14:val="standardContextual"/>
             </w:rPr>
           </w:pPr>
-          <w:hyperlink w:anchor="_Toc233877203" w:history="1">
+          <w:hyperlink w:anchor="_Toc234245006" w:history="1">
             <w:r>
               <w:rPr>
                 <w:rStyle w:val="Collegamentoipertestuale"/>
@@ -1436,7 +1438,7 @@
                 <w:noProof/>
                 <w:webHidden/>
               </w:rPr>
-              <w:instrText xml:space="preserve"> PAGEREF _Toc233877203 \h </w:instrText>
+              <w:instrText xml:space="preserve"> PAGEREF _Toc234245006 \h </w:instrText>
             </w:r>
             <w:r>
               <w:rPr>
@@ -1456,7 +1458,7 @@
                 <w:noProof/>
                 <w:webHidden/>
               </w:rPr>
-              <w:t>6</w:t>
+              <w:t>7</w:t>
             </w:r>
             <w:r>
               <w:rPr>
@@ -1483,7 +1485,7 @@
               <w14:ligatures w14:val="standardContextual"/>
             </w:rPr>
           </w:pPr>
-          <w:hyperlink w:anchor="_Toc233877204" w:history="1">
+          <w:hyperlink w:anchor="_Toc234245007" w:history="1">
             <w:r>
               <w:rPr>
                 <w:rStyle w:val="Collegamentoipertestuale"/>
@@ -1510,7 +1512,7 @@
                 <w:noProof/>
                 <w:webHidden/>
               </w:rPr>
-              <w:instrText xml:space="preserve"> PAGEREF _Toc233877204 \h </w:instrText>
+              <w:instrText xml:space="preserve"> PAGEREF _Toc234245007 \h </w:instrText>
             </w:r>
             <w:r>
               <w:rPr>
@@ -1557,7 +1559,7 @@
               <w14:ligatures w14:val="standardContextual"/>
             </w:rPr>
           </w:pPr>
-          <w:hyperlink w:anchor="_Toc233877205" w:history="1">
+          <w:hyperlink w:anchor="_Toc234245008" w:history="1">
             <w:r>
               <w:rPr>
                 <w:rStyle w:val="Collegamentoipertestuale"/>
@@ -1584,7 +1586,7 @@
                 <w:noProof/>
                 <w:webHidden/>
               </w:rPr>
-              <w:instrText xml:space="preserve"> PAGEREF _Toc233877205 \h </w:instrText>
+              <w:instrText xml:space="preserve"> PAGEREF _Toc234245008 \h </w:instrText>
             </w:r>
             <w:r>
               <w:rPr>
@@ -1631,7 +1633,7 @@
               <w14:ligatures w14:val="standardContextual"/>
             </w:rPr>
           </w:pPr>
-          <w:hyperlink w:anchor="_Toc233877206" w:history="1">
+          <w:hyperlink w:anchor="_Toc234245009" w:history="1">
             <w:r>
               <w:rPr>
                 <w:rStyle w:val="Collegamentoipertestuale"/>
@@ -1658,7 +1660,7 @@
                 <w:noProof/>
                 <w:webHidden/>
               </w:rPr>
-              <w:instrText xml:space="preserve"> PAGEREF _Toc233877206 \h </w:instrText>
+              <w:instrText xml:space="preserve"> PAGEREF _Toc234245009 \h </w:instrText>
             </w:r>
             <w:r>
               <w:rPr>
@@ -1713,7 +1715,7 @@
       <w:pPr>
         <w:pStyle w:val="Titolo2"/>
       </w:pPr>
-      <w:bookmarkStart w:id="1" w:name="_Toc233877186"/>
+      <w:bookmarkStart w:id="1" w:name="_Toc234244989"/>
       <w:r>
         <w:t xml:space="preserve">Calendario </w:t>
       </w:r>
@@ -1727,15 +1729,7 @@
     </w:p>
     <w:p>
       <w:r>
-        <w:t xml:space="preserve">Si saltano le prime 3 giornate di serie A, si comincia la nostra stagione dalla </w:t>
-      </w:r>
-      <w:proofErr w:type="gramStart"/>
-      <w:r>
-        <w:t>4</w:t>
-      </w:r>
-      <w:proofErr w:type="gramEnd"/>
-      <w:r>
-        <w:t xml:space="preserve"> giornata di serie A prevista per </w:t>
+        <w:t xml:space="preserve">Si saltano le prime 3 giornate di serie A, si comincia la nostra stagione dalla 4 giornata di serie A prevista per </w:t>
       </w:r>
       <w:r>
         <w:t>venerdì 1</w:t>
@@ -1744,15 +1738,7 @@
         <w:t>1</w:t>
       </w:r>
       <w:r>
-        <w:t xml:space="preserve"> settembre e termina la </w:t>
-      </w:r>
-      <w:proofErr w:type="gramStart"/>
-      <w:r>
-        <w:t>38</w:t>
-      </w:r>
-      <w:proofErr w:type="gramEnd"/>
-      <w:r>
-        <w:t xml:space="preserve"> giornata di serie A prevista per il </w:t>
+        <w:t xml:space="preserve"> settembre e termina la 38 giornata di serie A prevista per il </w:t>
       </w:r>
       <w:r>
         <w:t>30</w:t>
@@ -1772,7 +1758,7 @@
       <w:pPr>
         <w:pStyle w:val="Titolo3"/>
       </w:pPr>
-      <w:bookmarkStart w:id="2" w:name="_Toc233877187"/>
+      <w:bookmarkStart w:id="2" w:name="_Toc234244990"/>
       <w:r>
         <w:t>Campionato</w:t>
       </w:r>
@@ -1797,7 +1783,7 @@
       <w:pPr>
         <w:pStyle w:val="Titolo3"/>
       </w:pPr>
-      <w:bookmarkStart w:id="3" w:name="_Toc233877188"/>
+      <w:bookmarkStart w:id="3" w:name="_Toc234244991"/>
       <w:r>
         <w:t>Champions</w:t>
       </w:r>
@@ -1933,7 +1919,63 @@
           <w:b/>
           <w:bCs/>
         </w:rPr>
-        <w:t>in caso non venga consegnata la formazione non vengono previste multe, la partita si giocherà regolarmente inserendo la formazione precedentemente rilasciata.</w:t>
+        <w:t xml:space="preserve">in caso non venga consegnata la formazione </w:t>
+      </w:r>
+      <w:r>
+        <w:rPr>
+          <w:b/>
+          <w:bCs/>
+        </w:rPr>
+        <w:t xml:space="preserve">viene </w:t>
+      </w:r>
+      <w:r>
+        <w:rPr>
+          <w:b/>
+          <w:bCs/>
+        </w:rPr>
+        <w:t>previst</w:t>
+      </w:r>
+      <w:r>
+        <w:rPr>
+          <w:b/>
+          <w:bCs/>
+        </w:rPr>
+        <w:t>a</w:t>
+      </w:r>
+      <w:r>
+        <w:rPr>
+          <w:b/>
+          <w:bCs/>
+        </w:rPr>
+        <w:t xml:space="preserve"> </w:t>
+      </w:r>
+      <w:r>
+        <w:rPr>
+          <w:b/>
+          <w:bCs/>
+        </w:rPr>
+        <w:t xml:space="preserve">la </w:t>
+      </w:r>
+      <w:r>
+        <w:rPr>
+          <w:b/>
+          <w:bCs/>
+        </w:rPr>
+        <w:t>mult</w:t>
+      </w:r>
+      <w:r>
+        <w:rPr>
+          <w:b/>
+          <w:bCs/>
+        </w:rPr>
+        <w:t>a ma</w:t>
+      </w:r>
+      <w:r>
+        <w:rPr>
+          <w:b/>
+          <w:bCs/>
+        </w:rPr>
+        <w:t xml:space="preserve"> la partita si giocherà regolarmente inserendo la formazione precedentemente rilasciata.</w:t>
       </w:r>
     </w:p>
     <w:p/>
@@ -1941,7 +1983,7 @@
       <w:pPr>
         <w:pStyle w:val="Titolo3"/>
       </w:pPr>
-      <w:bookmarkStart w:id="4" w:name="_Toc233877189"/>
+      <w:bookmarkStart w:id="4" w:name="_Toc234244992"/>
       <w:r>
         <w:t>Coppa dei perdenti</w:t>
       </w:r>
@@ -2049,22 +2091,100 @@
           <w:b/>
           <w:bCs/>
         </w:rPr>
-        <w:t>Gli accoppiamenti saranno definiti subito dopo il termine dell’ultima partita dei gironi di Champions, accederanno alle semifinali le squadre eliminate dalla Champions.</w:t>
-      </w:r>
-    </w:p>
-    <w:p>
-      <w:pPr>
-        <w:rPr>
-          <w:b/>
-          <w:bCs/>
-        </w:rPr>
-      </w:pPr>
-      <w:r>
-        <w:rPr>
-          <w:b/>
-          <w:bCs/>
-        </w:rPr>
-        <w:t>Si scontreranno in semifinale la 3 del girone A vs 4 girone B e la 3 del girone B vs la 4 del girone A</w:t>
+        <w:t xml:space="preserve">Gli accoppiamenti saranno definiti </w:t>
+      </w:r>
+      <w:r>
+        <w:rPr>
+          <w:b/>
+          <w:bCs/>
+        </w:rPr>
+        <w:t>alla fine della 3</w:t>
+      </w:r>
+      <w:r>
+        <w:rPr>
+          <w:b/>
+          <w:bCs/>
+        </w:rPr>
+        <w:t>2</w:t>
+      </w:r>
+      <w:r>
+        <w:rPr>
+          <w:b/>
+          <w:bCs/>
+        </w:rPr>
+        <w:t>° giornata di fanta-campionato</w:t>
+      </w:r>
+      <w:r>
+        <w:rPr>
+          <w:b/>
+          <w:bCs/>
+        </w:rPr>
+        <w:t>.</w:t>
+      </w:r>
+    </w:p>
+    <w:p>
+      <w:pPr>
+        <w:rPr>
+          <w:b/>
+          <w:bCs/>
+        </w:rPr>
+      </w:pPr>
+      <w:r>
+        <w:rPr>
+          <w:b/>
+          <w:bCs/>
+        </w:rPr>
+        <w:t xml:space="preserve">Si scontreranno in semifinale </w:t>
+      </w:r>
+      <w:r>
+        <w:rPr>
+          <w:b/>
+          <w:bCs/>
+        </w:rPr>
+        <w:t xml:space="preserve">andata e ritorno </w:t>
+      </w:r>
+      <w:r>
+        <w:rPr>
+          <w:b/>
+          <w:bCs/>
+        </w:rPr>
+        <w:t xml:space="preserve">la </w:t>
+      </w:r>
+      <w:r>
+        <w:rPr>
+          <w:b/>
+          <w:bCs/>
+        </w:rPr>
+        <w:t>5° vs 8° e la 6° vs 7°.</w:t>
+      </w:r>
+    </w:p>
+    <w:p>
+      <w:pPr>
+        <w:rPr>
+          <w:b/>
+          <w:bCs/>
+        </w:rPr>
+      </w:pPr>
+      <w:r>
+        <w:rPr>
+          <w:b/>
+          <w:bCs/>
+        </w:rPr>
+        <w:t>Le vincenti si affronteranno in finale</w:t>
+      </w:r>
+      <w:r>
+        <w:rPr>
+          <w:b/>
+          <w:bCs/>
+        </w:rPr>
+        <w:t xml:space="preserve"> secca senza fattore casalingo</w:t>
+      </w:r>
+      <w:r>
+        <w:rPr>
+          <w:b/>
+          <w:bCs/>
+        </w:rPr>
+        <w:t>.</w:t>
       </w:r>
     </w:p>
     <w:p>
@@ -2080,100 +2200,194 @@
           <w:bCs/>
         </w:rPr>
         <w:lastRenderedPageBreak/>
-        <w:t>Che premi prevede la Coppa dei perdenti? L’azzeramento della quota annuale del fantacalcio.</w:t>
-      </w:r>
-    </w:p>
-    <w:p>
-      <w:pPr>
-        <w:rPr>
-          <w:b/>
-          <w:bCs/>
-        </w:rPr>
-      </w:pPr>
-      <w:r>
-        <w:rPr>
-          <w:b/>
-          <w:bCs/>
-        </w:rPr>
-        <w:t>Il vincitore della doppia semifinale regala al perdente metà della quota annuale (esempio: 120€ di quota annuale, la metà 60€ va al perdente della semifinale che a fine anno dovrà pagare 120+60=180€.</w:t>
-      </w:r>
-    </w:p>
-    <w:p>
-      <w:pPr>
-        <w:rPr>
-          <w:b/>
-          <w:bCs/>
-        </w:rPr>
-      </w:pPr>
-      <w:r>
-        <w:rPr>
-          <w:b/>
-          <w:bCs/>
-        </w:rPr>
-        <w:t>In finale si gioca All-in: la vincente regala i 60€ restanti al perdente e quindi la situazione sarà la seguente:</w:t>
-      </w:r>
-    </w:p>
-    <w:p>
-      <w:pPr>
-        <w:pStyle w:val="Paragrafoelenco"/>
-        <w:numPr>
-          <w:ilvl w:val="0"/>
-          <w:numId w:val="10"/>
-        </w:numPr>
-        <w:rPr>
-          <w:b/>
-          <w:bCs/>
-        </w:rPr>
-      </w:pPr>
-      <w:r>
-        <w:rPr>
-          <w:b/>
-          <w:bCs/>
-        </w:rPr>
-        <w:t>Vincitore: 0€</w:t>
-      </w:r>
-    </w:p>
-    <w:p>
-      <w:pPr>
-        <w:pStyle w:val="Paragrafoelenco"/>
-        <w:numPr>
-          <w:ilvl w:val="0"/>
-          <w:numId w:val="10"/>
-        </w:numPr>
-        <w:rPr>
-          <w:b/>
-          <w:bCs/>
-        </w:rPr>
-      </w:pPr>
-      <w:r>
-        <w:rPr>
-          <w:b/>
-          <w:bCs/>
-        </w:rPr>
-        <w:t>Perdente finale: 120€</w:t>
-      </w:r>
-    </w:p>
-    <w:p>
-      <w:pPr>
-        <w:pStyle w:val="Paragrafoelenco"/>
-        <w:numPr>
-          <w:ilvl w:val="0"/>
-          <w:numId w:val="10"/>
-        </w:numPr>
-        <w:rPr>
-          <w:b/>
-          <w:bCs/>
-        </w:rPr>
-      </w:pPr>
-      <w:r>
-        <w:rPr>
-          <w:b/>
-          <w:bCs/>
-        </w:rPr>
-        <w:t>Perdenti semifinali: 180€</w:t>
-      </w:r>
-    </w:p>
-    <w:p>
+        <w:t>Che premi prevede la Coppa dei perdenti? L’a</w:t>
+      </w:r>
+      <w:r>
+        <w:rPr>
+          <w:b/>
+          <w:bCs/>
+        </w:rPr>
+        <w:t>bbassamento</w:t>
+      </w:r>
+      <w:r>
+        <w:rPr>
+          <w:b/>
+          <w:bCs/>
+        </w:rPr>
+        <w:t xml:space="preserve"> della quota annuale del fantacalcio.</w:t>
+      </w:r>
+    </w:p>
+    <w:p>
+      <w:pPr>
+        <w:rPr>
+          <w:b/>
+          <w:bCs/>
+        </w:rPr>
+      </w:pPr>
+      <w:r>
+        <w:rPr>
+          <w:b/>
+          <w:bCs/>
+        </w:rPr>
+        <w:t>A fronte di una quota annuale di 120€ la ripartizione verrà così modificata:</w:t>
+      </w:r>
+    </w:p>
+    <w:tbl>
+      <w:tblPr>
+        <w:tblStyle w:val="Grigliatabella"/>
+        <w:tblW w:w="0" w:type="auto"/>
+        <w:tblLook w:val="04A0" w:firstRow="1" w:lastRow="0" w:firstColumn="1" w:lastColumn="0" w:noHBand="0" w:noVBand="1"/>
+      </w:tblPr>
+      <w:tblGrid>
+        <w:gridCol w:w="3209"/>
+        <w:gridCol w:w="3209"/>
+        <w:gridCol w:w="3210"/>
+      </w:tblGrid>
+      <w:tr>
+        <w:tc>
+          <w:tcPr>
+            <w:tcW w:w="3209" w:type="dxa"/>
+          </w:tcPr>
+          <w:p>
+            <w:pPr>
+              <w:rPr>
+                <w:b/>
+                <w:bCs/>
+              </w:rPr>
+            </w:pPr>
+            <w:r>
+              <w:rPr>
+                <w:b/>
+                <w:bCs/>
+              </w:rPr>
+              <w:t>Fase</w:t>
+            </w:r>
+          </w:p>
+        </w:tc>
+        <w:tc>
+          <w:tcPr>
+            <w:tcW w:w="3209" w:type="dxa"/>
+          </w:tcPr>
+          <w:p>
+            <w:pPr>
+              <w:rPr>
+                <w:b/>
+                <w:bCs/>
+              </w:rPr>
+            </w:pPr>
+            <w:r>
+              <w:rPr>
+                <w:b/>
+                <w:bCs/>
+              </w:rPr>
+              <w:t>Vincente</w:t>
+            </w:r>
+          </w:p>
+        </w:tc>
+        <w:tc>
+          <w:tcPr>
+            <w:tcW w:w="3210" w:type="dxa"/>
+          </w:tcPr>
+          <w:p>
+            <w:pPr>
+              <w:rPr>
+                <w:b/>
+                <w:bCs/>
+              </w:rPr>
+            </w:pPr>
+            <w:r>
+              <w:rPr>
+                <w:b/>
+                <w:bCs/>
+              </w:rPr>
+              <w:t>Perdente</w:t>
+            </w:r>
+          </w:p>
+        </w:tc>
+      </w:tr>
+      <w:tr>
+        <w:tc>
+          <w:tcPr>
+            <w:tcW w:w="3209" w:type="dxa"/>
+          </w:tcPr>
+          <w:p>
+            <w:r>
+              <w:t>Semi</w:t>
+            </w:r>
+            <w:r>
+              <w:t>finali</w:t>
+            </w:r>
+          </w:p>
+        </w:tc>
+        <w:tc>
+          <w:tcPr>
+            <w:tcW w:w="3209" w:type="dxa"/>
+          </w:tcPr>
+          <w:p>
+            <w:r>
+              <w:t>90€</w:t>
+            </w:r>
+          </w:p>
+        </w:tc>
+        <w:tc>
+          <w:tcPr>
+            <w:tcW w:w="3210" w:type="dxa"/>
+          </w:tcPr>
+          <w:p>
+            <w:r>
+              <w:t>150€</w:t>
+            </w:r>
+          </w:p>
+        </w:tc>
+      </w:tr>
+      <w:tr>
+        <w:tc>
+          <w:tcPr>
+            <w:tcW w:w="3209" w:type="dxa"/>
+          </w:tcPr>
+          <w:p>
+            <w:r>
+              <w:t>Finale</w:t>
+            </w:r>
+          </w:p>
+        </w:tc>
+        <w:tc>
+          <w:tcPr>
+            <w:tcW w:w="3209" w:type="dxa"/>
+          </w:tcPr>
+          <w:p>
+            <w:r>
+              <w:t>60€</w:t>
+            </w:r>
+          </w:p>
+        </w:tc>
+        <w:tc>
+          <w:tcPr>
+            <w:tcW w:w="3210" w:type="dxa"/>
+          </w:tcPr>
+          <w:p>
+            <w:r>
+              <w:t>120€</w:t>
+            </w:r>
+          </w:p>
+        </w:tc>
+      </w:tr>
+    </w:tbl>
+    <w:p>
+      <w:pPr>
+        <w:rPr>
+          <w:b/>
+          <w:bCs/>
+        </w:rPr>
+      </w:pPr>
+    </w:p>
+    <w:p>
+      <w:pPr>
+        <w:rPr>
+          <w:b/>
+          <w:bCs/>
+        </w:rPr>
+      </w:pPr>
       <w:r>
         <w:rPr>
           <w:b/>
@@ -2182,52 +2396,89 @@
         <w:t>Le spese di mercato e le multe non vengono conteggiate nella suddivisione suddetta</w:t>
       </w:r>
     </w:p>
-    <w:p/>
-    <w:p>
-      <w:pPr>
-        <w:pStyle w:val="Titolo2"/>
-      </w:pPr>
-      <w:bookmarkStart w:id="5" w:name="_Toc233877190"/>
-      <w:r>
-        <w:t>Rose</w:t>
-      </w:r>
-      <w:bookmarkEnd w:id="5"/>
-      <w:r>
-        <w:t xml:space="preserve">  </w:t>
-      </w:r>
-    </w:p>
-    <w:p>
-      <w:r>
-        <w:t>Il numero dei giocatori per ciascuna rosa è fisso:</w:t>
-      </w:r>
-      <w:r>
+    <w:p>
+      <w:pPr>
+        <w:rPr>
+          <w:b/>
+          <w:bCs/>
+        </w:rPr>
+      </w:pPr>
+      <w:r>
+        <w:rPr>
+          <w:b/>
+          <w:bCs/>
+        </w:rPr>
+        <w:t xml:space="preserve">Per le fasi finali </w:t>
+      </w:r>
+      <w:r>
+        <w:rPr>
+          <w:b/>
+          <w:bCs/>
+        </w:rPr>
+        <w:t xml:space="preserve">della Champions </w:t>
+      </w:r>
+      <w:r>
+        <w:rPr>
+          <w:b/>
+          <w:bCs/>
+        </w:rPr>
+        <w:t xml:space="preserve">in caso non venga consegnata la formazione </w:t>
+      </w:r>
+      <w:r>
+        <w:rPr>
+          <w:b/>
+          <w:bCs/>
+        </w:rPr>
+        <w:t xml:space="preserve">viene </w:t>
+      </w:r>
+      <w:r>
+        <w:rPr>
+          <w:b/>
+          <w:bCs/>
+        </w:rPr>
+        <w:t>previst</w:t>
+      </w:r>
+      <w:r>
+        <w:rPr>
+          <w:b/>
+          <w:bCs/>
+        </w:rPr>
+        <w:t>a</w:t>
+      </w:r>
+      <w:r>
+        <w:rPr>
+          <w:b/>
+          <w:bCs/>
+        </w:rPr>
         <w:t xml:space="preserve"> </w:t>
       </w:r>
       <w:r>
-        <w:t>3 Portieri</w:t>
-      </w:r>
-      <w:r>
-        <w:t xml:space="preserve">, </w:t>
-      </w:r>
-      <w:r>
-        <w:t>8 Difensori</w:t>
-      </w:r>
-      <w:r>
-        <w:t xml:space="preserve">, </w:t>
-      </w:r>
-      <w:r>
-        <w:t>8 centrocampisti</w:t>
-      </w:r>
-      <w:r>
-        <w:t xml:space="preserve">, </w:t>
-      </w:r>
-      <w:r>
-        <w:t>6 attaccanti</w:t>
-      </w:r>
-    </w:p>
-    <w:p>
-      <w:r>
-        <w:t>In caso di infortunio o morte di un giocatore, questo non potrà essere sostituito fino alla prossima sessione di mercato. Nel caso non sia prevista un’ulteriore sessione di mercato la squadra rimarrà con un giocatore in meno.</w:t>
+        <w:rPr>
+          <w:b/>
+          <w:bCs/>
+        </w:rPr>
+        <w:t xml:space="preserve">la </w:t>
+      </w:r>
+      <w:r>
+        <w:rPr>
+          <w:b/>
+          <w:bCs/>
+        </w:rPr>
+        <w:t>mult</w:t>
+      </w:r>
+      <w:r>
+        <w:rPr>
+          <w:b/>
+          <w:bCs/>
+        </w:rPr>
+        <w:t>a ma</w:t>
+      </w:r>
+      <w:r>
+        <w:rPr>
+          <w:b/>
+          <w:bCs/>
+        </w:rPr>
+        <w:t xml:space="preserve"> la partita si giocherà regolarmente inserendo la formazione precedentemente rilasciata.</w:t>
       </w:r>
     </w:p>
     <w:p/>
@@ -2236,7 +2487,56 @@
       <w:pPr>
         <w:pStyle w:val="Titolo2"/>
       </w:pPr>
-      <w:bookmarkStart w:id="6" w:name="_Toc233877191"/>
+      <w:bookmarkStart w:id="5" w:name="_Toc234244993"/>
+      <w:r>
+        <w:t>Rose</w:t>
+      </w:r>
+      <w:bookmarkEnd w:id="5"/>
+      <w:r>
+        <w:t xml:space="preserve">  </w:t>
+      </w:r>
+    </w:p>
+    <w:p>
+      <w:r>
+        <w:t>Il numero dei giocatori per ciascuna rosa è fisso:</w:t>
+      </w:r>
+      <w:r>
+        <w:t xml:space="preserve"> </w:t>
+      </w:r>
+      <w:r>
+        <w:t>3 Portieri</w:t>
+      </w:r>
+      <w:r>
+        <w:t xml:space="preserve">, </w:t>
+      </w:r>
+      <w:r>
+        <w:t>8 Difensori</w:t>
+      </w:r>
+      <w:r>
+        <w:t xml:space="preserve">, </w:t>
+      </w:r>
+      <w:r>
+        <w:t>8 centrocampisti</w:t>
+      </w:r>
+      <w:r>
+        <w:t xml:space="preserve">, </w:t>
+      </w:r>
+      <w:r>
+        <w:t>6 attaccanti</w:t>
+      </w:r>
+    </w:p>
+    <w:p>
+      <w:r>
+        <w:t>In caso di infortunio o morte di un giocatore, questo non potrà essere sostituito fino alla prossima sessione di mercato. Nel caso non sia prevista un’ulteriore sessione di mercato la squadra rimarrà con un giocatore in meno.</w:t>
+      </w:r>
+    </w:p>
+    <w:p/>
+    <w:p/>
+    <w:p>
+      <w:pPr>
+        <w:pStyle w:val="Titolo2"/>
+      </w:pPr>
+      <w:bookmarkStart w:id="6" w:name="_Toc234244994"/>
       <w:r>
         <w:t>Acquisto portieri</w:t>
       </w:r>
@@ -2257,7 +2557,7 @@
       <w:pPr>
         <w:pStyle w:val="Titolo2"/>
       </w:pPr>
-      <w:bookmarkStart w:id="7" w:name="_Toc233877192"/>
+      <w:bookmarkStart w:id="7" w:name="_Toc234244995"/>
       <w:r>
         <w:t>Schieramento formazione</w:t>
       </w:r>
@@ -2275,13 +2575,8 @@
       </w:r>
     </w:p>
     <w:p>
-      <w:proofErr w:type="gramStart"/>
-      <w:r>
-        <w:t>11</w:t>
-      </w:r>
-      <w:proofErr w:type="gramEnd"/>
-      <w:r>
-        <w:t xml:space="preserve"> titolari</w:t>
+      <w:r>
+        <w:t>11 titolari</w:t>
       </w:r>
     </w:p>
     <w:p>
@@ -2295,7 +2590,7 @@
       <w:pPr>
         <w:pStyle w:val="Titolo2"/>
       </w:pPr>
-      <w:bookmarkStart w:id="8" w:name="_Toc233877193"/>
+      <w:bookmarkStart w:id="8" w:name="_Toc234244996"/>
       <w:r>
         <w:t>Voti</w:t>
       </w:r>
@@ -2306,47 +2601,11 @@
     </w:p>
     <w:p>
       <w:r>
-        <w:t xml:space="preserve">I voti verranno presi dal sito PianetaFantacalcio.it; sul sito vengono riportati tutti i voti di tutte le principali testate giornalistiche sportive: Corriere dello sport e Gazzetta. Il conteggio di ciascun giocatore verrà fatto usando la media dei 2 giornali con precisione al </w:t>
-      </w:r>
-      <w:proofErr w:type="gramStart"/>
-      <w:r>
-        <w:t>2°</w:t>
-      </w:r>
-      <w:proofErr w:type="gramEnd"/>
-      <w:r>
-        <w:t xml:space="preserve"> numero decimale. </w:t>
-      </w:r>
-      <w:proofErr w:type="gramStart"/>
-      <w:r>
-        <w:t>E’</w:t>
-      </w:r>
-      <w:proofErr w:type="gramEnd"/>
-      <w:r>
-        <w:t xml:space="preserve"> importante ricordare che la media viene fatta solo sui voti presenti per un calciatore; </w:t>
-      </w:r>
-      <w:proofErr w:type="gramStart"/>
-      <w:r>
-        <w:t>ad esempio</w:t>
-      </w:r>
-      <w:proofErr w:type="gramEnd"/>
-      <w:r>
-        <w:t xml:space="preserve"> se Totti prende 6 sul corriere, </w:t>
-      </w:r>
-      <w:proofErr w:type="spellStart"/>
-      <w:r>
-        <w:t>s.v</w:t>
-      </w:r>
-      <w:proofErr w:type="spellEnd"/>
-      <w:r>
-        <w:t xml:space="preserve"> sulla gazzetta, il voto finale sarà 6. </w:t>
-      </w:r>
-      <w:proofErr w:type="gramStart"/>
-      <w:r>
-        <w:t>Inoltre</w:t>
-      </w:r>
-      <w:proofErr w:type="gramEnd"/>
-      <w:r>
-        <w:t xml:space="preserve"> se un giornale assegna un gol a un giocatore, mentre un altro giornale non assegna il gol ma dà l’autogol al difensore, verrà presa in considerazione esclusivamente la decisione che prenderà pianetafantacalcio.it Gli assist vengono presi esclusivamente dal Corriere dello Sport.</w:t>
+        <w:t xml:space="preserve">I voti verranno presi dal sito PianetaFantacalcio.it; sul sito vengono riportati tutti i voti di tutte le principali testate giornalistiche sportive: Corriere dello sport e Gazzetta. Il conteggio di ciascun giocatore verrà fatto usando la media dei 2 giornali con precisione al 2° numero decimale. E’ importante ricordare che la media viene fatta solo sui voti presenti per un calciatore; ad esempio se Totti prende 6 sul corriere, s.v sulla gazzetta, il voto finale sarà 6. Inoltre se un giornale assegna un gol a un giocatore, mentre un altro giornale </w:t>
+      </w:r>
+      <w:r>
+        <w:lastRenderedPageBreak/>
+        <w:t>non assegna il gol ma dà l’autogol al difensore, verrà presa in considerazione esclusivamente la decisione che prenderà pianetafantacalcio.it Gli assist vengono presi esclusivamente dal Corriere dello Sport.</w:t>
       </w:r>
     </w:p>
     <w:p/>
@@ -2356,7 +2615,7 @@
       <w:pPr>
         <w:pStyle w:val="Titolo2"/>
       </w:pPr>
-      <w:bookmarkStart w:id="9" w:name="_Toc233877194"/>
+      <w:bookmarkStart w:id="9" w:name="_Toc234244997"/>
       <w:r>
         <w:t>Sostituzioni della partita</w:t>
       </w:r>
@@ -2367,53 +2626,11 @@
     </w:p>
     <w:p>
       <w:r>
-        <w:t xml:space="preserve">Il numero massimo delle sostituzioni è fissato a </w:t>
-      </w:r>
-      <w:proofErr w:type="gramStart"/>
-      <w:r>
-        <w:t>6</w:t>
-      </w:r>
-      <w:proofErr w:type="gramEnd"/>
-      <w:r>
-        <w:t xml:space="preserve"> giocatori. Le sostituzioni seguono come sempre l’ordine del primo schierato per ciascun ruolo, secondariamente viene preso in considerazione il miglior voto (es.: non mi giocano 2 </w:t>
-      </w:r>
-      <w:proofErr w:type="spellStart"/>
-      <w:r>
-        <w:t>Dif</w:t>
-      </w:r>
-      <w:proofErr w:type="spellEnd"/>
-      <w:r>
-        <w:t xml:space="preserve">, 2 Cen, 2 </w:t>
-      </w:r>
-      <w:proofErr w:type="spellStart"/>
-      <w:r>
-        <w:t>Att</w:t>
-      </w:r>
-      <w:proofErr w:type="spellEnd"/>
-      <w:r>
-        <w:t xml:space="preserve">, tra le riserve mi entrerà la prima scelta del </w:t>
-      </w:r>
-      <w:proofErr w:type="spellStart"/>
-      <w:r>
-        <w:t>Dif</w:t>
-      </w:r>
-      <w:proofErr w:type="spellEnd"/>
-      <w:r>
-        <w:t>, del Cen, dell’</w:t>
-      </w:r>
-      <w:proofErr w:type="spellStart"/>
-      <w:r>
-        <w:t>Att</w:t>
-      </w:r>
-      <w:proofErr w:type="spellEnd"/>
-      <w:r>
-        <w:t xml:space="preserve">; come quarta riserva mi entrerà il migliore tra le seconde scelte). In caso non vi sia alcun sostituto il giocatore senza voto prende in automatico </w:t>
-      </w:r>
-      <w:proofErr w:type="gramStart"/>
+        <w:t xml:space="preserve">Il numero massimo delle sostituzioni è fissato a 6 giocatori. Le sostituzioni seguono come sempre l’ordine del primo schierato per ciascun ruolo, secondariamente viene preso in considerazione il miglior voto (es.: non mi giocano 2 Dif, 2 Cen, 2 Att, tra le riserve mi entrerà la prima scelta del Dif, del Cen, dell’Att; come quarta riserva mi entrerà il migliore tra le seconde scelte). In caso non vi sia alcun sostituto il giocatore senza voto prende in automatico </w:t>
+      </w:r>
       <w:r>
         <w:t>3</w:t>
       </w:r>
-      <w:proofErr w:type="gramEnd"/>
       <w:r>
         <w:t xml:space="preserve"> come voto.</w:t>
       </w:r>
@@ -2425,7 +2642,7 @@
       <w:pPr>
         <w:pStyle w:val="Titolo2"/>
       </w:pPr>
-      <w:bookmarkStart w:id="10" w:name="_Toc233877195"/>
+      <w:bookmarkStart w:id="10" w:name="_Toc234244998"/>
       <w:r>
         <w:t>Bonus / Malus</w:t>
       </w:r>
@@ -2580,7 +2797,7 @@
       <w:pPr>
         <w:pStyle w:val="Titolo2"/>
       </w:pPr>
-      <w:bookmarkStart w:id="11" w:name="_Toc233877196"/>
+      <w:bookmarkStart w:id="11" w:name="_Toc234244999"/>
       <w:r>
         <w:t>Calcolo dei gol</w:t>
       </w:r>
@@ -2679,7 +2896,7 @@
       <w:pPr>
         <w:pStyle w:val="Titolo2"/>
       </w:pPr>
-      <w:bookmarkStart w:id="12" w:name="_Toc233877197"/>
+      <w:bookmarkStart w:id="12" w:name="_Toc234245000"/>
       <w:r>
         <w:t>In caso di parità punti</w:t>
       </w:r>
@@ -2715,7 +2932,6 @@
         </w:numPr>
       </w:pPr>
       <w:r>
-        <w:lastRenderedPageBreak/>
         <w:t>Differenza reti</w:t>
       </w:r>
     </w:p>
@@ -2745,31 +2961,7 @@
     </w:p>
     <w:p>
       <w:r>
-        <w:t xml:space="preserve">Per le partite eliminatorie come la semifinale o la finale di </w:t>
-      </w:r>
-      <w:proofErr w:type="spellStart"/>
-      <w:r>
-        <w:t>champions</w:t>
-      </w:r>
-      <w:proofErr w:type="spellEnd"/>
-      <w:r>
-        <w:t xml:space="preserve"> in caso di partita che finisce in parità vincerà la squadra che ha realizzato il miglior </w:t>
-      </w:r>
-      <w:proofErr w:type="spellStart"/>
-      <w:r>
-        <w:t>fantapunteggio</w:t>
-      </w:r>
-      <w:proofErr w:type="spellEnd"/>
-      <w:r>
-        <w:t xml:space="preserve">. Per la semifinale si calcolerà il </w:t>
-      </w:r>
-      <w:proofErr w:type="spellStart"/>
-      <w:r>
-        <w:t>fanta</w:t>
-      </w:r>
-      <w:proofErr w:type="spellEnd"/>
-      <w:r>
-        <w:t xml:space="preserve"> punteggio dell’andata più quello del ritorno.</w:t>
+        <w:t>Per le partite eliminatorie come la semifinale o la finale di champions in caso di partita che finisce in parità vincerà la squadra che ha realizzato il miglior fantapunteggio. Per la semifinale si calcolerà il fanta punteggio dell’andata più quello del ritorno.</w:t>
       </w:r>
       <w:r>
         <w:t xml:space="preserve"> </w:t>
@@ -2779,23 +2971,7 @@
           <w:b/>
           <w:bCs/>
         </w:rPr>
-        <w:t xml:space="preserve">In caso di parità al </w:t>
-      </w:r>
-      <w:proofErr w:type="spellStart"/>
-      <w:r>
-        <w:rPr>
-          <w:b/>
-          <w:bCs/>
-        </w:rPr>
-        <w:t>fantapunteggio</w:t>
-      </w:r>
-      <w:proofErr w:type="spellEnd"/>
-      <w:r>
-        <w:rPr>
-          <w:b/>
-          <w:bCs/>
-        </w:rPr>
-        <w:t xml:space="preserve"> vincerà la squadra meglio piazzata in campionato (al momento della disputa) </w:t>
+        <w:t xml:space="preserve">In caso di parità al fantapunteggio vincerà la squadra meglio piazzata in campionato (al momento della disputa) </w:t>
       </w:r>
     </w:p>
     <w:p/>
@@ -2804,7 +2980,7 @@
       <w:pPr>
         <w:pStyle w:val="Titolo2"/>
       </w:pPr>
-      <w:bookmarkStart w:id="13" w:name="_Toc233877198"/>
+      <w:bookmarkStart w:id="13" w:name="_Toc234245001"/>
       <w:r>
         <w:t>Comunicazione formazione e multe</w:t>
       </w:r>
@@ -2844,36 +3020,40 @@
     </w:p>
     <w:p>
       <w:r>
-        <w:t>Nel caso una squadra non vengano rispettate le norme sopra stabilite, la squadra giocherà con la formazione della precedente giornata con l'handicap di prendere 0 punti indistintamente dal risultato maturato; in più pagherà una multa di 10 euro che arricchirà il montepremi del torneo generale.</w:t>
-      </w:r>
-    </w:p>
-    <w:p>
-      <w:pPr>
-        <w:rPr>
-          <w:b/>
-          <w:bCs/>
-        </w:rPr>
-      </w:pPr>
-      <w:r>
-        <w:rPr>
-          <w:b/>
-          <w:bCs/>
-        </w:rPr>
-        <w:t>Si propone l’abolizione delle multe</w:t>
-      </w:r>
-      <w:r>
-        <w:rPr>
-          <w:b/>
-          <w:bCs/>
-        </w:rPr>
-        <w:t xml:space="preserve">: </w:t>
-      </w:r>
-      <w:r>
-        <w:rPr>
-          <w:b/>
-          <w:bCs/>
-        </w:rPr>
-        <w:t>ciascun</w:t>
+        <w:t xml:space="preserve">Nel caso una squadra non vengano rispettate le norme sopra stabilite, la squadra giocherà con la formazione della precedente </w:t>
+      </w:r>
+      <w:r>
+        <w:rPr>
+          <w:b/>
+          <w:bCs/>
+          <w:strike/>
+        </w:rPr>
+        <w:t>giornata con l'handicap di prendere 0 punti indistintamente dal risultato maturato</w:t>
+      </w:r>
+      <w:r>
+        <w:t>; in più pagherà una multa di 10 euro che arricchirà il montepremi del torneo generale.</w:t>
+      </w:r>
+    </w:p>
+    <w:p>
+      <w:pPr>
+        <w:rPr>
+          <w:b/>
+          <w:bCs/>
+        </w:rPr>
+      </w:pPr>
+      <w:r>
+        <w:rPr>
+          <w:b/>
+          <w:bCs/>
+        </w:rPr>
+        <w:t>C</w:t>
+      </w:r>
+      <w:r>
+        <w:rPr>
+          <w:b/>
+          <w:bCs/>
+        </w:rPr>
+        <w:t>iascun</w:t>
       </w:r>
       <w:r>
         <w:rPr>
@@ -2902,7 +3082,7 @@
       <w:pPr>
         <w:pStyle w:val="Titolo2"/>
       </w:pPr>
-      <w:bookmarkStart w:id="14" w:name="_Toc233877199"/>
+      <w:bookmarkStart w:id="14" w:name="_Toc234245002"/>
       <w:r>
         <w:t>Recuperi partite rinviate</w:t>
       </w:r>
@@ -2913,15 +3093,7 @@
     </w:p>
     <w:p>
       <w:r>
-        <w:t xml:space="preserve">In caso di partite rinviate in serie A, si aspetterà il recupero della stessa per procedere all’aggiornamento dei voti del fantacalcio. </w:t>
-      </w:r>
-      <w:proofErr w:type="gramStart"/>
-      <w:r>
-        <w:t>Nel frattempo</w:t>
-      </w:r>
-      <w:proofErr w:type="gramEnd"/>
-      <w:r>
-        <w:t xml:space="preserve"> si aggiornerà la giornata impostando a tutte le partite di giornata il risultato di 0-0. Dopo il recupero, i giocatori schierati in formazione e non scesi in campo nella partita, avranno il 6 politico solo nel caso in cui non ci sia nessun sostituto disponibile.</w:t>
+        <w:t>In caso di partite rinviate in serie A, si aspetterà il recupero della stessa per procedere all’aggiornamento dei voti del fantacalcio. Nel frattempo si aggiornerà la giornata impostando a tutte le partite di giornata il risultato di 0-0. Dopo il recupero, i giocatori schierati in formazione e non scesi in campo nella partita, avranno il 6 politico solo nel caso in cui non ci sia nessun sostituto disponibile.</w:t>
       </w:r>
     </w:p>
     <w:p/>
@@ -2931,7 +3103,7 @@
       <w:pPr>
         <w:pStyle w:val="Titolo2"/>
       </w:pPr>
-      <w:bookmarkStart w:id="15" w:name="_Toc233877200"/>
+      <w:bookmarkStart w:id="15" w:name="_Toc234245003"/>
       <w:r>
         <w:t>Mercato di settembre</w:t>
       </w:r>
@@ -2942,19 +3114,11 @@
     </w:p>
     <w:p>
       <w:r>
-        <w:t xml:space="preserve">Durante l’asta ciascun presidente chiamerà un giocatore seguendo il consueto ordine (portieri, difensori, centrocampisti, attaccanti). Ogni presidente può chiamare 1 solo giocatore a sua scelta con la chiamata a busta. Al mercato di settembre ogni squadra partirà con 600 fantamilioni. Nel caso una squadra spenda più soldi di quelli concessi si procederà togliendo alla squadra il giocatore più pagato nel mercato; </w:t>
-      </w:r>
-      <w:proofErr w:type="gramStart"/>
-      <w:r>
-        <w:t>inoltre</w:t>
-      </w:r>
-      <w:proofErr w:type="gramEnd"/>
-      <w:r>
-        <w:t xml:space="preserve"> il giocatore tolto potrà essere comprato dalle altre squadre solo nel mercato di gennaio; la squadra penalizzata ovviamente non riprende nessun fantamilione dal giocatore perso. Per altre tipologie di illeciti voluti o non voluti durante il mercato iniziale si applicherà una multa che verrà decisa sul momento dalle persone non interessate direttamente nella questione. Suddetta multa andrà ad arricchire il montepremi del Campionato. Inoltre, dove possibile, il danno dovrà essere quanto prima "aggiustato" per riportare la situazione alla normalità. I giocatori non potranno più essere ceduti in cambio di soldi reali direttamente al </w:t>
+        <w:t xml:space="preserve">Durante l’asta ciascun presidente chiamerà un giocatore seguendo il consueto ordine (portieri, difensori, centrocampisti, attaccanti). Ogni presidente può chiamare 1 solo giocatore a sua scelta con la chiamata a busta. Al mercato di settembre ogni squadra partirà con 600 fantamilioni. Nel caso una squadra spenda più soldi di quelli concessi si procederà togliendo alla squadra il giocatore più pagato nel mercato; inoltre il giocatore tolto potrà essere comprato dalle altre squadre solo nel mercato di gennaio; la squadra penalizzata ovviamente non riprende nessun fantamilione dal giocatore perso. Per altre tipologie di illeciti voluti o non voluti durante il mercato iniziale si applicherà una multa che verrà decisa sul momento dalle persone non interessate direttamente nella questione. Suddetta multa andrà ad arricchire il montepremi </w:t>
       </w:r>
       <w:r>
         <w:lastRenderedPageBreak/>
-        <w:t>presidente che vende; i giocatori messi sul mercato verranno battuti all’asta e i soldi andranno solo sul montepremi generale.</w:t>
+        <w:t>del Campionato. Inoltre, dove possibile, il danno dovrà essere quanto prima "aggiustato" per riportare la situazione alla normalità. I giocatori non potranno più essere ceduti in cambio di soldi reali direttamente al presidente che vende; i giocatori messi sul mercato verranno battuti all’asta e i soldi andranno solo sul montepremi generale.</w:t>
       </w:r>
     </w:p>
     <w:p/>
@@ -2964,7 +3128,7 @@
       <w:pPr>
         <w:pStyle w:val="Titolo2"/>
       </w:pPr>
-      <w:bookmarkStart w:id="16" w:name="_Toc233877201"/>
+      <w:bookmarkStart w:id="16" w:name="_Toc234245004"/>
       <w:r>
         <w:t>Scambio giocatori</w:t>
       </w:r>
@@ -2989,7 +3153,7 @@
       <w:pPr>
         <w:pStyle w:val="Titolo2"/>
       </w:pPr>
-      <w:bookmarkStart w:id="17" w:name="_Toc233877202"/>
+      <w:bookmarkStart w:id="17" w:name="_Toc234245005"/>
       <w:r>
         <w:t>Sessioni di mercato</w:t>
       </w:r>
@@ -3017,7 +3181,35 @@
           <w:b/>
           <w:bCs/>
         </w:rPr>
-        <w:t>(orientativamente a novembre e a marzo) verrà creata una sessione di mercato sul sito</w:t>
+        <w:t xml:space="preserve">(orientativamente </w:t>
+      </w:r>
+      <w:r>
+        <w:rPr>
+          <w:b/>
+          <w:bCs/>
+        </w:rPr>
+        <w:t xml:space="preserve">11-17 </w:t>
+      </w:r>
+      <w:r>
+        <w:rPr>
+          <w:b/>
+          <w:bCs/>
+        </w:rPr>
+        <w:t xml:space="preserve">novembre e </w:t>
+      </w:r>
+      <w:r>
+        <w:rPr>
+          <w:b/>
+          <w:bCs/>
+        </w:rPr>
+        <w:t>24-30</w:t>
+      </w:r>
+      <w:r>
+        <w:rPr>
+          <w:b/>
+          <w:bCs/>
+        </w:rPr>
+        <w:t xml:space="preserve"> marzo) verrà creata una sessione di mercato sul sito</w:t>
       </w:r>
       <w:r>
         <w:rPr>
@@ -3031,7 +3223,22 @@
           <w:b/>
           <w:bCs/>
         </w:rPr>
-        <w:t xml:space="preserve"> La sessione di mercato prevede </w:t>
+        <w:t xml:space="preserve"> </w:t>
+      </w:r>
+    </w:p>
+    <w:p>
+      <w:pPr>
+        <w:rPr>
+          <w:b/>
+          <w:bCs/>
+        </w:rPr>
+      </w:pPr>
+      <w:r>
+        <w:rPr>
+          <w:b/>
+          <w:bCs/>
+        </w:rPr>
+        <w:t xml:space="preserve">La sessione di mercato prevede </w:t>
       </w:r>
       <w:r>
         <w:rPr>
@@ -3168,6 +3375,13 @@
           <w:b/>
           <w:bCs/>
         </w:rPr>
+        <w:t xml:space="preserve"> della proposta</w:t>
+      </w:r>
+      <w:r>
+        <w:rPr>
+          <w:b/>
+          <w:bCs/>
+        </w:rPr>
         <w:t>.</w:t>
       </w:r>
     </w:p>
@@ -3267,23 +3481,7 @@
           <w:b/>
           <w:bCs/>
         </w:rPr>
-        <w:t xml:space="preserve">Cap acquisti: ogni squadra può aggiudicarsi al massimo gli acquisti effettivi </w:t>
-      </w:r>
-      <w:proofErr w:type="gramStart"/>
-      <w:r>
-        <w:rPr>
-          <w:b/>
-          <w:bCs/>
-        </w:rPr>
-        <w:t>concessi, quindi</w:t>
-      </w:r>
-      <w:proofErr w:type="gramEnd"/>
-      <w:r>
-        <w:rPr>
-          <w:b/>
-          <w:bCs/>
-        </w:rPr>
-        <w:t xml:space="preserve"> se un presidente effettua 5 proposte e gli acquisti consentiti sono 2 prende i primi 2 giocatori</w:t>
+        <w:t>Cap acquisti: ogni squadra può aggiudicarsi al massimo gli acquisti effettivi concessi, quindi se un presidente effettua 5 proposte e gli acquisti consentiti sono 2 prende i primi 2 giocatori</w:t>
       </w:r>
       <w:r>
         <w:rPr>
@@ -3322,8 +3520,9 @@
       <w:pPr>
         <w:pStyle w:val="Titolo2"/>
       </w:pPr>
-      <w:bookmarkStart w:id="18" w:name="_Toc233877203"/>
-      <w:r>
+      <w:bookmarkStart w:id="18" w:name="_Toc234245006"/>
+      <w:r>
+        <w:lastRenderedPageBreak/>
         <w:t>Mercato di gennaio</w:t>
       </w:r>
       <w:bookmarkEnd w:id="18"/>
@@ -3333,19 +3532,7 @@
     </w:p>
     <w:p>
       <w:r>
-        <w:t xml:space="preserve">Il mercato di riparazione si terrà, subito dopo la conclusione del mercato reale della serie A, fissato per il 31 gennaio. Per investire al mercato di gennaio si usano i fantamilioni restanti dal mercato di settembre; i fantamilioni restanti verranno tramutati in € secondo la seguente regola: 1 € = 5 </w:t>
-      </w:r>
-      <w:proofErr w:type="gramStart"/>
-      <w:r>
-        <w:t>fantamilioni</w:t>
-      </w:r>
-      <w:proofErr w:type="gramEnd"/>
-      <w:r>
-        <w:t xml:space="preserve"> In caso di </w:t>
-      </w:r>
-      <w:r>
-        <w:lastRenderedPageBreak/>
-        <w:t>slittamenti del mercato le partite giocate in meno di 11 giocatori prevedono un 6 politico per ogni giocatore mancante in formazione. I giocatori non potranno più essere ceduti in cambio di soldi reali direttamente al presidente che vende; i giocatori messi sul mercato verranno battuti all’asta e i soldi andranno solo sul montepremi generale.</w:t>
+        <w:t>Il mercato di riparazione si terrà, subito dopo la conclusione del mercato reale della serie A, fissato per il 31 gennaio. Per investire al mercato di gennaio si usano i fantamilioni restanti dal mercato di settembre; i fantamilioni restanti verranno tramutati in € secondo la seguente regola: 1 € = 5 fantamilioni In caso di slittamenti del mercato le partite giocate in meno di 11 giocatori prevedono un 6 politico per ogni giocatore mancante in formazione. I giocatori non potranno più essere ceduti in cambio di soldi reali direttamente al presidente che vende; i giocatori messi sul mercato verranno battuti all’asta e i soldi andranno solo sul montepremi generale.</w:t>
       </w:r>
     </w:p>
     <w:p>
@@ -3364,7 +3551,7 @@
       <w:pPr>
         <w:pStyle w:val="Titolo2"/>
       </w:pPr>
-      <w:bookmarkStart w:id="19" w:name="_Toc233877204"/>
+      <w:bookmarkStart w:id="19" w:name="_Toc234245007"/>
       <w:r>
         <w:t>Cena di fine stagione</w:t>
       </w:r>
@@ -3391,7 +3578,7 @@
       <w:pPr>
         <w:pStyle w:val="Titolo2"/>
       </w:pPr>
-      <w:bookmarkStart w:id="20" w:name="_Toc233877205"/>
+      <w:bookmarkStart w:id="20" w:name="_Toc234245008"/>
       <w:r>
         <w:t>Premi stagionali</w:t>
       </w:r>
@@ -3459,7 +3646,7 @@
       <w:pPr>
         <w:pStyle w:val="Titolo2"/>
       </w:pPr>
-      <w:bookmarkStart w:id="21" w:name="_Toc233877206"/>
+      <w:bookmarkStart w:id="21" w:name="_Toc234245009"/>
       <w:r>
         <w:t>Penalità di fine stagione</w:t>
       </w:r>
@@ -3470,15 +3657,7 @@
     </w:p>
     <w:p>
       <w:r>
-        <w:t xml:space="preserve">Al termine della stagione, la squadra che si classifica nel campionato all’ultimo posto subirà, la prossima stagione, il cambio del nome della propria squadra. Gli altri </w:t>
-      </w:r>
-      <w:proofErr w:type="gramStart"/>
-      <w:r>
-        <w:t>7</w:t>
-      </w:r>
-      <w:proofErr w:type="gramEnd"/>
-      <w:r>
-        <w:t xml:space="preserve"> presidenti dovranno decidere il nuovo nome da assegnare alla squadra arrivata ultima.</w:t>
+        <w:t>Al termine della stagione, la squadra che si classifica nel campionato all’ultimo posto subirà, la prossima stagione, il cambio del nome della propria squadra. Gli altri 7 presidenti dovranno decidere il nuovo nome da assegnare alla squadra arrivata ultima.</w:t>
       </w:r>
     </w:p>
     <w:sectPr>
@@ -5166,7 +5345,7 @@
   <w:style w:type="paragraph" w:default="1" w:styleId="Normale">
     <w:name w:val="Normal"/>
     <w:qFormat/>
-    <w:rsid w:val="004A43B0"/>
+    <w:rsid w:val="00A379A4"/>
   </w:style>
   <w:style w:type="paragraph" w:styleId="Titolo1">
     <w:name w:val="heading 1"/>
@@ -5436,6 +5615,25 @@
       <w:rFonts w:eastAsiaTheme="minorEastAsia" w:cs="Times New Roman"/>
       <w:lang w:eastAsia="it-IT"/>
     </w:rPr>
+  </w:style>
+  <w:style w:type="table" w:styleId="Grigliatabella">
+    <w:name w:val="Table Grid"/>
+    <w:basedOn w:val="Tabellanormale"/>
+    <w:uiPriority w:val="39"/>
+    <w:rsid w:val="00A379A4"/>
+    <w:pPr>
+      <w:spacing w:after="0" w:line="240" w:lineRule="auto"/>
+    </w:pPr>
+    <w:tblPr>
+      <w:tblBorders>
+        <w:top w:val="single" w:sz="4" w:space="0" w:color="auto"/>
+        <w:left w:val="single" w:sz="4" w:space="0" w:color="auto"/>
+        <w:bottom w:val="single" w:sz="4" w:space="0" w:color="auto"/>
+        <w:right w:val="single" w:sz="4" w:space="0" w:color="auto"/>
+        <w:insideH w:val="single" w:sz="4" w:space="0" w:color="auto"/>
+        <w:insideV w:val="single" w:sz="4" w:space="0" w:color="auto"/>
+      </w:tblBorders>
+    </w:tblPr>
   </w:style>
 </w:styles>
 </file>

</xml_diff>

<commit_message>
refactor: update penalties and rules in regulation document for Coppa dei Perdenti
</commit_message>
<xml_diff>
--- a/public/docs/Regolamento_erFantacalcio.docx
+++ b/public/docs/Regolamento_erFantacalcio.docx
@@ -1729,7 +1729,15 @@
     </w:p>
     <w:p>
       <w:r>
-        <w:t xml:space="preserve">Si saltano le prime 3 giornate di serie A, si comincia la nostra stagione dalla 4 giornata di serie A prevista per </w:t>
+        <w:t xml:space="preserve">Si saltano le prime 3 giornate di serie A, si comincia la nostra stagione dalla </w:t>
+      </w:r>
+      <w:proofErr w:type="gramStart"/>
+      <w:r>
+        <w:t>4</w:t>
+      </w:r>
+      <w:proofErr w:type="gramEnd"/>
+      <w:r>
+        <w:t xml:space="preserve"> giornata di serie A prevista per </w:t>
       </w:r>
       <w:r>
         <w:t>venerdì 1</w:t>
@@ -1738,7 +1746,15 @@
         <w:t>1</w:t>
       </w:r>
       <w:r>
-        <w:t xml:space="preserve"> settembre e termina la 38 giornata di serie A prevista per il </w:t>
+        <w:t xml:space="preserve"> settembre e termina la </w:t>
+      </w:r>
+      <w:proofErr w:type="gramStart"/>
+      <w:r>
+        <w:t>38</w:t>
+      </w:r>
+      <w:proofErr w:type="gramEnd"/>
+      <w:r>
+        <w:t xml:space="preserve"> giornata di serie A prevista per il </w:t>
       </w:r>
       <w:r>
         <w:t>30</w:t>
@@ -2112,7 +2128,23 @@
           <w:b/>
           <w:bCs/>
         </w:rPr>
-        <w:t>° giornata di fanta-campionato</w:t>
+        <w:t xml:space="preserve">° giornata di </w:t>
+      </w:r>
+      <w:proofErr w:type="spellStart"/>
+      <w:r>
+        <w:rPr>
+          <w:b/>
+          <w:bCs/>
+        </w:rPr>
+        <w:t>fanta</w:t>
+      </w:r>
+      <w:proofErr w:type="spellEnd"/>
+      <w:r>
+        <w:rPr>
+          <w:b/>
+          <w:bCs/>
+        </w:rPr>
+        <w:t>-campionato</w:t>
       </w:r>
       <w:r>
         <w:rPr>
@@ -2357,7 +2389,10 @@
           </w:tcPr>
           <w:p>
             <w:r>
-              <w:t>60€</w:t>
+              <w:t>7</w:t>
+            </w:r>
+            <w:r>
+              <w:t>0€</w:t>
             </w:r>
           </w:p>
         </w:tc>
@@ -2367,7 +2402,13 @@
           </w:tcPr>
           <w:p>
             <w:r>
-              <w:t>120€</w:t>
+              <w:t>1</w:t>
+            </w:r>
+            <w:r>
+              <w:t>1</w:t>
+            </w:r>
+            <w:r>
+              <w:t>0€</w:t>
             </w:r>
           </w:p>
         </w:tc>
@@ -2408,14 +2449,21 @@
           <w:b/>
           <w:bCs/>
         </w:rPr>
-        <w:t xml:space="preserve">Per le fasi finali </w:t>
-      </w:r>
-      <w:r>
-        <w:rPr>
-          <w:b/>
-          <w:bCs/>
-        </w:rPr>
-        <w:t xml:space="preserve">della Champions </w:t>
+        <w:t>Per l</w:t>
+      </w:r>
+      <w:r>
+        <w:rPr>
+          <w:b/>
+          <w:bCs/>
+        </w:rPr>
+        <w:t>a coppa dei perdenti</w:t>
+      </w:r>
+      <w:r>
+        <w:rPr>
+          <w:b/>
+          <w:bCs/>
+        </w:rPr>
+        <w:t xml:space="preserve"> </w:t>
       </w:r>
       <w:r>
         <w:rPr>
@@ -2575,8 +2623,13 @@
       </w:r>
     </w:p>
     <w:p>
-      <w:r>
-        <w:t>11 titolari</w:t>
+      <w:proofErr w:type="gramStart"/>
+      <w:r>
+        <w:t>11</w:t>
+      </w:r>
+      <w:proofErr w:type="gramEnd"/>
+      <w:r>
+        <w:t xml:space="preserve"> titolari</w:t>
       </w:r>
     </w:p>
     <w:p>
@@ -2601,7 +2654,47 @@
     </w:p>
     <w:p>
       <w:r>
-        <w:t xml:space="preserve">I voti verranno presi dal sito PianetaFantacalcio.it; sul sito vengono riportati tutti i voti di tutte le principali testate giornalistiche sportive: Corriere dello sport e Gazzetta. Il conteggio di ciascun giocatore verrà fatto usando la media dei 2 giornali con precisione al 2° numero decimale. E’ importante ricordare che la media viene fatta solo sui voti presenti per un calciatore; ad esempio se Totti prende 6 sul corriere, s.v sulla gazzetta, il voto finale sarà 6. Inoltre se un giornale assegna un gol a un giocatore, mentre un altro giornale </w:t>
+        <w:t xml:space="preserve">I voti verranno presi dal sito PianetaFantacalcio.it; sul sito vengono riportati tutti i voti di tutte le principali testate giornalistiche sportive: Corriere dello sport e Gazzetta. Il conteggio di ciascun giocatore verrà fatto usando la media dei 2 giornali con precisione al </w:t>
+      </w:r>
+      <w:proofErr w:type="gramStart"/>
+      <w:r>
+        <w:t>2°</w:t>
+      </w:r>
+      <w:proofErr w:type="gramEnd"/>
+      <w:r>
+        <w:t xml:space="preserve"> numero decimale. </w:t>
+      </w:r>
+      <w:proofErr w:type="gramStart"/>
+      <w:r>
+        <w:t>E’</w:t>
+      </w:r>
+      <w:proofErr w:type="gramEnd"/>
+      <w:r>
+        <w:t xml:space="preserve"> importante ricordare che la media viene fatta solo sui voti presenti per un calciatore; </w:t>
+      </w:r>
+      <w:proofErr w:type="gramStart"/>
+      <w:r>
+        <w:t>ad esempio</w:t>
+      </w:r>
+      <w:proofErr w:type="gramEnd"/>
+      <w:r>
+        <w:t xml:space="preserve"> se Totti prende 6 sul corriere, </w:t>
+      </w:r>
+      <w:proofErr w:type="spellStart"/>
+      <w:r>
+        <w:t>s.v</w:t>
+      </w:r>
+      <w:proofErr w:type="spellEnd"/>
+      <w:r>
+        <w:t xml:space="preserve"> sulla gazzetta, il voto finale sarà 6. </w:t>
+      </w:r>
+      <w:proofErr w:type="gramStart"/>
+      <w:r>
+        <w:t>Inoltre</w:t>
+      </w:r>
+      <w:proofErr w:type="gramEnd"/>
+      <w:r>
+        <w:t xml:space="preserve"> se un giornale assegna un gol a un giocatore, mentre un altro giornale </w:t>
       </w:r>
       <w:r>
         <w:lastRenderedPageBreak/>
@@ -2626,11 +2719,53 @@
     </w:p>
     <w:p>
       <w:r>
-        <w:t xml:space="preserve">Il numero massimo delle sostituzioni è fissato a 6 giocatori. Le sostituzioni seguono come sempre l’ordine del primo schierato per ciascun ruolo, secondariamente viene preso in considerazione il miglior voto (es.: non mi giocano 2 Dif, 2 Cen, 2 Att, tra le riserve mi entrerà la prima scelta del Dif, del Cen, dell’Att; come quarta riserva mi entrerà il migliore tra le seconde scelte). In caso non vi sia alcun sostituto il giocatore senza voto prende in automatico </w:t>
-      </w:r>
+        <w:t xml:space="preserve">Il numero massimo delle sostituzioni è fissato a </w:t>
+      </w:r>
+      <w:proofErr w:type="gramStart"/>
+      <w:r>
+        <w:t>6</w:t>
+      </w:r>
+      <w:proofErr w:type="gramEnd"/>
+      <w:r>
+        <w:t xml:space="preserve"> giocatori. Le sostituzioni seguono come sempre l’ordine del primo schierato per ciascun ruolo, secondariamente viene preso in considerazione il miglior voto (es.: non mi giocano 2 </w:t>
+      </w:r>
+      <w:proofErr w:type="spellStart"/>
+      <w:r>
+        <w:t>Dif</w:t>
+      </w:r>
+      <w:proofErr w:type="spellEnd"/>
+      <w:r>
+        <w:t xml:space="preserve">, 2 Cen, 2 </w:t>
+      </w:r>
+      <w:proofErr w:type="spellStart"/>
+      <w:r>
+        <w:t>Att</w:t>
+      </w:r>
+      <w:proofErr w:type="spellEnd"/>
+      <w:r>
+        <w:t xml:space="preserve">, tra le riserve mi entrerà la prima scelta del </w:t>
+      </w:r>
+      <w:proofErr w:type="spellStart"/>
+      <w:r>
+        <w:t>Dif</w:t>
+      </w:r>
+      <w:proofErr w:type="spellEnd"/>
+      <w:r>
+        <w:t>, del Cen, dell’</w:t>
+      </w:r>
+      <w:proofErr w:type="spellStart"/>
+      <w:r>
+        <w:t>Att</w:t>
+      </w:r>
+      <w:proofErr w:type="spellEnd"/>
+      <w:r>
+        <w:t xml:space="preserve">; come quarta riserva mi entrerà il migliore tra le seconde scelte). In caso non vi sia alcun sostituto il giocatore senza voto prende in automatico </w:t>
+      </w:r>
+      <w:proofErr w:type="gramStart"/>
       <w:r>
         <w:t>3</w:t>
       </w:r>
+      <w:proofErr w:type="gramEnd"/>
       <w:r>
         <w:t xml:space="preserve"> come voto.</w:t>
       </w:r>
@@ -2961,7 +3096,31 @@
     </w:p>
     <w:p>
       <w:r>
-        <w:t>Per le partite eliminatorie come la semifinale o la finale di champions in caso di partita che finisce in parità vincerà la squadra che ha realizzato il miglior fantapunteggio. Per la semifinale si calcolerà il fanta punteggio dell’andata più quello del ritorno.</w:t>
+        <w:t xml:space="preserve">Per le partite eliminatorie come la semifinale o la finale di </w:t>
+      </w:r>
+      <w:proofErr w:type="spellStart"/>
+      <w:r>
+        <w:t>champions</w:t>
+      </w:r>
+      <w:proofErr w:type="spellEnd"/>
+      <w:r>
+        <w:t xml:space="preserve"> in caso di partita che finisce in parità vincerà la squadra che ha realizzato il miglior </w:t>
+      </w:r>
+      <w:proofErr w:type="spellStart"/>
+      <w:r>
+        <w:t>fantapunteggio</w:t>
+      </w:r>
+      <w:proofErr w:type="spellEnd"/>
+      <w:r>
+        <w:t xml:space="preserve">. Per la semifinale si calcolerà il </w:t>
+      </w:r>
+      <w:proofErr w:type="spellStart"/>
+      <w:r>
+        <w:t>fanta</w:t>
+      </w:r>
+      <w:proofErr w:type="spellEnd"/>
+      <w:r>
+        <w:t xml:space="preserve"> punteggio dell’andata più quello del ritorno.</w:t>
       </w:r>
       <w:r>
         <w:t xml:space="preserve"> </w:t>
@@ -2971,7 +3130,23 @@
           <w:b/>
           <w:bCs/>
         </w:rPr>
-        <w:t xml:space="preserve">In caso di parità al fantapunteggio vincerà la squadra meglio piazzata in campionato (al momento della disputa) </w:t>
+        <w:t xml:space="preserve">In caso di parità al </w:t>
+      </w:r>
+      <w:proofErr w:type="spellStart"/>
+      <w:r>
+        <w:rPr>
+          <w:b/>
+          <w:bCs/>
+        </w:rPr>
+        <w:t>fantapunteggio</w:t>
+      </w:r>
+      <w:proofErr w:type="spellEnd"/>
+      <w:r>
+        <w:rPr>
+          <w:b/>
+          <w:bCs/>
+        </w:rPr>
+        <w:t xml:space="preserve"> vincerà la squadra meglio piazzata in campionato (al momento della disputa) </w:t>
       </w:r>
     </w:p>
     <w:p/>
@@ -3093,7 +3268,15 @@
     </w:p>
     <w:p>
       <w:r>
-        <w:t>In caso di partite rinviate in serie A, si aspetterà il recupero della stessa per procedere all’aggiornamento dei voti del fantacalcio. Nel frattempo si aggiornerà la giornata impostando a tutte le partite di giornata il risultato di 0-0. Dopo il recupero, i giocatori schierati in formazione e non scesi in campo nella partita, avranno il 6 politico solo nel caso in cui non ci sia nessun sostituto disponibile.</w:t>
+        <w:t xml:space="preserve">In caso di partite rinviate in serie A, si aspetterà il recupero della stessa per procedere all’aggiornamento dei voti del fantacalcio. </w:t>
+      </w:r>
+      <w:proofErr w:type="gramStart"/>
+      <w:r>
+        <w:t>Nel frattempo</w:t>
+      </w:r>
+      <w:proofErr w:type="gramEnd"/>
+      <w:r>
+        <w:t xml:space="preserve"> si aggiornerà la giornata impostando a tutte le partite di giornata il risultato di 0-0. Dopo il recupero, i giocatori schierati in formazione e non scesi in campo nella partita, avranno il 6 politico solo nel caso in cui non ci sia nessun sostituto disponibile.</w:t>
       </w:r>
     </w:p>
     <w:p/>
@@ -3114,7 +3297,15 @@
     </w:p>
     <w:p>
       <w:r>
-        <w:t xml:space="preserve">Durante l’asta ciascun presidente chiamerà un giocatore seguendo il consueto ordine (portieri, difensori, centrocampisti, attaccanti). Ogni presidente può chiamare 1 solo giocatore a sua scelta con la chiamata a busta. Al mercato di settembre ogni squadra partirà con 600 fantamilioni. Nel caso una squadra spenda più soldi di quelli concessi si procederà togliendo alla squadra il giocatore più pagato nel mercato; inoltre il giocatore tolto potrà essere comprato dalle altre squadre solo nel mercato di gennaio; la squadra penalizzata ovviamente non riprende nessun fantamilione dal giocatore perso. Per altre tipologie di illeciti voluti o non voluti durante il mercato iniziale si applicherà una multa che verrà decisa sul momento dalle persone non interessate direttamente nella questione. Suddetta multa andrà ad arricchire il montepremi </w:t>
+        <w:t xml:space="preserve">Durante l’asta ciascun presidente chiamerà un giocatore seguendo il consueto ordine (portieri, difensori, centrocampisti, attaccanti). Ogni presidente può chiamare 1 solo giocatore a sua scelta con la chiamata a busta. Al mercato di settembre ogni squadra partirà con 600 fantamilioni. Nel caso una squadra spenda più soldi di quelli concessi si procederà togliendo alla squadra il giocatore più pagato nel mercato; </w:t>
+      </w:r>
+      <w:proofErr w:type="gramStart"/>
+      <w:r>
+        <w:t>inoltre</w:t>
+      </w:r>
+      <w:proofErr w:type="gramEnd"/>
+      <w:r>
+        <w:t xml:space="preserve"> il giocatore tolto potrà essere comprato dalle altre squadre solo nel mercato di gennaio; la squadra penalizzata ovviamente non riprende nessun fantamilione dal giocatore perso. Per altre tipologie di illeciti voluti o non voluti durante il mercato iniziale si applicherà una multa che verrà decisa sul momento dalle persone non interessate direttamente nella questione. Suddetta multa andrà ad arricchire il montepremi </w:t>
       </w:r>
       <w:r>
         <w:lastRenderedPageBreak/>
@@ -3481,7 +3672,23 @@
           <w:b/>
           <w:bCs/>
         </w:rPr>
-        <w:t>Cap acquisti: ogni squadra può aggiudicarsi al massimo gli acquisti effettivi concessi, quindi se un presidente effettua 5 proposte e gli acquisti consentiti sono 2 prende i primi 2 giocatori</w:t>
+        <w:t xml:space="preserve">Cap acquisti: ogni squadra può aggiudicarsi al massimo gli acquisti effettivi </w:t>
+      </w:r>
+      <w:proofErr w:type="gramStart"/>
+      <w:r>
+        <w:rPr>
+          <w:b/>
+          <w:bCs/>
+        </w:rPr>
+        <w:t>concessi, quindi</w:t>
+      </w:r>
+      <w:proofErr w:type="gramEnd"/>
+      <w:r>
+        <w:rPr>
+          <w:b/>
+          <w:bCs/>
+        </w:rPr>
+        <w:t xml:space="preserve"> se un presidente effettua 5 proposte e gli acquisti consentiti sono 2 prende i primi 2 giocatori</w:t>
       </w:r>
       <w:r>
         <w:rPr>
@@ -3532,7 +3739,15 @@
     </w:p>
     <w:p>
       <w:r>
-        <w:t>Il mercato di riparazione si terrà, subito dopo la conclusione del mercato reale della serie A, fissato per il 31 gennaio. Per investire al mercato di gennaio si usano i fantamilioni restanti dal mercato di settembre; i fantamilioni restanti verranno tramutati in € secondo la seguente regola: 1 € = 5 fantamilioni In caso di slittamenti del mercato le partite giocate in meno di 11 giocatori prevedono un 6 politico per ogni giocatore mancante in formazione. I giocatori non potranno più essere ceduti in cambio di soldi reali direttamente al presidente che vende; i giocatori messi sul mercato verranno battuti all’asta e i soldi andranno solo sul montepremi generale.</w:t>
+        <w:t xml:space="preserve">Il mercato di riparazione si terrà, subito dopo la conclusione del mercato reale della serie A, fissato per il 31 gennaio. Per investire al mercato di gennaio si usano i fantamilioni restanti dal mercato di settembre; i fantamilioni restanti verranno tramutati in € secondo la seguente regola: 1 € = 5 </w:t>
+      </w:r>
+      <w:proofErr w:type="gramStart"/>
+      <w:r>
+        <w:t>fantamilioni</w:t>
+      </w:r>
+      <w:proofErr w:type="gramEnd"/>
+      <w:r>
+        <w:t xml:space="preserve"> In caso di slittamenti del mercato le partite giocate in meno di 11 giocatori prevedono un 6 politico per ogni giocatore mancante in formazione. I giocatori non potranno più essere ceduti in cambio di soldi reali direttamente al presidente che vende; i giocatori messi sul mercato verranno battuti all’asta e i soldi andranno solo sul montepremi generale.</w:t>
       </w:r>
     </w:p>
     <w:p>
@@ -3657,7 +3872,15 @@
     </w:p>
     <w:p>
       <w:r>
-        <w:t>Al termine della stagione, la squadra che si classifica nel campionato all’ultimo posto subirà, la prossima stagione, il cambio del nome della propria squadra. Gli altri 7 presidenti dovranno decidere il nuovo nome da assegnare alla squadra arrivata ultima.</w:t>
+        <w:t xml:space="preserve">Al termine della stagione, la squadra che si classifica nel campionato all’ultimo posto subirà, la prossima stagione, il cambio del nome della propria squadra. Gli altri </w:t>
+      </w:r>
+      <w:proofErr w:type="gramStart"/>
+      <w:r>
+        <w:t>7</w:t>
+      </w:r>
+      <w:proofErr w:type="gramEnd"/>
+      <w:r>
+        <w:t xml:space="preserve"> presidenti dovranno decidere il nuovo nome da assegnare alla squadra arrivata ultima.</w:t>
       </w:r>
     </w:p>
     <w:sectPr>

</xml_diff>

<commit_message>
feat(Regolamento): update market session rules and parameters for national breaks
</commit_message>
<xml_diff>
--- a/public/docs/Regolamento_erFantacalcio.docx
+++ b/public/docs/Regolamento_erFantacalcio.docx
@@ -1,6 +1,6 @@
 
 <file path=word/document.xml><?xml version="1.0" encoding="utf-8"?>
-<w:document xmlns:wpc="http://schemas.microsoft.com/office/word/2010/wordprocessingCanvas" xmlns:cx="http://schemas.microsoft.com/office/drawing/2014/chartex" xmlns:cx1="http://schemas.microsoft.com/office/drawing/2015/9/8/chartex" xmlns:cx2="http://schemas.microsoft.com/office/drawing/2015/10/21/chartex" xmlns:cx3="http://schemas.microsoft.com/office/drawing/2016/5/9/chartex" xmlns:cx4="http://schemas.microsoft.com/office/drawing/2016/5/10/chartex" xmlns:cx5="http://schemas.microsoft.com/office/drawing/2016/5/11/chartex" xmlns:cx6="http://schemas.microsoft.com/office/drawing/2016/5/12/chartex" xmlns:cx7="http://schemas.microsoft.com/office/drawing/2016/5/13/chartex" xmlns:cx8="http://schemas.microsoft.com/office/drawing/2016/5/14/chartex" xmlns:mc="http://schemas.openxmlformats.org/markup-compatibility/2006" xmlns:aink="http://schemas.microsoft.com/office/drawing/2016/ink" xmlns:am3d="http://schemas.microsoft.com/office/drawing/2017/model3d" xmlns:o="urn:schemas-microsoft-com:office:office" xmlns:oel="http://schemas.microsoft.com/office/2019/extlst" xmlns:r="http://schemas.openxmlformats.org/officeDocument/2006/relationships" xmlns:m="http://schemas.openxmlformats.org/officeDocument/2006/math" xmlns:v="urn:schemas-microsoft-com:vml" xmlns:wp14="http://schemas.microsoft.com/office/word/2010/wordprocessingDrawing" xmlns:wp="http://schemas.openxmlformats.org/drawingml/2006/wordprocessingDrawing" xmlns:w10="urn:schemas-microsoft-com:office:word" xmlns:w="http://schemas.openxmlformats.org/wordprocessingml/2006/main" xmlns:w14="http://schemas.microsoft.com/office/word/2010/wordml" xmlns:w15="http://schemas.microsoft.com/office/word/2012/wordml" xmlns:w16cex="http://schemas.microsoft.com/office/word/2018/wordml/cex" xmlns:w16cid="http://schemas.microsoft.com/office/word/2016/wordml/cid" xmlns:w16="http://schemas.microsoft.com/office/word/2018/wordml" xmlns:w16du="http://schemas.microsoft.com/office/word/2023/wordml/word16du" xmlns:w16sdtdh="http://schemas.microsoft.com/office/word/2020/wordml/sdtdatahash" xmlns:w16sdtfl="http://schemas.microsoft.com/office/word/2024/wordml/sdtformatlock" xmlns:w16se="http://schemas.microsoft.com/office/word/2015/wordml/symex" xmlns:wpg="http://schemas.microsoft.com/office/word/2010/wordprocessingGroup" xmlns:wpi="http://schemas.microsoft.com/office/word/2010/wordprocessingInk" xmlns:wne="http://schemas.microsoft.com/office/word/2006/wordml" xmlns:wps="http://schemas.microsoft.com/office/word/2010/wordprocessingShape" mc:Ignorable="w14 w15 w16se w16cid w16 w16cex w16sdtdh w16sdtfl w16du wp14">
+<w:document xmlns:wpc="http://schemas.microsoft.com/office/word/2010/wordprocessingCanvas" xmlns:cx="http://schemas.microsoft.com/office/drawing/2014/chartex" xmlns:cx1="http://schemas.microsoft.com/office/drawing/2015/9/8/chartex" xmlns:cx2="http://schemas.microsoft.com/office/drawing/2015/10/21/chartex" xmlns:cx3="http://schemas.microsoft.com/office/drawing/2016/5/9/chartex" xmlns:cx4="http://schemas.microsoft.com/office/drawing/2016/5/10/chartex" xmlns:cx5="http://schemas.microsoft.com/office/drawing/2016/5/11/chartex" xmlns:cx6="http://schemas.microsoft.com/office/drawing/2016/5/12/chartex" xmlns:cx7="http://schemas.microsoft.com/office/drawing/2016/5/13/chartex" xmlns:cx8="http://schemas.microsoft.com/office/drawing/2016/5/14/chartex" xmlns:mc="http://schemas.openxmlformats.org/markup-compatibility/2006" xmlns:aink="http://schemas.microsoft.com/office/drawing/2016/ink" xmlns:am3d="http://schemas.microsoft.com/office/drawing/2017/model3d" xmlns:o="urn:schemas-microsoft-com:office:office" xmlns:oel="http://schemas.microsoft.com/office/2019/extlst" xmlns:r="http://schemas.openxmlformats.org/officeDocument/2006/relationships" xmlns:m="http://schemas.openxmlformats.org/officeDocument/2006/math" xmlns:v="urn:schemas-microsoft-com:vml" xmlns:wp14="http://schemas.microsoft.com/office/word/2010/wordprocessingDrawing" xmlns:wp="http://schemas.openxmlformats.org/drawingml/2006/wordprocessingDrawing" xmlns:w10="urn:schemas-microsoft-com:office:word" xmlns:w="http://schemas.openxmlformats.org/wordprocessingml/2006/main" xmlns:w14="http://schemas.microsoft.com/office/word/2010/wordml" xmlns:w15="http://schemas.microsoft.com/office/word/2012/wordml" xmlns:w16cei="http://schemas.microsoft.com/office/word/2026/wordml/cei" xmlns:w16cex="http://schemas.microsoft.com/office/word/2018/wordml/cex" xmlns:w16cid="http://schemas.microsoft.com/office/word/2016/wordml/cid" xmlns:w16="http://schemas.microsoft.com/office/word/2018/wordml" xmlns:w16du="http://schemas.microsoft.com/office/word/2023/wordml/word16du" xmlns:w16sdtdh="http://schemas.microsoft.com/office/word/2020/wordml/sdtdatahash" xmlns:w16sdtfl="http://schemas.microsoft.com/office/word/2024/wordml/sdtformatlock" xmlns:w16se="http://schemas.microsoft.com/office/word/2015/wordml/symex" xmlns:wpg="http://schemas.microsoft.com/office/word/2010/wordprocessingGroup" xmlns:wpi="http://schemas.microsoft.com/office/word/2010/wordprocessingInk" xmlns:wne="http://schemas.microsoft.com/office/word/2006/wordml" xmlns:wps="http://schemas.microsoft.com/office/word/2010/wordprocessingShape" mc:Ignorable="w14 w15 w16se w16cid w16 w16cex w16sdtdh w16sdtfl w16du wp14">
   <w:body>
     <w:p>
       <w:pPr>
@@ -3344,335 +3344,339 @@
       <w:pPr>
         <w:pStyle w:val="Titolo2"/>
       </w:pPr>
-      <w:bookmarkStart w:id="17" w:name="_Toc234245005"/>
-      <w:r>
-        <w:t>Sessioni di mercato</w:t>
-      </w:r>
-      <w:r>
-        <w:t xml:space="preserve"> sosta nazionali</w:t>
-      </w:r>
-      <w:bookmarkEnd w:id="17"/>
-    </w:p>
-    <w:p>
-      <w:pPr>
-        <w:rPr>
-          <w:b/>
-          <w:bCs/>
-        </w:rPr>
-      </w:pPr>
-      <w:r>
-        <w:rPr>
-          <w:b/>
-          <w:bCs/>
-        </w:rPr>
-        <w:t xml:space="preserve">Durante il periodo della sosta nazionali </w:t>
-      </w:r>
-      <w:r>
-        <w:rPr>
-          <w:b/>
-          <w:bCs/>
-        </w:rPr>
-        <w:t xml:space="preserve">(orientativamente </w:t>
-      </w:r>
-      <w:r>
-        <w:rPr>
-          <w:b/>
-          <w:bCs/>
-        </w:rPr>
-        <w:t xml:space="preserve">11-17 </w:t>
-      </w:r>
-      <w:r>
-        <w:rPr>
-          <w:b/>
-          <w:bCs/>
-        </w:rPr>
-        <w:t xml:space="preserve">novembre e </w:t>
-      </w:r>
-      <w:r>
-        <w:rPr>
-          <w:b/>
-          <w:bCs/>
-        </w:rPr>
-        <w:t>24-30</w:t>
-      </w:r>
-      <w:r>
-        <w:rPr>
-          <w:b/>
-          <w:bCs/>
-        </w:rPr>
-        <w:t xml:space="preserve"> marzo) verrà creata una sessione di mercato sul sito</w:t>
-      </w:r>
-      <w:r>
-        <w:rPr>
-          <w:b/>
-          <w:bCs/>
-        </w:rPr>
+      <w:r>
+        <w:t>Sessioni di mercato sosta nazionali</w:t>
+      </w:r>
+    </w:p>
+    <w:p>
+      <w:r>
+        <w:t xml:space="preserve">Durante la sosta delle nazionali (orientativamente 11-17 novembre e 24-30 marzo) viene creata una sessione di mercato sul sito dal pannello </w:t>
+      </w:r>
+      <w:r>
+        <w:rPr>
+          <w:b/>
+          <w:bCs/>
+        </w:rPr>
+        <w:t>"Crea nuova sessione"</w:t>
+      </w:r>
+      <w:r>
         <w:t>.</w:t>
       </w:r>
-      <w:r>
-        <w:rPr>
-          <w:b/>
-          <w:bCs/>
-        </w:rPr>
-        <w:t xml:space="preserve"> </w:t>
-      </w:r>
-    </w:p>
-    <w:p>
-      <w:pPr>
-        <w:rPr>
-          <w:b/>
-          <w:bCs/>
-        </w:rPr>
-      </w:pPr>
-      <w:r>
-        <w:rPr>
-          <w:b/>
-          <w:bCs/>
-        </w:rPr>
-        <w:t xml:space="preserve">La sessione di mercato prevede </w:t>
-      </w:r>
-      <w:r>
-        <w:rPr>
-          <w:b/>
-          <w:bCs/>
-        </w:rPr>
-        <w:t>la scelta di:</w:t>
-      </w:r>
-    </w:p>
-    <w:p>
-      <w:pPr>
-        <w:pStyle w:val="Paragrafoelenco"/>
+    </w:p>
+    <w:p>
+      <w:pPr>
+        <w:rPr>
+          <w:b/>
+          <w:bCs/>
+        </w:rPr>
+      </w:pPr>
+      <w:r>
+        <w:rPr>
+          <w:b/>
+          <w:bCs/>
+        </w:rPr>
+        <w:t>1. Parametri Generali della Sessione</w:t>
+      </w:r>
+    </w:p>
+    <w:p>
+      <w:r>
+        <w:t>A prescindere dalla tipologia di asta scelta, l'amministratore imposta i seguenti parametri:</w:t>
+      </w:r>
+    </w:p>
+    <w:p>
+      <w:pPr>
         <w:numPr>
           <w:ilvl w:val="0"/>
-          <w:numId w:val="9"/>
+          <w:numId w:val="12"/>
         </w:numPr>
-        <w:rPr>
-          <w:b/>
-          <w:bCs/>
-        </w:rPr>
-      </w:pPr>
-      <w:r>
-        <w:rPr>
-          <w:b/>
-          <w:bCs/>
-        </w:rPr>
-        <w:t xml:space="preserve">una finestra temporale (data inizio, data fine) </w:t>
-      </w:r>
-    </w:p>
-    <w:p>
-      <w:pPr>
-        <w:pStyle w:val="Paragrafoelenco"/>
+      </w:pPr>
+      <w:r>
+        <w:rPr>
+          <w:b/>
+          <w:bCs/>
+        </w:rPr>
+        <w:t>Finestra temporale:</w:t>
+      </w:r>
+      <w:r>
+        <w:t xml:space="preserve"> </w:t>
+      </w:r>
+      <w:r>
+        <w:rPr>
+          <w:i/>
+          <w:iCs/>
+        </w:rPr>
+        <w:t>Data apertura</w:t>
+      </w:r>
+      <w:r>
+        <w:t xml:space="preserve"> e </w:t>
+      </w:r>
+      <w:r>
+        <w:rPr>
+          <w:i/>
+          <w:iCs/>
+        </w:rPr>
+        <w:t>Data chiusura</w:t>
+      </w:r>
+      <w:r>
+        <w:t xml:space="preserve"> (con data e ora).</w:t>
+      </w:r>
+    </w:p>
+    <w:p>
+      <w:pPr>
         <w:numPr>
           <w:ilvl w:val="0"/>
-          <w:numId w:val="9"/>
+          <w:numId w:val="12"/>
         </w:numPr>
-        <w:rPr>
-          <w:b/>
-          <w:bCs/>
-        </w:rPr>
-      </w:pPr>
-      <w:r>
-        <w:rPr>
-          <w:b/>
-          <w:bCs/>
-        </w:rPr>
-        <w:t>soldi reali o fantamilioni</w:t>
-      </w:r>
-    </w:p>
-    <w:p>
-      <w:pPr>
-        <w:pStyle w:val="Paragrafoelenco"/>
+      </w:pPr>
+      <w:r>
+        <w:rPr>
+          <w:b/>
+          <w:bCs/>
+        </w:rPr>
+        <w:t>Max proposte:</w:t>
+      </w:r>
+      <w:r>
+        <w:t xml:space="preserve"> Numero massimo di proposte di acquisto inviabili da ciascuna squadra (es. 3).</w:t>
+      </w:r>
+    </w:p>
+    <w:p>
+      <w:pPr>
         <w:numPr>
           <w:ilvl w:val="0"/>
-          <w:numId w:val="9"/>
+          <w:numId w:val="12"/>
         </w:numPr>
-        <w:rPr>
-          <w:b/>
-          <w:bCs/>
-        </w:rPr>
-      </w:pPr>
-      <w:r>
-        <w:rPr>
-          <w:b/>
-          <w:bCs/>
-        </w:rPr>
-        <w:t>un numero massimo di proposte di acquisto per ciascuna squadra</w:t>
-      </w:r>
-    </w:p>
-    <w:p>
-      <w:pPr>
-        <w:pStyle w:val="Paragrafoelenco"/>
+      </w:pPr>
+      <w:r>
+        <w:rPr>
+          <w:b/>
+          <w:bCs/>
+        </w:rPr>
+        <w:t>Acquisti effettivi:</w:t>
+      </w:r>
+      <w:r>
+        <w:t xml:space="preserve"> Numero massimo di giocatori che una squadra può aggiudicarsi (es. 3, con vincolo </w:t>
+      </w:r>
+      <m:oMath>
+        <m:r>
+          <w:rPr>
+            <w:rFonts w:ascii="Cambria Math" w:hAnsi="Cambria Math"/>
+          </w:rPr>
+          <m:t>≤</m:t>
+        </m:r>
+      </m:oMath>
+      <w:r>
+        <w:t xml:space="preserve"> al numero di proposte).</w:t>
+      </w:r>
+    </w:p>
+    <w:p>
+      <w:pPr>
+        <w:rPr>
+          <w:b/>
+          <w:bCs/>
+        </w:rPr>
+      </w:pPr>
+      <w:r>
+        <w:rPr>
+          <w:b/>
+          <w:bCs/>
+        </w:rPr>
+        <w:t>2. Asta al Buio</w:t>
+      </w:r>
+    </w:p>
+    <w:p>
+      <w:pPr>
         <w:numPr>
           <w:ilvl w:val="0"/>
-          <w:numId w:val="9"/>
+          <w:numId w:val="13"/>
         </w:numPr>
-        <w:rPr>
-          <w:b/>
-          <w:bCs/>
-        </w:rPr>
-      </w:pPr>
-      <w:r>
-        <w:rPr>
-          <w:b/>
-          <w:bCs/>
-        </w:rPr>
-        <w:t>un numero massimo di giocatori acquistabili per ciascuna squadra</w:t>
-      </w:r>
-      <w:r>
-        <w:rPr>
-          <w:b/>
-          <w:bCs/>
-        </w:rPr>
-        <w:t xml:space="preserve">. </w:t>
-      </w:r>
-    </w:p>
-    <w:p>
-      <w:pPr>
-        <w:rPr>
-          <w:b/>
-          <w:bCs/>
-        </w:rPr>
-      </w:pPr>
-      <w:r>
-        <w:rPr>
-          <w:b/>
-          <w:bCs/>
-        </w:rPr>
-        <w:t>Ciascun presidente può effettuare delle proposte di acquisto</w:t>
-      </w:r>
-      <w:r>
-        <w:rPr>
-          <w:b/>
-          <w:bCs/>
-        </w:rPr>
-        <w:t xml:space="preserve"> indicando il costo</w:t>
-      </w:r>
-      <w:r>
-        <w:rPr>
-          <w:b/>
-          <w:bCs/>
-        </w:rPr>
-        <w:t>, in soldi reali o fantamilioni restanti</w:t>
-      </w:r>
-      <w:r>
-        <w:rPr>
-          <w:b/>
-          <w:bCs/>
-        </w:rPr>
-        <w:t xml:space="preserve"> e la priorità</w:t>
-      </w:r>
-      <w:r>
-        <w:rPr>
-          <w:b/>
-          <w:bCs/>
-        </w:rPr>
-        <w:t xml:space="preserve"> della proposta</w:t>
-      </w:r>
-      <w:r>
-        <w:rPr>
-          <w:b/>
-          <w:bCs/>
-        </w:rPr>
-        <w:t>.</w:t>
-      </w:r>
-    </w:p>
-    <w:p>
-      <w:pPr>
-        <w:rPr>
-          <w:b/>
-          <w:bCs/>
-        </w:rPr>
-      </w:pPr>
-      <w:r>
-        <w:rPr>
-          <w:b/>
-          <w:bCs/>
-        </w:rPr>
-        <w:t>Le proposte di acquisto non sono visibili agli altri presidenti fino a chiusura della data fine della sessione di mercato (le proposte sono criptate, non visibili nemmeno dall’amministratore).</w:t>
-      </w:r>
-    </w:p>
-    <w:p>
-      <w:pPr>
-        <w:rPr>
-          <w:b/>
-          <w:bCs/>
-        </w:rPr>
-      </w:pPr>
-      <w:r>
-        <w:rPr>
-          <w:b/>
-          <w:bCs/>
-        </w:rPr>
-        <w:t xml:space="preserve">Alla scadenza della sessione di mercato le offerte pervenute saranno visibili da tutti </w:t>
-      </w:r>
-      <w:r>
-        <w:rPr>
-          <w:b/>
-          <w:bCs/>
-        </w:rPr>
-        <w:t xml:space="preserve">in trasparenza </w:t>
-      </w:r>
-      <w:r>
-        <w:rPr>
-          <w:b/>
-          <w:bCs/>
-        </w:rPr>
-        <w:t>e si procederà all’acquisto dichiarando il giocatore da cedere.</w:t>
-      </w:r>
-    </w:p>
-    <w:p>
-      <w:pPr>
-        <w:rPr>
-          <w:b/>
-          <w:bCs/>
-        </w:rPr>
-      </w:pPr>
-      <w:r>
-        <w:rPr>
-          <w:b/>
-          <w:bCs/>
-        </w:rPr>
-        <w:t>L’aggiudicazione di un giocatore avviene nel seguente modo:</w:t>
-      </w:r>
-    </w:p>
-    <w:p>
-      <w:pPr>
-        <w:pStyle w:val="Paragrafoelenco"/>
+      </w:pPr>
+      <w:r>
+        <w:rPr>
+          <w:b/>
+          <w:bCs/>
+        </w:rPr>
+        <w:t>Valuta d'asta:</w:t>
+      </w:r>
+      <w:r>
+        <w:t xml:space="preserve"> Viene impostato automaticamente l'euro (soldi reali). In alternativa può essere usata la valuta in Fantamilioni.</w:t>
+      </w:r>
+    </w:p>
+    <w:p>
+      <w:pPr>
         <w:numPr>
           <w:ilvl w:val="0"/>
-          <w:numId w:val="9"/>
+          <w:numId w:val="13"/>
         </w:numPr>
-        <w:rPr>
-          <w:b/>
-          <w:bCs/>
-        </w:rPr>
-      </w:pPr>
-      <w:r>
-        <w:rPr>
-          <w:b/>
-          <w:bCs/>
-        </w:rPr>
-        <w:t>regola base: per ogni giocatore vince la squadra che ha offerto il prezzo più alto. A parità di prezzo, vince chi ha inviato la proposta prima</w:t>
-      </w:r>
-    </w:p>
-    <w:p>
-      <w:pPr>
-        <w:pStyle w:val="Paragrafoelenco"/>
+      </w:pPr>
+      <w:r>
+        <w:rPr>
+          <w:b/>
+          <w:bCs/>
+        </w:rPr>
+        <w:t>Funzionamento e Visibilità:</w:t>
+      </w:r>
+    </w:p>
+    <w:p>
+      <w:pPr>
+        <w:numPr>
+          <w:ilvl w:val="1"/>
+          <w:numId w:val="13"/>
+        </w:numPr>
+      </w:pPr>
+      <w:r>
+        <w:t>Ogni presidente invia le proprie proposte specificando il costo e l'ordine di priorità.</w:t>
+      </w:r>
+    </w:p>
+    <w:p>
+      <w:pPr>
+        <w:numPr>
+          <w:ilvl w:val="1"/>
+          <w:numId w:val="13"/>
+        </w:numPr>
+      </w:pPr>
+      <w:r>
+        <w:t xml:space="preserve">Le offerte sono </w:t>
+      </w:r>
+      <w:r>
+        <w:rPr>
+          <w:b/>
+          <w:bCs/>
+        </w:rPr>
+        <w:t>criptate e invisibili</w:t>
+      </w:r>
+      <w:r>
+        <w:t xml:space="preserve"> a tutti (compreso l'amministratore) fino alla </w:t>
+      </w:r>
+      <w:r>
+        <w:rPr>
+          <w:i/>
+          <w:iCs/>
+        </w:rPr>
+        <w:t>Data chiusura</w:t>
+      </w:r>
+      <w:r>
+        <w:t xml:space="preserve"> della sessione.</w:t>
+      </w:r>
+    </w:p>
+    <w:p>
+      <w:pPr>
         <w:numPr>
           <w:ilvl w:val="0"/>
-          <w:numId w:val="9"/>
+          <w:numId w:val="13"/>
         </w:numPr>
-        <w:rPr>
-          <w:b/>
-          <w:bCs/>
-        </w:rPr>
-      </w:pPr>
-      <w:r>
-        <w:rPr>
-          <w:b/>
-          <w:bCs/>
-        </w:rPr>
-        <w:t xml:space="preserve">Cap acquisti: ogni squadra può aggiudicarsi al massimo gli acquisti effettivi </w:t>
+      </w:pPr>
+      <w:r>
+        <w:rPr>
+          <w:b/>
+          <w:bCs/>
+        </w:rPr>
+        <w:t>Aggiudicazione e Chiusura:</w:t>
+      </w:r>
+    </w:p>
+    <w:p>
+      <w:pPr>
+        <w:numPr>
+          <w:ilvl w:val="1"/>
+          <w:numId w:val="13"/>
+        </w:numPr>
+      </w:pPr>
+      <w:r>
+        <w:t>Alla scadenza della sessione, le offerte vengono rese visibili a tutti.</w:t>
+      </w:r>
+    </w:p>
+    <w:p>
+      <w:pPr>
+        <w:numPr>
+          <w:ilvl w:val="1"/>
+          <w:numId w:val="13"/>
+        </w:numPr>
+      </w:pPr>
+      <w:r>
+        <w:t>Per ogni giocatore vince l'offerta più alta; a parità di prezzo prevale l'offerta inviata prima (</w:t>
+      </w:r>
+      <w:proofErr w:type="spellStart"/>
+      <w:r>
+        <w:t>timestamp</w:t>
+      </w:r>
+      <w:proofErr w:type="spellEnd"/>
+      <w:r>
+        <w:t>).</w:t>
+      </w:r>
+    </w:p>
+    <w:p>
+      <w:pPr>
+        <w:numPr>
+          <w:ilvl w:val="1"/>
+          <w:numId w:val="13"/>
+        </w:numPr>
+      </w:pPr>
+      <w:r>
+        <w:t xml:space="preserve">Si applica il </w:t>
+      </w:r>
+      <w:r>
+        <w:rPr>
+          <w:b/>
+          <w:bCs/>
+        </w:rPr>
+        <w:t>Cap acquisti</w:t>
+      </w:r>
+      <w:r>
+        <w:t xml:space="preserve">: se una squadra ha inviato più proposte rispetto al limite di </w:t>
+      </w:r>
+      <w:r>
+        <w:rPr>
+          <w:i/>
+          <w:iCs/>
+        </w:rPr>
+        <w:t>Acquisti effettivi</w:t>
+      </w:r>
+      <w:r>
+        <w:t>, si aggiudicherà solo i primi giocatori in ordine di priorità per cui risulta miglior offerente.</w:t>
+      </w:r>
+    </w:p>
+    <w:p>
+      <w:pPr>
+        <w:numPr>
+          <w:ilvl w:val="1"/>
+          <w:numId w:val="13"/>
+        </w:numPr>
+      </w:pPr>
+      <w:r>
+        <w:t>Contestualmente all'acquisto si dichiara il giocatore da cedere.</w:t>
+      </w:r>
+    </w:p>
+    <w:p>
+      <w:pPr>
+        <w:numPr>
+          <w:ilvl w:val="0"/>
+          <w:numId w:val="13"/>
+        </w:numPr>
+      </w:pPr>
+      <w:r>
+        <w:rPr>
+          <w:b/>
+          <w:bCs/>
+        </w:rPr>
+        <w:lastRenderedPageBreak/>
+        <w:t>Budget e Bonus:</w:t>
+      </w:r>
+      <w:r>
+        <w:t xml:space="preserve"> Non sono previsti extra bonus se si gioca in euro; se impostata in Fantamilioni si aggiunge un extra bonus di 30 FM ai crediti rimanenti.</w:t>
+      </w:r>
+    </w:p>
+    <w:p>
+      <w:pPr>
+        <w:rPr>
+          <w:b/>
+          <w:bCs/>
+        </w:rPr>
+      </w:pPr>
+      <w:r>
+        <w:rPr>
+          <w:b/>
+          <w:bCs/>
+        </w:rPr>
+        <w:t xml:space="preserve">3. Asta in Chiaro (Rilancio in </w:t>
       </w:r>
       <w:proofErr w:type="gramStart"/>
       <w:r>
@@ -3680,7 +3684,7 @@
           <w:b/>
           <w:bCs/>
         </w:rPr>
-        <w:t>concessi, quindi</w:t>
+        <w:t>Euro</w:t>
       </w:r>
       <w:proofErr w:type="gramEnd"/>
       <w:r>
@@ -3688,36 +3692,165 @@
           <w:b/>
           <w:bCs/>
         </w:rPr>
-        <w:t xml:space="preserve"> se un presidente effettua 5 proposte e gli acquisti consentiti sono 2 prende i primi 2 giocatori</w:t>
-      </w:r>
-      <w:r>
-        <w:rPr>
-          <w:b/>
-          <w:bCs/>
-        </w:rPr>
-        <w:t xml:space="preserve"> in ordine di priorità, su cui è il miglior offerente.</w:t>
-      </w:r>
-    </w:p>
-    <w:p>
-      <w:pPr>
-        <w:rPr>
-          <w:b/>
-          <w:bCs/>
-        </w:rPr>
-      </w:pPr>
-      <w:r>
-        <w:rPr>
-          <w:b/>
-          <w:bCs/>
-        </w:rPr>
-        <w:t>Per le sessioni di mercato se procediamo con l’acquisto in fantamilioni è previsto all’apertura di ogni sessione un extra bonus di 30 fantamilioni oltre a quelli restanti del mercato di settembre/gennaio. Se procediamo con soldi reali non sono previsti extra bonus e l’offerta non è legata a vincoli</w:t>
-      </w:r>
-      <w:r>
-        <w:rPr>
-          <w:b/>
-          <w:bCs/>
-        </w:rPr>
-        <w:t>.</w:t>
+        <w:t>)</w:t>
+      </w:r>
+    </w:p>
+    <w:p>
+      <w:pPr>
+        <w:numPr>
+          <w:ilvl w:val="0"/>
+          <w:numId w:val="14"/>
+        </w:numPr>
+      </w:pPr>
+      <w:r>
+        <w:rPr>
+          <w:b/>
+          <w:bCs/>
+        </w:rPr>
+        <w:t>Valuta d'asta:</w:t>
+      </w:r>
+      <w:r>
+        <w:t xml:space="preserve"> Rilanci esclusivamente in euro (soldi reali).</w:t>
+      </w:r>
+    </w:p>
+    <w:p>
+      <w:pPr>
+        <w:numPr>
+          <w:ilvl w:val="0"/>
+          <w:numId w:val="14"/>
+        </w:numPr>
+      </w:pPr>
+      <w:r>
+        <w:rPr>
+          <w:b/>
+          <w:bCs/>
+        </w:rPr>
+        <w:t>Funzionamento e Visibilità:</w:t>
+      </w:r>
+    </w:p>
+    <w:p>
+      <w:pPr>
+        <w:numPr>
+          <w:ilvl w:val="1"/>
+          <w:numId w:val="14"/>
+        </w:numPr>
+      </w:pPr>
+      <w:r>
+        <w:t xml:space="preserve">Tutti i rilanci e le offerte sono </w:t>
+      </w:r>
+      <w:r>
+        <w:rPr>
+          <w:b/>
+          <w:bCs/>
+        </w:rPr>
+        <w:t>pubblici e visibili</w:t>
+      </w:r>
+      <w:r>
+        <w:t xml:space="preserve"> in tempo reale a tutti i presidenti.</w:t>
+      </w:r>
+    </w:p>
+    <w:p>
+      <w:pPr>
+        <w:numPr>
+          <w:ilvl w:val="1"/>
+          <w:numId w:val="14"/>
+        </w:numPr>
+      </w:pPr>
+      <w:r>
+        <w:rPr>
+          <w:b/>
+          <w:bCs/>
+        </w:rPr>
+        <w:t>Timer di 24 ore:</w:t>
+      </w:r>
+      <w:r>
+        <w:t xml:space="preserve"> Alla prima offerta ricevuta su un determinato giocatore si attiva un conto alla rovescia di 24 ore.</w:t>
+      </w:r>
+    </w:p>
+    <w:p>
+      <w:pPr>
+        <w:numPr>
+          <w:ilvl w:val="0"/>
+          <w:numId w:val="14"/>
+        </w:numPr>
+      </w:pPr>
+      <w:r>
+        <w:rPr>
+          <w:b/>
+          <w:bCs/>
+        </w:rPr>
+        <w:t>Aggiudicazione e Chiusura:</w:t>
+      </w:r>
+    </w:p>
+    <w:p>
+      <w:pPr>
+        <w:numPr>
+          <w:ilvl w:val="1"/>
+          <w:numId w:val="14"/>
+        </w:numPr>
+      </w:pPr>
+      <w:r>
+        <w:t xml:space="preserve">Il giocatore viene aggiudicato al miglior offerente allo scadere delle 24 ore oppure alla </w:t>
+      </w:r>
+      <w:r>
+        <w:rPr>
+          <w:i/>
+          <w:iCs/>
+        </w:rPr>
+        <w:t>Data chiusura</w:t>
+      </w:r>
+      <w:r>
+        <w:t xml:space="preserve"> generale della sessione (se questa scade prima del timer).</w:t>
+      </w:r>
+    </w:p>
+    <w:p>
+      <w:pPr>
+        <w:numPr>
+          <w:ilvl w:val="1"/>
+          <w:numId w:val="14"/>
+        </w:numPr>
+      </w:pPr>
+      <w:r>
+        <w:t xml:space="preserve">Rispetta il limite massimo di </w:t>
+      </w:r>
+      <w:r>
+        <w:rPr>
+          <w:i/>
+          <w:iCs/>
+        </w:rPr>
+        <w:t>Acquisti effettivi</w:t>
+      </w:r>
+      <w:r>
+        <w:t xml:space="preserve"> impostato per la squadra.</w:t>
+      </w:r>
+    </w:p>
+    <w:p>
+      <w:pPr>
+        <w:numPr>
+          <w:ilvl w:val="1"/>
+          <w:numId w:val="14"/>
+        </w:numPr>
+      </w:pPr>
+      <w:r>
+        <w:t>All'aggiudicazione si procede all'acquisto dichiarando il giocatore da cedere.</w:t>
+      </w:r>
+    </w:p>
+    <w:p>
+      <w:pPr>
+        <w:numPr>
+          <w:ilvl w:val="0"/>
+          <w:numId w:val="14"/>
+        </w:numPr>
+      </w:pPr>
+      <w:r>
+        <w:rPr>
+          <w:b/>
+          <w:bCs/>
+        </w:rPr>
+        <w:t>Budget e Bonus:</w:t>
+      </w:r>
+      <w:r>
+        <w:t xml:space="preserve"> Non sono previsti extra bonus e le offerte non sono vincolate ai crediti di fantamercato (Fantamilioni).</w:t>
       </w:r>
     </w:p>
     <w:p/>
@@ -3727,12 +3860,11 @@
       <w:pPr>
         <w:pStyle w:val="Titolo2"/>
       </w:pPr>
-      <w:bookmarkStart w:id="18" w:name="_Toc234245006"/>
-      <w:r>
-        <w:lastRenderedPageBreak/>
+      <w:bookmarkStart w:id="17" w:name="_Toc234245006"/>
+      <w:r>
         <w:t>Mercato di gennaio</w:t>
       </w:r>
-      <w:bookmarkEnd w:id="18"/>
+      <w:bookmarkEnd w:id="17"/>
       <w:r>
         <w:t xml:space="preserve">  </w:t>
       </w:r>
@@ -3766,11 +3898,11 @@
       <w:pPr>
         <w:pStyle w:val="Titolo2"/>
       </w:pPr>
-      <w:bookmarkStart w:id="19" w:name="_Toc234245007"/>
+      <w:bookmarkStart w:id="18" w:name="_Toc234245007"/>
       <w:r>
         <w:t>Cena di fine stagione</w:t>
       </w:r>
-      <w:bookmarkEnd w:id="19"/>
+      <w:bookmarkEnd w:id="18"/>
       <w:r>
         <w:t xml:space="preserve">  </w:t>
       </w:r>
@@ -3793,11 +3925,11 @@
       <w:pPr>
         <w:pStyle w:val="Titolo2"/>
       </w:pPr>
-      <w:bookmarkStart w:id="20" w:name="_Toc234245008"/>
+      <w:bookmarkStart w:id="19" w:name="_Toc234245008"/>
       <w:r>
         <w:t>Premi stagionali</w:t>
       </w:r>
-      <w:bookmarkEnd w:id="20"/>
+      <w:bookmarkEnd w:id="19"/>
       <w:r>
         <w:t xml:space="preserve">  </w:t>
       </w:r>
@@ -3861,11 +3993,11 @@
       <w:pPr>
         <w:pStyle w:val="Titolo2"/>
       </w:pPr>
-      <w:bookmarkStart w:id="21" w:name="_Toc234245009"/>
+      <w:bookmarkStart w:id="20" w:name="_Toc234245009"/>
       <w:r>
         <w:t>Penalità di fine stagione</w:t>
       </w:r>
-      <w:bookmarkEnd w:id="21"/>
+      <w:bookmarkEnd w:id="20"/>
       <w:r>
         <w:t xml:space="preserve">  </w:t>
       </w:r>
@@ -3894,7 +4026,7 @@
 </file>
 
 <file path=word/numbering.xml><?xml version="1.0" encoding="utf-8"?>
-<w:numbering xmlns:wpc="http://schemas.microsoft.com/office/word/2010/wordprocessingCanvas" xmlns:cx="http://schemas.microsoft.com/office/drawing/2014/chartex" xmlns:cx1="http://schemas.microsoft.com/office/drawing/2015/9/8/chartex" xmlns:cx2="http://schemas.microsoft.com/office/drawing/2015/10/21/chartex" xmlns:cx3="http://schemas.microsoft.com/office/drawing/2016/5/9/chartex" xmlns:cx4="http://schemas.microsoft.com/office/drawing/2016/5/10/chartex" xmlns:cx5="http://schemas.microsoft.com/office/drawing/2016/5/11/chartex" xmlns:cx6="http://schemas.microsoft.com/office/drawing/2016/5/12/chartex" xmlns:cx7="http://schemas.microsoft.com/office/drawing/2016/5/13/chartex" xmlns:cx8="http://schemas.microsoft.com/office/drawing/2016/5/14/chartex" xmlns:mc="http://schemas.openxmlformats.org/markup-compatibility/2006" xmlns:aink="http://schemas.microsoft.com/office/drawing/2016/ink" xmlns:am3d="http://schemas.microsoft.com/office/drawing/2017/model3d" xmlns:o="urn:schemas-microsoft-com:office:office" xmlns:oel="http://schemas.microsoft.com/office/2019/extlst" xmlns:r="http://schemas.openxmlformats.org/officeDocument/2006/relationships" xmlns:m="http://schemas.openxmlformats.org/officeDocument/2006/math" xmlns:v="urn:schemas-microsoft-com:vml" xmlns:wp14="http://schemas.microsoft.com/office/word/2010/wordprocessingDrawing" xmlns:wp="http://schemas.openxmlformats.org/drawingml/2006/wordprocessingDrawing" xmlns:w10="urn:schemas-microsoft-com:office:word" xmlns:w="http://schemas.openxmlformats.org/wordprocessingml/2006/main" xmlns:w14="http://schemas.microsoft.com/office/word/2010/wordml" xmlns:w15="http://schemas.microsoft.com/office/word/2012/wordml" xmlns:w16cex="http://schemas.microsoft.com/office/word/2018/wordml/cex" xmlns:w16cid="http://schemas.microsoft.com/office/word/2016/wordml/cid" xmlns:w16="http://schemas.microsoft.com/office/word/2018/wordml" xmlns:w16du="http://schemas.microsoft.com/office/word/2023/wordml/word16du" xmlns:w16sdtdh="http://schemas.microsoft.com/office/word/2020/wordml/sdtdatahash" xmlns:w16sdtfl="http://schemas.microsoft.com/office/word/2024/wordml/sdtformatlock" xmlns:w16se="http://schemas.microsoft.com/office/word/2015/wordml/symex" xmlns:wpg="http://schemas.microsoft.com/office/word/2010/wordprocessingGroup" xmlns:wpi="http://schemas.microsoft.com/office/word/2010/wordprocessingInk" xmlns:wne="http://schemas.microsoft.com/office/word/2006/wordml" xmlns:wps="http://schemas.microsoft.com/office/word/2010/wordprocessingShape" mc:Ignorable="w14 w15 w16se w16cid w16 w16cex w16sdtdh w16sdtfl w16du wp14">
+<w:numbering xmlns:wpc="http://schemas.microsoft.com/office/word/2010/wordprocessingCanvas" xmlns:cx="http://schemas.microsoft.com/office/drawing/2014/chartex" xmlns:cx1="http://schemas.microsoft.com/office/drawing/2015/9/8/chartex" xmlns:cx2="http://schemas.microsoft.com/office/drawing/2015/10/21/chartex" xmlns:cx3="http://schemas.microsoft.com/office/drawing/2016/5/9/chartex" xmlns:cx4="http://schemas.microsoft.com/office/drawing/2016/5/10/chartex" xmlns:cx5="http://schemas.microsoft.com/office/drawing/2016/5/11/chartex" xmlns:cx6="http://schemas.microsoft.com/office/drawing/2016/5/12/chartex" xmlns:cx7="http://schemas.microsoft.com/office/drawing/2016/5/13/chartex" xmlns:cx8="http://schemas.microsoft.com/office/drawing/2016/5/14/chartex" xmlns:mc="http://schemas.openxmlformats.org/markup-compatibility/2006" xmlns:aink="http://schemas.microsoft.com/office/drawing/2016/ink" xmlns:am3d="http://schemas.microsoft.com/office/drawing/2017/model3d" xmlns:o="urn:schemas-microsoft-com:office:office" xmlns:oel="http://schemas.microsoft.com/office/2019/extlst" xmlns:r="http://schemas.openxmlformats.org/officeDocument/2006/relationships" xmlns:m="http://schemas.openxmlformats.org/officeDocument/2006/math" xmlns:v="urn:schemas-microsoft-com:vml" xmlns:wp14="http://schemas.microsoft.com/office/word/2010/wordprocessingDrawing" xmlns:wp="http://schemas.openxmlformats.org/drawingml/2006/wordprocessingDrawing" xmlns:w10="urn:schemas-microsoft-com:office:word" xmlns:w="http://schemas.openxmlformats.org/wordprocessingml/2006/main" xmlns:w14="http://schemas.microsoft.com/office/word/2010/wordml" xmlns:w15="http://schemas.microsoft.com/office/word/2012/wordml" xmlns:w16cei="http://schemas.microsoft.com/office/word/2026/wordml/cei" xmlns:w16cex="http://schemas.microsoft.com/office/word/2018/wordml/cex" xmlns:w16cid="http://schemas.microsoft.com/office/word/2016/wordml/cid" xmlns:w16="http://schemas.microsoft.com/office/word/2018/wordml" xmlns:w16du="http://schemas.microsoft.com/office/word/2023/wordml/word16du" xmlns:w16sdtdh="http://schemas.microsoft.com/office/word/2020/wordml/sdtdatahash" xmlns:w16sdtfl="http://schemas.microsoft.com/office/word/2024/wordml/sdtformatlock" xmlns:w16se="http://schemas.microsoft.com/office/word/2015/wordml/symex" xmlns:wpg="http://schemas.microsoft.com/office/word/2010/wordprocessingGroup" xmlns:wpi="http://schemas.microsoft.com/office/word/2010/wordprocessingInk" xmlns:wne="http://schemas.microsoft.com/office/word/2006/wordml" xmlns:wps="http://schemas.microsoft.com/office/word/2010/wordprocessingShape" mc:Ignorable="w14 w15 w16se w16cid w16 w16cex w16sdtdh w16sdtfl w16du wp14">
   <w:abstractNum w:abstractNumId="0" w15:restartNumberingAfterBreak="0">
     <w:nsid w:val="103036DA"/>
     <w:multiLevelType w:val="hybridMultilevel"/>
@@ -4796,6 +4928,155 @@
     </w:lvl>
   </w:abstractNum>
   <w:abstractNum w:abstractNumId="8" w15:restartNumberingAfterBreak="0">
+    <w:nsid w:val="5AC7429C"/>
+    <w:multiLevelType w:val="multilevel"/>
+    <w:tmpl w:val="3B78E5E2"/>
+    <w:lvl w:ilvl="0">
+      <w:start w:val="1"/>
+      <w:numFmt w:val="bullet"/>
+      <w:lvlText w:val=""/>
+      <w:lvlJc w:val="left"/>
+      <w:pPr>
+        <w:tabs>
+          <w:tab w:val="num" w:pos="720"/>
+        </w:tabs>
+        <w:ind w:left="720" w:hanging="360"/>
+      </w:pPr>
+      <w:rPr>
+        <w:rFonts w:ascii="Symbol" w:hAnsi="Symbol" w:hint="default"/>
+        <w:sz w:val="20"/>
+      </w:rPr>
+    </w:lvl>
+    <w:lvl w:ilvl="1">
+      <w:start w:val="1"/>
+      <w:numFmt w:val="bullet"/>
+      <w:lvlText w:val="o"/>
+      <w:lvlJc w:val="left"/>
+      <w:pPr>
+        <w:tabs>
+          <w:tab w:val="num" w:pos="1440"/>
+        </w:tabs>
+        <w:ind w:left="1440" w:hanging="360"/>
+      </w:pPr>
+      <w:rPr>
+        <w:rFonts w:ascii="Courier New" w:hAnsi="Courier New" w:hint="default"/>
+        <w:sz w:val="20"/>
+      </w:rPr>
+    </w:lvl>
+    <w:lvl w:ilvl="2" w:tentative="1">
+      <w:start w:val="1"/>
+      <w:numFmt w:val="bullet"/>
+      <w:lvlText w:val=""/>
+      <w:lvlJc w:val="left"/>
+      <w:pPr>
+        <w:tabs>
+          <w:tab w:val="num" w:pos="2160"/>
+        </w:tabs>
+        <w:ind w:left="2160" w:hanging="360"/>
+      </w:pPr>
+      <w:rPr>
+        <w:rFonts w:ascii="Wingdings" w:hAnsi="Wingdings" w:hint="default"/>
+        <w:sz w:val="20"/>
+      </w:rPr>
+    </w:lvl>
+    <w:lvl w:ilvl="3" w:tentative="1">
+      <w:start w:val="1"/>
+      <w:numFmt w:val="bullet"/>
+      <w:lvlText w:val=""/>
+      <w:lvlJc w:val="left"/>
+      <w:pPr>
+        <w:tabs>
+          <w:tab w:val="num" w:pos="2880"/>
+        </w:tabs>
+        <w:ind w:left="2880" w:hanging="360"/>
+      </w:pPr>
+      <w:rPr>
+        <w:rFonts w:ascii="Wingdings" w:hAnsi="Wingdings" w:hint="default"/>
+        <w:sz w:val="20"/>
+      </w:rPr>
+    </w:lvl>
+    <w:lvl w:ilvl="4" w:tentative="1">
+      <w:start w:val="1"/>
+      <w:numFmt w:val="bullet"/>
+      <w:lvlText w:val=""/>
+      <w:lvlJc w:val="left"/>
+      <w:pPr>
+        <w:tabs>
+          <w:tab w:val="num" w:pos="3600"/>
+        </w:tabs>
+        <w:ind w:left="3600" w:hanging="360"/>
+      </w:pPr>
+      <w:rPr>
+        <w:rFonts w:ascii="Wingdings" w:hAnsi="Wingdings" w:hint="default"/>
+        <w:sz w:val="20"/>
+      </w:rPr>
+    </w:lvl>
+    <w:lvl w:ilvl="5" w:tentative="1">
+      <w:start w:val="1"/>
+      <w:numFmt w:val="bullet"/>
+      <w:lvlText w:val=""/>
+      <w:lvlJc w:val="left"/>
+      <w:pPr>
+        <w:tabs>
+          <w:tab w:val="num" w:pos="4320"/>
+        </w:tabs>
+        <w:ind w:left="4320" w:hanging="360"/>
+      </w:pPr>
+      <w:rPr>
+        <w:rFonts w:ascii="Wingdings" w:hAnsi="Wingdings" w:hint="default"/>
+        <w:sz w:val="20"/>
+      </w:rPr>
+    </w:lvl>
+    <w:lvl w:ilvl="6" w:tentative="1">
+      <w:start w:val="1"/>
+      <w:numFmt w:val="bullet"/>
+      <w:lvlText w:val=""/>
+      <w:lvlJc w:val="left"/>
+      <w:pPr>
+        <w:tabs>
+          <w:tab w:val="num" w:pos="5040"/>
+        </w:tabs>
+        <w:ind w:left="5040" w:hanging="360"/>
+      </w:pPr>
+      <w:rPr>
+        <w:rFonts w:ascii="Wingdings" w:hAnsi="Wingdings" w:hint="default"/>
+        <w:sz w:val="20"/>
+      </w:rPr>
+    </w:lvl>
+    <w:lvl w:ilvl="7" w:tentative="1">
+      <w:start w:val="1"/>
+      <w:numFmt w:val="bullet"/>
+      <w:lvlText w:val=""/>
+      <w:lvlJc w:val="left"/>
+      <w:pPr>
+        <w:tabs>
+          <w:tab w:val="num" w:pos="5760"/>
+        </w:tabs>
+        <w:ind w:left="5760" w:hanging="360"/>
+      </w:pPr>
+      <w:rPr>
+        <w:rFonts w:ascii="Wingdings" w:hAnsi="Wingdings" w:hint="default"/>
+        <w:sz w:val="20"/>
+      </w:rPr>
+    </w:lvl>
+    <w:lvl w:ilvl="8" w:tentative="1">
+      <w:start w:val="1"/>
+      <w:numFmt w:val="bullet"/>
+      <w:lvlText w:val=""/>
+      <w:lvlJc w:val="left"/>
+      <w:pPr>
+        <w:tabs>
+          <w:tab w:val="num" w:pos="6480"/>
+        </w:tabs>
+        <w:ind w:left="6480" w:hanging="360"/>
+      </w:pPr>
+      <w:rPr>
+        <w:rFonts w:ascii="Wingdings" w:hAnsi="Wingdings" w:hint="default"/>
+        <w:sz w:val="20"/>
+      </w:rPr>
+    </w:lvl>
+  </w:abstractNum>
+  <w:abstractNum w:abstractNumId="9" w15:restartNumberingAfterBreak="0">
     <w:nsid w:val="5E2D33B9"/>
     <w:multiLevelType w:val="hybridMultilevel"/>
     <w:tmpl w:val="14960ACC"/>
@@ -4908,7 +5189,156 @@
       </w:rPr>
     </w:lvl>
   </w:abstractNum>
-  <w:abstractNum w:abstractNumId="9" w15:restartNumberingAfterBreak="0">
+  <w:abstractNum w:abstractNumId="10" w15:restartNumberingAfterBreak="0">
+    <w:nsid w:val="5F3D7D0A"/>
+    <w:multiLevelType w:val="multilevel"/>
+    <w:tmpl w:val="54BC2A22"/>
+    <w:lvl w:ilvl="0">
+      <w:start w:val="1"/>
+      <w:numFmt w:val="bullet"/>
+      <w:lvlText w:val=""/>
+      <w:lvlJc w:val="left"/>
+      <w:pPr>
+        <w:tabs>
+          <w:tab w:val="num" w:pos="720"/>
+        </w:tabs>
+        <w:ind w:left="720" w:hanging="360"/>
+      </w:pPr>
+      <w:rPr>
+        <w:rFonts w:ascii="Symbol" w:hAnsi="Symbol" w:hint="default"/>
+        <w:sz w:val="20"/>
+      </w:rPr>
+    </w:lvl>
+    <w:lvl w:ilvl="1" w:tentative="1">
+      <w:start w:val="1"/>
+      <w:numFmt w:val="bullet"/>
+      <w:lvlText w:val="o"/>
+      <w:lvlJc w:val="left"/>
+      <w:pPr>
+        <w:tabs>
+          <w:tab w:val="num" w:pos="1440"/>
+        </w:tabs>
+        <w:ind w:left="1440" w:hanging="360"/>
+      </w:pPr>
+      <w:rPr>
+        <w:rFonts w:ascii="Courier New" w:hAnsi="Courier New" w:hint="default"/>
+        <w:sz w:val="20"/>
+      </w:rPr>
+    </w:lvl>
+    <w:lvl w:ilvl="2" w:tentative="1">
+      <w:start w:val="1"/>
+      <w:numFmt w:val="bullet"/>
+      <w:lvlText w:val=""/>
+      <w:lvlJc w:val="left"/>
+      <w:pPr>
+        <w:tabs>
+          <w:tab w:val="num" w:pos="2160"/>
+        </w:tabs>
+        <w:ind w:left="2160" w:hanging="360"/>
+      </w:pPr>
+      <w:rPr>
+        <w:rFonts w:ascii="Wingdings" w:hAnsi="Wingdings" w:hint="default"/>
+        <w:sz w:val="20"/>
+      </w:rPr>
+    </w:lvl>
+    <w:lvl w:ilvl="3" w:tentative="1">
+      <w:start w:val="1"/>
+      <w:numFmt w:val="bullet"/>
+      <w:lvlText w:val=""/>
+      <w:lvlJc w:val="left"/>
+      <w:pPr>
+        <w:tabs>
+          <w:tab w:val="num" w:pos="2880"/>
+        </w:tabs>
+        <w:ind w:left="2880" w:hanging="360"/>
+      </w:pPr>
+      <w:rPr>
+        <w:rFonts w:ascii="Wingdings" w:hAnsi="Wingdings" w:hint="default"/>
+        <w:sz w:val="20"/>
+      </w:rPr>
+    </w:lvl>
+    <w:lvl w:ilvl="4" w:tentative="1">
+      <w:start w:val="1"/>
+      <w:numFmt w:val="bullet"/>
+      <w:lvlText w:val=""/>
+      <w:lvlJc w:val="left"/>
+      <w:pPr>
+        <w:tabs>
+          <w:tab w:val="num" w:pos="3600"/>
+        </w:tabs>
+        <w:ind w:left="3600" w:hanging="360"/>
+      </w:pPr>
+      <w:rPr>
+        <w:rFonts w:ascii="Wingdings" w:hAnsi="Wingdings" w:hint="default"/>
+        <w:sz w:val="20"/>
+      </w:rPr>
+    </w:lvl>
+    <w:lvl w:ilvl="5" w:tentative="1">
+      <w:start w:val="1"/>
+      <w:numFmt w:val="bullet"/>
+      <w:lvlText w:val=""/>
+      <w:lvlJc w:val="left"/>
+      <w:pPr>
+        <w:tabs>
+          <w:tab w:val="num" w:pos="4320"/>
+        </w:tabs>
+        <w:ind w:left="4320" w:hanging="360"/>
+      </w:pPr>
+      <w:rPr>
+        <w:rFonts w:ascii="Wingdings" w:hAnsi="Wingdings" w:hint="default"/>
+        <w:sz w:val="20"/>
+      </w:rPr>
+    </w:lvl>
+    <w:lvl w:ilvl="6" w:tentative="1">
+      <w:start w:val="1"/>
+      <w:numFmt w:val="bullet"/>
+      <w:lvlText w:val=""/>
+      <w:lvlJc w:val="left"/>
+      <w:pPr>
+        <w:tabs>
+          <w:tab w:val="num" w:pos="5040"/>
+        </w:tabs>
+        <w:ind w:left="5040" w:hanging="360"/>
+      </w:pPr>
+      <w:rPr>
+        <w:rFonts w:ascii="Wingdings" w:hAnsi="Wingdings" w:hint="default"/>
+        <w:sz w:val="20"/>
+      </w:rPr>
+    </w:lvl>
+    <w:lvl w:ilvl="7" w:tentative="1">
+      <w:start w:val="1"/>
+      <w:numFmt w:val="bullet"/>
+      <w:lvlText w:val=""/>
+      <w:lvlJc w:val="left"/>
+      <w:pPr>
+        <w:tabs>
+          <w:tab w:val="num" w:pos="5760"/>
+        </w:tabs>
+        <w:ind w:left="5760" w:hanging="360"/>
+      </w:pPr>
+      <w:rPr>
+        <w:rFonts w:ascii="Wingdings" w:hAnsi="Wingdings" w:hint="default"/>
+        <w:sz w:val="20"/>
+      </w:rPr>
+    </w:lvl>
+    <w:lvl w:ilvl="8" w:tentative="1">
+      <w:start w:val="1"/>
+      <w:numFmt w:val="bullet"/>
+      <w:lvlText w:val=""/>
+      <w:lvlJc w:val="left"/>
+      <w:pPr>
+        <w:tabs>
+          <w:tab w:val="num" w:pos="6480"/>
+        </w:tabs>
+        <w:ind w:left="6480" w:hanging="360"/>
+      </w:pPr>
+      <w:rPr>
+        <w:rFonts w:ascii="Wingdings" w:hAnsi="Wingdings" w:hint="default"/>
+        <w:sz w:val="20"/>
+      </w:rPr>
+    </w:lvl>
+  </w:abstractNum>
+  <w:abstractNum w:abstractNumId="11" w15:restartNumberingAfterBreak="0">
     <w:nsid w:val="700D66D2"/>
     <w:multiLevelType w:val="hybridMultilevel"/>
     <w:tmpl w:val="B3BA5AE8"/>
@@ -5021,7 +5451,7 @@
       </w:rPr>
     </w:lvl>
   </w:abstractNum>
-  <w:abstractNum w:abstractNumId="10" w15:restartNumberingAfterBreak="0">
+  <w:abstractNum w:abstractNumId="12" w15:restartNumberingAfterBreak="0">
     <w:nsid w:val="72353A77"/>
     <w:multiLevelType w:val="hybridMultilevel"/>
     <w:tmpl w:val="57502344"/>
@@ -5134,20 +5564,169 @@
       </w:rPr>
     </w:lvl>
   </w:abstractNum>
+  <w:abstractNum w:abstractNumId="13" w15:restartNumberingAfterBreak="0">
+    <w:nsid w:val="79A87E8E"/>
+    <w:multiLevelType w:val="multilevel"/>
+    <w:tmpl w:val="E4F2B828"/>
+    <w:lvl w:ilvl="0">
+      <w:start w:val="1"/>
+      <w:numFmt w:val="bullet"/>
+      <w:lvlText w:val=""/>
+      <w:lvlJc w:val="left"/>
+      <w:pPr>
+        <w:tabs>
+          <w:tab w:val="num" w:pos="720"/>
+        </w:tabs>
+        <w:ind w:left="720" w:hanging="360"/>
+      </w:pPr>
+      <w:rPr>
+        <w:rFonts w:ascii="Symbol" w:hAnsi="Symbol" w:hint="default"/>
+        <w:sz w:val="20"/>
+      </w:rPr>
+    </w:lvl>
+    <w:lvl w:ilvl="1">
+      <w:start w:val="1"/>
+      <w:numFmt w:val="bullet"/>
+      <w:lvlText w:val="o"/>
+      <w:lvlJc w:val="left"/>
+      <w:pPr>
+        <w:tabs>
+          <w:tab w:val="num" w:pos="1440"/>
+        </w:tabs>
+        <w:ind w:left="1440" w:hanging="360"/>
+      </w:pPr>
+      <w:rPr>
+        <w:rFonts w:ascii="Courier New" w:hAnsi="Courier New" w:hint="default"/>
+        <w:sz w:val="20"/>
+      </w:rPr>
+    </w:lvl>
+    <w:lvl w:ilvl="2" w:tentative="1">
+      <w:start w:val="1"/>
+      <w:numFmt w:val="bullet"/>
+      <w:lvlText w:val=""/>
+      <w:lvlJc w:val="left"/>
+      <w:pPr>
+        <w:tabs>
+          <w:tab w:val="num" w:pos="2160"/>
+        </w:tabs>
+        <w:ind w:left="2160" w:hanging="360"/>
+      </w:pPr>
+      <w:rPr>
+        <w:rFonts w:ascii="Wingdings" w:hAnsi="Wingdings" w:hint="default"/>
+        <w:sz w:val="20"/>
+      </w:rPr>
+    </w:lvl>
+    <w:lvl w:ilvl="3" w:tentative="1">
+      <w:start w:val="1"/>
+      <w:numFmt w:val="bullet"/>
+      <w:lvlText w:val=""/>
+      <w:lvlJc w:val="left"/>
+      <w:pPr>
+        <w:tabs>
+          <w:tab w:val="num" w:pos="2880"/>
+        </w:tabs>
+        <w:ind w:left="2880" w:hanging="360"/>
+      </w:pPr>
+      <w:rPr>
+        <w:rFonts w:ascii="Wingdings" w:hAnsi="Wingdings" w:hint="default"/>
+        <w:sz w:val="20"/>
+      </w:rPr>
+    </w:lvl>
+    <w:lvl w:ilvl="4" w:tentative="1">
+      <w:start w:val="1"/>
+      <w:numFmt w:val="bullet"/>
+      <w:lvlText w:val=""/>
+      <w:lvlJc w:val="left"/>
+      <w:pPr>
+        <w:tabs>
+          <w:tab w:val="num" w:pos="3600"/>
+        </w:tabs>
+        <w:ind w:left="3600" w:hanging="360"/>
+      </w:pPr>
+      <w:rPr>
+        <w:rFonts w:ascii="Wingdings" w:hAnsi="Wingdings" w:hint="default"/>
+        <w:sz w:val="20"/>
+      </w:rPr>
+    </w:lvl>
+    <w:lvl w:ilvl="5" w:tentative="1">
+      <w:start w:val="1"/>
+      <w:numFmt w:val="bullet"/>
+      <w:lvlText w:val=""/>
+      <w:lvlJc w:val="left"/>
+      <w:pPr>
+        <w:tabs>
+          <w:tab w:val="num" w:pos="4320"/>
+        </w:tabs>
+        <w:ind w:left="4320" w:hanging="360"/>
+      </w:pPr>
+      <w:rPr>
+        <w:rFonts w:ascii="Wingdings" w:hAnsi="Wingdings" w:hint="default"/>
+        <w:sz w:val="20"/>
+      </w:rPr>
+    </w:lvl>
+    <w:lvl w:ilvl="6" w:tentative="1">
+      <w:start w:val="1"/>
+      <w:numFmt w:val="bullet"/>
+      <w:lvlText w:val=""/>
+      <w:lvlJc w:val="left"/>
+      <w:pPr>
+        <w:tabs>
+          <w:tab w:val="num" w:pos="5040"/>
+        </w:tabs>
+        <w:ind w:left="5040" w:hanging="360"/>
+      </w:pPr>
+      <w:rPr>
+        <w:rFonts w:ascii="Wingdings" w:hAnsi="Wingdings" w:hint="default"/>
+        <w:sz w:val="20"/>
+      </w:rPr>
+    </w:lvl>
+    <w:lvl w:ilvl="7" w:tentative="1">
+      <w:start w:val="1"/>
+      <w:numFmt w:val="bullet"/>
+      <w:lvlText w:val=""/>
+      <w:lvlJc w:val="left"/>
+      <w:pPr>
+        <w:tabs>
+          <w:tab w:val="num" w:pos="5760"/>
+        </w:tabs>
+        <w:ind w:left="5760" w:hanging="360"/>
+      </w:pPr>
+      <w:rPr>
+        <w:rFonts w:ascii="Wingdings" w:hAnsi="Wingdings" w:hint="default"/>
+        <w:sz w:val="20"/>
+      </w:rPr>
+    </w:lvl>
+    <w:lvl w:ilvl="8" w:tentative="1">
+      <w:start w:val="1"/>
+      <w:numFmt w:val="bullet"/>
+      <w:lvlText w:val=""/>
+      <w:lvlJc w:val="left"/>
+      <w:pPr>
+        <w:tabs>
+          <w:tab w:val="num" w:pos="6480"/>
+        </w:tabs>
+        <w:ind w:left="6480" w:hanging="360"/>
+      </w:pPr>
+      <w:rPr>
+        <w:rFonts w:ascii="Wingdings" w:hAnsi="Wingdings" w:hint="default"/>
+        <w:sz w:val="20"/>
+      </w:rPr>
+    </w:lvl>
+  </w:abstractNum>
   <w:num w:numId="1" w16cid:durableId="1235234935">
-    <w:abstractNumId w:val="10"/>
+    <w:abstractNumId w:val="12"/>
   </w:num>
   <w:num w:numId="2" w16cid:durableId="1808547614">
     <w:abstractNumId w:val="2"/>
   </w:num>
   <w:num w:numId="3" w16cid:durableId="1125194435">
-    <w:abstractNumId w:val="9"/>
+    <w:abstractNumId w:val="11"/>
   </w:num>
   <w:num w:numId="4" w16cid:durableId="998002894">
     <w:abstractNumId w:val="4"/>
   </w:num>
   <w:num w:numId="5" w16cid:durableId="171259058">
-    <w:abstractNumId w:val="8"/>
+    <w:abstractNumId w:val="9"/>
   </w:num>
   <w:num w:numId="6" w16cid:durableId="642078686">
     <w:abstractNumId w:val="3"/>
@@ -5166,6 +5745,15 @@
   </w:num>
   <w:num w:numId="11" w16cid:durableId="2082438036">
     <w:abstractNumId w:val="1"/>
+  </w:num>
+  <w:num w:numId="12" w16cid:durableId="1651323674">
+    <w:abstractNumId w:val="10"/>
+  </w:num>
+  <w:num w:numId="13" w16cid:durableId="1343973325">
+    <w:abstractNumId w:val="8"/>
+  </w:num>
+  <w:num w:numId="14" w16cid:durableId="1046760472">
+    <w:abstractNumId w:val="13"/>
   </w:num>
 </w:numbering>
 </file>
@@ -5660,7 +6248,6 @@
   <w:style w:type="character" w:default="1" w:styleId="Carpredefinitoparagrafo">
     <w:name w:val="Default Paragraph Font"/>
     <w:uiPriority w:val="1"/>
-    <w:semiHidden/>
     <w:unhideWhenUsed/>
   </w:style>
   <w:style w:type="table" w:default="1" w:styleId="Tabellanormale">

</xml_diff>

<commit_message>
fix: update regulations for semifinals and finals penalties, and adjust market session parameters
</commit_message>
<xml_diff>
--- a/public/docs/Regolamento_erFantacalcio.docx
+++ b/public/docs/Regolamento_erFantacalcio.docx
@@ -7,7 +7,7 @@
         <w:pStyle w:val="Titolo1"/>
         <w:jc w:val="center"/>
       </w:pPr>
-      <w:bookmarkStart w:id="0" w:name="_Toc234244988"/>
+      <w:bookmarkStart w:id="0" w:name="_Toc239683705"/>
       <w:r>
         <w:t>Regolamento erFantacalcio</w:t>
       </w:r>
@@ -82,7 +82,7 @@
           <w:r>
             <w:fldChar w:fldCharType="separate"/>
           </w:r>
-          <w:hyperlink w:anchor="_Toc234244988" w:history="1">
+          <w:hyperlink w:anchor="_Toc239683705" w:history="1">
             <w:r>
               <w:rPr>
                 <w:rStyle w:val="Collegamentoipertestuale"/>
@@ -109,7 +109,7 @@
                 <w:noProof/>
                 <w:webHidden/>
               </w:rPr>
-              <w:instrText xml:space="preserve"> PAGEREF _Toc234244988 \h </w:instrText>
+              <w:instrText xml:space="preserve"> PAGEREF _Toc239683705 \h </w:instrText>
             </w:r>
             <w:r>
               <w:rPr>
@@ -156,7 +156,7 @@
               <w14:ligatures w14:val="standardContextual"/>
             </w:rPr>
           </w:pPr>
-          <w:hyperlink w:anchor="_Toc234244989" w:history="1">
+          <w:hyperlink w:anchor="_Toc239683706" w:history="1">
             <w:r>
               <w:rPr>
                 <w:rStyle w:val="Collegamentoipertestuale"/>
@@ -183,7 +183,7 @@
                 <w:noProof/>
                 <w:webHidden/>
               </w:rPr>
-              <w:instrText xml:space="preserve"> PAGEREF _Toc234244989 \h </w:instrText>
+              <w:instrText xml:space="preserve"> PAGEREF _Toc239683706 \h </w:instrText>
             </w:r>
             <w:r>
               <w:rPr>
@@ -229,7 +229,7 @@
               <w14:ligatures w14:val="standardContextual"/>
             </w:rPr>
           </w:pPr>
-          <w:hyperlink w:anchor="_Toc234244990" w:history="1">
+          <w:hyperlink w:anchor="_Toc239683707" w:history="1">
             <w:r>
               <w:rPr>
                 <w:rStyle w:val="Collegamentoipertestuale"/>
@@ -256,7 +256,7 @@
                 <w:noProof/>
                 <w:webHidden/>
               </w:rPr>
-              <w:instrText xml:space="preserve"> PAGEREF _Toc234244990 \h </w:instrText>
+              <w:instrText xml:space="preserve"> PAGEREF _Toc239683707 \h </w:instrText>
             </w:r>
             <w:r>
               <w:rPr>
@@ -302,7 +302,7 @@
               <w14:ligatures w14:val="standardContextual"/>
             </w:rPr>
           </w:pPr>
-          <w:hyperlink w:anchor="_Toc234244991" w:history="1">
+          <w:hyperlink w:anchor="_Toc239683708" w:history="1">
             <w:r>
               <w:rPr>
                 <w:rStyle w:val="Collegamentoipertestuale"/>
@@ -329,7 +329,7 @@
                 <w:noProof/>
                 <w:webHidden/>
               </w:rPr>
-              <w:instrText xml:space="preserve"> PAGEREF _Toc234244991 \h </w:instrText>
+              <w:instrText xml:space="preserve"> PAGEREF _Toc239683708 \h </w:instrText>
             </w:r>
             <w:r>
               <w:rPr>
@@ -375,7 +375,7 @@
               <w14:ligatures w14:val="standardContextual"/>
             </w:rPr>
           </w:pPr>
-          <w:hyperlink w:anchor="_Toc234244992" w:history="1">
+          <w:hyperlink w:anchor="_Toc239683709" w:history="1">
             <w:r>
               <w:rPr>
                 <w:rStyle w:val="Collegamentoipertestuale"/>
@@ -402,7 +402,7 @@
                 <w:noProof/>
                 <w:webHidden/>
               </w:rPr>
-              <w:instrText xml:space="preserve"> PAGEREF _Toc234244992 \h </w:instrText>
+              <w:instrText xml:space="preserve"> PAGEREF _Toc239683709 \h </w:instrText>
             </w:r>
             <w:r>
               <w:rPr>
@@ -449,7 +449,7 @@
               <w14:ligatures w14:val="standardContextual"/>
             </w:rPr>
           </w:pPr>
-          <w:hyperlink w:anchor="_Toc234244993" w:history="1">
+          <w:hyperlink w:anchor="_Toc239683710" w:history="1">
             <w:r>
               <w:rPr>
                 <w:rStyle w:val="Collegamentoipertestuale"/>
@@ -476,7 +476,7 @@
                 <w:noProof/>
                 <w:webHidden/>
               </w:rPr>
-              <w:instrText xml:space="preserve"> PAGEREF _Toc234244993 \h </w:instrText>
+              <w:instrText xml:space="preserve"> PAGEREF _Toc239683710 \h </w:instrText>
             </w:r>
             <w:r>
               <w:rPr>
@@ -523,7 +523,7 @@
               <w14:ligatures w14:val="standardContextual"/>
             </w:rPr>
           </w:pPr>
-          <w:hyperlink w:anchor="_Toc234244994" w:history="1">
+          <w:hyperlink w:anchor="_Toc239683711" w:history="1">
             <w:r>
               <w:rPr>
                 <w:rStyle w:val="Collegamentoipertestuale"/>
@@ -550,7 +550,7 @@
                 <w:noProof/>
                 <w:webHidden/>
               </w:rPr>
-              <w:instrText xml:space="preserve"> PAGEREF _Toc234244994 \h </w:instrText>
+              <w:instrText xml:space="preserve"> PAGEREF _Toc239683711 \h </w:instrText>
             </w:r>
             <w:r>
               <w:rPr>
@@ -597,7 +597,7 @@
               <w14:ligatures w14:val="standardContextual"/>
             </w:rPr>
           </w:pPr>
-          <w:hyperlink w:anchor="_Toc234244995" w:history="1">
+          <w:hyperlink w:anchor="_Toc239683712" w:history="1">
             <w:r>
               <w:rPr>
                 <w:rStyle w:val="Collegamentoipertestuale"/>
@@ -624,7 +624,7 @@
                 <w:noProof/>
                 <w:webHidden/>
               </w:rPr>
-              <w:instrText xml:space="preserve"> PAGEREF _Toc234244995 \h </w:instrText>
+              <w:instrText xml:space="preserve"> PAGEREF _Toc239683712 \h </w:instrText>
             </w:r>
             <w:r>
               <w:rPr>
@@ -671,7 +671,7 @@
               <w14:ligatures w14:val="standardContextual"/>
             </w:rPr>
           </w:pPr>
-          <w:hyperlink w:anchor="_Toc234244996" w:history="1">
+          <w:hyperlink w:anchor="_Toc239683713" w:history="1">
             <w:r>
               <w:rPr>
                 <w:rStyle w:val="Collegamentoipertestuale"/>
@@ -698,7 +698,7 @@
                 <w:noProof/>
                 <w:webHidden/>
               </w:rPr>
-              <w:instrText xml:space="preserve"> PAGEREF _Toc234244996 \h </w:instrText>
+              <w:instrText xml:space="preserve"> PAGEREF _Toc239683713 \h </w:instrText>
             </w:r>
             <w:r>
               <w:rPr>
@@ -745,7 +745,7 @@
               <w14:ligatures w14:val="standardContextual"/>
             </w:rPr>
           </w:pPr>
-          <w:hyperlink w:anchor="_Toc234244997" w:history="1">
+          <w:hyperlink w:anchor="_Toc239683714" w:history="1">
             <w:r>
               <w:rPr>
                 <w:rStyle w:val="Collegamentoipertestuale"/>
@@ -772,7 +772,7 @@
                 <w:noProof/>
                 <w:webHidden/>
               </w:rPr>
-              <w:instrText xml:space="preserve"> PAGEREF _Toc234244997 \h </w:instrText>
+              <w:instrText xml:space="preserve"> PAGEREF _Toc239683714 \h </w:instrText>
             </w:r>
             <w:r>
               <w:rPr>
@@ -819,7 +819,7 @@
               <w14:ligatures w14:val="standardContextual"/>
             </w:rPr>
           </w:pPr>
-          <w:hyperlink w:anchor="_Toc234244998" w:history="1">
+          <w:hyperlink w:anchor="_Toc239683715" w:history="1">
             <w:r>
               <w:rPr>
                 <w:rStyle w:val="Collegamentoipertestuale"/>
@@ -846,7 +846,7 @@
                 <w:noProof/>
                 <w:webHidden/>
               </w:rPr>
-              <w:instrText xml:space="preserve"> PAGEREF _Toc234244998 \h </w:instrText>
+              <w:instrText xml:space="preserve"> PAGEREF _Toc239683715 \h </w:instrText>
             </w:r>
             <w:r>
               <w:rPr>
@@ -893,7 +893,7 @@
               <w14:ligatures w14:val="standardContextual"/>
             </w:rPr>
           </w:pPr>
-          <w:hyperlink w:anchor="_Toc234244999" w:history="1">
+          <w:hyperlink w:anchor="_Toc239683716" w:history="1">
             <w:r>
               <w:rPr>
                 <w:rStyle w:val="Collegamentoipertestuale"/>
@@ -920,7 +920,7 @@
                 <w:noProof/>
                 <w:webHidden/>
               </w:rPr>
-              <w:instrText xml:space="preserve"> PAGEREF _Toc234244999 \h </w:instrText>
+              <w:instrText xml:space="preserve"> PAGEREF _Toc239683716 \h </w:instrText>
             </w:r>
             <w:r>
               <w:rPr>
@@ -967,7 +967,7 @@
               <w14:ligatures w14:val="standardContextual"/>
             </w:rPr>
           </w:pPr>
-          <w:hyperlink w:anchor="_Toc234245000" w:history="1">
+          <w:hyperlink w:anchor="_Toc239683717" w:history="1">
             <w:r>
               <w:rPr>
                 <w:rStyle w:val="Collegamentoipertestuale"/>
@@ -994,7 +994,7 @@
                 <w:noProof/>
                 <w:webHidden/>
               </w:rPr>
-              <w:instrText xml:space="preserve"> PAGEREF _Toc234245000 \h </w:instrText>
+              <w:instrText xml:space="preserve"> PAGEREF _Toc239683717 \h </w:instrText>
             </w:r>
             <w:r>
               <w:rPr>
@@ -1041,7 +1041,7 @@
               <w14:ligatures w14:val="standardContextual"/>
             </w:rPr>
           </w:pPr>
-          <w:hyperlink w:anchor="_Toc234245001" w:history="1">
+          <w:hyperlink w:anchor="_Toc239683718" w:history="1">
             <w:r>
               <w:rPr>
                 <w:rStyle w:val="Collegamentoipertestuale"/>
@@ -1068,7 +1068,7 @@
                 <w:noProof/>
                 <w:webHidden/>
               </w:rPr>
-              <w:instrText xml:space="preserve"> PAGEREF _Toc234245001 \h </w:instrText>
+              <w:instrText xml:space="preserve"> PAGEREF _Toc239683718 \h </w:instrText>
             </w:r>
             <w:r>
               <w:rPr>
@@ -1115,7 +1115,7 @@
               <w14:ligatures w14:val="standardContextual"/>
             </w:rPr>
           </w:pPr>
-          <w:hyperlink w:anchor="_Toc234245002" w:history="1">
+          <w:hyperlink w:anchor="_Toc239683719" w:history="1">
             <w:r>
               <w:rPr>
                 <w:rStyle w:val="Collegamentoipertestuale"/>
@@ -1142,7 +1142,7 @@
                 <w:noProof/>
                 <w:webHidden/>
               </w:rPr>
-              <w:instrText xml:space="preserve"> PAGEREF _Toc234245002 \h </w:instrText>
+              <w:instrText xml:space="preserve"> PAGEREF _Toc239683719 \h </w:instrText>
             </w:r>
             <w:r>
               <w:rPr>
@@ -1189,7 +1189,7 @@
               <w14:ligatures w14:val="standardContextual"/>
             </w:rPr>
           </w:pPr>
-          <w:hyperlink w:anchor="_Toc234245003" w:history="1">
+          <w:hyperlink w:anchor="_Toc239683720" w:history="1">
             <w:r>
               <w:rPr>
                 <w:rStyle w:val="Collegamentoipertestuale"/>
@@ -1216,7 +1216,7 @@
                 <w:noProof/>
                 <w:webHidden/>
               </w:rPr>
-              <w:instrText xml:space="preserve"> PAGEREF _Toc234245003 \h </w:instrText>
+              <w:instrText xml:space="preserve"> PAGEREF _Toc239683720 \h </w:instrText>
             </w:r>
             <w:r>
               <w:rPr>
@@ -1263,7 +1263,7 @@
               <w14:ligatures w14:val="standardContextual"/>
             </w:rPr>
           </w:pPr>
-          <w:hyperlink w:anchor="_Toc234245004" w:history="1">
+          <w:hyperlink w:anchor="_Toc239683721" w:history="1">
             <w:r>
               <w:rPr>
                 <w:rStyle w:val="Collegamentoipertestuale"/>
@@ -1290,7 +1290,7 @@
                 <w:noProof/>
                 <w:webHidden/>
               </w:rPr>
-              <w:instrText xml:space="preserve"> PAGEREF _Toc234245004 \h </w:instrText>
+              <w:instrText xml:space="preserve"> PAGEREF _Toc239683721 \h </w:instrText>
             </w:r>
             <w:r>
               <w:rPr>
@@ -1337,7 +1337,7 @@
               <w14:ligatures w14:val="standardContextual"/>
             </w:rPr>
           </w:pPr>
-          <w:hyperlink w:anchor="_Toc234245005" w:history="1">
+          <w:hyperlink w:anchor="_Toc239683722" w:history="1">
             <w:r>
               <w:rPr>
                 <w:rStyle w:val="Collegamentoipertestuale"/>
@@ -1364,7 +1364,7 @@
                 <w:noProof/>
                 <w:webHidden/>
               </w:rPr>
-              <w:instrText xml:space="preserve"> PAGEREF _Toc234245005 \h </w:instrText>
+              <w:instrText xml:space="preserve"> PAGEREF _Toc239683722 \h </w:instrText>
             </w:r>
             <w:r>
               <w:rPr>
@@ -1411,7 +1411,7 @@
               <w14:ligatures w14:val="standardContextual"/>
             </w:rPr>
           </w:pPr>
-          <w:hyperlink w:anchor="_Toc234245006" w:history="1">
+          <w:hyperlink w:anchor="_Toc239683723" w:history="1">
             <w:r>
               <w:rPr>
                 <w:rStyle w:val="Collegamentoipertestuale"/>
@@ -1438,7 +1438,7 @@
                 <w:noProof/>
                 <w:webHidden/>
               </w:rPr>
-              <w:instrText xml:space="preserve"> PAGEREF _Toc234245006 \h </w:instrText>
+              <w:instrText xml:space="preserve"> PAGEREF _Toc239683723 \h </w:instrText>
             </w:r>
             <w:r>
               <w:rPr>
@@ -1485,7 +1485,7 @@
               <w14:ligatures w14:val="standardContextual"/>
             </w:rPr>
           </w:pPr>
-          <w:hyperlink w:anchor="_Toc234245007" w:history="1">
+          <w:hyperlink w:anchor="_Toc239683724" w:history="1">
             <w:r>
               <w:rPr>
                 <w:rStyle w:val="Collegamentoipertestuale"/>
@@ -1512,7 +1512,7 @@
                 <w:noProof/>
                 <w:webHidden/>
               </w:rPr>
-              <w:instrText xml:space="preserve"> PAGEREF _Toc234245007 \h </w:instrText>
+              <w:instrText xml:space="preserve"> PAGEREF _Toc239683724 \h </w:instrText>
             </w:r>
             <w:r>
               <w:rPr>
@@ -1559,7 +1559,7 @@
               <w14:ligatures w14:val="standardContextual"/>
             </w:rPr>
           </w:pPr>
-          <w:hyperlink w:anchor="_Toc234245008" w:history="1">
+          <w:hyperlink w:anchor="_Toc239683725" w:history="1">
             <w:r>
               <w:rPr>
                 <w:rStyle w:val="Collegamentoipertestuale"/>
@@ -1586,7 +1586,7 @@
                 <w:noProof/>
                 <w:webHidden/>
               </w:rPr>
-              <w:instrText xml:space="preserve"> PAGEREF _Toc234245008 \h </w:instrText>
+              <w:instrText xml:space="preserve"> PAGEREF _Toc239683725 \h </w:instrText>
             </w:r>
             <w:r>
               <w:rPr>
@@ -1633,7 +1633,7 @@
               <w14:ligatures w14:val="standardContextual"/>
             </w:rPr>
           </w:pPr>
-          <w:hyperlink w:anchor="_Toc234245009" w:history="1">
+          <w:hyperlink w:anchor="_Toc239683726" w:history="1">
             <w:r>
               <w:rPr>
                 <w:rStyle w:val="Collegamentoipertestuale"/>
@@ -1660,7 +1660,7 @@
                 <w:noProof/>
                 <w:webHidden/>
               </w:rPr>
-              <w:instrText xml:space="preserve"> PAGEREF _Toc234245009 \h </w:instrText>
+              <w:instrText xml:space="preserve"> PAGEREF _Toc239683726 \h </w:instrText>
             </w:r>
             <w:r>
               <w:rPr>
@@ -1715,7 +1715,7 @@
       <w:pPr>
         <w:pStyle w:val="Titolo2"/>
       </w:pPr>
-      <w:bookmarkStart w:id="1" w:name="_Toc234244989"/>
+      <w:bookmarkStart w:id="1" w:name="_Toc239683706"/>
       <w:r>
         <w:t xml:space="preserve">Calendario </w:t>
       </w:r>
@@ -1774,7 +1774,7 @@
       <w:pPr>
         <w:pStyle w:val="Titolo3"/>
       </w:pPr>
-      <w:bookmarkStart w:id="2" w:name="_Toc234244990"/>
+      <w:bookmarkStart w:id="2" w:name="_Toc239683707"/>
       <w:r>
         <w:t>Campionato</w:t>
       </w:r>
@@ -1799,7 +1799,7 @@
       <w:pPr>
         <w:pStyle w:val="Titolo3"/>
       </w:pPr>
-      <w:bookmarkStart w:id="3" w:name="_Toc234244991"/>
+      <w:bookmarkStart w:id="3" w:name="_Toc239683708"/>
       <w:r>
         <w:t>Champions</w:t>
       </w:r>
@@ -1999,7 +1999,7 @@
       <w:pPr>
         <w:pStyle w:val="Titolo3"/>
       </w:pPr>
-      <w:bookmarkStart w:id="4" w:name="_Toc234244992"/>
+      <w:bookmarkStart w:id="4" w:name="_Toc239683709"/>
       <w:r>
         <w:t>Coppa dei perdenti</w:t>
       </w:r>
@@ -2357,7 +2357,10 @@
           </w:tcPr>
           <w:p>
             <w:r>
-              <w:t>90€</w:t>
+              <w:t>14</w:t>
+            </w:r>
+            <w:r>
+              <w:t>0€</w:t>
             </w:r>
           </w:p>
         </w:tc>
@@ -2367,7 +2370,13 @@
           </w:tcPr>
           <w:p>
             <w:r>
-              <w:t>150€</w:t>
+              <w:t>1</w:t>
+            </w:r>
+            <w:r>
+              <w:t>4</w:t>
+            </w:r>
+            <w:r>
+              <w:t>0€</w:t>
             </w:r>
           </w:p>
         </w:tc>
@@ -2389,7 +2398,7 @@
           </w:tcPr>
           <w:p>
             <w:r>
-              <w:t>7</w:t>
+              <w:t>6</w:t>
             </w:r>
             <w:r>
               <w:t>0€</w:t>
@@ -2405,7 +2414,7 @@
               <w:t>1</w:t>
             </w:r>
             <w:r>
-              <w:t>1</w:t>
+              <w:t>4</w:t>
             </w:r>
             <w:r>
               <w:t>0€</w:t>
@@ -2535,7 +2544,7 @@
       <w:pPr>
         <w:pStyle w:val="Titolo2"/>
       </w:pPr>
-      <w:bookmarkStart w:id="5" w:name="_Toc234244993"/>
+      <w:bookmarkStart w:id="5" w:name="_Toc239683710"/>
       <w:r>
         <w:t>Rose</w:t>
       </w:r>
@@ -2584,7 +2593,7 @@
       <w:pPr>
         <w:pStyle w:val="Titolo2"/>
       </w:pPr>
-      <w:bookmarkStart w:id="6" w:name="_Toc234244994"/>
+      <w:bookmarkStart w:id="6" w:name="_Toc239683711"/>
       <w:r>
         <w:t>Acquisto portieri</w:t>
       </w:r>
@@ -2605,7 +2614,7 @@
       <w:pPr>
         <w:pStyle w:val="Titolo2"/>
       </w:pPr>
-      <w:bookmarkStart w:id="7" w:name="_Toc234244995"/>
+      <w:bookmarkStart w:id="7" w:name="_Toc239683712"/>
       <w:r>
         <w:t>Schieramento formazione</w:t>
       </w:r>
@@ -2643,7 +2652,7 @@
       <w:pPr>
         <w:pStyle w:val="Titolo2"/>
       </w:pPr>
-      <w:bookmarkStart w:id="8" w:name="_Toc234244996"/>
+      <w:bookmarkStart w:id="8" w:name="_Toc239683713"/>
       <w:r>
         <w:t>Voti</w:t>
       </w:r>
@@ -2708,7 +2717,7 @@
       <w:pPr>
         <w:pStyle w:val="Titolo2"/>
       </w:pPr>
-      <w:bookmarkStart w:id="9" w:name="_Toc234244997"/>
+      <w:bookmarkStart w:id="9" w:name="_Toc239683714"/>
       <w:r>
         <w:t>Sostituzioni della partita</w:t>
       </w:r>
@@ -2777,7 +2786,7 @@
       <w:pPr>
         <w:pStyle w:val="Titolo2"/>
       </w:pPr>
-      <w:bookmarkStart w:id="10" w:name="_Toc234244998"/>
+      <w:bookmarkStart w:id="10" w:name="_Toc239683715"/>
       <w:r>
         <w:t>Bonus / Malus</w:t>
       </w:r>
@@ -2932,7 +2941,7 @@
       <w:pPr>
         <w:pStyle w:val="Titolo2"/>
       </w:pPr>
-      <w:bookmarkStart w:id="11" w:name="_Toc234244999"/>
+      <w:bookmarkStart w:id="11" w:name="_Toc239683716"/>
       <w:r>
         <w:t>Calcolo dei gol</w:t>
       </w:r>
@@ -3031,7 +3040,7 @@
       <w:pPr>
         <w:pStyle w:val="Titolo2"/>
       </w:pPr>
-      <w:bookmarkStart w:id="12" w:name="_Toc234245000"/>
+      <w:bookmarkStart w:id="12" w:name="_Toc239683717"/>
       <w:r>
         <w:t>In caso di parità punti</w:t>
       </w:r>
@@ -3155,7 +3164,7 @@
       <w:pPr>
         <w:pStyle w:val="Titolo2"/>
       </w:pPr>
-      <w:bookmarkStart w:id="13" w:name="_Toc234245001"/>
+      <w:bookmarkStart w:id="13" w:name="_Toc239683718"/>
       <w:r>
         <w:t>Comunicazione formazione e multe</w:t>
       </w:r>
@@ -3198,11 +3207,6 @@
         <w:t xml:space="preserve">Nel caso una squadra non vengano rispettate le norme sopra stabilite, la squadra giocherà con la formazione della precedente </w:t>
       </w:r>
       <w:r>
-        <w:rPr>
-          <w:b/>
-          <w:bCs/>
-          <w:strike/>
-        </w:rPr>
         <w:t>giornata con l'handicap di prendere 0 punti indistintamente dal risultato maturato</w:t>
       </w:r>
       <w:r>
@@ -3210,46 +3214,80 @@
       </w:r>
     </w:p>
     <w:p>
-      <w:pPr>
-        <w:rPr>
-          <w:b/>
-          <w:bCs/>
-        </w:rPr>
-      </w:pPr>
-      <w:r>
-        <w:rPr>
-          <w:b/>
-          <w:bCs/>
-        </w:rPr>
+      <w:r>
         <w:t>C</w:t>
       </w:r>
       <w:r>
-        <w:rPr>
-          <w:b/>
-          <w:bCs/>
-        </w:rPr>
         <w:t>iascun</w:t>
       </w:r>
       <w:r>
-        <w:rPr>
-          <w:b/>
-          <w:bCs/>
-        </w:rPr>
         <w:t xml:space="preserve"> presidente </w:t>
       </w:r>
       <w:r>
-        <w:rPr>
-          <w:b/>
-          <w:bCs/>
-        </w:rPr>
         <w:t xml:space="preserve">ritardatario </w:t>
       </w:r>
       <w:r>
-        <w:rPr>
-          <w:b/>
-          <w:bCs/>
-        </w:rPr>
-        <w:t>potrà, in autonomia, solo confermare la formazione precedente e giocarsela senza handicap.</w:t>
+        <w:t>deve</w:t>
+      </w:r>
+      <w:r>
+        <w:t>, in autonomia, confermare la formazione precedente.</w:t>
+      </w:r>
+    </w:p>
+    <w:p>
+      <w:r>
+        <w:t>In caso di formazione non data nelle fasi di semifinale o finale (</w:t>
+      </w:r>
+      <w:proofErr w:type="spellStart"/>
+      <w:r>
+        <w:t>champions</w:t>
+      </w:r>
+      <w:proofErr w:type="spellEnd"/>
+      <w:r>
+        <w:t xml:space="preserve"> o coppa perdenti) la penalità prevede:</w:t>
+      </w:r>
+    </w:p>
+    <w:p>
+      <w:pPr>
+        <w:pStyle w:val="Paragrafoelenco"/>
+        <w:numPr>
+          <w:ilvl w:val="0"/>
+          <w:numId w:val="6"/>
+        </w:numPr>
+      </w:pPr>
+      <w:r>
+        <w:t>- 4 punti sul conteggio</w:t>
+      </w:r>
+    </w:p>
+    <w:p>
+      <w:pPr>
+        <w:pStyle w:val="Paragrafoelenco"/>
+        <w:numPr>
+          <w:ilvl w:val="0"/>
+          <w:numId w:val="6"/>
+        </w:numPr>
+      </w:pPr>
+      <w:r>
+        <w:t>10€ di multa</w:t>
+      </w:r>
+    </w:p>
+    <w:p>
+      <w:pPr>
+        <w:pStyle w:val="Paragrafoelenco"/>
+        <w:numPr>
+          <w:ilvl w:val="0"/>
+          <w:numId w:val="6"/>
+        </w:numPr>
+      </w:pPr>
+      <w:r>
+        <w:t xml:space="preserve">Gioca la partita con la formazione precedente (di </w:t>
+      </w:r>
+      <w:proofErr w:type="spellStart"/>
+      <w:r>
+        <w:t>champions</w:t>
+      </w:r>
+      <w:proofErr w:type="spellEnd"/>
+      <w:r>
+        <w:t xml:space="preserve"> o coppa perdenti)</w:t>
       </w:r>
     </w:p>
     <w:p/>
@@ -3257,7 +3295,7 @@
       <w:pPr>
         <w:pStyle w:val="Titolo2"/>
       </w:pPr>
-      <w:bookmarkStart w:id="14" w:name="_Toc234245002"/>
+      <w:bookmarkStart w:id="14" w:name="_Toc239683719"/>
       <w:r>
         <w:t>Recuperi partite rinviate</w:t>
       </w:r>
@@ -3286,7 +3324,7 @@
       <w:pPr>
         <w:pStyle w:val="Titolo2"/>
       </w:pPr>
-      <w:bookmarkStart w:id="15" w:name="_Toc234245003"/>
+      <w:bookmarkStart w:id="15" w:name="_Toc239683720"/>
       <w:r>
         <w:t>Mercato di settembre</w:t>
       </w:r>
@@ -3297,7 +3335,11 @@
     </w:p>
     <w:p>
       <w:r>
-        <w:t xml:space="preserve">Durante l’asta ciascun presidente chiamerà un giocatore seguendo il consueto ordine (portieri, difensori, centrocampisti, attaccanti). Ogni presidente può chiamare 1 solo giocatore a sua scelta con la chiamata a busta. Al mercato di settembre ogni squadra partirà con 600 fantamilioni. Nel caso una squadra spenda più soldi di quelli concessi si procederà togliendo alla squadra il giocatore più pagato nel mercato; </w:t>
+        <w:t xml:space="preserve">Durante l’asta ciascun presidente chiamerà un giocatore seguendo il consueto ordine (portieri, difensori, centrocampisti, attaccanti). Ogni presidente può chiamare 1 solo giocatore a sua scelta con la chiamata a busta. Al mercato di settembre ogni squadra partirà con 600 fantamilioni. Nel caso una squadra spenda più </w:t>
+      </w:r>
+      <w:r>
+        <w:lastRenderedPageBreak/>
+        <w:t xml:space="preserve">soldi di quelli concessi si procederà togliendo alla squadra il giocatore più pagato nel mercato; </w:t>
       </w:r>
       <w:proofErr w:type="gramStart"/>
       <w:r>
@@ -3305,11 +3347,7 @@
       </w:r>
       <w:proofErr w:type="gramEnd"/>
       <w:r>
-        <w:t xml:space="preserve"> il giocatore tolto potrà essere comprato dalle altre squadre solo nel mercato di gennaio; la squadra penalizzata ovviamente non riprende nessun fantamilione dal giocatore perso. Per altre tipologie di illeciti voluti o non voluti durante il mercato iniziale si applicherà una multa che verrà decisa sul momento dalle persone non interessate direttamente nella questione. Suddetta multa andrà ad arricchire il montepremi </w:t>
-      </w:r>
-      <w:r>
-        <w:lastRenderedPageBreak/>
-        <w:t>del Campionato. Inoltre, dove possibile, il danno dovrà essere quanto prima "aggiustato" per riportare la situazione alla normalità. I giocatori non potranno più essere ceduti in cambio di soldi reali direttamente al presidente che vende; i giocatori messi sul mercato verranno battuti all’asta e i soldi andranno solo sul montepremi generale.</w:t>
+        <w:t xml:space="preserve"> il giocatore tolto potrà essere comprato dalle altre squadre solo nel mercato di gennaio; la squadra penalizzata ovviamente non riprende nessun fantamilione dal giocatore perso. Per altre tipologie di illeciti voluti o non voluti durante il mercato iniziale si applicherà una multa che verrà decisa sul momento dalle persone non interessate direttamente nella questione. Suddetta multa andrà ad arricchire il montepremi del Campionato. Inoltre, dove possibile, il danno dovrà essere quanto prima "aggiustato" per riportare la situazione alla normalità. I giocatori non potranno più essere ceduti in cambio di soldi reali direttamente al presidente che vende; i giocatori messi sul mercato verranno battuti all’asta e i soldi andranno solo sul montepremi generale.</w:t>
       </w:r>
     </w:p>
     <w:p/>
@@ -3319,7 +3357,7 @@
       <w:pPr>
         <w:pStyle w:val="Titolo2"/>
       </w:pPr>
-      <w:bookmarkStart w:id="16" w:name="_Toc234245004"/>
+      <w:bookmarkStart w:id="16" w:name="_Toc239683721"/>
       <w:r>
         <w:t>Scambio giocatori</w:t>
       </w:r>
@@ -3344,13 +3382,21 @@
       <w:pPr>
         <w:pStyle w:val="Titolo2"/>
       </w:pPr>
+      <w:bookmarkStart w:id="17" w:name="_Toc239683722"/>
       <w:r>
         <w:t>Sessioni di mercato sosta nazionali</w:t>
       </w:r>
-    </w:p>
-    <w:p>
-      <w:r>
-        <w:t xml:space="preserve">Durante la sosta delle nazionali (orientativamente 11-17 novembre e 24-30 marzo) viene creata una sessione di mercato sul sito dal pannello </w:t>
+      <w:bookmarkEnd w:id="17"/>
+    </w:p>
+    <w:p>
+      <w:r>
+        <w:t>Durante la sosta delle nazionali (orientativamente 1</w:t>
+      </w:r>
+      <w:r>
+        <w:t>0</w:t>
+      </w:r>
+      <w:r>
+        <w:t xml:space="preserve">-17 novembre e 24-30 marzo) viene creata una sessione di mercato sul sito dal pannello </w:t>
       </w:r>
       <w:r>
         <w:rPr>
@@ -3436,7 +3482,13 @@
         <w:t>Max proposte:</w:t>
       </w:r>
       <w:r>
-        <w:t xml:space="preserve"> Numero massimo di proposte di acquisto inviabili da ciascuna squadra (es. 3).</w:t>
+        <w:t xml:space="preserve"> </w:t>
+      </w:r>
+      <w:r>
+        <w:t>10</w:t>
+      </w:r>
+      <w:r>
+        <w:t>.</w:t>
       </w:r>
     </w:p>
     <w:p>
@@ -3451,21 +3503,23 @@
           <w:b/>
           <w:bCs/>
         </w:rPr>
+        <w:t xml:space="preserve">Max </w:t>
+      </w:r>
+      <w:r>
+        <w:rPr>
+          <w:b/>
+          <w:bCs/>
+        </w:rPr>
         <w:t>Acquisti effettivi:</w:t>
       </w:r>
       <w:r>
-        <w:t xml:space="preserve"> Numero massimo di giocatori che una squadra può aggiudicarsi (es. 3, con vincolo </w:t>
-      </w:r>
-      <m:oMath>
-        <m:r>
-          <w:rPr>
-            <w:rFonts w:ascii="Cambria Math" w:hAnsi="Cambria Math"/>
-          </w:rPr>
-          <m:t>≤</m:t>
-        </m:r>
-      </m:oMath>
-      <w:r>
-        <w:t xml:space="preserve"> al numero di proposte).</w:t>
+        <w:t xml:space="preserve"> </w:t>
+      </w:r>
+      <w:r>
+        <w:t>2</w:t>
+      </w:r>
+      <w:r>
+        <w:t>.</w:t>
       </w:r>
     </w:p>
     <w:p>
@@ -3498,7 +3552,18 @@
         <w:t>Valuta d'asta:</w:t>
       </w:r>
       <w:r>
-        <w:t xml:space="preserve"> Viene impostato automaticamente l'euro (soldi reali). In alternativa può essere usata la valuta in Fantamilioni.</w:t>
+        <w:t xml:space="preserve"> </w:t>
+      </w:r>
+      <w:proofErr w:type="gramStart"/>
+      <w:r>
+        <w:t>Euro</w:t>
+      </w:r>
+      <w:proofErr w:type="gramEnd"/>
+      <w:r>
+        <w:t xml:space="preserve"> + restanti fantamilioni convertiti (5 FM = 1€)</w:t>
+      </w:r>
+      <w:r>
+        <w:t>.</w:t>
       </w:r>
     </w:p>
     <w:p>
@@ -3592,15 +3657,7 @@
         </w:numPr>
       </w:pPr>
       <w:r>
-        <w:t>Per ogni giocatore vince l'offerta più alta; a parità di prezzo prevale l'offerta inviata prima (</w:t>
-      </w:r>
-      <w:proofErr w:type="spellStart"/>
-      <w:r>
-        <w:t>timestamp</w:t>
-      </w:r>
-      <w:proofErr w:type="spellEnd"/>
-      <w:r>
-        <w:t>).</w:t>
+        <w:t>Per ogni giocatore vince l'offerta più alta; a parità di prezzo prevale l'offerta inviata prima.</w:t>
       </w:r>
     </w:p>
     <w:p>
@@ -3642,6 +3699,7 @@
         </w:numPr>
       </w:pPr>
       <w:r>
+        <w:lastRenderedPageBreak/>
         <w:t>Contestualmente all'acquisto si dichiara il giocatore da cedere.</w:t>
       </w:r>
     </w:p>
@@ -3657,200 +3715,47 @@
           <w:b/>
           <w:bCs/>
         </w:rPr>
-        <w:lastRenderedPageBreak/>
         <w:t>Budget e Bonus:</w:t>
       </w:r>
       <w:r>
-        <w:t xml:space="preserve"> Non sono previsti extra bonus se si gioca in euro; se impostata in Fantamilioni si aggiunge un extra bonus di 30 FM ai crediti rimanenti.</w:t>
-      </w:r>
-    </w:p>
-    <w:p>
-      <w:pPr>
-        <w:rPr>
-          <w:b/>
-          <w:bCs/>
-        </w:rPr>
-      </w:pPr>
-      <w:r>
-        <w:rPr>
-          <w:b/>
-          <w:bCs/>
-        </w:rPr>
-        <w:t xml:space="preserve">3. Asta in Chiaro (Rilancio in </w:t>
+        <w:t xml:space="preserve"> Non sono previsti extra bonus.</w:t>
+      </w:r>
+    </w:p>
+    <w:p/>
+    <w:p/>
+    <w:p>
+      <w:pPr>
+        <w:pStyle w:val="Titolo2"/>
+      </w:pPr>
+      <w:bookmarkStart w:id="18" w:name="_Toc239683723"/>
+      <w:r>
+        <w:t>Mercato di gennaio</w:t>
+      </w:r>
+      <w:bookmarkEnd w:id="18"/>
+      <w:r>
+        <w:t xml:space="preserve">  </w:t>
+      </w:r>
+    </w:p>
+    <w:p>
+      <w:r>
+        <w:t xml:space="preserve">Il mercato di riparazione si terrà, subito dopo la conclusione del mercato reale della serie A, fissato per il 31 gennaio. Per investire al mercato di gennaio si usano i fantamilioni restanti dal mercato di settembre; i fantamilioni restanti verranno tramutati in € secondo la seguente regola: 1 € = 5 </w:t>
       </w:r>
       <w:proofErr w:type="gramStart"/>
       <w:r>
-        <w:rPr>
-          <w:b/>
-          <w:bCs/>
-        </w:rPr>
-        <w:t>Euro</w:t>
+        <w:t>fantamilioni</w:t>
       </w:r>
       <w:proofErr w:type="gramEnd"/>
       <w:r>
-        <w:rPr>
-          <w:b/>
-          <w:bCs/>
-        </w:rPr>
-        <w:t>)</w:t>
-      </w:r>
-    </w:p>
-    <w:p>
-      <w:pPr>
-        <w:numPr>
-          <w:ilvl w:val="0"/>
-          <w:numId w:val="14"/>
-        </w:numPr>
-      </w:pPr>
-      <w:r>
-        <w:rPr>
-          <w:b/>
-          <w:bCs/>
-        </w:rPr>
-        <w:t>Valuta d'asta:</w:t>
-      </w:r>
-      <w:r>
-        <w:t xml:space="preserve"> Rilanci esclusivamente in euro (soldi reali).</w:t>
-      </w:r>
-    </w:p>
-    <w:p>
-      <w:pPr>
-        <w:numPr>
-          <w:ilvl w:val="0"/>
-          <w:numId w:val="14"/>
-        </w:numPr>
-      </w:pPr>
-      <w:r>
-        <w:rPr>
-          <w:b/>
-          <w:bCs/>
-        </w:rPr>
-        <w:t>Funzionamento e Visibilità:</w:t>
-      </w:r>
-    </w:p>
-    <w:p>
-      <w:pPr>
-        <w:numPr>
-          <w:ilvl w:val="1"/>
-          <w:numId w:val="14"/>
-        </w:numPr>
-      </w:pPr>
-      <w:r>
-        <w:t xml:space="preserve">Tutti i rilanci e le offerte sono </w:t>
-      </w:r>
-      <w:r>
-        <w:rPr>
-          <w:b/>
-          <w:bCs/>
-        </w:rPr>
-        <w:t>pubblici e visibili</w:t>
-      </w:r>
-      <w:r>
-        <w:t xml:space="preserve"> in tempo reale a tutti i presidenti.</w:t>
-      </w:r>
-    </w:p>
-    <w:p>
-      <w:pPr>
-        <w:numPr>
-          <w:ilvl w:val="1"/>
-          <w:numId w:val="14"/>
-        </w:numPr>
-      </w:pPr>
-      <w:r>
-        <w:rPr>
-          <w:b/>
-          <w:bCs/>
-        </w:rPr>
-        <w:t>Timer di 24 ore:</w:t>
-      </w:r>
-      <w:r>
-        <w:t xml:space="preserve"> Alla prima offerta ricevuta su un determinato giocatore si attiva un conto alla rovescia di 24 ore.</w:t>
-      </w:r>
-    </w:p>
-    <w:p>
-      <w:pPr>
-        <w:numPr>
-          <w:ilvl w:val="0"/>
-          <w:numId w:val="14"/>
-        </w:numPr>
-      </w:pPr>
-      <w:r>
-        <w:rPr>
-          <w:b/>
-          <w:bCs/>
-        </w:rPr>
-        <w:t>Aggiudicazione e Chiusura:</w:t>
-      </w:r>
-    </w:p>
-    <w:p>
-      <w:pPr>
-        <w:numPr>
-          <w:ilvl w:val="1"/>
-          <w:numId w:val="14"/>
-        </w:numPr>
-      </w:pPr>
-      <w:r>
-        <w:t xml:space="preserve">Il giocatore viene aggiudicato al miglior offerente allo scadere delle 24 ore oppure alla </w:t>
-      </w:r>
-      <w:r>
-        <w:rPr>
-          <w:i/>
-          <w:iCs/>
-        </w:rPr>
-        <w:t>Data chiusura</w:t>
-      </w:r>
-      <w:r>
-        <w:t xml:space="preserve"> generale della sessione (se questa scade prima del timer).</w:t>
-      </w:r>
-    </w:p>
-    <w:p>
-      <w:pPr>
-        <w:numPr>
-          <w:ilvl w:val="1"/>
-          <w:numId w:val="14"/>
-        </w:numPr>
-      </w:pPr>
-      <w:r>
-        <w:t xml:space="preserve">Rispetta il limite massimo di </w:t>
-      </w:r>
-      <w:r>
-        <w:rPr>
-          <w:i/>
-          <w:iCs/>
-        </w:rPr>
-        <w:t>Acquisti effettivi</w:t>
-      </w:r>
-      <w:r>
-        <w:t xml:space="preserve"> impostato per la squadra.</w:t>
-      </w:r>
-    </w:p>
-    <w:p>
-      <w:pPr>
-        <w:numPr>
-          <w:ilvl w:val="1"/>
-          <w:numId w:val="14"/>
-        </w:numPr>
-      </w:pPr>
-      <w:r>
-        <w:t>All'aggiudicazione si procede all'acquisto dichiarando il giocatore da cedere.</w:t>
-      </w:r>
-    </w:p>
-    <w:p>
-      <w:pPr>
-        <w:numPr>
-          <w:ilvl w:val="0"/>
-          <w:numId w:val="14"/>
-        </w:numPr>
-      </w:pPr>
-      <w:r>
-        <w:rPr>
-          <w:b/>
-          <w:bCs/>
-        </w:rPr>
-        <w:t>Budget e Bonus:</w:t>
-      </w:r>
-      <w:r>
-        <w:t xml:space="preserve"> Non sono previsti extra bonus e le offerte non sono vincolate ai crediti di fantamercato (Fantamilioni).</w:t>
+        <w:t xml:space="preserve"> In caso di slittamenti del mercato le partite giocate in meno di 11 giocatori prevedono un 6 politico per ogni giocatore mancante in formazione. I giocatori non potranno più essere ceduti in cambio di soldi reali direttamente al presidente che vende; i giocatori messi sul mercato verranno battuti all’asta e i soldi andranno solo sul montepremi generale.</w:t>
+      </w:r>
+    </w:p>
+    <w:p>
+      <w:r>
+        <w:rPr>
+          <w:b/>
+          <w:bCs/>
+        </w:rPr>
+        <w:t>Al mercato di riparazione in caso di alcune dimenticanze di aggiustamenti della rosa dovranno essere riparati quanto prima; eventuali partite giocate, prima della riparazione, andranno ricalcolate con il giocatore/i subentrato</w:t>
       </w:r>
     </w:p>
     <w:p/>
@@ -3860,35 +3765,24 @@
       <w:pPr>
         <w:pStyle w:val="Titolo2"/>
       </w:pPr>
-      <w:bookmarkStart w:id="17" w:name="_Toc234245006"/>
-      <w:r>
-        <w:t>Mercato di gennaio</w:t>
-      </w:r>
-      <w:bookmarkEnd w:id="17"/>
+      <w:bookmarkStart w:id="19" w:name="_Toc239683724"/>
+      <w:r>
+        <w:t>Cena di fine stagione</w:t>
+      </w:r>
+      <w:bookmarkEnd w:id="19"/>
       <w:r>
         <w:t xml:space="preserve">  </w:t>
       </w:r>
     </w:p>
     <w:p>
       <w:r>
-        <w:t xml:space="preserve">Il mercato di riparazione si terrà, subito dopo la conclusione del mercato reale della serie A, fissato per il 31 gennaio. Per investire al mercato di gennaio si usano i fantamilioni restanti dal mercato di settembre; i fantamilioni restanti verranno tramutati in € secondo la seguente regola: 1 € = 5 </w:t>
-      </w:r>
-      <w:proofErr w:type="gramStart"/>
-      <w:r>
-        <w:t>fantamilioni</w:t>
-      </w:r>
-      <w:proofErr w:type="gramEnd"/>
-      <w:r>
-        <w:t xml:space="preserve"> In caso di slittamenti del mercato le partite giocate in meno di 11 giocatori prevedono un 6 politico per ogni giocatore mancante in formazione. I giocatori non potranno più essere ceduti in cambio di soldi reali direttamente al presidente che vende; i giocatori messi sul mercato verranno battuti all’asta e i soldi andranno solo sul montepremi generale.</w:t>
-      </w:r>
-    </w:p>
-    <w:p>
-      <w:r>
-        <w:rPr>
-          <w:b/>
-          <w:bCs/>
-        </w:rPr>
-        <w:t>Al mercato di riparazione in caso di alcune dimenticanze di aggiustamenti della rosa dovranno essere riparati quanto prima; eventuali partite giocate, prima della riparazione, andranno ricalcolate con il giocatore/i subentrato</w:t>
+        <w:t>Al termine della stagione Fanta calcistica è consuetudine partecipare alla cena per i saluti/insulti di fine anno. Alla cena verranno regolati i conti delle squadre e quindi assegnati i premi ai vincitori.</w:t>
+      </w:r>
+      <w:r>
+        <w:t xml:space="preserve"> </w:t>
+      </w:r>
+      <w:r>
+        <w:t>Nell’organizzazione della cena si cercherà di venire incontro a tutte le esigenze dei presidenti ma entro certi limiti.</w:t>
       </w:r>
     </w:p>
     <w:p/>
@@ -3898,38 +3792,11 @@
       <w:pPr>
         <w:pStyle w:val="Titolo2"/>
       </w:pPr>
-      <w:bookmarkStart w:id="18" w:name="_Toc234245007"/>
-      <w:r>
-        <w:t>Cena di fine stagione</w:t>
-      </w:r>
-      <w:bookmarkEnd w:id="18"/>
-      <w:r>
-        <w:t xml:space="preserve">  </w:t>
-      </w:r>
-    </w:p>
-    <w:p>
-      <w:r>
-        <w:t>Al termine della stagione Fanta calcistica è consuetudine partecipare alla cena per i saluti/insulti di fine anno. Alla cena verranno regolati i conti delle squadre e quindi assegnati i premi ai vincitori.</w:t>
-      </w:r>
-      <w:r>
-        <w:t xml:space="preserve"> </w:t>
-      </w:r>
-      <w:r>
-        <w:t>Nell’organizzazione della cena si cercherà di venire incontro a tutte le esigenze dei presidenti ma entro certi limiti.</w:t>
-      </w:r>
-    </w:p>
-    <w:p/>
-    <w:p/>
-    <w:p/>
-    <w:p>
-      <w:pPr>
-        <w:pStyle w:val="Titolo2"/>
-      </w:pPr>
-      <w:bookmarkStart w:id="19" w:name="_Toc234245008"/>
+      <w:bookmarkStart w:id="20" w:name="_Toc239683725"/>
       <w:r>
         <w:t>Premi stagionali</w:t>
       </w:r>
-      <w:bookmarkEnd w:id="19"/>
+      <w:bookmarkEnd w:id="20"/>
       <w:r>
         <w:t xml:space="preserve">  </w:t>
       </w:r>
@@ -3993,11 +3860,11 @@
       <w:pPr>
         <w:pStyle w:val="Titolo2"/>
       </w:pPr>
-      <w:bookmarkStart w:id="20" w:name="_Toc234245009"/>
+      <w:bookmarkStart w:id="21" w:name="_Toc239683726"/>
       <w:r>
         <w:t>Penalità di fine stagione</w:t>
       </w:r>
-      <w:bookmarkEnd w:id="20"/>
+      <w:bookmarkEnd w:id="21"/>
       <w:r>
         <w:t xml:space="preserve">  </w:t>
       </w:r>
@@ -4141,6 +4008,118 @@
     </w:lvl>
   </w:abstractNum>
   <w:abstractNum w:abstractNumId="1" w15:restartNumberingAfterBreak="0">
+    <w:nsid w:val="120916B0"/>
+    <w:multiLevelType w:val="hybridMultilevel"/>
+    <w:tmpl w:val="1298C07E"/>
+    <w:lvl w:ilvl="0" w:tplc="6D4A3D8A">
+      <w:numFmt w:val="bullet"/>
+      <w:lvlText w:val="-"/>
+      <w:lvlJc w:val="left"/>
+      <w:pPr>
+        <w:ind w:left="720" w:hanging="360"/>
+      </w:pPr>
+      <w:rPr>
+        <w:rFonts w:ascii="Calibri" w:eastAsiaTheme="minorHAnsi" w:hAnsi="Calibri" w:cs="Calibri" w:hint="default"/>
+      </w:rPr>
+    </w:lvl>
+    <w:lvl w:ilvl="1" w:tplc="04100003" w:tentative="1">
+      <w:start w:val="1"/>
+      <w:numFmt w:val="bullet"/>
+      <w:lvlText w:val="o"/>
+      <w:lvlJc w:val="left"/>
+      <w:pPr>
+        <w:ind w:left="1440" w:hanging="360"/>
+      </w:pPr>
+      <w:rPr>
+        <w:rFonts w:ascii="Courier New" w:hAnsi="Courier New" w:cs="Courier New" w:hint="default"/>
+      </w:rPr>
+    </w:lvl>
+    <w:lvl w:ilvl="2" w:tplc="04100005" w:tentative="1">
+      <w:start w:val="1"/>
+      <w:numFmt w:val="bullet"/>
+      <w:lvlText w:val=""/>
+      <w:lvlJc w:val="left"/>
+      <w:pPr>
+        <w:ind w:left="2160" w:hanging="360"/>
+      </w:pPr>
+      <w:rPr>
+        <w:rFonts w:ascii="Wingdings" w:hAnsi="Wingdings" w:hint="default"/>
+      </w:rPr>
+    </w:lvl>
+    <w:lvl w:ilvl="3" w:tplc="04100001" w:tentative="1">
+      <w:start w:val="1"/>
+      <w:numFmt w:val="bullet"/>
+      <w:lvlText w:val=""/>
+      <w:lvlJc w:val="left"/>
+      <w:pPr>
+        <w:ind w:left="2880" w:hanging="360"/>
+      </w:pPr>
+      <w:rPr>
+        <w:rFonts w:ascii="Symbol" w:hAnsi="Symbol" w:hint="default"/>
+      </w:rPr>
+    </w:lvl>
+    <w:lvl w:ilvl="4" w:tplc="04100003" w:tentative="1">
+      <w:start w:val="1"/>
+      <w:numFmt w:val="bullet"/>
+      <w:lvlText w:val="o"/>
+      <w:lvlJc w:val="left"/>
+      <w:pPr>
+        <w:ind w:left="3600" w:hanging="360"/>
+      </w:pPr>
+      <w:rPr>
+        <w:rFonts w:ascii="Courier New" w:hAnsi="Courier New" w:cs="Courier New" w:hint="default"/>
+      </w:rPr>
+    </w:lvl>
+    <w:lvl w:ilvl="5" w:tplc="04100005" w:tentative="1">
+      <w:start w:val="1"/>
+      <w:numFmt w:val="bullet"/>
+      <w:lvlText w:val=""/>
+      <w:lvlJc w:val="left"/>
+      <w:pPr>
+        <w:ind w:left="4320" w:hanging="360"/>
+      </w:pPr>
+      <w:rPr>
+        <w:rFonts w:ascii="Wingdings" w:hAnsi="Wingdings" w:hint="default"/>
+      </w:rPr>
+    </w:lvl>
+    <w:lvl w:ilvl="6" w:tplc="04100001" w:tentative="1">
+      <w:start w:val="1"/>
+      <w:numFmt w:val="bullet"/>
+      <w:lvlText w:val=""/>
+      <w:lvlJc w:val="left"/>
+      <w:pPr>
+        <w:ind w:left="5040" w:hanging="360"/>
+      </w:pPr>
+      <w:rPr>
+        <w:rFonts w:ascii="Symbol" w:hAnsi="Symbol" w:hint="default"/>
+      </w:rPr>
+    </w:lvl>
+    <w:lvl w:ilvl="7" w:tplc="04100003" w:tentative="1">
+      <w:start w:val="1"/>
+      <w:numFmt w:val="bullet"/>
+      <w:lvlText w:val="o"/>
+      <w:lvlJc w:val="left"/>
+      <w:pPr>
+        <w:ind w:left="5760" w:hanging="360"/>
+      </w:pPr>
+      <w:rPr>
+        <w:rFonts w:ascii="Courier New" w:hAnsi="Courier New" w:cs="Courier New" w:hint="default"/>
+      </w:rPr>
+    </w:lvl>
+    <w:lvl w:ilvl="8" w:tplc="04100005" w:tentative="1">
+      <w:start w:val="1"/>
+      <w:numFmt w:val="bullet"/>
+      <w:lvlText w:val=""/>
+      <w:lvlJc w:val="left"/>
+      <w:pPr>
+        <w:ind w:left="6480" w:hanging="360"/>
+      </w:pPr>
+      <w:rPr>
+        <w:rFonts w:ascii="Wingdings" w:hAnsi="Wingdings" w:hint="default"/>
+      </w:rPr>
+    </w:lvl>
+  </w:abstractNum>
+  <w:abstractNum w:abstractNumId="2" w15:restartNumberingAfterBreak="0">
     <w:nsid w:val="21277D14"/>
     <w:multiLevelType w:val="hybridMultilevel"/>
     <w:tmpl w:val="7DB2BB9A"/>
@@ -4252,7 +4231,7 @@
       </w:rPr>
     </w:lvl>
   </w:abstractNum>
-  <w:abstractNum w:abstractNumId="2" w15:restartNumberingAfterBreak="0">
+  <w:abstractNum w:abstractNumId="3" w15:restartNumberingAfterBreak="0">
     <w:nsid w:val="21C417C6"/>
     <w:multiLevelType w:val="hybridMultilevel"/>
     <w:tmpl w:val="755A910E"/>
@@ -4365,7 +4344,7 @@
       </w:rPr>
     </w:lvl>
   </w:abstractNum>
-  <w:abstractNum w:abstractNumId="3" w15:restartNumberingAfterBreak="0">
+  <w:abstractNum w:abstractNumId="4" w15:restartNumberingAfterBreak="0">
     <w:nsid w:val="236510C2"/>
     <w:multiLevelType w:val="hybridMultilevel"/>
     <w:tmpl w:val="25E06386"/>
@@ -4478,7 +4457,7 @@
       </w:rPr>
     </w:lvl>
   </w:abstractNum>
-  <w:abstractNum w:abstractNumId="4" w15:restartNumberingAfterBreak="0">
+  <w:abstractNum w:abstractNumId="5" w15:restartNumberingAfterBreak="0">
     <w:nsid w:val="292B1991"/>
     <w:multiLevelType w:val="hybridMultilevel"/>
     <w:tmpl w:val="EC448D02"/>
@@ -4591,7 +4570,7 @@
       </w:rPr>
     </w:lvl>
   </w:abstractNum>
-  <w:abstractNum w:abstractNumId="5" w15:restartNumberingAfterBreak="0">
+  <w:abstractNum w:abstractNumId="6" w15:restartNumberingAfterBreak="0">
     <w:nsid w:val="2FC12FA8"/>
     <w:multiLevelType w:val="hybridMultilevel"/>
     <w:tmpl w:val="2AC65196"/>
@@ -4703,7 +4682,119 @@
       </w:rPr>
     </w:lvl>
   </w:abstractNum>
-  <w:abstractNum w:abstractNumId="6" w15:restartNumberingAfterBreak="0">
+  <w:abstractNum w:abstractNumId="7" w15:restartNumberingAfterBreak="0">
+    <w:nsid w:val="3E48188D"/>
+    <w:multiLevelType w:val="hybridMultilevel"/>
+    <w:tmpl w:val="421EF1AE"/>
+    <w:lvl w:ilvl="0" w:tplc="6D4A3D8A">
+      <w:numFmt w:val="bullet"/>
+      <w:lvlText w:val="-"/>
+      <w:lvlJc w:val="left"/>
+      <w:pPr>
+        <w:ind w:left="720" w:hanging="360"/>
+      </w:pPr>
+      <w:rPr>
+        <w:rFonts w:ascii="Calibri" w:eastAsiaTheme="minorHAnsi" w:hAnsi="Calibri" w:cs="Calibri" w:hint="default"/>
+      </w:rPr>
+    </w:lvl>
+    <w:lvl w:ilvl="1" w:tplc="04100003" w:tentative="1">
+      <w:start w:val="1"/>
+      <w:numFmt w:val="bullet"/>
+      <w:lvlText w:val="o"/>
+      <w:lvlJc w:val="left"/>
+      <w:pPr>
+        <w:ind w:left="1440" w:hanging="360"/>
+      </w:pPr>
+      <w:rPr>
+        <w:rFonts w:ascii="Courier New" w:hAnsi="Courier New" w:cs="Courier New" w:hint="default"/>
+      </w:rPr>
+    </w:lvl>
+    <w:lvl w:ilvl="2" w:tplc="04100005" w:tentative="1">
+      <w:start w:val="1"/>
+      <w:numFmt w:val="bullet"/>
+      <w:lvlText w:val=""/>
+      <w:lvlJc w:val="left"/>
+      <w:pPr>
+        <w:ind w:left="2160" w:hanging="360"/>
+      </w:pPr>
+      <w:rPr>
+        <w:rFonts w:ascii="Wingdings" w:hAnsi="Wingdings" w:hint="default"/>
+      </w:rPr>
+    </w:lvl>
+    <w:lvl w:ilvl="3" w:tplc="04100001" w:tentative="1">
+      <w:start w:val="1"/>
+      <w:numFmt w:val="bullet"/>
+      <w:lvlText w:val=""/>
+      <w:lvlJc w:val="left"/>
+      <w:pPr>
+        <w:ind w:left="2880" w:hanging="360"/>
+      </w:pPr>
+      <w:rPr>
+        <w:rFonts w:ascii="Symbol" w:hAnsi="Symbol" w:hint="default"/>
+      </w:rPr>
+    </w:lvl>
+    <w:lvl w:ilvl="4" w:tplc="04100003" w:tentative="1">
+      <w:start w:val="1"/>
+      <w:numFmt w:val="bullet"/>
+      <w:lvlText w:val="o"/>
+      <w:lvlJc w:val="left"/>
+      <w:pPr>
+        <w:ind w:left="3600" w:hanging="360"/>
+      </w:pPr>
+      <w:rPr>
+        <w:rFonts w:ascii="Courier New" w:hAnsi="Courier New" w:cs="Courier New" w:hint="default"/>
+      </w:rPr>
+    </w:lvl>
+    <w:lvl w:ilvl="5" w:tplc="04100005" w:tentative="1">
+      <w:start w:val="1"/>
+      <w:numFmt w:val="bullet"/>
+      <w:lvlText w:val=""/>
+      <w:lvlJc w:val="left"/>
+      <w:pPr>
+        <w:ind w:left="4320" w:hanging="360"/>
+      </w:pPr>
+      <w:rPr>
+        <w:rFonts w:ascii="Wingdings" w:hAnsi="Wingdings" w:hint="default"/>
+      </w:rPr>
+    </w:lvl>
+    <w:lvl w:ilvl="6" w:tplc="04100001" w:tentative="1">
+      <w:start w:val="1"/>
+      <w:numFmt w:val="bullet"/>
+      <w:lvlText w:val=""/>
+      <w:lvlJc w:val="left"/>
+      <w:pPr>
+        <w:ind w:left="5040" w:hanging="360"/>
+      </w:pPr>
+      <w:rPr>
+        <w:rFonts w:ascii="Symbol" w:hAnsi="Symbol" w:hint="default"/>
+      </w:rPr>
+    </w:lvl>
+    <w:lvl w:ilvl="7" w:tplc="04100003" w:tentative="1">
+      <w:start w:val="1"/>
+      <w:numFmt w:val="bullet"/>
+      <w:lvlText w:val="o"/>
+      <w:lvlJc w:val="left"/>
+      <w:pPr>
+        <w:ind w:left="5760" w:hanging="360"/>
+      </w:pPr>
+      <w:rPr>
+        <w:rFonts w:ascii="Courier New" w:hAnsi="Courier New" w:cs="Courier New" w:hint="default"/>
+      </w:rPr>
+    </w:lvl>
+    <w:lvl w:ilvl="8" w:tplc="04100005" w:tentative="1">
+      <w:start w:val="1"/>
+      <w:numFmt w:val="bullet"/>
+      <w:lvlText w:val=""/>
+      <w:lvlJc w:val="left"/>
+      <w:pPr>
+        <w:ind w:left="6480" w:hanging="360"/>
+      </w:pPr>
+      <w:rPr>
+        <w:rFonts w:ascii="Wingdings" w:hAnsi="Wingdings" w:hint="default"/>
+      </w:rPr>
+    </w:lvl>
+  </w:abstractNum>
+  <w:abstractNum w:abstractNumId="8" w15:restartNumberingAfterBreak="0">
     <w:nsid w:val="42F45ABE"/>
     <w:multiLevelType w:val="hybridMultilevel"/>
     <w:tmpl w:val="B6625492"/>
@@ -4815,7 +4906,7 @@
       </w:rPr>
     </w:lvl>
   </w:abstractNum>
-  <w:abstractNum w:abstractNumId="7" w15:restartNumberingAfterBreak="0">
+  <w:abstractNum w:abstractNumId="9" w15:restartNumberingAfterBreak="0">
     <w:nsid w:val="47181E04"/>
     <w:multiLevelType w:val="hybridMultilevel"/>
     <w:tmpl w:val="6E2CE55C"/>
@@ -4927,7 +5018,7 @@
       </w:rPr>
     </w:lvl>
   </w:abstractNum>
-  <w:abstractNum w:abstractNumId="8" w15:restartNumberingAfterBreak="0">
+  <w:abstractNum w:abstractNumId="10" w15:restartNumberingAfterBreak="0">
     <w:nsid w:val="5AC7429C"/>
     <w:multiLevelType w:val="multilevel"/>
     <w:tmpl w:val="3B78E5E2"/>
@@ -5076,7 +5167,7 @@
       </w:rPr>
     </w:lvl>
   </w:abstractNum>
-  <w:abstractNum w:abstractNumId="9" w15:restartNumberingAfterBreak="0">
+  <w:abstractNum w:abstractNumId="11" w15:restartNumberingAfterBreak="0">
     <w:nsid w:val="5E2D33B9"/>
     <w:multiLevelType w:val="hybridMultilevel"/>
     <w:tmpl w:val="14960ACC"/>
@@ -5189,7 +5280,7 @@
       </w:rPr>
     </w:lvl>
   </w:abstractNum>
-  <w:abstractNum w:abstractNumId="10" w15:restartNumberingAfterBreak="0">
+  <w:abstractNum w:abstractNumId="12" w15:restartNumberingAfterBreak="0">
     <w:nsid w:val="5F3D7D0A"/>
     <w:multiLevelType w:val="multilevel"/>
     <w:tmpl w:val="54BC2A22"/>
@@ -5338,7 +5429,7 @@
       </w:rPr>
     </w:lvl>
   </w:abstractNum>
-  <w:abstractNum w:abstractNumId="11" w15:restartNumberingAfterBreak="0">
+  <w:abstractNum w:abstractNumId="13" w15:restartNumberingAfterBreak="0">
     <w:nsid w:val="700D66D2"/>
     <w:multiLevelType w:val="hybridMultilevel"/>
     <w:tmpl w:val="B3BA5AE8"/>
@@ -5451,7 +5542,7 @@
       </w:rPr>
     </w:lvl>
   </w:abstractNum>
-  <w:abstractNum w:abstractNumId="12" w15:restartNumberingAfterBreak="0">
+  <w:abstractNum w:abstractNumId="14" w15:restartNumberingAfterBreak="0">
     <w:nsid w:val="72353A77"/>
     <w:multiLevelType w:val="hybridMultilevel"/>
     <w:tmpl w:val="57502344"/>
@@ -5564,7 +5655,7 @@
       </w:rPr>
     </w:lvl>
   </w:abstractNum>
-  <w:abstractNum w:abstractNumId="13" w15:restartNumberingAfterBreak="0">
+  <w:abstractNum w:abstractNumId="15" w15:restartNumberingAfterBreak="0">
     <w:nsid w:val="79A87E8E"/>
     <w:multiLevelType w:val="multilevel"/>
     <w:tmpl w:val="E4F2B828"/>
@@ -5714,46 +5805,52 @@
     </w:lvl>
   </w:abstractNum>
   <w:num w:numId="1" w16cid:durableId="1235234935">
-    <w:abstractNumId w:val="12"/>
+    <w:abstractNumId w:val="14"/>
   </w:num>
   <w:num w:numId="2" w16cid:durableId="1808547614">
-    <w:abstractNumId w:val="2"/>
+    <w:abstractNumId w:val="3"/>
   </w:num>
   <w:num w:numId="3" w16cid:durableId="1125194435">
+    <w:abstractNumId w:val="13"/>
+  </w:num>
+  <w:num w:numId="4" w16cid:durableId="998002894">
+    <w:abstractNumId w:val="5"/>
+  </w:num>
+  <w:num w:numId="5" w16cid:durableId="171259058">
     <w:abstractNumId w:val="11"/>
   </w:num>
-  <w:num w:numId="4" w16cid:durableId="998002894">
+  <w:num w:numId="6" w16cid:durableId="642078686">
     <w:abstractNumId w:val="4"/>
-  </w:num>
-  <w:num w:numId="5" w16cid:durableId="171259058">
-    <w:abstractNumId w:val="9"/>
-  </w:num>
-  <w:num w:numId="6" w16cid:durableId="642078686">
-    <w:abstractNumId w:val="3"/>
   </w:num>
   <w:num w:numId="7" w16cid:durableId="1473905170">
     <w:abstractNumId w:val="0"/>
   </w:num>
   <w:num w:numId="8" w16cid:durableId="849641207">
+    <w:abstractNumId w:val="9"/>
+  </w:num>
+  <w:num w:numId="9" w16cid:durableId="1176336906">
+    <w:abstractNumId w:val="8"/>
+  </w:num>
+  <w:num w:numId="10" w16cid:durableId="1626812830">
+    <w:abstractNumId w:val="6"/>
+  </w:num>
+  <w:num w:numId="11" w16cid:durableId="2082438036">
+    <w:abstractNumId w:val="2"/>
+  </w:num>
+  <w:num w:numId="12" w16cid:durableId="1651323674">
+    <w:abstractNumId w:val="12"/>
+  </w:num>
+  <w:num w:numId="13" w16cid:durableId="1343973325">
+    <w:abstractNumId w:val="10"/>
+  </w:num>
+  <w:num w:numId="14" w16cid:durableId="1046760472">
+    <w:abstractNumId w:val="15"/>
+  </w:num>
+  <w:num w:numId="15" w16cid:durableId="1887840139">
     <w:abstractNumId w:val="7"/>
   </w:num>
-  <w:num w:numId="9" w16cid:durableId="1176336906">
-    <w:abstractNumId w:val="6"/>
-  </w:num>
-  <w:num w:numId="10" w16cid:durableId="1626812830">
-    <w:abstractNumId w:val="5"/>
-  </w:num>
-  <w:num w:numId="11" w16cid:durableId="2082438036">
+  <w:num w:numId="16" w16cid:durableId="610551505">
     <w:abstractNumId w:val="1"/>
-  </w:num>
-  <w:num w:numId="12" w16cid:durableId="1651323674">
-    <w:abstractNumId w:val="10"/>
-  </w:num>
-  <w:num w:numId="13" w16cid:durableId="1343973325">
-    <w:abstractNumId w:val="8"/>
-  </w:num>
-  <w:num w:numId="14" w16cid:durableId="1046760472">
-    <w:abstractNumId w:val="13"/>
   </w:num>
 </w:numbering>
 </file>
@@ -6248,6 +6345,7 @@
   <w:style w:type="character" w:default="1" w:styleId="Carpredefinitoparagrafo">
     <w:name w:val="Default Paragraph Font"/>
     <w:uiPriority w:val="1"/>
+    <w:semiHidden/>
     <w:unhideWhenUsed/>
   </w:style>
   <w:style w:type="table" w:default="1" w:styleId="Tabellanormale">

</xml_diff>